<commit_message>
Word import: content-based cover fallback and manual cover buttons
When size-based detection finds nothing, pick the subtitle by venue/time
wording and the title as the short keyword text box before it. Add
per-panel "set as cover title/subtitle" buttons, and turn the cover on
automatically after an import that finds cover text.

Co-Authored-By: Claude Sonnet 5.5 <noreply@anthropic.com>
Claude-Session: https://claude.ai/code/session_01Lr4nGZF4GGC967dspef5Pw
</commit_message>
<xml_diff>
--- a/deliverables/jabara-manual.docx
+++ b/deliverables/jabara-manual.docx
@@ -2129,6 +2129,38 @@
           <w:rFonts w:ascii="Yu Gothic" w:cs="Yu Gothic" w:eastAsia="Yu Gothic" w:hAnsi="Yu Gothic"/>
         </w:rPr>
         <w:t xml:space="preserve">古い .doc 形式は読み込めません。Wordで「名前を付けて保存」→ファイルの種類「Word文書（.docx）」にしてから読み込んでください。</w:t>
+      </w:r>
+    </w:p>
+    <w:p>
+      <w:pPr>
+        <w:pStyle w:val="ListParagraph"/>
+        <w:numPr>
+          <w:ilvl w:val="0"/>
+          <w:numId w:val="2"/>
+        </w:numPr>
+        <w:spacing w:after="60" w:line="320"/>
+      </w:pPr>
+      <w:r>
+        <w:rPr>
+          <w:rFonts w:ascii="Yu Gothic" w:cs="Yu Gothic" w:eastAsia="Yu Gothic" w:hAnsi="Yu Gothic"/>
+        </w:rPr>
+        <w:t xml:space="preserve">文字サイズで見分けられないファイルでも、「開式」「午前」「会館」などの文言があれば、サブタイトルとその直前のタイトルを文言から判定します。</w:t>
+      </w:r>
+    </w:p>
+    <w:p>
+      <w:pPr>
+        <w:pStyle w:val="ListParagraph"/>
+        <w:numPr>
+          <w:ilvl w:val="0"/>
+          <w:numId w:val="2"/>
+        </w:numPr>
+        <w:spacing w:after="60" w:line="320"/>
+      </w:pPr>
+      <w:r>
+        <w:rPr>
+          <w:rFonts w:ascii="Yu Gothic" w:cs="Yu Gothic" w:eastAsia="Yu Gothic" w:hAnsi="Yu Gothic"/>
+        </w:rPr>
+        <w:t xml:space="preserve">自動判定できなかったときは、反映後にパネル一覧の「表紙タイトルにする」「表紙サブタイトルにする」ボタンで手動で指定できます（そのパネルの文言が表紙欄に移り、パネルは一覧から消えます）。</w:t>
       </w:r>
     </w:p>
     <w:p>

</xml_diff>

<commit_message>
Word import: read legacy .doc; pack plain-line documents into panels
Adds an in-browser reader for Word 97-2003 .doc files (text boxes, font
sizes, first-line indents, ruby fields) so they import exactly like .docx.
Documents without text boxes are split into panels by sentence/paragraph
breaks within the max-line limit, and (よみ) after kanji becomes ruby.

Co-Authored-By: Claude Sonnet 5.5 <noreply@anthropic.com>
Claude-Session: https://claude.ai/code/session_01Lr4nGZF4GGC967dspef5Pw
</commit_message>
<xml_diff>
--- a/deliverables/jabara-manual.docx
+++ b/deliverables/jabara-manual.docx
@@ -506,7 +506,7 @@
               <w:rPr>
                 <w:rFonts w:ascii="Yu Gothic" w:cs="Yu Gothic" w:eastAsia="Yu Gothic" w:hAnsi="Yu Gothic"/>
               </w:rPr>
-              <w:t xml:space="preserve">既存のWordファイル（.docx）のテキストボックスを、そのままパネルとして読み込む。過去の祝辞を流用するとき向け。</w:t>
+              <w:t xml:space="preserve">既存のWordファイル（.docx／.doc）のテキストボックスを、そのままパネルとして読み込む。過去の祝辞を流用するとき向け。</w:t>
             </w:r>
           </w:p>
         </w:tc>
@@ -563,7 +563,7 @@
         <w:rPr>
           <w:rFonts w:ascii="Yu Gothic" w:cs="Yu Gothic" w:eastAsia="Yu Gothic" w:hAnsi="Yu Gothic"/>
         </w:rPr>
-        <w:t xml:space="preserve">Word読み込み版は、.docxを開くためのライブラリをインターネットから読み込むため、ネット接続が必要です。</w:t>
+        <w:t xml:space="preserve">Word読み込み版で.docxを読み込むときは、ファイルを開くためのライブラリをインターネットから読み込むため、ネット接続が必要です（旧形式の.docは不要です）。</w:t>
       </w:r>
     </w:p>
     <w:p>
@@ -2019,7 +2019,7 @@
         <w:rPr>
           <w:rFonts w:ascii="Yu Gothic" w:cs="Yu Gothic" w:eastAsia="Yu Gothic" w:hAnsi="Yu Gothic"/>
         </w:rPr>
-        <w:t xml:space="preserve">「ファイルを選択」で .docx ファイルを選びます。</w:t>
+        <w:t xml:space="preserve">「ファイルを選択」で Wordファイル（.docx、または旧形式の .doc）を選びます。</w:t>
       </w:r>
     </w:p>
     <w:p>
@@ -2064,7 +2064,7 @@
         <w:rPr>
           <w:rFonts w:ascii="Yu Gothic" w:cs="Yu Gothic" w:eastAsia="Yu Gothic" w:hAnsi="Yu Gothic"/>
         </w:rPr>
-        <w:t xml:space="preserve">Wordのテキストボックス1つが、1つのパネルになります。テキストボックスが無い文書は、本文の段落を読み込みます。</w:t>
+        <w:t xml:space="preserve">Wordのテキストボックス1つが、1つのパネルになります。</w:t>
       </w:r>
     </w:p>
     <w:p>
@@ -2080,7 +2080,7 @@
         <w:rPr>
           <w:rFonts w:ascii="Yu Gothic" w:cs="Yu Gothic" w:eastAsia="Yu Gothic" w:hAnsi="Yu Gothic"/>
         </w:rPr>
-        <w:t xml:space="preserve">文字サイズが明らかに大きいものは表紙タイトル、日付や会場らしい文言（「○年○月」「開式」「会館」など）を含むものは表紙サブタイトルとして自動判定し、表紙欄に振り分けます。本文パネルとは重複しません。判定できないときは通常のパネルとして読み込みます。</w:t>
+        <w:t xml:space="preserve">テキストボックスが無く、本文の行だけのファイルは、1パネルの最大行数に収まるように、文末（「。」）や段落の頭で区切って自動でパネルに分けます（4行なら2行＋2行のように、できるだけ均等に分けます）。「大宝(だいほう)」のように、漢字の直後にひらがなをかっこで入れた書き方は、ふりがなとして読み込みます。</w:t>
       </w:r>
     </w:p>
     <w:p>
@@ -2096,7 +2096,7 @@
         <w:rPr>
           <w:rFonts w:ascii="Yu Gothic" w:cs="Yu Gothic" w:eastAsia="Yu Gothic" w:hAnsi="Yu Gothic"/>
         </w:rPr>
-        <w:t xml:space="preserve">Wordのふりがな（ルビ）は「文字[よみ]」の形式に変換されます。</w:t>
+        <w:t xml:space="preserve">文字サイズが明らかに大きいものは表紙タイトル、日付や会場らしい文言（「○年○月」「開式」「会館」など）を含むものは表紙サブタイトルとして自動判定し、表紙欄に振り分けます。本文パネルとは重複しません。判定できないときは通常のパネルとして読み込みます。</w:t>
       </w:r>
     </w:p>
     <w:p>
@@ -2112,7 +2112,7 @@
         <w:rPr>
           <w:rFonts w:ascii="Yu Gothic" w:cs="Yu Gothic" w:eastAsia="Yu Gothic" w:hAnsi="Yu Gothic"/>
         </w:rPr>
-        <w:t xml:space="preserve">段落の字下げ（先頭行のインデント）は、全角スペースとして再現されます。</w:t>
+        <w:t xml:space="preserve">Wordのふりがな（ルビ）は「文字[よみ]」の形式に変換されます。</w:t>
       </w:r>
     </w:p>
     <w:p>
@@ -2128,7 +2128,7 @@
         <w:rPr>
           <w:rFonts w:ascii="Yu Gothic" w:cs="Yu Gothic" w:eastAsia="Yu Gothic" w:hAnsi="Yu Gothic"/>
         </w:rPr>
-        <w:t xml:space="preserve">古い .doc 形式は読み込めません。Wordで「名前を付けて保存」→ファイルの種類「Word文書（.docx）」にしてから読み込んでください。</w:t>
+        <w:t xml:space="preserve">段落の字下げ（先頭行のインデント）は、全角スペースとして再現されます。</w:t>
       </w:r>
     </w:p>
     <w:p>
@@ -4665,7 +4665,7 @@
               <w:rPr>
                 <w:rFonts w:ascii="Yu Gothic" w:cs="Yu Gothic" w:eastAsia="Yu Gothic" w:hAnsi="Yu Gothic"/>
               </w:rPr>
-              <w:t xml:space="preserve">.docx形式か、インターネットに接続されているかを確認してください。.docは、Wordで.docxとして保存し直します。</w:t>
+              <w:t xml:space="preserve">.docx／.docのどちらか（Excelなど別の形式ではないか）、パスワードが付いていないかを確認してください。.docxの読み込みにはインターネット接続も必要です。</w:t>
             </w:r>
           </w:p>
         </w:tc>

</xml_diff>

<commit_message>
Rewrite manual around the easy Word-import 3-step flow
Co-Authored-By: Claude Sonnet 5.5 <noreply@anthropic.com>
Claude-Session: https://claude.ai/code/session_01Lr4nGZF4GGC967dspef5Pw
</commit_message>
<xml_diff>
--- a/deliverables/jabara-manual.docx
+++ b/deliverables/jabara-manual.docx
@@ -364,7 +364,7 @@
               <w:rPr>
                 <w:rFonts w:ascii="Yu Gothic" w:cs="Yu Gothic" w:eastAsia="Yu Gothic" w:hAnsi="Yu Gothic"/>
               </w:rPr>
-              <w:t xml:space="preserve">jabara-shukuji.html</w:t>
+              <w:t xml:space="preserve">jabara-word-import.html</w:t>
             </w:r>
           </w:p>
         </w:tc>
@@ -392,7 +392,7 @@
               <w:rPr>
                 <w:rFonts w:ascii="Yu Gothic" w:cs="Yu Gothic" w:eastAsia="Yu Gothic" w:hAnsi="Yu Gothic"/>
               </w:rPr>
-              <w:t xml:space="preserve">蛇腹祝辞メーカー</w:t>
+              <w:t xml:space="preserve">Word読み込み版（おすすめ）</w:t>
             </w:r>
           </w:p>
         </w:tc>
@@ -420,7 +420,7 @@
               <w:rPr>
                 <w:rFonts w:ascii="Yu Gothic" w:cs="Yu Gothic" w:eastAsia="Yu Gothic" w:hAnsi="Yu Gothic"/>
               </w:rPr>
-              <w:t xml:space="preserve">台本（テキスト）を貼り付けて、自動でパネルに区切る。新規に作るとき向け。</w:t>
+              <w:t xml:space="preserve">Wordで作った祝辞（.docx／.doc）を選ぶだけ。表紙・本文・ふりがな・字下げ・パネルの区切りまで自動で入ります。</w:t>
             </w:r>
           </w:p>
         </w:tc>
@@ -450,7 +450,7 @@
               <w:rPr>
                 <w:rFonts w:ascii="Yu Gothic" w:cs="Yu Gothic" w:eastAsia="Yu Gothic" w:hAnsi="Yu Gothic"/>
               </w:rPr>
-              <w:t xml:space="preserve">jabara-word-import.html</w:t>
+              <w:t xml:space="preserve">jabara-shukuji.html</w:t>
             </w:r>
           </w:p>
         </w:tc>
@@ -478,7 +478,7 @@
               <w:rPr>
                 <w:rFonts w:ascii="Yu Gothic" w:cs="Yu Gothic" w:eastAsia="Yu Gothic" w:hAnsi="Yu Gothic"/>
               </w:rPr>
-              <w:t xml:space="preserve">Word読み込み版</w:t>
+              <w:t xml:space="preserve">蛇腹祝辞メーカー</w:t>
             </w:r>
           </w:p>
         </w:tc>
@@ -506,7 +506,7 @@
               <w:rPr>
                 <w:rFonts w:ascii="Yu Gothic" w:cs="Yu Gothic" w:eastAsia="Yu Gothic" w:hAnsi="Yu Gothic"/>
               </w:rPr>
-              <w:t xml:space="preserve">既存のWordファイル（.docx／.doc）のテキストボックスを、そのままパネルとして読み込む。過去の祝辞を流用するとき向け。</w:t>
+              <w:t xml:space="preserve">台本（テキスト）を貼り付けて、自動でパネルに区切る。Wordのファイルが無いとき向け。</w:t>
             </w:r>
           </w:p>
         </w:tc>
@@ -520,7 +520,7 @@
         <w:rPr>
           <w:rFonts w:ascii="Yu Gothic" w:cs="Yu Gothic" w:eastAsia="Yu Gothic" w:hAnsi="Yu Gothic"/>
         </w:rPr>
-        <w:t xml:space="preserve">入力欄・設定・印刷方法は両ツールで共通です。違いは「台本を一括入力する欄」が「Wordファイルを読み込む欄」に置き換わっている点だけです。</w:t>
+        <w:t xml:space="preserve">迷ったら「Word読み込み版」を使ってください。入力欄・設定・印刷方法は両ツールで共通で、違いは「台本を一括入力する欄」が「Wordファイルを読み込む欄」に置き換わっている点だけです。</w:t>
       </w:r>
     </w:p>
     <w:p>
@@ -606,7 +606,18 @@
         <w:rPr>
           <w:rFonts w:ascii="Yu Gothic" w:cs="Yu Gothic" w:eastAsia="Yu Gothic" w:hAnsi="Yu Gothic"/>
         </w:rPr>
-        <w:t xml:space="preserve">2. 基本の流れ</w:t>
+        <w:t xml:space="preserve">2. かんたん3ステップ（Word読み込み版）</w:t>
+      </w:r>
+    </w:p>
+    <w:p>
+      <w:pPr>
+        <w:spacing w:after="120" w:line="320"/>
+      </w:pPr>
+      <w:r>
+        <w:rPr>
+          <w:rFonts w:ascii="Yu Gothic" w:cs="Yu Gothic" w:eastAsia="Yu Gothic" w:hAnsi="Yu Gothic"/>
+        </w:rPr>
+        <w:t xml:space="preserve">Wordファイルがあれば、操作はこの3つだけです。</w:t>
       </w:r>
     </w:p>
     <w:p>
@@ -624,184 +635,13 @@
           <w:b/>
           <w:bCs/>
         </w:rPr>
-        <w:t xml:space="preserve">ファイルを開く：</w:t>
-      </w:r>
-      <w:r>
-        <w:rPr>
-          <w:rFonts w:ascii="Yu Gothic" w:cs="Yu Gothic" w:eastAsia="Yu Gothic" w:hAnsi="Yu Gothic"/>
-        </w:rPr>
-        <w:t xml:space="preserve">ツールのHTMLファイルをブラウザで開きます。</w:t>
-      </w:r>
-    </w:p>
-    <w:p>
-      <w:pPr>
-        <w:pStyle w:val="ListParagraph"/>
-        <w:numPr>
-          <w:ilvl w:val="0"/>
-          <w:numId w:val="3"/>
-        </w:numPr>
-        <w:spacing w:after="80" w:line="320"/>
-      </w:pPr>
-      <w:r>
-        <w:rPr>
-          <w:rFonts w:ascii="Yu Gothic" w:cs="Yu Gothic" w:eastAsia="Yu Gothic" w:hAnsi="Yu Gothic"/>
-          <w:b/>
-          <w:bCs/>
-        </w:rPr>
-        <w:t xml:space="preserve">表紙を入力する：</w:t>
-      </w:r>
-      <w:r>
-        <w:rPr>
-          <w:rFonts w:ascii="Yu Gothic" w:cs="Yu Gothic" w:eastAsia="Yu Gothic" w:hAnsi="Yu Gothic"/>
-        </w:rPr>
-        <w:t xml:space="preserve">タイトル・サブタイトルを入れます（不要ならチェックを外す）。</w:t>
-      </w:r>
-    </w:p>
-    <w:p>
-      <w:pPr>
-        <w:pStyle w:val="ListParagraph"/>
-        <w:numPr>
-          <w:ilvl w:val="0"/>
-          <w:numId w:val="3"/>
-        </w:numPr>
-        <w:spacing w:after="80" w:line="320"/>
-      </w:pPr>
-      <w:r>
-        <w:rPr>
-          <w:rFonts w:ascii="Yu Gothic" w:cs="Yu Gothic" w:eastAsia="Yu Gothic" w:hAnsi="Yu Gothic"/>
-          <w:b/>
-          <w:bCs/>
-        </w:rPr>
-        <w:t xml:space="preserve">用紙・パネルの設定を確認する：</w:t>
-      </w:r>
-      <w:r>
-        <w:rPr>
-          <w:rFonts w:ascii="Yu Gothic" w:cs="Yu Gothic" w:eastAsia="Yu Gothic" w:hAnsi="Yu Gothic"/>
-        </w:rPr>
-        <w:t xml:space="preserve">通常は初期値（折り幅6.8cm・30pt）のままで構いません。</w:t>
-      </w:r>
-    </w:p>
-    <w:p>
-      <w:pPr>
-        <w:pStyle w:val="ListParagraph"/>
-        <w:numPr>
-          <w:ilvl w:val="0"/>
-          <w:numId w:val="3"/>
-        </w:numPr>
-        <w:spacing w:after="80" w:line="320"/>
-      </w:pPr>
-      <w:r>
-        <w:rPr>
-          <w:rFonts w:ascii="Yu Gothic" w:cs="Yu Gothic" w:eastAsia="Yu Gothic" w:hAnsi="Yu Gothic"/>
-          <w:b/>
-          <w:bCs/>
-        </w:rPr>
-        <w:t xml:space="preserve">台本を入れる：</w:t>
-      </w:r>
-      <w:r>
-        <w:rPr>
-          <w:rFonts w:ascii="Yu Gothic" w:cs="Yu Gothic" w:eastAsia="Yu Gothic" w:hAnsi="Yu Gothic"/>
-        </w:rPr>
-        <w:t xml:space="preserve">蛇腹祝辞メーカーは「台本を一括入力」、Word読み込み版は「Wordファイルを読み込む」から。「パネルに反映」を押します。</w:t>
-      </w:r>
-    </w:p>
-    <w:p>
-      <w:pPr>
-        <w:pStyle w:val="ListParagraph"/>
-        <w:numPr>
-          <w:ilvl w:val="0"/>
-          <w:numId w:val="3"/>
-        </w:numPr>
-        <w:spacing w:after="80" w:line="320"/>
-      </w:pPr>
-      <w:r>
-        <w:rPr>
-          <w:rFonts w:ascii="Yu Gothic" w:cs="Yu Gothic" w:eastAsia="Yu Gothic" w:hAnsi="Yu Gothic"/>
-          <w:b/>
-          <w:bCs/>
-        </w:rPr>
-        <w:t xml:space="preserve">パネルごとに整える：</w:t>
-      </w:r>
-      <w:r>
-        <w:rPr>
-          <w:rFonts w:ascii="Yu Gothic" w:cs="Yu Gothic" w:eastAsia="Yu Gothic" w:hAnsi="Yu Gothic"/>
-        </w:rPr>
-        <w:t xml:space="preserve">ふりがなを付ける、境目を移動する、署名の字下げを整える。下のプレビューに赤い枠が出ていないか確認します。</w:t>
-      </w:r>
-    </w:p>
-    <w:p>
-      <w:pPr>
-        <w:pStyle w:val="ListParagraph"/>
-        <w:numPr>
-          <w:ilvl w:val="0"/>
-          <w:numId w:val="3"/>
-        </w:numPr>
-        <w:spacing w:after="80" w:line="320"/>
-      </w:pPr>
-      <w:r>
-        <w:rPr>
-          <w:rFonts w:ascii="Yu Gothic" w:cs="Yu Gothic" w:eastAsia="Yu Gothic" w:hAnsi="Yu Gothic"/>
-          <w:b/>
-          <w:bCs/>
-        </w:rPr>
-        <w:t xml:space="preserve">印刷する：</w:t>
-      </w:r>
-      <w:r>
-        <w:rPr>
-          <w:rFonts w:ascii="Yu Gothic" w:cs="Yu Gothic" w:eastAsia="Yu Gothic" w:hAnsi="Yu Gothic"/>
-        </w:rPr>
-        <w:t xml:space="preserve">「印刷」ボタンからA4横・余白なし・倍率100%で印刷します（4章）。</w:t>
-      </w:r>
-    </w:p>
-    <w:p>
-      <w:pPr>
-        <w:pStyle w:val="ListParagraph"/>
-        <w:numPr>
-          <w:ilvl w:val="0"/>
-          <w:numId w:val="3"/>
-        </w:numPr>
-        <w:spacing w:after="80" w:line="320"/>
-      </w:pPr>
-      <w:r>
-        <w:rPr>
-          <w:rFonts w:ascii="Yu Gothic" w:cs="Yu Gothic" w:eastAsia="Yu Gothic" w:hAnsi="Yu Gothic"/>
-          <w:b/>
-          <w:bCs/>
-        </w:rPr>
-        <w:t xml:space="preserve">折って貼り合わせる：</w:t>
-      </w:r>
-      <w:r>
-        <w:rPr>
-          <w:rFonts w:ascii="Yu Gothic" w:cs="Yu Gothic" w:eastAsia="Yu Gothic" w:hAnsi="Yu Gothic"/>
-        </w:rPr>
-        <w:t xml:space="preserve">山折り・谷折りを交互に折り、のりしろで次の用紙とつなぎます（5章）。</w:t>
-      </w:r>
-    </w:p>
-    <w:p>
-      <w:r>
-        <w:br w:type="page"/>
-      </w:r>
-    </w:p>
-    <w:p>
-      <w:pPr>
-        <w:pStyle w:val="Heading1"/>
-      </w:pPr>
-      <w:r>
-        <w:rPr>
-          <w:rFonts w:ascii="Yu Gothic" w:cs="Yu Gothic" w:eastAsia="Yu Gothic" w:hAnsi="Yu Gothic"/>
-        </w:rPr>
-        <w:t xml:space="preserve">3. 画面の説明と操作</w:t>
-      </w:r>
-    </w:p>
-    <w:p>
-      <w:pPr>
-        <w:pStyle w:val="Heading2"/>
-      </w:pPr>
-      <w:r>
-        <w:rPr>
-          <w:rFonts w:ascii="Yu Gothic" w:cs="Yu Gothic" w:eastAsia="Yu Gothic" w:hAnsi="Yu Gothic"/>
-        </w:rPr>
-        <w:t xml:space="preserve">3.1 表紙（1枚目 右端パネル）</w:t>
+        <w:t xml:space="preserve">Wordファイルを選ぶ：</w:t>
+      </w:r>
+      <w:r>
+        <w:rPr>
+          <w:rFonts w:ascii="Yu Gothic" w:cs="Yu Gothic" w:eastAsia="Yu Gothic" w:hAnsi="Yu Gothic"/>
+        </w:rPr>
+        <w:t xml:space="preserve">「Word読み込み版」のHTMLを開き、「Wordファイルを読み込む」で祝辞のWordファイル（.docx／.doc）を選びます。</w:t>
       </w:r>
     </w:p>
     <w:p>
@@ -812,9 +652,9 @@
       <w:r>
         <w:drawing>
           <wp:inline distT="0" distB="0" distL="0" distR="0">
-            <wp:extent cx="5334000" cy="2476500"/>
+            <wp:extent cx="5334000" cy="1171575"/>
             <wp:effectExtent t="0" r="0" b="0" l="0"/>
-            <wp:docPr id="1" name="表紙の設定欄" descr="表紙の設定欄" title="表紙の設定欄"/>
+            <wp:docPr id="1" name="Wordファイルを選んだところ" descr="Wordファイルを選んだところ" title="Wordファイルを選んだところ"/>
             <wp:cNvGraphicFramePr>
               <a:graphicFrameLocks xmlns:a="http://schemas.openxmlformats.org/drawingml/2006/main" noChangeAspect="1"/>
             </wp:cNvGraphicFramePr>
@@ -837,7 +677,7 @@
                   <pic:spPr bwMode="auto">
                     <a:xfrm>
                       <a:off x="0" y="0"/>
-                      <a:ext cx="5334000" cy="2476500"/>
+                      <a:ext cx="5334000" cy="1171575"/>
                     </a:xfrm>
                     <a:prstGeom prst="rect">
                       <a:avLst/>
@@ -862,7 +702,7 @@
           <w:sz w:val="18"/>
           <w:szCs w:val="18"/>
         </w:rPr>
-        <w:t xml:space="preserve">図1　表紙の設定欄</w:t>
+        <w:t xml:space="preserve">図1　ファイルを選ぶと、検出結果が表示される</w:t>
       </w:r>
     </w:p>
     <w:p>
@@ -870,9 +710,9 @@
         <w:pStyle w:val="ListParagraph"/>
         <w:numPr>
           <w:ilvl w:val="0"/>
-          <w:numId w:val="2"/>
+          <w:numId w:val="3"/>
         </w:numPr>
-        <w:spacing w:after="60" w:line="320"/>
+        <w:spacing w:after="80" w:line="320"/>
       </w:pPr>
       <w:r>
         <w:rPr>
@@ -880,149 +720,13 @@
           <w:b/>
           <w:bCs/>
         </w:rPr>
-        <w:t xml:space="preserve">表紙チェック：</w:t>
-      </w:r>
-      <w:r>
-        <w:rPr>
-          <w:rFonts w:ascii="Yu Gothic" w:cs="Yu Gothic" w:eastAsia="Yu Gothic" w:hAnsi="Yu Gothic"/>
-        </w:rPr>
-        <w:t xml:space="preserve">オンにすると、1枚目の右端にタイトル・サブタイトルの表紙パネルが付きます。</w:t>
-      </w:r>
-    </w:p>
-    <w:p>
-      <w:pPr>
-        <w:pStyle w:val="ListParagraph"/>
-        <w:numPr>
-          <w:ilvl w:val="0"/>
-          <w:numId w:val="2"/>
-        </w:numPr>
-        <w:spacing w:after="60" w:line="320"/>
-      </w:pPr>
-      <w:r>
-        <w:rPr>
-          <w:rFonts w:ascii="Yu Gothic" w:cs="Yu Gothic" w:eastAsia="Yu Gothic" w:hAnsi="Yu Gothic"/>
-          <w:b/>
-          <w:bCs/>
-        </w:rPr>
-        <w:t xml:space="preserve">タイトル（大）／サブタイトル（小）：</w:t>
-      </w:r>
-      <w:r>
-        <w:rPr>
-          <w:rFonts w:ascii="Yu Gothic" w:cs="Yu Gothic" w:eastAsia="Yu Gothic" w:hAnsi="Yu Gothic"/>
-        </w:rPr>
-        <w:t xml:space="preserve">式典名、日付・会場などを入力します。改行するとその位置で次の列になります。</w:t>
-      </w:r>
-    </w:p>
-    <w:p>
-      <w:pPr>
-        <w:pStyle w:val="ListParagraph"/>
-        <w:numPr>
-          <w:ilvl w:val="0"/>
-          <w:numId w:val="2"/>
-        </w:numPr>
-        <w:spacing w:after="60" w:line="320"/>
-      </w:pPr>
-      <w:r>
-        <w:rPr>
-          <w:rFonts w:ascii="Yu Gothic" w:cs="Yu Gothic" w:eastAsia="Yu Gothic" w:hAnsi="Yu Gothic"/>
-          <w:b/>
-          <w:bCs/>
-        </w:rPr>
-        <w:t xml:space="preserve">表紙パネルの幅：</w:t>
-      </w:r>
-      <w:r>
-        <w:rPr>
-          <w:rFonts w:ascii="Yu Gothic" w:cs="Yu Gothic" w:eastAsia="Yu Gothic" w:hAnsi="Yu Gothic"/>
-        </w:rPr>
-        <w:t xml:space="preserve">折り幅の何個分か（初期値は1個分）。常に折り幅の整数倍になり、内部にも折り線が入ります。</w:t>
-      </w:r>
-    </w:p>
-    <w:p>
-      <w:pPr>
-        <w:pStyle w:val="ListParagraph"/>
-        <w:numPr>
-          <w:ilvl w:val="0"/>
-          <w:numId w:val="2"/>
-        </w:numPr>
-        <w:spacing w:after="60" w:line="320"/>
-      </w:pPr>
-      <w:r>
-        <w:rPr>
-          <w:rFonts w:ascii="Yu Gothic" w:cs="Yu Gothic" w:eastAsia="Yu Gothic" w:hAnsi="Yu Gothic"/>
-          <w:b/>
-          <w:bCs/>
-        </w:rPr>
-        <w:t xml:space="preserve">文字サイズ：</w:t>
-      </w:r>
-      <w:r>
-        <w:rPr>
-          <w:rFonts w:ascii="Yu Gothic" w:cs="Yu Gothic" w:eastAsia="Yu Gothic" w:hAnsi="Yu Gothic"/>
-        </w:rPr>
-        <w:t xml:space="preserve">タイトル初期値24pt、サブタイトル初期値18pt。</w:t>
-      </w:r>
-    </w:p>
-    <w:p>
-      <w:pPr>
-        <w:pStyle w:val="ListParagraph"/>
-        <w:numPr>
-          <w:ilvl w:val="0"/>
-          <w:numId w:val="2"/>
-        </w:numPr>
-        <w:spacing w:after="60" w:line="320"/>
-      </w:pPr>
-      <w:r>
-        <w:rPr>
-          <w:rFonts w:ascii="Yu Gothic" w:cs="Yu Gothic" w:eastAsia="Yu Gothic" w:hAnsi="Yu Gothic"/>
-          <w:b/>
-          <w:bCs/>
-        </w:rPr>
-        <w:t xml:space="preserve">スペース自動調整（サブタイトル）：</w:t>
-      </w:r>
-      <w:r>
-        <w:rPr>
-          <w:rFonts w:ascii="Yu Gothic" w:cs="Yu Gothic" w:eastAsia="Yu Gothic" w:hAnsi="Yu Gothic"/>
-        </w:rPr>
-        <w:t xml:space="preserve">1行目（日付）の先頭に全角5文字分、2行目（会場）の先頭に全角10文字分の空白を入れます。すでに先頭にある空白は置き換わります。</w:t>
-      </w:r>
-    </w:p>
-    <w:p>
-      <w:pPr>
-        <w:pStyle w:val="ListParagraph"/>
-        <w:numPr>
-          <w:ilvl w:val="0"/>
-          <w:numId w:val="2"/>
-        </w:numPr>
-        <w:spacing w:after="60" w:line="320"/>
-      </w:pPr>
-      <w:r>
-        <w:rPr>
-          <w:rFonts w:ascii="Yu Gothic" w:cs="Yu Gothic" w:eastAsia="Yu Gothic" w:hAnsi="Yu Gothic"/>
-          <w:b/>
-          <w:bCs/>
-        </w:rPr>
-        <w:t xml:space="preserve">文言を消す：</w:t>
-      </w:r>
-      <w:r>
-        <w:rPr>
-          <w:rFonts w:ascii="Yu Gothic" w:cs="Yu Gothic" w:eastAsia="Yu Gothic" w:hAnsi="Yu Gothic"/>
-        </w:rPr>
-        <w:t xml:space="preserve">その欄の文言を全て消します。</w:t>
-      </w:r>
-    </w:p>
-    <w:p>
-      <w:pPr>
-        <w:spacing w:after="60"/>
-      </w:pPr>
-    </w:p>
-    <w:p>
-      <w:pPr>
-        <w:pStyle w:val="Heading2"/>
-      </w:pPr>
-      <w:r>
-        <w:rPr>
-          <w:rFonts w:ascii="Yu Gothic" w:cs="Yu Gothic" w:eastAsia="Yu Gothic" w:hAnsi="Yu Gothic"/>
-        </w:rPr>
-        <w:t xml:space="preserve">3.2 用紙・パネルの設定</w:t>
+        <w:t xml:space="preserve">「パネルに反映」を押す：</w:t>
+      </w:r>
+      <w:r>
+        <w:rPr>
+          <w:rFonts w:ascii="Yu Gothic" w:cs="Yu Gothic" w:eastAsia="Yu Gothic" w:hAnsi="Yu Gothic"/>
+        </w:rPr>
+        <w:t xml:space="preserve">表紙のタイトル・サブタイトル、本文のパネル、ふりがな、字下げが自動で入ります。</w:t>
       </w:r>
     </w:p>
     <w:p>
@@ -1033,9 +737,9 @@
       <w:r>
         <w:drawing>
           <wp:inline distT="0" distB="0" distL="0" distR="0">
-            <wp:extent cx="5334000" cy="1571625"/>
+            <wp:extent cx="5334000" cy="2476500"/>
             <wp:effectExtent t="0" r="0" b="0" l="0"/>
-            <wp:docPr id="2" name="用紙・パネルの設定欄" descr="用紙・パネルの設定欄" title="用紙・パネルの設定欄"/>
+            <wp:docPr id="2" name="表紙欄に自動で入ったタイトルとサブタイトル" descr="表紙欄に自動で入ったタイトルとサブタイトル" title="表紙欄に自動で入ったタイトルとサブタイトル"/>
             <wp:cNvGraphicFramePr>
               <a:graphicFrameLocks xmlns:a="http://schemas.openxmlformats.org/drawingml/2006/main" noChangeAspect="1"/>
             </wp:cNvGraphicFramePr>
@@ -1058,7 +762,7 @@
                   <pic:spPr bwMode="auto">
                     <a:xfrm>
                       <a:off x="0" y="0"/>
-                      <a:ext cx="5334000" cy="1571625"/>
+                      <a:ext cx="5334000" cy="2476500"/>
                     </a:xfrm>
                     <a:prstGeom prst="rect">
                       <a:avLst/>
@@ -1083,730 +787,31 @@
           <w:sz w:val="18"/>
           <w:szCs w:val="18"/>
         </w:rPr>
-        <w:t xml:space="preserve">図2　用紙・パネルの設定欄</w:t>
-      </w:r>
-    </w:p>
-    <w:tbl>
-      <w:tblPr>
-        <w:tblW w:type="dxa" w:w="9638"/>
-        <w:tblBorders>
-          <w:top w:val="single" w:color="auto" w:sz="4"/>
-          <w:left w:val="single" w:color="auto" w:sz="4"/>
-          <w:bottom w:val="single" w:color="auto" w:sz="4"/>
-          <w:right w:val="single" w:color="auto" w:sz="4"/>
-          <w:insideH w:val="single" w:color="auto" w:sz="4"/>
-          <w:insideV w:val="single" w:color="auto" w:sz="4"/>
-        </w:tblBorders>
-      </w:tblPr>
-      <w:tblGrid>
-        <w:gridCol w:w="2900"/>
-        <w:gridCol w:w="1500"/>
-        <w:gridCol w:w="5238"/>
-      </w:tblGrid>
-      <w:tr>
-        <w:trPr>
-          <w:tblHeader/>
-        </w:trPr>
-        <w:tc>
-          <w:tcPr>
-            <w:tcW w:type="dxa" w:w="2900"/>
-            <w:tcBorders>
-              <w:top w:val="single" w:color="C9CEC0" w:sz="4"/>
-              <w:left w:val="single" w:color="C9CEC0" w:sz="4"/>
-              <w:bottom w:val="single" w:color="C9CEC0" w:sz="4"/>
-              <w:right w:val="single" w:color="C9CEC0" w:sz="4"/>
-            </w:tcBorders>
-            <w:shd w:fill="E6ECF3" w:color="auto" w:val="clear"/>
-            <w:tcMar>
-              <w:top w:type="dxa" w:w="70"/>
-              <w:left w:type="dxa" w:w="110"/>
-              <w:bottom w:type="dxa" w:w="70"/>
-              <w:right w:type="dxa" w:w="110"/>
-            </w:tcMar>
-          </w:tcPr>
-          <w:p>
-            <w:pPr>
-              <w:spacing w:after="0" w:line="300"/>
-            </w:pPr>
-            <w:r>
-              <w:rPr>
-                <w:rFonts w:ascii="Yu Gothic" w:cs="Yu Gothic" w:eastAsia="Yu Gothic" w:hAnsi="Yu Gothic"/>
-                <w:b/>
-                <w:bCs/>
-                <w:color w:val="2B4C6F"/>
-              </w:rPr>
-              <w:t xml:space="preserve">項目</w:t>
-            </w:r>
-          </w:p>
-        </w:tc>
-        <w:tc>
-          <w:tcPr>
-            <w:tcW w:type="dxa" w:w="1500"/>
-            <w:tcBorders>
-              <w:top w:val="single" w:color="C9CEC0" w:sz="4"/>
-              <w:left w:val="single" w:color="C9CEC0" w:sz="4"/>
-              <w:bottom w:val="single" w:color="C9CEC0" w:sz="4"/>
-              <w:right w:val="single" w:color="C9CEC0" w:sz="4"/>
-            </w:tcBorders>
-            <w:shd w:fill="E6ECF3" w:color="auto" w:val="clear"/>
-            <w:tcMar>
-              <w:top w:type="dxa" w:w="70"/>
-              <w:left w:type="dxa" w:w="110"/>
-              <w:bottom w:type="dxa" w:w="70"/>
-              <w:right w:type="dxa" w:w="110"/>
-            </w:tcMar>
-          </w:tcPr>
-          <w:p>
-            <w:pPr>
-              <w:spacing w:after="0" w:line="300"/>
-            </w:pPr>
-            <w:r>
-              <w:rPr>
-                <w:rFonts w:ascii="Yu Gothic" w:cs="Yu Gothic" w:eastAsia="Yu Gothic" w:hAnsi="Yu Gothic"/>
-                <w:b/>
-                <w:bCs/>
-                <w:color w:val="2B4C6F"/>
-              </w:rPr>
-              <w:t xml:space="preserve">初期値</w:t>
-            </w:r>
-          </w:p>
-        </w:tc>
-        <w:tc>
-          <w:tcPr>
-            <w:tcW w:type="dxa" w:w="5238"/>
-            <w:tcBorders>
-              <w:top w:val="single" w:color="C9CEC0" w:sz="4"/>
-              <w:left w:val="single" w:color="C9CEC0" w:sz="4"/>
-              <w:bottom w:val="single" w:color="C9CEC0" w:sz="4"/>
-              <w:right w:val="single" w:color="C9CEC0" w:sz="4"/>
-            </w:tcBorders>
-            <w:shd w:fill="E6ECF3" w:color="auto" w:val="clear"/>
-            <w:tcMar>
-              <w:top w:type="dxa" w:w="70"/>
-              <w:left w:type="dxa" w:w="110"/>
-              <w:bottom w:type="dxa" w:w="70"/>
-              <w:right w:type="dxa" w:w="110"/>
-            </w:tcMar>
-          </w:tcPr>
-          <w:p>
-            <w:pPr>
-              <w:spacing w:after="0" w:line="300"/>
-            </w:pPr>
-            <w:r>
-              <w:rPr>
-                <w:rFonts w:ascii="Yu Gothic" w:cs="Yu Gothic" w:eastAsia="Yu Gothic" w:hAnsi="Yu Gothic"/>
-                <w:b/>
-                <w:bCs/>
-                <w:color w:val="2B4C6F"/>
-              </w:rPr>
-              <w:t xml:space="preserve">説明</w:t>
-            </w:r>
-          </w:p>
-        </w:tc>
-      </w:tr>
-      <w:tr>
-        <w:tc>
-          <w:tcPr>
-            <w:tcW w:type="dxa" w:w="2900"/>
-            <w:tcBorders>
-              <w:top w:val="single" w:color="C9CEC0" w:sz="4"/>
-              <w:left w:val="single" w:color="C9CEC0" w:sz="4"/>
-              <w:bottom w:val="single" w:color="C9CEC0" w:sz="4"/>
-              <w:right w:val="single" w:color="C9CEC0" w:sz="4"/>
-            </w:tcBorders>
-            <w:tcMar>
-              <w:top w:type="dxa" w:w="70"/>
-              <w:left w:type="dxa" w:w="110"/>
-              <w:bottom w:type="dxa" w:w="70"/>
-              <w:right w:type="dxa" w:w="110"/>
-            </w:tcMar>
-          </w:tcPr>
-          <w:p>
-            <w:pPr>
-              <w:spacing w:after="0" w:line="300"/>
-            </w:pPr>
-            <w:r>
-              <w:rPr>
-                <w:rFonts w:ascii="Yu Gothic" w:cs="Yu Gothic" w:eastAsia="Yu Gothic" w:hAnsi="Yu Gothic"/>
-              </w:rPr>
-              <w:t xml:space="preserve">折り幅（1パネルの横幅）</w:t>
-            </w:r>
-          </w:p>
-        </w:tc>
-        <w:tc>
-          <w:tcPr>
-            <w:tcW w:type="dxa" w:w="1500"/>
-            <w:tcBorders>
-              <w:top w:val="single" w:color="C9CEC0" w:sz="4"/>
-              <w:left w:val="single" w:color="C9CEC0" w:sz="4"/>
-              <w:bottom w:val="single" w:color="C9CEC0" w:sz="4"/>
-              <w:right w:val="single" w:color="C9CEC0" w:sz="4"/>
-            </w:tcBorders>
-            <w:tcMar>
-              <w:top w:type="dxa" w:w="70"/>
-              <w:left w:type="dxa" w:w="110"/>
-              <w:bottom w:type="dxa" w:w="70"/>
-              <w:right w:type="dxa" w:w="110"/>
-            </w:tcMar>
-          </w:tcPr>
-          <w:p>
-            <w:pPr>
-              <w:spacing w:after="0" w:line="300"/>
-            </w:pPr>
-            <w:r>
-              <w:rPr>
-                <w:rFonts w:ascii="Yu Gothic" w:cs="Yu Gothic" w:eastAsia="Yu Gothic" w:hAnsi="Yu Gothic"/>
-              </w:rPr>
-              <w:t xml:space="preserve">6.8 cm</w:t>
-            </w:r>
-          </w:p>
-        </w:tc>
-        <w:tc>
-          <w:tcPr>
-            <w:tcW w:type="dxa" w:w="5238"/>
-            <w:tcBorders>
-              <w:top w:val="single" w:color="C9CEC0" w:sz="4"/>
-              <w:left w:val="single" w:color="C9CEC0" w:sz="4"/>
-              <w:bottom w:val="single" w:color="C9CEC0" w:sz="4"/>
-              <w:right w:val="single" w:color="C9CEC0" w:sz="4"/>
-            </w:tcBorders>
-            <w:tcMar>
-              <w:top w:type="dxa" w:w="70"/>
-              <w:left w:type="dxa" w:w="110"/>
-              <w:bottom w:type="dxa" w:w="70"/>
-              <w:right w:type="dxa" w:w="110"/>
-            </w:tcMar>
-          </w:tcPr>
-          <w:p>
-            <w:pPr>
-              <w:spacing w:after="0" w:line="300"/>
-            </w:pPr>
-            <w:r>
-              <w:rPr>
-                <w:rFonts w:ascii="Yu Gothic" w:cs="Yu Gothic" w:eastAsia="Yu Gothic" w:hAnsi="Yu Gothic"/>
-              </w:rPr>
-              <w:t xml:space="preserve">蛇腹の1面の幅。全パネルこの幅に固定されます。</w:t>
-            </w:r>
-          </w:p>
-        </w:tc>
-      </w:tr>
-      <w:tr>
-        <w:tc>
-          <w:tcPr>
-            <w:tcW w:type="dxa" w:w="2900"/>
-            <w:tcBorders>
-              <w:top w:val="single" w:color="C9CEC0" w:sz="4"/>
-              <w:left w:val="single" w:color="C9CEC0" w:sz="4"/>
-              <w:bottom w:val="single" w:color="C9CEC0" w:sz="4"/>
-              <w:right w:val="single" w:color="C9CEC0" w:sz="4"/>
-            </w:tcBorders>
-            <w:tcMar>
-              <w:top w:type="dxa" w:w="70"/>
-              <w:left w:type="dxa" w:w="110"/>
-              <w:bottom w:type="dxa" w:w="70"/>
-              <w:right w:type="dxa" w:w="110"/>
-            </w:tcMar>
-          </w:tcPr>
-          <w:p>
-            <w:pPr>
-              <w:spacing w:after="0" w:line="300"/>
-            </w:pPr>
-            <w:r>
-              <w:rPr>
-                <w:rFonts w:ascii="Yu Gothic" w:cs="Yu Gothic" w:eastAsia="Yu Gothic" w:hAnsi="Yu Gothic"/>
-              </w:rPr>
-              <w:t xml:space="preserve">文字サイズ</w:t>
-            </w:r>
-          </w:p>
-        </w:tc>
-        <w:tc>
-          <w:tcPr>
-            <w:tcW w:type="dxa" w:w="1500"/>
-            <w:tcBorders>
-              <w:top w:val="single" w:color="C9CEC0" w:sz="4"/>
-              <w:left w:val="single" w:color="C9CEC0" w:sz="4"/>
-              <w:bottom w:val="single" w:color="C9CEC0" w:sz="4"/>
-              <w:right w:val="single" w:color="C9CEC0" w:sz="4"/>
-            </w:tcBorders>
-            <w:tcMar>
-              <w:top w:type="dxa" w:w="70"/>
-              <w:left w:type="dxa" w:w="110"/>
-              <w:bottom w:type="dxa" w:w="70"/>
-              <w:right w:type="dxa" w:w="110"/>
-            </w:tcMar>
-          </w:tcPr>
-          <w:p>
-            <w:pPr>
-              <w:spacing w:after="0" w:line="300"/>
-            </w:pPr>
-            <w:r>
-              <w:rPr>
-                <w:rFonts w:ascii="Yu Gothic" w:cs="Yu Gothic" w:eastAsia="Yu Gothic" w:hAnsi="Yu Gothic"/>
-              </w:rPr>
-              <w:t xml:space="preserve">30 pt</w:t>
-            </w:r>
-          </w:p>
-        </w:tc>
-        <w:tc>
-          <w:tcPr>
-            <w:tcW w:type="dxa" w:w="5238"/>
-            <w:tcBorders>
-              <w:top w:val="single" w:color="C9CEC0" w:sz="4"/>
-              <w:left w:val="single" w:color="C9CEC0" w:sz="4"/>
-              <w:bottom w:val="single" w:color="C9CEC0" w:sz="4"/>
-              <w:right w:val="single" w:color="C9CEC0" w:sz="4"/>
-            </w:tcBorders>
-            <w:tcMar>
-              <w:top w:type="dxa" w:w="70"/>
-              <w:left w:type="dxa" w:w="110"/>
-              <w:bottom w:type="dxa" w:w="70"/>
-              <w:right w:type="dxa" w:w="110"/>
-            </w:tcMar>
-          </w:tcPr>
-          <w:p>
-            <w:pPr>
-              <w:spacing w:after="0" w:line="300"/>
-            </w:pPr>
-            <w:r>
-              <w:rPr>
-                <w:rFonts w:ascii="Yu Gothic" w:cs="Yu Gothic" w:eastAsia="Yu Gothic" w:hAnsi="Yu Gothic"/>
-              </w:rPr>
-              <w:t xml:space="preserve">全パネル共通の文字サイズ。パネルごとに上書きもできます（3.5）。</w:t>
-            </w:r>
-          </w:p>
-        </w:tc>
-      </w:tr>
-      <w:tr>
-        <w:tc>
-          <w:tcPr>
-            <w:tcW w:type="dxa" w:w="2900"/>
-            <w:tcBorders>
-              <w:top w:val="single" w:color="C9CEC0" w:sz="4"/>
-              <w:left w:val="single" w:color="C9CEC0" w:sz="4"/>
-              <w:bottom w:val="single" w:color="C9CEC0" w:sz="4"/>
-              <w:right w:val="single" w:color="C9CEC0" w:sz="4"/>
-            </w:tcBorders>
-            <w:tcMar>
-              <w:top w:type="dxa" w:w="70"/>
-              <w:left w:type="dxa" w:w="110"/>
-              <w:bottom w:type="dxa" w:w="70"/>
-              <w:right w:type="dxa" w:w="110"/>
-            </w:tcMar>
-          </w:tcPr>
-          <w:p>
-            <w:pPr>
-              <w:spacing w:after="0" w:line="300"/>
-            </w:pPr>
-            <w:r>
-              <w:rPr>
-                <w:rFonts w:ascii="Yu Gothic" w:cs="Yu Gothic" w:eastAsia="Yu Gothic" w:hAnsi="Yu Gothic"/>
-              </w:rPr>
-              <w:t xml:space="preserve">A4横に入るパネル数</w:t>
-            </w:r>
-          </w:p>
-        </w:tc>
-        <w:tc>
-          <w:tcPr>
-            <w:tcW w:type="dxa" w:w="1500"/>
-            <w:tcBorders>
-              <w:top w:val="single" w:color="C9CEC0" w:sz="4"/>
-              <w:left w:val="single" w:color="C9CEC0" w:sz="4"/>
-              <w:bottom w:val="single" w:color="C9CEC0" w:sz="4"/>
-              <w:right w:val="single" w:color="C9CEC0" w:sz="4"/>
-            </w:tcBorders>
-            <w:tcMar>
-              <w:top w:type="dxa" w:w="70"/>
-              <w:left w:type="dxa" w:w="110"/>
-              <w:bottom w:type="dxa" w:w="70"/>
-              <w:right w:type="dxa" w:w="110"/>
-            </w:tcMar>
-          </w:tcPr>
-          <w:p>
-            <w:pPr>
-              <w:spacing w:after="0" w:line="300"/>
-            </w:pPr>
-            <w:r>
-              <w:rPr>
-                <w:rFonts w:ascii="Yu Gothic" w:cs="Yu Gothic" w:eastAsia="Yu Gothic" w:hAnsi="Yu Gothic"/>
-              </w:rPr>
-              <w:t xml:space="preserve">自動表示</w:t>
-            </w:r>
-          </w:p>
-        </w:tc>
-        <w:tc>
-          <w:tcPr>
-            <w:tcW w:type="dxa" w:w="5238"/>
-            <w:tcBorders>
-              <w:top w:val="single" w:color="C9CEC0" w:sz="4"/>
-              <w:left w:val="single" w:color="C9CEC0" w:sz="4"/>
-              <w:bottom w:val="single" w:color="C9CEC0" w:sz="4"/>
-              <w:right w:val="single" w:color="C9CEC0" w:sz="4"/>
-            </w:tcBorders>
-            <w:tcMar>
-              <w:top w:type="dxa" w:w="70"/>
-              <w:left w:type="dxa" w:w="110"/>
-              <w:bottom w:type="dxa" w:w="70"/>
-              <w:right w:type="dxa" w:w="110"/>
-            </w:tcMar>
-          </w:tcPr>
-          <w:p>
-            <w:pPr>
-              <w:spacing w:after="0" w:line="300"/>
-            </w:pPr>
-            <w:r>
-              <w:rPr>
-                <w:rFonts w:ascii="Yu Gothic" w:cs="Yu Gothic" w:eastAsia="Yu Gothic" w:hAnsi="Yu Gothic"/>
-              </w:rPr>
-              <w:t xml:space="preserve">用紙幅と折り幅から自動計算されます（初期値では4パネル／枚）。</w:t>
-            </w:r>
-          </w:p>
-        </w:tc>
-      </w:tr>
-      <w:tr>
-        <w:tc>
-          <w:tcPr>
-            <w:tcW w:type="dxa" w:w="2900"/>
-            <w:tcBorders>
-              <w:top w:val="single" w:color="C9CEC0" w:sz="4"/>
-              <w:left w:val="single" w:color="C9CEC0" w:sz="4"/>
-              <w:bottom w:val="single" w:color="C9CEC0" w:sz="4"/>
-              <w:right w:val="single" w:color="C9CEC0" w:sz="4"/>
-            </w:tcBorders>
-            <w:tcMar>
-              <w:top w:type="dxa" w:w="70"/>
-              <w:left w:type="dxa" w:w="110"/>
-              <w:bottom w:type="dxa" w:w="70"/>
-              <w:right w:type="dxa" w:w="110"/>
-            </w:tcMar>
-          </w:tcPr>
-          <w:p>
-            <w:pPr>
-              <w:spacing w:after="0" w:line="300"/>
-            </w:pPr>
-            <w:r>
-              <w:rPr>
-                <w:rFonts w:ascii="Yu Gothic" w:cs="Yu Gothic" w:eastAsia="Yu Gothic" w:hAnsi="Yu Gothic"/>
-              </w:rPr>
-              <w:t xml:space="preserve">1パネル最大行数</w:t>
-            </w:r>
-          </w:p>
-        </w:tc>
-        <w:tc>
-          <w:tcPr>
-            <w:tcW w:type="dxa" w:w="1500"/>
-            <w:tcBorders>
-              <w:top w:val="single" w:color="C9CEC0" w:sz="4"/>
-              <w:left w:val="single" w:color="C9CEC0" w:sz="4"/>
-              <w:bottom w:val="single" w:color="C9CEC0" w:sz="4"/>
-              <w:right w:val="single" w:color="C9CEC0" w:sz="4"/>
-            </w:tcBorders>
-            <w:tcMar>
-              <w:top w:type="dxa" w:w="70"/>
-              <w:left w:type="dxa" w:w="110"/>
-              <w:bottom w:type="dxa" w:w="70"/>
-              <w:right w:type="dxa" w:w="110"/>
-            </w:tcMar>
-          </w:tcPr>
-          <w:p>
-            <w:pPr>
-              <w:spacing w:after="0" w:line="300"/>
-            </w:pPr>
-            <w:r>
-              <w:rPr>
-                <w:rFonts w:ascii="Yu Gothic" w:cs="Yu Gothic" w:eastAsia="Yu Gothic" w:hAnsi="Yu Gothic"/>
-              </w:rPr>
-              <w:t xml:space="preserve">3 行</w:t>
-            </w:r>
-          </w:p>
-        </w:tc>
-        <w:tc>
-          <w:tcPr>
-            <w:tcW w:type="dxa" w:w="5238"/>
-            <w:tcBorders>
-              <w:top w:val="single" w:color="C9CEC0" w:sz="4"/>
-              <w:left w:val="single" w:color="C9CEC0" w:sz="4"/>
-              <w:bottom w:val="single" w:color="C9CEC0" w:sz="4"/>
-              <w:right w:val="single" w:color="C9CEC0" w:sz="4"/>
-            </w:tcBorders>
-            <w:tcMar>
-              <w:top w:type="dxa" w:w="70"/>
-              <w:left w:type="dxa" w:w="110"/>
-              <w:bottom w:type="dxa" w:w="70"/>
-              <w:right w:type="dxa" w:w="110"/>
-            </w:tcMar>
-          </w:tcPr>
-          <w:p>
-            <w:pPr>
-              <w:spacing w:after="0" w:line="300"/>
-            </w:pPr>
-            <w:r>
-              <w:rPr>
-                <w:rFonts w:ascii="Yu Gothic" w:cs="Yu Gothic" w:eastAsia="Yu Gothic" w:hAnsi="Yu Gothic"/>
-              </w:rPr>
-              <w:t xml:space="preserve">1パネルの改行数（列数）の上限。超えると警告が出ます。</w:t>
-            </w:r>
-          </w:p>
-        </w:tc>
-      </w:tr>
-      <w:tr>
-        <w:tc>
-          <w:tcPr>
-            <w:tcW w:type="dxa" w:w="2900"/>
-            <w:tcBorders>
-              <w:top w:val="single" w:color="C9CEC0" w:sz="4"/>
-              <w:left w:val="single" w:color="C9CEC0" w:sz="4"/>
-              <w:bottom w:val="single" w:color="C9CEC0" w:sz="4"/>
-              <w:right w:val="single" w:color="C9CEC0" w:sz="4"/>
-            </w:tcBorders>
-            <w:tcMar>
-              <w:top w:type="dxa" w:w="70"/>
-              <w:left w:type="dxa" w:w="110"/>
-              <w:bottom w:type="dxa" w:w="70"/>
-              <w:right w:type="dxa" w:w="110"/>
-            </w:tcMar>
-          </w:tcPr>
-          <w:p>
-            <w:pPr>
-              <w:spacing w:after="0" w:line="300"/>
-            </w:pPr>
-            <w:r>
-              <w:rPr>
-                <w:rFonts w:ascii="Yu Gothic" w:cs="Yu Gothic" w:eastAsia="Yu Gothic" w:hAnsi="Yu Gothic"/>
-              </w:rPr>
-              <w:t xml:space="preserve">用紙の余白　上</w:t>
-            </w:r>
-          </w:p>
-        </w:tc>
-        <w:tc>
-          <w:tcPr>
-            <w:tcW w:type="dxa" w:w="1500"/>
-            <w:tcBorders>
-              <w:top w:val="single" w:color="C9CEC0" w:sz="4"/>
-              <w:left w:val="single" w:color="C9CEC0" w:sz="4"/>
-              <w:bottom w:val="single" w:color="C9CEC0" w:sz="4"/>
-              <w:right w:val="single" w:color="C9CEC0" w:sz="4"/>
-            </w:tcBorders>
-            <w:tcMar>
-              <w:top w:type="dxa" w:w="70"/>
-              <w:left w:type="dxa" w:w="110"/>
-              <w:bottom w:type="dxa" w:w="70"/>
-              <w:right w:type="dxa" w:w="110"/>
-            </w:tcMar>
-          </w:tcPr>
-          <w:p>
-            <w:pPr>
-              <w:spacing w:after="0" w:line="300"/>
-            </w:pPr>
-            <w:r>
-              <w:rPr>
-                <w:rFonts w:ascii="Yu Gothic" w:cs="Yu Gothic" w:eastAsia="Yu Gothic" w:hAnsi="Yu Gothic"/>
-              </w:rPr>
-              <w:t xml:space="preserve">0.5 cm</w:t>
-            </w:r>
-          </w:p>
-        </w:tc>
-        <w:tc>
-          <w:tcPr>
-            <w:tcW w:type="dxa" w:w="5238"/>
-            <w:tcBorders>
-              <w:top w:val="single" w:color="C9CEC0" w:sz="4"/>
-              <w:left w:val="single" w:color="C9CEC0" w:sz="4"/>
-              <w:bottom w:val="single" w:color="C9CEC0" w:sz="4"/>
-              <w:right w:val="single" w:color="C9CEC0" w:sz="4"/>
-            </w:tcBorders>
-            <w:tcMar>
-              <w:top w:type="dxa" w:w="70"/>
-              <w:left w:type="dxa" w:w="110"/>
-              <w:bottom w:type="dxa" w:w="70"/>
-              <w:right w:type="dxa" w:w="110"/>
-            </w:tcMar>
-          </w:tcPr>
-          <w:p>
-            <w:pPr>
-              <w:spacing w:after="0" w:line="300"/>
-            </w:pPr>
-            <w:r>
-              <w:rPr>
-                <w:rFonts w:ascii="Yu Gothic" w:cs="Yu Gothic" w:eastAsia="Yu Gothic" w:hAnsi="Yu Gothic"/>
-              </w:rPr>
-              <w:t xml:space="preserve">用紙の上側の余白。</w:t>
-            </w:r>
-          </w:p>
-        </w:tc>
-      </w:tr>
-      <w:tr>
-        <w:tc>
-          <w:tcPr>
-            <w:tcW w:type="dxa" w:w="2900"/>
-            <w:tcBorders>
-              <w:top w:val="single" w:color="C9CEC0" w:sz="4"/>
-              <w:left w:val="single" w:color="C9CEC0" w:sz="4"/>
-              <w:bottom w:val="single" w:color="C9CEC0" w:sz="4"/>
-              <w:right w:val="single" w:color="C9CEC0" w:sz="4"/>
-            </w:tcBorders>
-            <w:tcMar>
-              <w:top w:type="dxa" w:w="70"/>
-              <w:left w:type="dxa" w:w="110"/>
-              <w:bottom w:type="dxa" w:w="70"/>
-              <w:right w:type="dxa" w:w="110"/>
-            </w:tcMar>
-          </w:tcPr>
-          <w:p>
-            <w:pPr>
-              <w:spacing w:after="0" w:line="300"/>
-            </w:pPr>
-            <w:r>
-              <w:rPr>
-                <w:rFonts w:ascii="Yu Gothic" w:cs="Yu Gothic" w:eastAsia="Yu Gothic" w:hAnsi="Yu Gothic"/>
-              </w:rPr>
-              <w:t xml:space="preserve">用紙の余白　下・左・右</w:t>
-            </w:r>
-          </w:p>
-        </w:tc>
-        <w:tc>
-          <w:tcPr>
-            <w:tcW w:type="dxa" w:w="1500"/>
-            <w:tcBorders>
-              <w:top w:val="single" w:color="C9CEC0" w:sz="4"/>
-              <w:left w:val="single" w:color="C9CEC0" w:sz="4"/>
-              <w:bottom w:val="single" w:color="C9CEC0" w:sz="4"/>
-              <w:right w:val="single" w:color="C9CEC0" w:sz="4"/>
-            </w:tcBorders>
-            <w:tcMar>
-              <w:top w:type="dxa" w:w="70"/>
-              <w:left w:type="dxa" w:w="110"/>
-              <w:bottom w:type="dxa" w:w="70"/>
-              <w:right w:type="dxa" w:w="110"/>
-            </w:tcMar>
-          </w:tcPr>
-          <w:p>
-            <w:pPr>
-              <w:spacing w:after="0" w:line="300"/>
-            </w:pPr>
-            <w:r>
-              <w:rPr>
-                <w:rFonts w:ascii="Yu Gothic" w:cs="Yu Gothic" w:eastAsia="Yu Gothic" w:hAnsi="Yu Gothic"/>
-              </w:rPr>
-              <w:t xml:space="preserve">0 cm</w:t>
-            </w:r>
-          </w:p>
-        </w:tc>
-        <w:tc>
-          <w:tcPr>
-            <w:tcW w:type="dxa" w:w="5238"/>
-            <w:tcBorders>
-              <w:top w:val="single" w:color="C9CEC0" w:sz="4"/>
-              <w:left w:val="single" w:color="C9CEC0" w:sz="4"/>
-              <w:bottom w:val="single" w:color="C9CEC0" w:sz="4"/>
-              <w:right w:val="single" w:color="C9CEC0" w:sz="4"/>
-            </w:tcBorders>
-            <w:tcMar>
-              <w:top w:type="dxa" w:w="70"/>
-              <w:left w:type="dxa" w:w="110"/>
-              <w:bottom w:type="dxa" w:w="70"/>
-              <w:right w:type="dxa" w:w="110"/>
-            </w:tcMar>
-          </w:tcPr>
-          <w:p>
-            <w:pPr>
-              <w:spacing w:after="0" w:line="300"/>
-            </w:pPr>
-            <w:r>
-              <w:rPr>
-                <w:rFonts w:ascii="Yu Gothic" w:cs="Yu Gothic" w:eastAsia="Yu Gothic" w:hAnsi="Yu Gothic"/>
-              </w:rPr>
-              <w:t xml:space="preserve">左の余白を小さくした分は「のりしろ」に回ります。</w:t>
-            </w:r>
-          </w:p>
-        </w:tc>
-      </w:tr>
-    </w:tbl>
-    <w:p>
-      <w:pPr>
-        <w:spacing w:after="80"/>
-      </w:pPr>
-    </w:p>
-    <w:tbl>
-      <w:tblPr>
-        <w:tblW w:type="dxa" w:w="9638"/>
-        <w:tblBorders>
-          <w:top w:val="single" w:color="auto" w:sz="4"/>
-          <w:left w:val="single" w:color="auto" w:sz="4"/>
-          <w:bottom w:val="single" w:color="auto" w:sz="4"/>
-          <w:right w:val="single" w:color="auto" w:sz="4"/>
-          <w:insideH w:val="single" w:color="auto" w:sz="4"/>
-          <w:insideV w:val="single" w:color="auto" w:sz="4"/>
-        </w:tblBorders>
-      </w:tblPr>
-      <w:tblGrid>
-        <w:gridCol w:w="9638"/>
-      </w:tblGrid>
-      <w:tr>
-        <w:tc>
-          <w:tcPr>
-            <w:tcW w:type="dxa" w:w="9638"/>
-            <w:tcBorders>
-              <w:top w:val="none" w:color="FFFFFF" w:sz="0"/>
-              <w:left w:val="single" w:color="B26A00" w:sz="24"/>
-              <w:bottom w:val="none" w:color="FFFFFF" w:sz="0"/>
-              <w:right w:val="none" w:color="FFFFFF" w:sz="0"/>
-            </w:tcBorders>
-            <w:shd w:fill="FFF6E5" w:color="auto" w:val="clear"/>
-            <w:tcMar>
-              <w:top w:type="dxa" w:w="100"/>
-              <w:left w:type="dxa" w:w="180"/>
-              <w:bottom w:type="dxa" w:w="100"/>
-              <w:right w:type="dxa" w:w="140"/>
-            </w:tcMar>
-          </w:tcPr>
-          <w:p>
-            <w:pPr>
-              <w:spacing w:after="60" w:line="300"/>
-            </w:pPr>
-            <w:r>
-              <w:rPr>
-                <w:rFonts w:ascii="Yu Gothic" w:cs="Yu Gothic" w:eastAsia="Yu Gothic" w:hAnsi="Yu Gothic"/>
-                <w:b/>
-                <w:bCs/>
-                <w:color w:val="B26A00"/>
-              </w:rPr>
-              <w:t xml:space="preserve">注意　</w:t>
-            </w:r>
-            <w:r>
-              <w:rPr>
-                <w:rFonts w:ascii="Yu Gothic" w:cs="Yu Gothic" w:eastAsia="Yu Gothic" w:hAnsi="Yu Gothic"/>
-              </w:rPr>
-              <w:t xml:space="preserve">余白を0にすると、プリンターによっては用紙の端が印刷されないことがあります（多くの機種は3〜5mm程度が下限）。端が切れる場合は余白を広げてください。</w:t>
-            </w:r>
-          </w:p>
-          <w:p>
-            <w:pPr>
-              <w:spacing w:after="0" w:line="300"/>
-            </w:pPr>
-            <w:r>
-              <w:rPr>
-                <w:rFonts w:ascii="Yu Gothic" w:cs="Yu Gothic" w:eastAsia="Yu Gothic" w:hAnsi="Yu Gothic"/>
-              </w:rPr>
-              <w:t xml:space="preserve">用紙幅が折り幅で割り切れないとき、余った幅（初期値では2.5cm）が「のりしろ」として紙の左端に自動で確保されます。</w:t>
-            </w:r>
-          </w:p>
-        </w:tc>
-      </w:tr>
-    </w:tbl>
-    <w:p>
-      <w:pPr>
-        <w:spacing w:after="120"/>
-      </w:pPr>
-    </w:p>
-    <w:p>
-      <w:pPr>
-        <w:pStyle w:val="Heading2"/>
-      </w:pPr>
-      <w:r>
-        <w:rPr>
-          <w:rFonts w:ascii="Yu Gothic" w:cs="Yu Gothic" w:eastAsia="Yu Gothic" w:hAnsi="Yu Gothic"/>
-        </w:rPr>
-        <w:t xml:space="preserve">3.3 台本を一括入力する（蛇腹祝辞メーカー）</w:t>
+        <w:t xml:space="preserve">図2　表紙のタイトル・サブタイトルが自動で入った状態</w:t>
+      </w:r>
+    </w:p>
+    <w:p>
+      <w:pPr>
+        <w:pStyle w:val="ListParagraph"/>
+        <w:numPr>
+          <w:ilvl w:val="0"/>
+          <w:numId w:val="3"/>
+        </w:numPr>
+        <w:spacing w:after="80" w:line="320"/>
+      </w:pPr>
+      <w:r>
+        <w:rPr>
+          <w:rFonts w:ascii="Yu Gothic" w:cs="Yu Gothic" w:eastAsia="Yu Gothic" w:hAnsi="Yu Gothic"/>
+          <w:b/>
+          <w:bCs/>
+        </w:rPr>
+        <w:t xml:space="preserve">確認して印刷する：</w:t>
+      </w:r>
+      <w:r>
+        <w:rPr>
+          <w:rFonts w:ascii="Yu Gothic" w:cs="Yu Gothic" w:eastAsia="Yu Gothic" w:hAnsi="Yu Gothic"/>
+        </w:rPr>
+        <w:t xml:space="preserve">下のプレビューを見て、赤い枠（はみ出し）が無いか確認し、「印刷」を押します（印刷設定は4章）。</w:t>
       </w:r>
     </w:p>
     <w:p>
@@ -1817,9 +822,9 @@
       <w:r>
         <w:drawing>
           <wp:inline distT="0" distB="0" distL="0" distR="0">
-            <wp:extent cx="5334000" cy="1876425"/>
+            <wp:extent cx="5334000" cy="190500"/>
             <wp:effectExtent t="0" r="0" b="0" l="0"/>
-            <wp:docPr id="3" name="台本を一括入力する欄" descr="台本を一括入力する欄" title="台本を一括入力する欄"/>
+            <wp:docPr id="3" name="印刷ボタン" descr="印刷ボタン" title="印刷ボタン"/>
             <wp:cNvGraphicFramePr>
               <a:graphicFrameLocks xmlns:a="http://schemas.openxmlformats.org/drawingml/2006/main" noChangeAspect="1"/>
             </wp:cNvGraphicFramePr>
@@ -1842,7 +847,7 @@
                   <pic:spPr bwMode="auto">
                     <a:xfrm>
                       <a:off x="0" y="0"/>
-                      <a:ext cx="5334000" cy="1876425"/>
+                      <a:ext cx="5334000" cy="190500"/>
                     </a:xfrm>
                     <a:prstGeom prst="rect">
                       <a:avLst/>
@@ -1867,56 +872,419 @@
           <w:sz w:val="18"/>
           <w:szCs w:val="18"/>
         </w:rPr>
-        <w:t xml:space="preserve">図3　台本を一括入力する欄</w:t>
-      </w:r>
-    </w:p>
-    <w:p>
-      <w:pPr>
-        <w:pStyle w:val="ListParagraph"/>
-        <w:numPr>
-          <w:ilvl w:val="0"/>
-          <w:numId w:val="3"/>
-        </w:numPr>
-        <w:spacing w:after="80" w:line="320"/>
-      </w:pPr>
-      <w:r>
-        <w:rPr>
-          <w:rFonts w:ascii="Yu Gothic" w:cs="Yu Gothic" w:eastAsia="Yu Gothic" w:hAnsi="Yu Gothic"/>
-        </w:rPr>
-        <w:t xml:space="preserve">台本をそのまま貼り付けます。</w:t>
-      </w:r>
-    </w:p>
-    <w:p>
-      <w:pPr>
-        <w:pStyle w:val="ListParagraph"/>
-        <w:numPr>
-          <w:ilvl w:val="0"/>
-          <w:numId w:val="3"/>
-        </w:numPr>
-        <w:spacing w:after="80" w:line="320"/>
-      </w:pPr>
-      <w:r>
-        <w:rPr>
-          <w:rFonts w:ascii="Yu Gothic" w:cs="Yu Gothic" w:eastAsia="Yu Gothic" w:hAnsi="Yu Gothic"/>
-        </w:rPr>
-        <w:t xml:space="preserve">「パネルに反映」を押すと、現在のパネル幅・文字サイズに収まる文字数を目安に、「。」「、」や改行を優先して自動でパネルに区切られます。</w:t>
-      </w:r>
-    </w:p>
-    <w:p>
-      <w:pPr>
-        <w:pStyle w:val="ListParagraph"/>
-        <w:numPr>
-          <w:ilvl w:val="0"/>
-          <w:numId w:val="3"/>
-        </w:numPr>
-        <w:spacing w:after="80" w:line="320"/>
-      </w:pPr>
-      <w:r>
-        <w:rPr>
-          <w:rFonts w:ascii="Yu Gothic" w:cs="Yu Gothic" w:eastAsia="Yu Gothic" w:hAnsi="Yu Gothic"/>
-        </w:rPr>
-        <w:t xml:space="preserve">意図した位置で必ず区切りたいときは、その位置に空行を入れます（空行では必ず区切られます）。</w:t>
-      </w:r>
+        <w:t xml:space="preserve">図3　画面上部の「印刷」ボタン</w:t>
+      </w:r>
+    </w:p>
+    <w:p>
+      <w:pPr>
+        <w:spacing w:after="60"/>
+      </w:pPr>
+    </w:p>
+    <w:p>
+      <w:pPr>
+        <w:pStyle w:val="Heading2"/>
+      </w:pPr>
+      <w:r>
+        <w:rPr>
+          <w:rFonts w:ascii="Yu Gothic" w:cs="Yu Gothic" w:eastAsia="Yu Gothic" w:hAnsi="Yu Gothic"/>
+        </w:rPr>
+        <w:t xml:space="preserve">自動で入るもの／あとで確認するもの</w:t>
+      </w:r>
+    </w:p>
+    <w:tbl>
+      <w:tblPr>
+        <w:tblW w:type="dxa" w:w="9638"/>
+        <w:tblBorders>
+          <w:top w:val="single" w:color="auto" w:sz="4"/>
+          <w:left w:val="single" w:color="auto" w:sz="4"/>
+          <w:bottom w:val="single" w:color="auto" w:sz="4"/>
+          <w:right w:val="single" w:color="auto" w:sz="4"/>
+          <w:insideH w:val="single" w:color="auto" w:sz="4"/>
+          <w:insideV w:val="single" w:color="auto" w:sz="4"/>
+        </w:tblBorders>
+      </w:tblPr>
+      <w:tblGrid>
+        <w:gridCol w:w="4800"/>
+        <w:gridCol w:w="4838"/>
+      </w:tblGrid>
+      <w:tr>
+        <w:trPr>
+          <w:tblHeader/>
+        </w:trPr>
+        <w:tc>
+          <w:tcPr>
+            <w:tcW w:type="dxa" w:w="4800"/>
+            <w:tcBorders>
+              <w:top w:val="single" w:color="C9CEC0" w:sz="4"/>
+              <w:left w:val="single" w:color="C9CEC0" w:sz="4"/>
+              <w:bottom w:val="single" w:color="C9CEC0" w:sz="4"/>
+              <w:right w:val="single" w:color="C9CEC0" w:sz="4"/>
+            </w:tcBorders>
+            <w:shd w:fill="E6ECF3" w:color="auto" w:val="clear"/>
+            <w:tcMar>
+              <w:top w:type="dxa" w:w="70"/>
+              <w:left w:type="dxa" w:w="110"/>
+              <w:bottom w:type="dxa" w:w="70"/>
+              <w:right w:type="dxa" w:w="110"/>
+            </w:tcMar>
+          </w:tcPr>
+          <w:p>
+            <w:pPr>
+              <w:spacing w:after="0" w:line="300"/>
+            </w:pPr>
+            <w:r>
+              <w:rPr>
+                <w:rFonts w:ascii="Yu Gothic" w:cs="Yu Gothic" w:eastAsia="Yu Gothic" w:hAnsi="Yu Gothic"/>
+                <w:b/>
+                <w:bCs/>
+                <w:color w:val="2B4C6F"/>
+              </w:rPr>
+              <w:t xml:space="preserve">自動で入る</w:t>
+            </w:r>
+          </w:p>
+        </w:tc>
+        <w:tc>
+          <w:tcPr>
+            <w:tcW w:type="dxa" w:w="4838"/>
+            <w:tcBorders>
+              <w:top w:val="single" w:color="C9CEC0" w:sz="4"/>
+              <w:left w:val="single" w:color="C9CEC0" w:sz="4"/>
+              <w:bottom w:val="single" w:color="C9CEC0" w:sz="4"/>
+              <w:right w:val="single" w:color="C9CEC0" w:sz="4"/>
+            </w:tcBorders>
+            <w:shd w:fill="E6ECF3" w:color="auto" w:val="clear"/>
+            <w:tcMar>
+              <w:top w:type="dxa" w:w="70"/>
+              <w:left w:type="dxa" w:w="110"/>
+              <w:bottom w:type="dxa" w:w="70"/>
+              <w:right w:type="dxa" w:w="110"/>
+            </w:tcMar>
+          </w:tcPr>
+          <w:p>
+            <w:pPr>
+              <w:spacing w:after="0" w:line="300"/>
+            </w:pPr>
+            <w:r>
+              <w:rPr>
+                <w:rFonts w:ascii="Yu Gothic" w:cs="Yu Gothic" w:eastAsia="Yu Gothic" w:hAnsi="Yu Gothic"/>
+                <w:b/>
+                <w:bCs/>
+                <w:color w:val="2B4C6F"/>
+              </w:rPr>
+              <w:t xml:space="preserve">必要なら確認・調整</w:t>
+            </w:r>
+          </w:p>
+        </w:tc>
+      </w:tr>
+      <w:tr>
+        <w:tc>
+          <w:tcPr>
+            <w:tcW w:type="dxa" w:w="4800"/>
+            <w:tcBorders>
+              <w:top w:val="single" w:color="C9CEC0" w:sz="4"/>
+              <w:left w:val="single" w:color="C9CEC0" w:sz="4"/>
+              <w:bottom w:val="single" w:color="C9CEC0" w:sz="4"/>
+              <w:right w:val="single" w:color="C9CEC0" w:sz="4"/>
+            </w:tcBorders>
+            <w:tcMar>
+              <w:top w:type="dxa" w:w="70"/>
+              <w:left w:type="dxa" w:w="110"/>
+              <w:bottom w:type="dxa" w:w="70"/>
+              <w:right w:type="dxa" w:w="110"/>
+            </w:tcMar>
+          </w:tcPr>
+          <w:p>
+            <w:pPr>
+              <w:spacing w:after="0" w:line="300"/>
+            </w:pPr>
+            <w:r>
+              <w:rPr>
+                <w:rFonts w:ascii="Yu Gothic" w:cs="Yu Gothic" w:eastAsia="Yu Gothic" w:hAnsi="Yu Gothic"/>
+              </w:rPr>
+              <w:t xml:space="preserve">表紙のタイトル・サブタイトル（文字サイズも）</w:t>
+            </w:r>
+          </w:p>
+        </w:tc>
+        <w:tc>
+          <w:tcPr>
+            <w:tcW w:type="dxa" w:w="4838"/>
+            <w:tcBorders>
+              <w:top w:val="single" w:color="C9CEC0" w:sz="4"/>
+              <w:left w:val="single" w:color="C9CEC0" w:sz="4"/>
+              <w:bottom w:val="single" w:color="C9CEC0" w:sz="4"/>
+              <w:right w:val="single" w:color="C9CEC0" w:sz="4"/>
+            </w:tcBorders>
+            <w:tcMar>
+              <w:top w:type="dxa" w:w="70"/>
+              <w:left w:type="dxa" w:w="110"/>
+              <w:bottom w:type="dxa" w:w="70"/>
+              <w:right w:type="dxa" w:w="110"/>
+            </w:tcMar>
+          </w:tcPr>
+          <w:p>
+            <w:pPr>
+              <w:spacing w:after="0" w:line="300"/>
+            </w:pPr>
+            <w:r>
+              <w:rPr>
+                <w:rFonts w:ascii="Yu Gothic" w:cs="Yu Gothic" w:eastAsia="Yu Gothic" w:hAnsi="Yu Gothic"/>
+              </w:rPr>
+              <w:t xml:space="preserve">判定できなかったとき：パネル一覧の「表紙タイトルにする」「表紙サブタイトルにする」</w:t>
+            </w:r>
+          </w:p>
+        </w:tc>
+      </w:tr>
+      <w:tr>
+        <w:tc>
+          <w:tcPr>
+            <w:tcW w:type="dxa" w:w="4800"/>
+            <w:tcBorders>
+              <w:top w:val="single" w:color="C9CEC0" w:sz="4"/>
+              <w:left w:val="single" w:color="C9CEC0" w:sz="4"/>
+              <w:bottom w:val="single" w:color="C9CEC0" w:sz="4"/>
+              <w:right w:val="single" w:color="C9CEC0" w:sz="4"/>
+            </w:tcBorders>
+            <w:tcMar>
+              <w:top w:type="dxa" w:w="70"/>
+              <w:left w:type="dxa" w:w="110"/>
+              <w:bottom w:type="dxa" w:w="70"/>
+              <w:right w:type="dxa" w:w="110"/>
+            </w:tcMar>
+          </w:tcPr>
+          <w:p>
+            <w:pPr>
+              <w:spacing w:after="0" w:line="300"/>
+            </w:pPr>
+            <w:r>
+              <w:rPr>
+                <w:rFonts w:ascii="Yu Gothic" w:cs="Yu Gothic" w:eastAsia="Yu Gothic" w:hAnsi="Yu Gothic"/>
+              </w:rPr>
+              <w:t xml:space="preserve">本文のパネル分け（1パネル最大3行）</w:t>
+            </w:r>
+          </w:p>
+        </w:tc>
+        <w:tc>
+          <w:tcPr>
+            <w:tcW w:type="dxa" w:w="4838"/>
+            <w:tcBorders>
+              <w:top w:val="single" w:color="C9CEC0" w:sz="4"/>
+              <w:left w:val="single" w:color="C9CEC0" w:sz="4"/>
+              <w:bottom w:val="single" w:color="C9CEC0" w:sz="4"/>
+              <w:right w:val="single" w:color="C9CEC0" w:sz="4"/>
+            </w:tcBorders>
+            <w:tcMar>
+              <w:top w:type="dxa" w:w="70"/>
+              <w:left w:type="dxa" w:w="110"/>
+              <w:bottom w:type="dxa" w:w="70"/>
+              <w:right w:type="dxa" w:w="110"/>
+            </w:tcMar>
+          </w:tcPr>
+          <w:p>
+            <w:pPr>
+              <w:spacing w:after="0" w:line="300"/>
+            </w:pPr>
+            <w:r>
+              <w:rPr>
+                <w:rFonts w:ascii="Yu Gothic" w:cs="Yu Gothic" w:eastAsia="Yu Gothic" w:hAnsi="Yu Gothic"/>
+              </w:rPr>
+              <w:t xml:space="preserve">区切り位置を変えたいとき：「前／次のパネルへ移動」</w:t>
+            </w:r>
+          </w:p>
+        </w:tc>
+      </w:tr>
+      <w:tr>
+        <w:tc>
+          <w:tcPr>
+            <w:tcW w:type="dxa" w:w="4800"/>
+            <w:tcBorders>
+              <w:top w:val="single" w:color="C9CEC0" w:sz="4"/>
+              <w:left w:val="single" w:color="C9CEC0" w:sz="4"/>
+              <w:bottom w:val="single" w:color="C9CEC0" w:sz="4"/>
+              <w:right w:val="single" w:color="C9CEC0" w:sz="4"/>
+            </w:tcBorders>
+            <w:tcMar>
+              <w:top w:type="dxa" w:w="70"/>
+              <w:left w:type="dxa" w:w="110"/>
+              <w:bottom w:type="dxa" w:w="70"/>
+              <w:right w:type="dxa" w:w="110"/>
+            </w:tcMar>
+          </w:tcPr>
+          <w:p>
+            <w:pPr>
+              <w:spacing w:after="0" w:line="300"/>
+            </w:pPr>
+            <w:r>
+              <w:rPr>
+                <w:rFonts w:ascii="Yu Gothic" w:cs="Yu Gothic" w:eastAsia="Yu Gothic" w:hAnsi="Yu Gothic"/>
+              </w:rPr>
+              <w:t xml:space="preserve">ふりがな、段落の字下げ</w:t>
+            </w:r>
+          </w:p>
+        </w:tc>
+        <w:tc>
+          <w:tcPr>
+            <w:tcW w:type="dxa" w:w="4838"/>
+            <w:tcBorders>
+              <w:top w:val="single" w:color="C9CEC0" w:sz="4"/>
+              <w:left w:val="single" w:color="C9CEC0" w:sz="4"/>
+              <w:bottom w:val="single" w:color="C9CEC0" w:sz="4"/>
+              <w:right w:val="single" w:color="C9CEC0" w:sz="4"/>
+            </w:tcBorders>
+            <w:tcMar>
+              <w:top w:type="dxa" w:w="70"/>
+              <w:left w:type="dxa" w:w="110"/>
+              <w:bottom w:type="dxa" w:w="70"/>
+              <w:right w:type="dxa" w:w="110"/>
+            </w:tcMar>
+          </w:tcPr>
+          <w:p>
+            <w:pPr>
+              <w:spacing w:after="0" w:line="300"/>
+            </w:pPr>
+            <w:r>
+              <w:rPr>
+                <w:rFonts w:ascii="Yu Gothic" w:cs="Yu Gothic" w:eastAsia="Yu Gothic" w:hAnsi="Yu Gothic"/>
+              </w:rPr>
+              <w:t xml:space="preserve">ふりがなの追加・修正（3.6）</w:t>
+            </w:r>
+          </w:p>
+        </w:tc>
+      </w:tr>
+      <w:tr>
+        <w:tc>
+          <w:tcPr>
+            <w:tcW w:type="dxa" w:w="4800"/>
+            <w:tcBorders>
+              <w:top w:val="single" w:color="C9CEC0" w:sz="4"/>
+              <w:left w:val="single" w:color="C9CEC0" w:sz="4"/>
+              <w:bottom w:val="single" w:color="C9CEC0" w:sz="4"/>
+              <w:right w:val="single" w:color="C9CEC0" w:sz="4"/>
+            </w:tcBorders>
+            <w:tcMar>
+              <w:top w:type="dxa" w:w="70"/>
+              <w:left w:type="dxa" w:w="110"/>
+              <w:bottom w:type="dxa" w:w="70"/>
+              <w:right w:type="dxa" w:w="110"/>
+            </w:tcMar>
+          </w:tcPr>
+          <w:p>
+            <w:pPr>
+              <w:spacing w:after="0" w:line="300"/>
+            </w:pPr>
+            <w:r>
+              <w:rPr>
+                <w:rFonts w:ascii="Yu Gothic" w:cs="Yu Gothic" w:eastAsia="Yu Gothic" w:hAnsi="Yu Gothic"/>
+              </w:rPr>
+              <w:t xml:space="preserve">折り線・山谷ラベル・のりしろ</w:t>
+            </w:r>
+          </w:p>
+        </w:tc>
+        <w:tc>
+          <w:tcPr>
+            <w:tcW w:type="dxa" w:w="4838"/>
+            <w:tcBorders>
+              <w:top w:val="single" w:color="C9CEC0" w:sz="4"/>
+              <w:left w:val="single" w:color="C9CEC0" w:sz="4"/>
+              <w:bottom w:val="single" w:color="C9CEC0" w:sz="4"/>
+              <w:right w:val="single" w:color="C9CEC0" w:sz="4"/>
+            </w:tcBorders>
+            <w:tcMar>
+              <w:top w:type="dxa" w:w="70"/>
+              <w:left w:type="dxa" w:w="110"/>
+              <w:bottom w:type="dxa" w:w="70"/>
+              <w:right w:type="dxa" w:w="110"/>
+            </w:tcMar>
+          </w:tcPr>
+          <w:p>
+            <w:pPr>
+              <w:spacing w:after="0" w:line="300"/>
+            </w:pPr>
+            <w:r>
+              <w:rPr>
+                <w:rFonts w:ascii="Yu Gothic" w:cs="Yu Gothic" w:eastAsia="Yu Gothic" w:hAnsi="Yu Gothic"/>
+              </w:rPr>
+              <w:t xml:space="preserve">署名の位置：最後のパネルの「スペース自動調整」（3.8）</w:t>
+            </w:r>
+          </w:p>
+        </w:tc>
+      </w:tr>
+    </w:tbl>
+    <w:p>
+      <w:pPr>
+        <w:spacing w:after="80"/>
+      </w:pPr>
+    </w:p>
+    <w:tbl>
+      <w:tblPr>
+        <w:tblW w:type="dxa" w:w="9638"/>
+        <w:tblBorders>
+          <w:top w:val="single" w:color="auto" w:sz="4"/>
+          <w:left w:val="single" w:color="auto" w:sz="4"/>
+          <w:bottom w:val="single" w:color="auto" w:sz="4"/>
+          <w:right w:val="single" w:color="auto" w:sz="4"/>
+          <w:insideH w:val="single" w:color="auto" w:sz="4"/>
+          <w:insideV w:val="single" w:color="auto" w:sz="4"/>
+        </w:tblBorders>
+      </w:tblPr>
+      <w:tblGrid>
+        <w:gridCol w:w="9638"/>
+      </w:tblGrid>
+      <w:tr>
+        <w:tc>
+          <w:tcPr>
+            <w:tcW w:type="dxa" w:w="9638"/>
+            <w:tcBorders>
+              <w:top w:val="none" w:color="FFFFFF" w:sz="0"/>
+              <w:left w:val="single" w:color="2B4C6F" w:sz="24"/>
+              <w:bottom w:val="none" w:color="FFFFFF" w:sz="0"/>
+              <w:right w:val="none" w:color="FFFFFF" w:sz="0"/>
+            </w:tcBorders>
+            <w:shd w:fill="E8F1FA" w:color="auto" w:val="clear"/>
+            <w:tcMar>
+              <w:top w:type="dxa" w:w="100"/>
+              <w:left w:type="dxa" w:w="180"/>
+              <w:bottom w:type="dxa" w:w="100"/>
+              <w:right w:type="dxa" w:w="140"/>
+            </w:tcMar>
+          </w:tcPr>
+          <w:p>
+            <w:pPr>
+              <w:spacing w:after="60" w:line="300"/>
+            </w:pPr>
+            <w:r>
+              <w:rPr>
+                <w:rFonts w:ascii="Yu Gothic" w:cs="Yu Gothic" w:eastAsia="Yu Gothic" w:hAnsi="Yu Gothic"/>
+                <w:b/>
+                <w:bCs/>
+                <w:color w:val="2B4C6F"/>
+              </w:rPr>
+              <w:t xml:space="preserve">メモ　</w:t>
+            </w:r>
+            <w:r>
+              <w:rPr>
+                <w:rFonts w:ascii="Yu Gothic" w:cs="Yu Gothic" w:eastAsia="Yu Gothic" w:hAnsi="Yu Gothic"/>
+              </w:rPr>
+              <w:t xml:space="preserve">テキストボックスが無く、本文の行だけのWordファイルでも読み込めます。その場合は「。」「、」の位置を見て、自然な区切りでパネルに分けます（表紙は空のままなので、必要なら上の手動ボタンで指定します）。</w:t>
+            </w:r>
+          </w:p>
+          <w:p>
+            <w:pPr>
+              <w:spacing w:after="0" w:line="300"/>
+            </w:pPr>
+            <w:r>
+              <w:rPr>
+                <w:rFonts w:ascii="Yu Gothic" w:cs="Yu Gothic" w:eastAsia="Yu Gothic" w:hAnsi="Yu Gothic"/>
+              </w:rPr>
+              <w:t xml:space="preserve">Wordファイルが無いときは「蛇腹祝辞メーカー」を使い、台本を貼り付けて「パネルに反映」を押します（3.3）。</w:t>
+            </w:r>
+          </w:p>
+        </w:tc>
+      </w:tr>
+    </w:tbl>
+    <w:p>
+      <w:pPr>
+        <w:spacing w:after="120"/>
+      </w:pPr>
     </w:p>
     <w:p>
       <w:pPr>
@@ -1926,13 +1294,24 @@
         <w:rPr>
           <w:rFonts w:ascii="Yu Gothic" w:cs="Yu Gothic" w:eastAsia="Yu Gothic" w:hAnsi="Yu Gothic"/>
         </w:rPr>
-        <w:t xml:space="preserve">すでにパネルがある状態で押すと、ボタンが「もう一度押すと置き換えます」に変わります。今のパネル一覧を上書きしてよければ、もう一度押してください（数秒で元に戻ります）。</w:t>
-      </w:r>
-    </w:p>
-    <w:p>
-      <w:pPr>
-        <w:spacing w:after="60"/>
-      </w:pPr>
+        <w:t xml:space="preserve">以降の章は、各部分の詳しい説明です。うまくいかないときや細かく調整したいときに見てください。</w:t>
+      </w:r>
+    </w:p>
+    <w:p>
+      <w:r>
+        <w:br w:type="page"/>
+      </w:r>
+    </w:p>
+    <w:p>
+      <w:pPr>
+        <w:pStyle w:val="Heading1"/>
+      </w:pPr>
+      <w:r>
+        <w:rPr>
+          <w:rFonts w:ascii="Yu Gothic" w:cs="Yu Gothic" w:eastAsia="Yu Gothic" w:hAnsi="Yu Gothic"/>
+        </w:rPr>
+        <w:t xml:space="preserve">3. 画面の説明と操作</w:t>
+      </w:r>
     </w:p>
     <w:p>
       <w:pPr>
@@ -1942,7 +1321,7 @@
         <w:rPr>
           <w:rFonts w:ascii="Yu Gothic" w:cs="Yu Gothic" w:eastAsia="Yu Gothic" w:hAnsi="Yu Gothic"/>
         </w:rPr>
-        <w:t xml:space="preserve">3.4 Wordファイルを読み込む（Word読み込み版）</w:t>
+        <w:t xml:space="preserve">3.1 表紙（1枚目 右端パネル）</w:t>
       </w:r>
     </w:p>
     <w:p>
@@ -1953,9 +1332,9 @@
       <w:r>
         <w:drawing>
           <wp:inline distT="0" distB="0" distL="0" distR="0">
-            <wp:extent cx="5334000" cy="1171575"/>
+            <wp:extent cx="5334000" cy="2476500"/>
             <wp:effectExtent t="0" r="0" b="0" l="0"/>
-            <wp:docPr id="4" name="Wordファイルを読み込む欄" descr="Wordファイルを読み込む欄" title="Wordファイルを読み込む欄"/>
+            <wp:docPr id="4" name="表紙の設定欄" descr="表紙の設定欄" title="表紙の設定欄"/>
             <wp:cNvGraphicFramePr>
               <a:graphicFrameLocks xmlns:a="http://schemas.openxmlformats.org/drawingml/2006/main" noChangeAspect="1"/>
             </wp:cNvGraphicFramePr>
@@ -1978,7 +1357,7 @@
                   <pic:spPr bwMode="auto">
                     <a:xfrm>
                       <a:off x="0" y="0"/>
-                      <a:ext cx="5334000" cy="1171575"/>
+                      <a:ext cx="5334000" cy="2476500"/>
                     </a:xfrm>
                     <a:prstGeom prst="rect">
                       <a:avLst/>
@@ -2003,52 +1382,7 @@
           <w:sz w:val="18"/>
           <w:szCs w:val="18"/>
         </w:rPr>
-        <w:t xml:space="preserve">図4　Wordファイルを読み込む欄</w:t>
-      </w:r>
-    </w:p>
-    <w:p>
-      <w:pPr>
-        <w:pStyle w:val="ListParagraph"/>
-        <w:numPr>
-          <w:ilvl w:val="0"/>
-          <w:numId w:val="3"/>
-        </w:numPr>
-        <w:spacing w:after="80" w:line="320"/>
-      </w:pPr>
-      <w:r>
-        <w:rPr>
-          <w:rFonts w:ascii="Yu Gothic" w:cs="Yu Gothic" w:eastAsia="Yu Gothic" w:hAnsi="Yu Gothic"/>
-        </w:rPr>
-        <w:t xml:space="preserve">「ファイルを選択」で Wordファイル（.docx、または旧形式の .doc）を選びます。</w:t>
-      </w:r>
-    </w:p>
-    <w:p>
-      <w:pPr>
-        <w:pStyle w:val="ListParagraph"/>
-        <w:numPr>
-          <w:ilvl w:val="0"/>
-          <w:numId w:val="3"/>
-        </w:numPr>
-        <w:spacing w:after="80" w:line="320"/>
-      </w:pPr>
-      <w:r>
-        <w:rPr>
-          <w:rFonts w:ascii="Yu Gothic" w:cs="Yu Gothic" w:eastAsia="Yu Gothic" w:hAnsi="Yu Gothic"/>
-        </w:rPr>
-        <w:t xml:space="preserve">「パネルに反映」を押すと、パネルの一覧が読み込んだ内容に置き換わります。</w:t>
-      </w:r>
-    </w:p>
-    <w:p>
-      <w:pPr>
-        <w:spacing w:after="60" w:before="80"/>
-      </w:pPr>
-      <w:r>
-        <w:rPr>
-          <w:rFonts w:ascii="Yu Gothic" w:cs="Yu Gothic" w:eastAsia="Yu Gothic" w:hAnsi="Yu Gothic"/>
-          <w:b/>
-          <w:bCs/>
-        </w:rPr>
-        <w:t xml:space="preserve">読み込みのルール</w:t>
+        <w:t xml:space="preserve">図1　表紙の設定欄</w:t>
       </w:r>
     </w:p>
     <w:p>
@@ -2063,8 +1397,16 @@
       <w:r>
         <w:rPr>
           <w:rFonts w:ascii="Yu Gothic" w:cs="Yu Gothic" w:eastAsia="Yu Gothic" w:hAnsi="Yu Gothic"/>
-        </w:rPr>
-        <w:t xml:space="preserve">Wordのテキストボックス1つが、1つのパネルになります。</w:t>
+          <w:b/>
+          <w:bCs/>
+        </w:rPr>
+        <w:t xml:space="preserve">表紙チェック：</w:t>
+      </w:r>
+      <w:r>
+        <w:rPr>
+          <w:rFonts w:ascii="Yu Gothic" w:cs="Yu Gothic" w:eastAsia="Yu Gothic" w:hAnsi="Yu Gothic"/>
+        </w:rPr>
+        <w:t xml:space="preserve">オンにすると、1枚目の右端にタイトル・サブタイトルの表紙パネルが付きます。</w:t>
       </w:r>
     </w:p>
     <w:p>
@@ -2079,8 +1421,16 @@
       <w:r>
         <w:rPr>
           <w:rFonts w:ascii="Yu Gothic" w:cs="Yu Gothic" w:eastAsia="Yu Gothic" w:hAnsi="Yu Gothic"/>
-        </w:rPr>
-        <w:t xml:space="preserve">テキストボックスが無く、本文の行だけのファイルは、1パネルの最大行数に収まるように、文末（「。」）や段落の頭で区切って自動でパネルに分けます（4行なら2行＋2行のように、できるだけ均等に分けます）。「大宝(だいほう)」のように、漢字の直後にひらがなをかっこで入れた書き方は、ふりがなとして読み込みます。</w:t>
+          <w:b/>
+          <w:bCs/>
+        </w:rPr>
+        <w:t xml:space="preserve">タイトル（大）／サブタイトル（小）：</w:t>
+      </w:r>
+      <w:r>
+        <w:rPr>
+          <w:rFonts w:ascii="Yu Gothic" w:cs="Yu Gothic" w:eastAsia="Yu Gothic" w:hAnsi="Yu Gothic"/>
+        </w:rPr>
+        <w:t xml:space="preserve">式典名、日付・会場などを入力します。改行するとその位置で次の列になります。</w:t>
       </w:r>
     </w:p>
     <w:p>
@@ -2095,8 +1445,16 @@
       <w:r>
         <w:rPr>
           <w:rFonts w:ascii="Yu Gothic" w:cs="Yu Gothic" w:eastAsia="Yu Gothic" w:hAnsi="Yu Gothic"/>
-        </w:rPr>
-        <w:t xml:space="preserve">文字サイズが明らかに大きいものは表紙タイトル、日付や会場らしい文言（「○年○月」「開式」「会館」など）を含むものは表紙サブタイトルとして自動判定し、表紙欄に振り分けます。本文パネルとは重複しません。判定できないときは通常のパネルとして読み込みます。</w:t>
+          <w:b/>
+          <w:bCs/>
+        </w:rPr>
+        <w:t xml:space="preserve">表紙パネルの幅：</w:t>
+      </w:r>
+      <w:r>
+        <w:rPr>
+          <w:rFonts w:ascii="Yu Gothic" w:cs="Yu Gothic" w:eastAsia="Yu Gothic" w:hAnsi="Yu Gothic"/>
+        </w:rPr>
+        <w:t xml:space="preserve">折り幅の何個分か（初期値は1個分）。常に折り幅の整数倍になり、内部にも折り線が入ります。</w:t>
       </w:r>
     </w:p>
     <w:p>
@@ -2111,8 +1469,16 @@
       <w:r>
         <w:rPr>
           <w:rFonts w:ascii="Yu Gothic" w:cs="Yu Gothic" w:eastAsia="Yu Gothic" w:hAnsi="Yu Gothic"/>
-        </w:rPr>
-        <w:t xml:space="preserve">Wordのふりがな（ルビ）は「文字[よみ]」の形式に変換されます。</w:t>
+          <w:b/>
+          <w:bCs/>
+        </w:rPr>
+        <w:t xml:space="preserve">文字サイズ：</w:t>
+      </w:r>
+      <w:r>
+        <w:rPr>
+          <w:rFonts w:ascii="Yu Gothic" w:cs="Yu Gothic" w:eastAsia="Yu Gothic" w:hAnsi="Yu Gothic"/>
+        </w:rPr>
+        <w:t xml:space="preserve">タイトル初期値24pt、サブタイトル初期値18pt。</w:t>
       </w:r>
     </w:p>
     <w:p>
@@ -2127,8 +1493,16 @@
       <w:r>
         <w:rPr>
           <w:rFonts w:ascii="Yu Gothic" w:cs="Yu Gothic" w:eastAsia="Yu Gothic" w:hAnsi="Yu Gothic"/>
-        </w:rPr>
-        <w:t xml:space="preserve">段落の字下げ（先頭行のインデント）は、全角スペースとして再現されます。</w:t>
+          <w:b/>
+          <w:bCs/>
+        </w:rPr>
+        <w:t xml:space="preserve">スペース自動調整（サブタイトル）：</w:t>
+      </w:r>
+      <w:r>
+        <w:rPr>
+          <w:rFonts w:ascii="Yu Gothic" w:cs="Yu Gothic" w:eastAsia="Yu Gothic" w:hAnsi="Yu Gothic"/>
+        </w:rPr>
+        <w:t xml:space="preserve">1行目（日付）の先頭に全角5文字分、2行目（会場）の先頭に全角10文字分の空白を入れます。すでに先頭にある空白は置き換わります。</w:t>
       </w:r>
     </w:p>
     <w:p>
@@ -2143,40 +1517,16 @@
       <w:r>
         <w:rPr>
           <w:rFonts w:ascii="Yu Gothic" w:cs="Yu Gothic" w:eastAsia="Yu Gothic" w:hAnsi="Yu Gothic"/>
-        </w:rPr>
-        <w:t xml:space="preserve">文字サイズで見分けられないファイルでも、「開式」「午前」「会館」などの文言があれば、サブタイトルとその直前のタイトルを文言から判定します。</w:t>
-      </w:r>
-    </w:p>
-    <w:p>
-      <w:pPr>
-        <w:pStyle w:val="ListParagraph"/>
-        <w:numPr>
-          <w:ilvl w:val="0"/>
-          <w:numId w:val="2"/>
-        </w:numPr>
-        <w:spacing w:after="60" w:line="320"/>
-      </w:pPr>
-      <w:r>
-        <w:rPr>
-          <w:rFonts w:ascii="Yu Gothic" w:cs="Yu Gothic" w:eastAsia="Yu Gothic" w:hAnsi="Yu Gothic"/>
-        </w:rPr>
-        <w:t xml:space="preserve">自動判定できなかったときは、反映後にパネル一覧の「表紙タイトルにする」「表紙サブタイトルにする」ボタンで手動で指定できます（そのパネルの文言が表紙欄に移り、パネルは一覧から消えます）。</w:t>
-      </w:r>
-    </w:p>
-    <w:p>
-      <w:pPr>
-        <w:pStyle w:val="ListParagraph"/>
-        <w:numPr>
-          <w:ilvl w:val="0"/>
-          <w:numId w:val="2"/>
-        </w:numPr>
-        <w:spacing w:after="60" w:line="320"/>
-      </w:pPr>
-      <w:r>
-        <w:rPr>
-          <w:rFonts w:ascii="Yu Gothic" w:cs="Yu Gothic" w:eastAsia="Yu Gothic" w:hAnsi="Yu Gothic"/>
-        </w:rPr>
-        <w:t xml:space="preserve">テキストボックスの順番はファイル内部の順序です。実際の読み順と違うときは、パネルごとの「▲」「▼」ボタンで並べ替えます。</w:t>
+          <w:b/>
+          <w:bCs/>
+        </w:rPr>
+        <w:t xml:space="preserve">文言を消す：</w:t>
+      </w:r>
+      <w:r>
+        <w:rPr>
+          <w:rFonts w:ascii="Yu Gothic" w:cs="Yu Gothic" w:eastAsia="Yu Gothic" w:hAnsi="Yu Gothic"/>
+        </w:rPr>
+        <w:t xml:space="preserve">その欄の文言を全て消します。</w:t>
       </w:r>
     </w:p>
     <w:p>
@@ -2192,7 +1542,7 @@
         <w:rPr>
           <w:rFonts w:ascii="Yu Gothic" w:cs="Yu Gothic" w:eastAsia="Yu Gothic" w:hAnsi="Yu Gothic"/>
         </w:rPr>
-        <w:t xml:space="preserve">3.5 パネルごとの文言</w:t>
+        <w:t xml:space="preserve">3.2 用紙・パネルの設定</w:t>
       </w:r>
     </w:p>
     <w:p>
@@ -2203,9 +1553,9 @@
       <w:r>
         <w:drawing>
           <wp:inline distT="0" distB="0" distL="0" distR="0">
-            <wp:extent cx="5334000" cy="4695825"/>
+            <wp:extent cx="5334000" cy="1571625"/>
             <wp:effectExtent t="0" r="0" b="0" l="0"/>
-            <wp:docPr id="5" name="パネルごとの文言の欄" descr="パネルごとの文言の欄" title="パネルごとの文言の欄"/>
+            <wp:docPr id="5" name="用紙・パネルの設定欄" descr="用紙・パネルの設定欄" title="用紙・パネルの設定欄"/>
             <wp:cNvGraphicFramePr>
               <a:graphicFrameLocks xmlns:a="http://schemas.openxmlformats.org/drawingml/2006/main" noChangeAspect="1"/>
             </wp:cNvGraphicFramePr>
@@ -2228,6 +1578,1176 @@
                   <pic:spPr bwMode="auto">
                     <a:xfrm>
                       <a:off x="0" y="0"/>
+                      <a:ext cx="5334000" cy="1571625"/>
+                    </a:xfrm>
+                    <a:prstGeom prst="rect">
+                      <a:avLst/>
+                    </a:prstGeom>
+                  </pic:spPr>
+                </pic:pic>
+              </a:graphicData>
+            </a:graphic>
+          </wp:inline>
+        </w:drawing>
+      </w:r>
+    </w:p>
+    <w:p>
+      <w:pPr>
+        <w:spacing w:after="160"/>
+        <w:jc w:val="center"/>
+      </w:pPr>
+      <w:r>
+        <w:rPr>
+          <w:rFonts w:ascii="Yu Gothic" w:cs="Yu Gothic" w:eastAsia="Yu Gothic" w:hAnsi="Yu Gothic"/>
+          <w:color w:val="5B6B7A"/>
+          <w:sz w:val="18"/>
+          <w:szCs w:val="18"/>
+        </w:rPr>
+        <w:t xml:space="preserve">図2　用紙・パネルの設定欄</w:t>
+      </w:r>
+    </w:p>
+    <w:tbl>
+      <w:tblPr>
+        <w:tblW w:type="dxa" w:w="9638"/>
+        <w:tblBorders>
+          <w:top w:val="single" w:color="auto" w:sz="4"/>
+          <w:left w:val="single" w:color="auto" w:sz="4"/>
+          <w:bottom w:val="single" w:color="auto" w:sz="4"/>
+          <w:right w:val="single" w:color="auto" w:sz="4"/>
+          <w:insideH w:val="single" w:color="auto" w:sz="4"/>
+          <w:insideV w:val="single" w:color="auto" w:sz="4"/>
+        </w:tblBorders>
+      </w:tblPr>
+      <w:tblGrid>
+        <w:gridCol w:w="2900"/>
+        <w:gridCol w:w="1500"/>
+        <w:gridCol w:w="5238"/>
+      </w:tblGrid>
+      <w:tr>
+        <w:trPr>
+          <w:tblHeader/>
+        </w:trPr>
+        <w:tc>
+          <w:tcPr>
+            <w:tcW w:type="dxa" w:w="2900"/>
+            <w:tcBorders>
+              <w:top w:val="single" w:color="C9CEC0" w:sz="4"/>
+              <w:left w:val="single" w:color="C9CEC0" w:sz="4"/>
+              <w:bottom w:val="single" w:color="C9CEC0" w:sz="4"/>
+              <w:right w:val="single" w:color="C9CEC0" w:sz="4"/>
+            </w:tcBorders>
+            <w:shd w:fill="E6ECF3" w:color="auto" w:val="clear"/>
+            <w:tcMar>
+              <w:top w:type="dxa" w:w="70"/>
+              <w:left w:type="dxa" w:w="110"/>
+              <w:bottom w:type="dxa" w:w="70"/>
+              <w:right w:type="dxa" w:w="110"/>
+            </w:tcMar>
+          </w:tcPr>
+          <w:p>
+            <w:pPr>
+              <w:spacing w:after="0" w:line="300"/>
+            </w:pPr>
+            <w:r>
+              <w:rPr>
+                <w:rFonts w:ascii="Yu Gothic" w:cs="Yu Gothic" w:eastAsia="Yu Gothic" w:hAnsi="Yu Gothic"/>
+                <w:b/>
+                <w:bCs/>
+                <w:color w:val="2B4C6F"/>
+              </w:rPr>
+              <w:t xml:space="preserve">項目</w:t>
+            </w:r>
+          </w:p>
+        </w:tc>
+        <w:tc>
+          <w:tcPr>
+            <w:tcW w:type="dxa" w:w="1500"/>
+            <w:tcBorders>
+              <w:top w:val="single" w:color="C9CEC0" w:sz="4"/>
+              <w:left w:val="single" w:color="C9CEC0" w:sz="4"/>
+              <w:bottom w:val="single" w:color="C9CEC0" w:sz="4"/>
+              <w:right w:val="single" w:color="C9CEC0" w:sz="4"/>
+            </w:tcBorders>
+            <w:shd w:fill="E6ECF3" w:color="auto" w:val="clear"/>
+            <w:tcMar>
+              <w:top w:type="dxa" w:w="70"/>
+              <w:left w:type="dxa" w:w="110"/>
+              <w:bottom w:type="dxa" w:w="70"/>
+              <w:right w:type="dxa" w:w="110"/>
+            </w:tcMar>
+          </w:tcPr>
+          <w:p>
+            <w:pPr>
+              <w:spacing w:after="0" w:line="300"/>
+            </w:pPr>
+            <w:r>
+              <w:rPr>
+                <w:rFonts w:ascii="Yu Gothic" w:cs="Yu Gothic" w:eastAsia="Yu Gothic" w:hAnsi="Yu Gothic"/>
+                <w:b/>
+                <w:bCs/>
+                <w:color w:val="2B4C6F"/>
+              </w:rPr>
+              <w:t xml:space="preserve">初期値</w:t>
+            </w:r>
+          </w:p>
+        </w:tc>
+        <w:tc>
+          <w:tcPr>
+            <w:tcW w:type="dxa" w:w="5238"/>
+            <w:tcBorders>
+              <w:top w:val="single" w:color="C9CEC0" w:sz="4"/>
+              <w:left w:val="single" w:color="C9CEC0" w:sz="4"/>
+              <w:bottom w:val="single" w:color="C9CEC0" w:sz="4"/>
+              <w:right w:val="single" w:color="C9CEC0" w:sz="4"/>
+            </w:tcBorders>
+            <w:shd w:fill="E6ECF3" w:color="auto" w:val="clear"/>
+            <w:tcMar>
+              <w:top w:type="dxa" w:w="70"/>
+              <w:left w:type="dxa" w:w="110"/>
+              <w:bottom w:type="dxa" w:w="70"/>
+              <w:right w:type="dxa" w:w="110"/>
+            </w:tcMar>
+          </w:tcPr>
+          <w:p>
+            <w:pPr>
+              <w:spacing w:after="0" w:line="300"/>
+            </w:pPr>
+            <w:r>
+              <w:rPr>
+                <w:rFonts w:ascii="Yu Gothic" w:cs="Yu Gothic" w:eastAsia="Yu Gothic" w:hAnsi="Yu Gothic"/>
+                <w:b/>
+                <w:bCs/>
+                <w:color w:val="2B4C6F"/>
+              </w:rPr>
+              <w:t xml:space="preserve">説明</w:t>
+            </w:r>
+          </w:p>
+        </w:tc>
+      </w:tr>
+      <w:tr>
+        <w:tc>
+          <w:tcPr>
+            <w:tcW w:type="dxa" w:w="2900"/>
+            <w:tcBorders>
+              <w:top w:val="single" w:color="C9CEC0" w:sz="4"/>
+              <w:left w:val="single" w:color="C9CEC0" w:sz="4"/>
+              <w:bottom w:val="single" w:color="C9CEC0" w:sz="4"/>
+              <w:right w:val="single" w:color="C9CEC0" w:sz="4"/>
+            </w:tcBorders>
+            <w:tcMar>
+              <w:top w:type="dxa" w:w="70"/>
+              <w:left w:type="dxa" w:w="110"/>
+              <w:bottom w:type="dxa" w:w="70"/>
+              <w:right w:type="dxa" w:w="110"/>
+            </w:tcMar>
+          </w:tcPr>
+          <w:p>
+            <w:pPr>
+              <w:spacing w:after="0" w:line="300"/>
+            </w:pPr>
+            <w:r>
+              <w:rPr>
+                <w:rFonts w:ascii="Yu Gothic" w:cs="Yu Gothic" w:eastAsia="Yu Gothic" w:hAnsi="Yu Gothic"/>
+              </w:rPr>
+              <w:t xml:space="preserve">折り幅（1パネルの横幅）</w:t>
+            </w:r>
+          </w:p>
+        </w:tc>
+        <w:tc>
+          <w:tcPr>
+            <w:tcW w:type="dxa" w:w="1500"/>
+            <w:tcBorders>
+              <w:top w:val="single" w:color="C9CEC0" w:sz="4"/>
+              <w:left w:val="single" w:color="C9CEC0" w:sz="4"/>
+              <w:bottom w:val="single" w:color="C9CEC0" w:sz="4"/>
+              <w:right w:val="single" w:color="C9CEC0" w:sz="4"/>
+            </w:tcBorders>
+            <w:tcMar>
+              <w:top w:type="dxa" w:w="70"/>
+              <w:left w:type="dxa" w:w="110"/>
+              <w:bottom w:type="dxa" w:w="70"/>
+              <w:right w:type="dxa" w:w="110"/>
+            </w:tcMar>
+          </w:tcPr>
+          <w:p>
+            <w:pPr>
+              <w:spacing w:after="0" w:line="300"/>
+            </w:pPr>
+            <w:r>
+              <w:rPr>
+                <w:rFonts w:ascii="Yu Gothic" w:cs="Yu Gothic" w:eastAsia="Yu Gothic" w:hAnsi="Yu Gothic"/>
+              </w:rPr>
+              <w:t xml:space="preserve">6.8 cm</w:t>
+            </w:r>
+          </w:p>
+        </w:tc>
+        <w:tc>
+          <w:tcPr>
+            <w:tcW w:type="dxa" w:w="5238"/>
+            <w:tcBorders>
+              <w:top w:val="single" w:color="C9CEC0" w:sz="4"/>
+              <w:left w:val="single" w:color="C9CEC0" w:sz="4"/>
+              <w:bottom w:val="single" w:color="C9CEC0" w:sz="4"/>
+              <w:right w:val="single" w:color="C9CEC0" w:sz="4"/>
+            </w:tcBorders>
+            <w:tcMar>
+              <w:top w:type="dxa" w:w="70"/>
+              <w:left w:type="dxa" w:w="110"/>
+              <w:bottom w:type="dxa" w:w="70"/>
+              <w:right w:type="dxa" w:w="110"/>
+            </w:tcMar>
+          </w:tcPr>
+          <w:p>
+            <w:pPr>
+              <w:spacing w:after="0" w:line="300"/>
+            </w:pPr>
+            <w:r>
+              <w:rPr>
+                <w:rFonts w:ascii="Yu Gothic" w:cs="Yu Gothic" w:eastAsia="Yu Gothic" w:hAnsi="Yu Gothic"/>
+              </w:rPr>
+              <w:t xml:space="preserve">蛇腹の1面の幅。全パネルこの幅に固定されます。</w:t>
+            </w:r>
+          </w:p>
+        </w:tc>
+      </w:tr>
+      <w:tr>
+        <w:tc>
+          <w:tcPr>
+            <w:tcW w:type="dxa" w:w="2900"/>
+            <w:tcBorders>
+              <w:top w:val="single" w:color="C9CEC0" w:sz="4"/>
+              <w:left w:val="single" w:color="C9CEC0" w:sz="4"/>
+              <w:bottom w:val="single" w:color="C9CEC0" w:sz="4"/>
+              <w:right w:val="single" w:color="C9CEC0" w:sz="4"/>
+            </w:tcBorders>
+            <w:tcMar>
+              <w:top w:type="dxa" w:w="70"/>
+              <w:left w:type="dxa" w:w="110"/>
+              <w:bottom w:type="dxa" w:w="70"/>
+              <w:right w:type="dxa" w:w="110"/>
+            </w:tcMar>
+          </w:tcPr>
+          <w:p>
+            <w:pPr>
+              <w:spacing w:after="0" w:line="300"/>
+            </w:pPr>
+            <w:r>
+              <w:rPr>
+                <w:rFonts w:ascii="Yu Gothic" w:cs="Yu Gothic" w:eastAsia="Yu Gothic" w:hAnsi="Yu Gothic"/>
+              </w:rPr>
+              <w:t xml:space="preserve">文字サイズ</w:t>
+            </w:r>
+          </w:p>
+        </w:tc>
+        <w:tc>
+          <w:tcPr>
+            <w:tcW w:type="dxa" w:w="1500"/>
+            <w:tcBorders>
+              <w:top w:val="single" w:color="C9CEC0" w:sz="4"/>
+              <w:left w:val="single" w:color="C9CEC0" w:sz="4"/>
+              <w:bottom w:val="single" w:color="C9CEC0" w:sz="4"/>
+              <w:right w:val="single" w:color="C9CEC0" w:sz="4"/>
+            </w:tcBorders>
+            <w:tcMar>
+              <w:top w:type="dxa" w:w="70"/>
+              <w:left w:type="dxa" w:w="110"/>
+              <w:bottom w:type="dxa" w:w="70"/>
+              <w:right w:type="dxa" w:w="110"/>
+            </w:tcMar>
+          </w:tcPr>
+          <w:p>
+            <w:pPr>
+              <w:spacing w:after="0" w:line="300"/>
+            </w:pPr>
+            <w:r>
+              <w:rPr>
+                <w:rFonts w:ascii="Yu Gothic" w:cs="Yu Gothic" w:eastAsia="Yu Gothic" w:hAnsi="Yu Gothic"/>
+              </w:rPr>
+              <w:t xml:space="preserve">30 pt</w:t>
+            </w:r>
+          </w:p>
+        </w:tc>
+        <w:tc>
+          <w:tcPr>
+            <w:tcW w:type="dxa" w:w="5238"/>
+            <w:tcBorders>
+              <w:top w:val="single" w:color="C9CEC0" w:sz="4"/>
+              <w:left w:val="single" w:color="C9CEC0" w:sz="4"/>
+              <w:bottom w:val="single" w:color="C9CEC0" w:sz="4"/>
+              <w:right w:val="single" w:color="C9CEC0" w:sz="4"/>
+            </w:tcBorders>
+            <w:tcMar>
+              <w:top w:type="dxa" w:w="70"/>
+              <w:left w:type="dxa" w:w="110"/>
+              <w:bottom w:type="dxa" w:w="70"/>
+              <w:right w:type="dxa" w:w="110"/>
+            </w:tcMar>
+          </w:tcPr>
+          <w:p>
+            <w:pPr>
+              <w:spacing w:after="0" w:line="300"/>
+            </w:pPr>
+            <w:r>
+              <w:rPr>
+                <w:rFonts w:ascii="Yu Gothic" w:cs="Yu Gothic" w:eastAsia="Yu Gothic" w:hAnsi="Yu Gothic"/>
+              </w:rPr>
+              <w:t xml:space="preserve">全パネル共通の文字サイズ。パネルごとに上書きもできます（3.5）。</w:t>
+            </w:r>
+          </w:p>
+        </w:tc>
+      </w:tr>
+      <w:tr>
+        <w:tc>
+          <w:tcPr>
+            <w:tcW w:type="dxa" w:w="2900"/>
+            <w:tcBorders>
+              <w:top w:val="single" w:color="C9CEC0" w:sz="4"/>
+              <w:left w:val="single" w:color="C9CEC0" w:sz="4"/>
+              <w:bottom w:val="single" w:color="C9CEC0" w:sz="4"/>
+              <w:right w:val="single" w:color="C9CEC0" w:sz="4"/>
+            </w:tcBorders>
+            <w:tcMar>
+              <w:top w:type="dxa" w:w="70"/>
+              <w:left w:type="dxa" w:w="110"/>
+              <w:bottom w:type="dxa" w:w="70"/>
+              <w:right w:type="dxa" w:w="110"/>
+            </w:tcMar>
+          </w:tcPr>
+          <w:p>
+            <w:pPr>
+              <w:spacing w:after="0" w:line="300"/>
+            </w:pPr>
+            <w:r>
+              <w:rPr>
+                <w:rFonts w:ascii="Yu Gothic" w:cs="Yu Gothic" w:eastAsia="Yu Gothic" w:hAnsi="Yu Gothic"/>
+              </w:rPr>
+              <w:t xml:space="preserve">A4横に入るパネル数</w:t>
+            </w:r>
+          </w:p>
+        </w:tc>
+        <w:tc>
+          <w:tcPr>
+            <w:tcW w:type="dxa" w:w="1500"/>
+            <w:tcBorders>
+              <w:top w:val="single" w:color="C9CEC0" w:sz="4"/>
+              <w:left w:val="single" w:color="C9CEC0" w:sz="4"/>
+              <w:bottom w:val="single" w:color="C9CEC0" w:sz="4"/>
+              <w:right w:val="single" w:color="C9CEC0" w:sz="4"/>
+            </w:tcBorders>
+            <w:tcMar>
+              <w:top w:type="dxa" w:w="70"/>
+              <w:left w:type="dxa" w:w="110"/>
+              <w:bottom w:type="dxa" w:w="70"/>
+              <w:right w:type="dxa" w:w="110"/>
+            </w:tcMar>
+          </w:tcPr>
+          <w:p>
+            <w:pPr>
+              <w:spacing w:after="0" w:line="300"/>
+            </w:pPr>
+            <w:r>
+              <w:rPr>
+                <w:rFonts w:ascii="Yu Gothic" w:cs="Yu Gothic" w:eastAsia="Yu Gothic" w:hAnsi="Yu Gothic"/>
+              </w:rPr>
+              <w:t xml:space="preserve">自動表示</w:t>
+            </w:r>
+          </w:p>
+        </w:tc>
+        <w:tc>
+          <w:tcPr>
+            <w:tcW w:type="dxa" w:w="5238"/>
+            <w:tcBorders>
+              <w:top w:val="single" w:color="C9CEC0" w:sz="4"/>
+              <w:left w:val="single" w:color="C9CEC0" w:sz="4"/>
+              <w:bottom w:val="single" w:color="C9CEC0" w:sz="4"/>
+              <w:right w:val="single" w:color="C9CEC0" w:sz="4"/>
+            </w:tcBorders>
+            <w:tcMar>
+              <w:top w:type="dxa" w:w="70"/>
+              <w:left w:type="dxa" w:w="110"/>
+              <w:bottom w:type="dxa" w:w="70"/>
+              <w:right w:type="dxa" w:w="110"/>
+            </w:tcMar>
+          </w:tcPr>
+          <w:p>
+            <w:pPr>
+              <w:spacing w:after="0" w:line="300"/>
+            </w:pPr>
+            <w:r>
+              <w:rPr>
+                <w:rFonts w:ascii="Yu Gothic" w:cs="Yu Gothic" w:eastAsia="Yu Gothic" w:hAnsi="Yu Gothic"/>
+              </w:rPr>
+              <w:t xml:space="preserve">用紙幅と折り幅から自動計算されます（初期値では4パネル／枚）。</w:t>
+            </w:r>
+          </w:p>
+        </w:tc>
+      </w:tr>
+      <w:tr>
+        <w:tc>
+          <w:tcPr>
+            <w:tcW w:type="dxa" w:w="2900"/>
+            <w:tcBorders>
+              <w:top w:val="single" w:color="C9CEC0" w:sz="4"/>
+              <w:left w:val="single" w:color="C9CEC0" w:sz="4"/>
+              <w:bottom w:val="single" w:color="C9CEC0" w:sz="4"/>
+              <w:right w:val="single" w:color="C9CEC0" w:sz="4"/>
+            </w:tcBorders>
+            <w:tcMar>
+              <w:top w:type="dxa" w:w="70"/>
+              <w:left w:type="dxa" w:w="110"/>
+              <w:bottom w:type="dxa" w:w="70"/>
+              <w:right w:type="dxa" w:w="110"/>
+            </w:tcMar>
+          </w:tcPr>
+          <w:p>
+            <w:pPr>
+              <w:spacing w:after="0" w:line="300"/>
+            </w:pPr>
+            <w:r>
+              <w:rPr>
+                <w:rFonts w:ascii="Yu Gothic" w:cs="Yu Gothic" w:eastAsia="Yu Gothic" w:hAnsi="Yu Gothic"/>
+              </w:rPr>
+              <w:t xml:space="preserve">1パネル最大行数</w:t>
+            </w:r>
+          </w:p>
+        </w:tc>
+        <w:tc>
+          <w:tcPr>
+            <w:tcW w:type="dxa" w:w="1500"/>
+            <w:tcBorders>
+              <w:top w:val="single" w:color="C9CEC0" w:sz="4"/>
+              <w:left w:val="single" w:color="C9CEC0" w:sz="4"/>
+              <w:bottom w:val="single" w:color="C9CEC0" w:sz="4"/>
+              <w:right w:val="single" w:color="C9CEC0" w:sz="4"/>
+            </w:tcBorders>
+            <w:tcMar>
+              <w:top w:type="dxa" w:w="70"/>
+              <w:left w:type="dxa" w:w="110"/>
+              <w:bottom w:type="dxa" w:w="70"/>
+              <w:right w:type="dxa" w:w="110"/>
+            </w:tcMar>
+          </w:tcPr>
+          <w:p>
+            <w:pPr>
+              <w:spacing w:after="0" w:line="300"/>
+            </w:pPr>
+            <w:r>
+              <w:rPr>
+                <w:rFonts w:ascii="Yu Gothic" w:cs="Yu Gothic" w:eastAsia="Yu Gothic" w:hAnsi="Yu Gothic"/>
+              </w:rPr>
+              <w:t xml:space="preserve">3 行</w:t>
+            </w:r>
+          </w:p>
+        </w:tc>
+        <w:tc>
+          <w:tcPr>
+            <w:tcW w:type="dxa" w:w="5238"/>
+            <w:tcBorders>
+              <w:top w:val="single" w:color="C9CEC0" w:sz="4"/>
+              <w:left w:val="single" w:color="C9CEC0" w:sz="4"/>
+              <w:bottom w:val="single" w:color="C9CEC0" w:sz="4"/>
+              <w:right w:val="single" w:color="C9CEC0" w:sz="4"/>
+            </w:tcBorders>
+            <w:tcMar>
+              <w:top w:type="dxa" w:w="70"/>
+              <w:left w:type="dxa" w:w="110"/>
+              <w:bottom w:type="dxa" w:w="70"/>
+              <w:right w:type="dxa" w:w="110"/>
+            </w:tcMar>
+          </w:tcPr>
+          <w:p>
+            <w:pPr>
+              <w:spacing w:after="0" w:line="300"/>
+            </w:pPr>
+            <w:r>
+              <w:rPr>
+                <w:rFonts w:ascii="Yu Gothic" w:cs="Yu Gothic" w:eastAsia="Yu Gothic" w:hAnsi="Yu Gothic"/>
+              </w:rPr>
+              <w:t xml:space="preserve">1パネルの改行数（列数）の上限。超えると警告が出ます。</w:t>
+            </w:r>
+          </w:p>
+        </w:tc>
+      </w:tr>
+      <w:tr>
+        <w:tc>
+          <w:tcPr>
+            <w:tcW w:type="dxa" w:w="2900"/>
+            <w:tcBorders>
+              <w:top w:val="single" w:color="C9CEC0" w:sz="4"/>
+              <w:left w:val="single" w:color="C9CEC0" w:sz="4"/>
+              <w:bottom w:val="single" w:color="C9CEC0" w:sz="4"/>
+              <w:right w:val="single" w:color="C9CEC0" w:sz="4"/>
+            </w:tcBorders>
+            <w:tcMar>
+              <w:top w:type="dxa" w:w="70"/>
+              <w:left w:type="dxa" w:w="110"/>
+              <w:bottom w:type="dxa" w:w="70"/>
+              <w:right w:type="dxa" w:w="110"/>
+            </w:tcMar>
+          </w:tcPr>
+          <w:p>
+            <w:pPr>
+              <w:spacing w:after="0" w:line="300"/>
+            </w:pPr>
+            <w:r>
+              <w:rPr>
+                <w:rFonts w:ascii="Yu Gothic" w:cs="Yu Gothic" w:eastAsia="Yu Gothic" w:hAnsi="Yu Gothic"/>
+              </w:rPr>
+              <w:t xml:space="preserve">用紙の余白　上</w:t>
+            </w:r>
+          </w:p>
+        </w:tc>
+        <w:tc>
+          <w:tcPr>
+            <w:tcW w:type="dxa" w:w="1500"/>
+            <w:tcBorders>
+              <w:top w:val="single" w:color="C9CEC0" w:sz="4"/>
+              <w:left w:val="single" w:color="C9CEC0" w:sz="4"/>
+              <w:bottom w:val="single" w:color="C9CEC0" w:sz="4"/>
+              <w:right w:val="single" w:color="C9CEC0" w:sz="4"/>
+            </w:tcBorders>
+            <w:tcMar>
+              <w:top w:type="dxa" w:w="70"/>
+              <w:left w:type="dxa" w:w="110"/>
+              <w:bottom w:type="dxa" w:w="70"/>
+              <w:right w:type="dxa" w:w="110"/>
+            </w:tcMar>
+          </w:tcPr>
+          <w:p>
+            <w:pPr>
+              <w:spacing w:after="0" w:line="300"/>
+            </w:pPr>
+            <w:r>
+              <w:rPr>
+                <w:rFonts w:ascii="Yu Gothic" w:cs="Yu Gothic" w:eastAsia="Yu Gothic" w:hAnsi="Yu Gothic"/>
+              </w:rPr>
+              <w:t xml:space="preserve">0.5 cm</w:t>
+            </w:r>
+          </w:p>
+        </w:tc>
+        <w:tc>
+          <w:tcPr>
+            <w:tcW w:type="dxa" w:w="5238"/>
+            <w:tcBorders>
+              <w:top w:val="single" w:color="C9CEC0" w:sz="4"/>
+              <w:left w:val="single" w:color="C9CEC0" w:sz="4"/>
+              <w:bottom w:val="single" w:color="C9CEC0" w:sz="4"/>
+              <w:right w:val="single" w:color="C9CEC0" w:sz="4"/>
+            </w:tcBorders>
+            <w:tcMar>
+              <w:top w:type="dxa" w:w="70"/>
+              <w:left w:type="dxa" w:w="110"/>
+              <w:bottom w:type="dxa" w:w="70"/>
+              <w:right w:type="dxa" w:w="110"/>
+            </w:tcMar>
+          </w:tcPr>
+          <w:p>
+            <w:pPr>
+              <w:spacing w:after="0" w:line="300"/>
+            </w:pPr>
+            <w:r>
+              <w:rPr>
+                <w:rFonts w:ascii="Yu Gothic" w:cs="Yu Gothic" w:eastAsia="Yu Gothic" w:hAnsi="Yu Gothic"/>
+              </w:rPr>
+              <w:t xml:space="preserve">用紙の上側の余白。</w:t>
+            </w:r>
+          </w:p>
+        </w:tc>
+      </w:tr>
+      <w:tr>
+        <w:tc>
+          <w:tcPr>
+            <w:tcW w:type="dxa" w:w="2900"/>
+            <w:tcBorders>
+              <w:top w:val="single" w:color="C9CEC0" w:sz="4"/>
+              <w:left w:val="single" w:color="C9CEC0" w:sz="4"/>
+              <w:bottom w:val="single" w:color="C9CEC0" w:sz="4"/>
+              <w:right w:val="single" w:color="C9CEC0" w:sz="4"/>
+            </w:tcBorders>
+            <w:tcMar>
+              <w:top w:type="dxa" w:w="70"/>
+              <w:left w:type="dxa" w:w="110"/>
+              <w:bottom w:type="dxa" w:w="70"/>
+              <w:right w:type="dxa" w:w="110"/>
+            </w:tcMar>
+          </w:tcPr>
+          <w:p>
+            <w:pPr>
+              <w:spacing w:after="0" w:line="300"/>
+            </w:pPr>
+            <w:r>
+              <w:rPr>
+                <w:rFonts w:ascii="Yu Gothic" w:cs="Yu Gothic" w:eastAsia="Yu Gothic" w:hAnsi="Yu Gothic"/>
+              </w:rPr>
+              <w:t xml:space="preserve">用紙の余白　下・左・右</w:t>
+            </w:r>
+          </w:p>
+        </w:tc>
+        <w:tc>
+          <w:tcPr>
+            <w:tcW w:type="dxa" w:w="1500"/>
+            <w:tcBorders>
+              <w:top w:val="single" w:color="C9CEC0" w:sz="4"/>
+              <w:left w:val="single" w:color="C9CEC0" w:sz="4"/>
+              <w:bottom w:val="single" w:color="C9CEC0" w:sz="4"/>
+              <w:right w:val="single" w:color="C9CEC0" w:sz="4"/>
+            </w:tcBorders>
+            <w:tcMar>
+              <w:top w:type="dxa" w:w="70"/>
+              <w:left w:type="dxa" w:w="110"/>
+              <w:bottom w:type="dxa" w:w="70"/>
+              <w:right w:type="dxa" w:w="110"/>
+            </w:tcMar>
+          </w:tcPr>
+          <w:p>
+            <w:pPr>
+              <w:spacing w:after="0" w:line="300"/>
+            </w:pPr>
+            <w:r>
+              <w:rPr>
+                <w:rFonts w:ascii="Yu Gothic" w:cs="Yu Gothic" w:eastAsia="Yu Gothic" w:hAnsi="Yu Gothic"/>
+              </w:rPr>
+              <w:t xml:space="preserve">0 cm</w:t>
+            </w:r>
+          </w:p>
+        </w:tc>
+        <w:tc>
+          <w:tcPr>
+            <w:tcW w:type="dxa" w:w="5238"/>
+            <w:tcBorders>
+              <w:top w:val="single" w:color="C9CEC0" w:sz="4"/>
+              <w:left w:val="single" w:color="C9CEC0" w:sz="4"/>
+              <w:bottom w:val="single" w:color="C9CEC0" w:sz="4"/>
+              <w:right w:val="single" w:color="C9CEC0" w:sz="4"/>
+            </w:tcBorders>
+            <w:tcMar>
+              <w:top w:type="dxa" w:w="70"/>
+              <w:left w:type="dxa" w:w="110"/>
+              <w:bottom w:type="dxa" w:w="70"/>
+              <w:right w:type="dxa" w:w="110"/>
+            </w:tcMar>
+          </w:tcPr>
+          <w:p>
+            <w:pPr>
+              <w:spacing w:after="0" w:line="300"/>
+            </w:pPr>
+            <w:r>
+              <w:rPr>
+                <w:rFonts w:ascii="Yu Gothic" w:cs="Yu Gothic" w:eastAsia="Yu Gothic" w:hAnsi="Yu Gothic"/>
+              </w:rPr>
+              <w:t xml:space="preserve">左の余白を小さくした分は「のりしろ」に回ります。</w:t>
+            </w:r>
+          </w:p>
+        </w:tc>
+      </w:tr>
+    </w:tbl>
+    <w:p>
+      <w:pPr>
+        <w:spacing w:after="80"/>
+      </w:pPr>
+    </w:p>
+    <w:tbl>
+      <w:tblPr>
+        <w:tblW w:type="dxa" w:w="9638"/>
+        <w:tblBorders>
+          <w:top w:val="single" w:color="auto" w:sz="4"/>
+          <w:left w:val="single" w:color="auto" w:sz="4"/>
+          <w:bottom w:val="single" w:color="auto" w:sz="4"/>
+          <w:right w:val="single" w:color="auto" w:sz="4"/>
+          <w:insideH w:val="single" w:color="auto" w:sz="4"/>
+          <w:insideV w:val="single" w:color="auto" w:sz="4"/>
+        </w:tblBorders>
+      </w:tblPr>
+      <w:tblGrid>
+        <w:gridCol w:w="9638"/>
+      </w:tblGrid>
+      <w:tr>
+        <w:tc>
+          <w:tcPr>
+            <w:tcW w:type="dxa" w:w="9638"/>
+            <w:tcBorders>
+              <w:top w:val="none" w:color="FFFFFF" w:sz="0"/>
+              <w:left w:val="single" w:color="B26A00" w:sz="24"/>
+              <w:bottom w:val="none" w:color="FFFFFF" w:sz="0"/>
+              <w:right w:val="none" w:color="FFFFFF" w:sz="0"/>
+            </w:tcBorders>
+            <w:shd w:fill="FFF6E5" w:color="auto" w:val="clear"/>
+            <w:tcMar>
+              <w:top w:type="dxa" w:w="100"/>
+              <w:left w:type="dxa" w:w="180"/>
+              <w:bottom w:type="dxa" w:w="100"/>
+              <w:right w:type="dxa" w:w="140"/>
+            </w:tcMar>
+          </w:tcPr>
+          <w:p>
+            <w:pPr>
+              <w:spacing w:after="60" w:line="300"/>
+            </w:pPr>
+            <w:r>
+              <w:rPr>
+                <w:rFonts w:ascii="Yu Gothic" w:cs="Yu Gothic" w:eastAsia="Yu Gothic" w:hAnsi="Yu Gothic"/>
+                <w:b/>
+                <w:bCs/>
+                <w:color w:val="B26A00"/>
+              </w:rPr>
+              <w:t xml:space="preserve">注意　</w:t>
+            </w:r>
+            <w:r>
+              <w:rPr>
+                <w:rFonts w:ascii="Yu Gothic" w:cs="Yu Gothic" w:eastAsia="Yu Gothic" w:hAnsi="Yu Gothic"/>
+              </w:rPr>
+              <w:t xml:space="preserve">余白を0にすると、プリンターによっては用紙の端が印刷されないことがあります（多くの機種は3〜5mm程度が下限）。端が切れる場合は余白を広げてください。</w:t>
+            </w:r>
+          </w:p>
+          <w:p>
+            <w:pPr>
+              <w:spacing w:after="0" w:line="300"/>
+            </w:pPr>
+            <w:r>
+              <w:rPr>
+                <w:rFonts w:ascii="Yu Gothic" w:cs="Yu Gothic" w:eastAsia="Yu Gothic" w:hAnsi="Yu Gothic"/>
+              </w:rPr>
+              <w:t xml:space="preserve">用紙幅が折り幅で割り切れないとき、余った幅（初期値では2.5cm）が「のりしろ」として紙の左端に自動で確保されます。</w:t>
+            </w:r>
+          </w:p>
+        </w:tc>
+      </w:tr>
+    </w:tbl>
+    <w:p>
+      <w:pPr>
+        <w:spacing w:after="120"/>
+      </w:pPr>
+    </w:p>
+    <w:p>
+      <w:pPr>
+        <w:pStyle w:val="Heading2"/>
+      </w:pPr>
+      <w:r>
+        <w:rPr>
+          <w:rFonts w:ascii="Yu Gothic" w:cs="Yu Gothic" w:eastAsia="Yu Gothic" w:hAnsi="Yu Gothic"/>
+        </w:rPr>
+        <w:t xml:space="preserve">3.3 台本を一括入力する（蛇腹祝辞メーカー）</w:t>
+      </w:r>
+    </w:p>
+    <w:p>
+      <w:pPr>
+        <w:spacing w:after="160" w:before="60"/>
+        <w:jc w:val="center"/>
+      </w:pPr>
+      <w:r>
+        <w:drawing>
+          <wp:inline distT="0" distB="0" distL="0" distR="0">
+            <wp:extent cx="5334000" cy="1876425"/>
+            <wp:effectExtent t="0" r="0" b="0" l="0"/>
+            <wp:docPr id="6" name="台本を一括入力する欄" descr="台本を一括入力する欄" title="台本を一括入力する欄"/>
+            <wp:cNvGraphicFramePr>
+              <a:graphicFrameLocks xmlns:a="http://schemas.openxmlformats.org/drawingml/2006/main" noChangeAspect="1"/>
+            </wp:cNvGraphicFramePr>
+            <a:graphic xmlns:a="http://schemas.openxmlformats.org/drawingml/2006/main">
+              <a:graphicData uri="http://schemas.openxmlformats.org/drawingml/2006/picture">
+                <pic:pic xmlns:pic="http://schemas.openxmlformats.org/drawingml/2006/picture">
+                  <pic:nvPicPr>
+                    <pic:cNvPr id="0" name="" descr=""/>
+                    <pic:cNvPicPr>
+                      <a:picLocks noChangeAspect="1" noChangeArrowheads="1"/>
+                    </pic:cNvPicPr>
+                  </pic:nvPicPr>
+                  <pic:blipFill>
+                    <a:blip r:embed="rId14" cstate="none"/>
+                    <a:srcRect/>
+                    <a:stretch>
+                      <a:fillRect/>
+                    </a:stretch>
+                  </pic:blipFill>
+                  <pic:spPr bwMode="auto">
+                    <a:xfrm>
+                      <a:off x="0" y="0"/>
+                      <a:ext cx="5334000" cy="1876425"/>
+                    </a:xfrm>
+                    <a:prstGeom prst="rect">
+                      <a:avLst/>
+                    </a:prstGeom>
+                  </pic:spPr>
+                </pic:pic>
+              </a:graphicData>
+            </a:graphic>
+          </wp:inline>
+        </w:drawing>
+      </w:r>
+    </w:p>
+    <w:p>
+      <w:pPr>
+        <w:spacing w:after="160"/>
+        <w:jc w:val="center"/>
+      </w:pPr>
+      <w:r>
+        <w:rPr>
+          <w:rFonts w:ascii="Yu Gothic" w:cs="Yu Gothic" w:eastAsia="Yu Gothic" w:hAnsi="Yu Gothic"/>
+          <w:color w:val="5B6B7A"/>
+          <w:sz w:val="18"/>
+          <w:szCs w:val="18"/>
+        </w:rPr>
+        <w:t xml:space="preserve">図3　台本を一括入力する欄</w:t>
+      </w:r>
+    </w:p>
+    <w:p>
+      <w:pPr>
+        <w:pStyle w:val="ListParagraph"/>
+        <w:numPr>
+          <w:ilvl w:val="0"/>
+          <w:numId w:val="3"/>
+        </w:numPr>
+        <w:spacing w:after="80" w:line="320"/>
+      </w:pPr>
+      <w:r>
+        <w:rPr>
+          <w:rFonts w:ascii="Yu Gothic" w:cs="Yu Gothic" w:eastAsia="Yu Gothic" w:hAnsi="Yu Gothic"/>
+        </w:rPr>
+        <w:t xml:space="preserve">台本をそのまま貼り付けます。</w:t>
+      </w:r>
+    </w:p>
+    <w:p>
+      <w:pPr>
+        <w:pStyle w:val="ListParagraph"/>
+        <w:numPr>
+          <w:ilvl w:val="0"/>
+          <w:numId w:val="3"/>
+        </w:numPr>
+        <w:spacing w:after="80" w:line="320"/>
+      </w:pPr>
+      <w:r>
+        <w:rPr>
+          <w:rFonts w:ascii="Yu Gothic" w:cs="Yu Gothic" w:eastAsia="Yu Gothic" w:hAnsi="Yu Gothic"/>
+        </w:rPr>
+        <w:t xml:space="preserve">「パネルに反映」を押すと、現在のパネル幅・文字サイズに収まる文字数を目安に、「。」「、」や改行を優先して自動でパネルに区切られます。</w:t>
+      </w:r>
+    </w:p>
+    <w:p>
+      <w:pPr>
+        <w:pStyle w:val="ListParagraph"/>
+        <w:numPr>
+          <w:ilvl w:val="0"/>
+          <w:numId w:val="3"/>
+        </w:numPr>
+        <w:spacing w:after="80" w:line="320"/>
+      </w:pPr>
+      <w:r>
+        <w:rPr>
+          <w:rFonts w:ascii="Yu Gothic" w:cs="Yu Gothic" w:eastAsia="Yu Gothic" w:hAnsi="Yu Gothic"/>
+        </w:rPr>
+        <w:t xml:space="preserve">意図した位置で必ず区切りたいときは、その位置に空行を入れます（空行では必ず区切られます）。</w:t>
+      </w:r>
+    </w:p>
+    <w:p>
+      <w:pPr>
+        <w:spacing w:after="120" w:line="320"/>
+      </w:pPr>
+      <w:r>
+        <w:rPr>
+          <w:rFonts w:ascii="Yu Gothic" w:cs="Yu Gothic" w:eastAsia="Yu Gothic" w:hAnsi="Yu Gothic"/>
+        </w:rPr>
+        <w:t xml:space="preserve">すでにパネルがある状態で押すと、ボタンが「もう一度押すと置き換えます」に変わります。今のパネル一覧を上書きしてよければ、もう一度押してください（数秒で元に戻ります）。</w:t>
+      </w:r>
+    </w:p>
+    <w:p>
+      <w:pPr>
+        <w:spacing w:after="60"/>
+      </w:pPr>
+    </w:p>
+    <w:p>
+      <w:pPr>
+        <w:pStyle w:val="Heading2"/>
+      </w:pPr>
+      <w:r>
+        <w:rPr>
+          <w:rFonts w:ascii="Yu Gothic" w:cs="Yu Gothic" w:eastAsia="Yu Gothic" w:hAnsi="Yu Gothic"/>
+        </w:rPr>
+        <w:t xml:space="preserve">3.4 Wordファイルを読み込む（Word読み込み版）</w:t>
+      </w:r>
+    </w:p>
+    <w:p>
+      <w:pPr>
+        <w:spacing w:after="160" w:before="60"/>
+        <w:jc w:val="center"/>
+      </w:pPr>
+      <w:r>
+        <w:drawing>
+          <wp:inline distT="0" distB="0" distL="0" distR="0">
+            <wp:extent cx="5334000" cy="1171575"/>
+            <wp:effectExtent t="0" r="0" b="0" l="0"/>
+            <wp:docPr id="7" name="Wordファイルを読み込む欄" descr="Wordファイルを読み込む欄" title="Wordファイルを読み込む欄"/>
+            <wp:cNvGraphicFramePr>
+              <a:graphicFrameLocks xmlns:a="http://schemas.openxmlformats.org/drawingml/2006/main" noChangeAspect="1"/>
+            </wp:cNvGraphicFramePr>
+            <a:graphic xmlns:a="http://schemas.openxmlformats.org/drawingml/2006/main">
+              <a:graphicData uri="http://schemas.openxmlformats.org/drawingml/2006/picture">
+                <pic:pic xmlns:pic="http://schemas.openxmlformats.org/drawingml/2006/picture">
+                  <pic:nvPicPr>
+                    <pic:cNvPr id="0" name="" descr=""/>
+                    <pic:cNvPicPr>
+                      <a:picLocks noChangeAspect="1" noChangeArrowheads="1"/>
+                    </pic:cNvPicPr>
+                  </pic:nvPicPr>
+                  <pic:blipFill>
+                    <a:blip r:embed="rId15" cstate="none"/>
+                    <a:srcRect/>
+                    <a:stretch>
+                      <a:fillRect/>
+                    </a:stretch>
+                  </pic:blipFill>
+                  <pic:spPr bwMode="auto">
+                    <a:xfrm>
+                      <a:off x="0" y="0"/>
+                      <a:ext cx="5334000" cy="1171575"/>
+                    </a:xfrm>
+                    <a:prstGeom prst="rect">
+                      <a:avLst/>
+                    </a:prstGeom>
+                  </pic:spPr>
+                </pic:pic>
+              </a:graphicData>
+            </a:graphic>
+          </wp:inline>
+        </w:drawing>
+      </w:r>
+    </w:p>
+    <w:p>
+      <w:pPr>
+        <w:spacing w:after="160"/>
+        <w:jc w:val="center"/>
+      </w:pPr>
+      <w:r>
+        <w:rPr>
+          <w:rFonts w:ascii="Yu Gothic" w:cs="Yu Gothic" w:eastAsia="Yu Gothic" w:hAnsi="Yu Gothic"/>
+          <w:color w:val="5B6B7A"/>
+          <w:sz w:val="18"/>
+          <w:szCs w:val="18"/>
+        </w:rPr>
+        <w:t xml:space="preserve">図4　Wordファイルを読み込む欄</w:t>
+      </w:r>
+    </w:p>
+    <w:p>
+      <w:pPr>
+        <w:pStyle w:val="ListParagraph"/>
+        <w:numPr>
+          <w:ilvl w:val="0"/>
+          <w:numId w:val="3"/>
+        </w:numPr>
+        <w:spacing w:after="80" w:line="320"/>
+      </w:pPr>
+      <w:r>
+        <w:rPr>
+          <w:rFonts w:ascii="Yu Gothic" w:cs="Yu Gothic" w:eastAsia="Yu Gothic" w:hAnsi="Yu Gothic"/>
+        </w:rPr>
+        <w:t xml:space="preserve">「ファイルを選択」で Wordファイル（.docx、または旧形式の .doc）を選びます。</w:t>
+      </w:r>
+    </w:p>
+    <w:p>
+      <w:pPr>
+        <w:pStyle w:val="ListParagraph"/>
+        <w:numPr>
+          <w:ilvl w:val="0"/>
+          <w:numId w:val="3"/>
+        </w:numPr>
+        <w:spacing w:after="80" w:line="320"/>
+      </w:pPr>
+      <w:r>
+        <w:rPr>
+          <w:rFonts w:ascii="Yu Gothic" w:cs="Yu Gothic" w:eastAsia="Yu Gothic" w:hAnsi="Yu Gothic"/>
+        </w:rPr>
+        <w:t xml:space="preserve">「パネルに反映」を押すと、パネルの一覧が読み込んだ内容に置き換わります。</w:t>
+      </w:r>
+    </w:p>
+    <w:p>
+      <w:pPr>
+        <w:spacing w:after="60" w:before="80"/>
+      </w:pPr>
+      <w:r>
+        <w:rPr>
+          <w:rFonts w:ascii="Yu Gothic" w:cs="Yu Gothic" w:eastAsia="Yu Gothic" w:hAnsi="Yu Gothic"/>
+          <w:b/>
+          <w:bCs/>
+        </w:rPr>
+        <w:t xml:space="preserve">読み込みのルール</w:t>
+      </w:r>
+    </w:p>
+    <w:p>
+      <w:pPr>
+        <w:pStyle w:val="ListParagraph"/>
+        <w:numPr>
+          <w:ilvl w:val="0"/>
+          <w:numId w:val="2"/>
+        </w:numPr>
+        <w:spacing w:after="60" w:line="320"/>
+      </w:pPr>
+      <w:r>
+        <w:rPr>
+          <w:rFonts w:ascii="Yu Gothic" w:cs="Yu Gothic" w:eastAsia="Yu Gothic" w:hAnsi="Yu Gothic"/>
+        </w:rPr>
+        <w:t xml:space="preserve">Wordのテキストボックス1つが、1つのパネルになります。</w:t>
+      </w:r>
+    </w:p>
+    <w:p>
+      <w:pPr>
+        <w:pStyle w:val="ListParagraph"/>
+        <w:numPr>
+          <w:ilvl w:val="0"/>
+          <w:numId w:val="2"/>
+        </w:numPr>
+        <w:spacing w:after="60" w:line="320"/>
+      </w:pPr>
+      <w:r>
+        <w:rPr>
+          <w:rFonts w:ascii="Yu Gothic" w:cs="Yu Gothic" w:eastAsia="Yu Gothic" w:hAnsi="Yu Gothic"/>
+        </w:rPr>
+        <w:t xml:space="preserve">テキストボックスが無く、本文の行だけのファイルは、1パネルの最大行数に収まるように、文末（「。」）や段落の頭で区切って自動でパネルに分けます（4行なら2行＋2行のように、できるだけ均等に分けます）。「大宝(だいほう)」のように、漢字の直後にひらがなをかっこで入れた書き方は、ふりがなとして読み込みます。</w:t>
+      </w:r>
+    </w:p>
+    <w:p>
+      <w:pPr>
+        <w:pStyle w:val="ListParagraph"/>
+        <w:numPr>
+          <w:ilvl w:val="0"/>
+          <w:numId w:val="2"/>
+        </w:numPr>
+        <w:spacing w:after="60" w:line="320"/>
+      </w:pPr>
+      <w:r>
+        <w:rPr>
+          <w:rFonts w:ascii="Yu Gothic" w:cs="Yu Gothic" w:eastAsia="Yu Gothic" w:hAnsi="Yu Gothic"/>
+        </w:rPr>
+        <w:t xml:space="preserve">文字サイズが明らかに大きいものは表紙タイトル、日付や会場らしい文言（「○年○月」「開式」「会館」など）を含むものは表紙サブタイトルとして自動判定し、表紙欄に振り分けます。本文パネルとは重複しません。判定できないときは通常のパネルとして読み込みます。</w:t>
+      </w:r>
+    </w:p>
+    <w:p>
+      <w:pPr>
+        <w:pStyle w:val="ListParagraph"/>
+        <w:numPr>
+          <w:ilvl w:val="0"/>
+          <w:numId w:val="2"/>
+        </w:numPr>
+        <w:spacing w:after="60" w:line="320"/>
+      </w:pPr>
+      <w:r>
+        <w:rPr>
+          <w:rFonts w:ascii="Yu Gothic" w:cs="Yu Gothic" w:eastAsia="Yu Gothic" w:hAnsi="Yu Gothic"/>
+        </w:rPr>
+        <w:t xml:space="preserve">Wordのふりがな（ルビ）は「文字[よみ]」の形式に変換されます。</w:t>
+      </w:r>
+    </w:p>
+    <w:p>
+      <w:pPr>
+        <w:pStyle w:val="ListParagraph"/>
+        <w:numPr>
+          <w:ilvl w:val="0"/>
+          <w:numId w:val="2"/>
+        </w:numPr>
+        <w:spacing w:after="60" w:line="320"/>
+      </w:pPr>
+      <w:r>
+        <w:rPr>
+          <w:rFonts w:ascii="Yu Gothic" w:cs="Yu Gothic" w:eastAsia="Yu Gothic" w:hAnsi="Yu Gothic"/>
+        </w:rPr>
+        <w:t xml:space="preserve">段落の字下げ（先頭行のインデント）は、全角スペースとして再現されます。</w:t>
+      </w:r>
+    </w:p>
+    <w:p>
+      <w:pPr>
+        <w:pStyle w:val="ListParagraph"/>
+        <w:numPr>
+          <w:ilvl w:val="0"/>
+          <w:numId w:val="2"/>
+        </w:numPr>
+        <w:spacing w:after="60" w:line="320"/>
+      </w:pPr>
+      <w:r>
+        <w:rPr>
+          <w:rFonts w:ascii="Yu Gothic" w:cs="Yu Gothic" w:eastAsia="Yu Gothic" w:hAnsi="Yu Gothic"/>
+        </w:rPr>
+        <w:t xml:space="preserve">文字サイズで見分けられないファイルでも、「開式」「午前」「会館」などの文言があれば、サブタイトルとその直前のタイトルを文言から判定します。</w:t>
+      </w:r>
+    </w:p>
+    <w:p>
+      <w:pPr>
+        <w:pStyle w:val="ListParagraph"/>
+        <w:numPr>
+          <w:ilvl w:val="0"/>
+          <w:numId w:val="2"/>
+        </w:numPr>
+        <w:spacing w:after="60" w:line="320"/>
+      </w:pPr>
+      <w:r>
+        <w:rPr>
+          <w:rFonts w:ascii="Yu Gothic" w:cs="Yu Gothic" w:eastAsia="Yu Gothic" w:hAnsi="Yu Gothic"/>
+        </w:rPr>
+        <w:t xml:space="preserve">自動判定できなかったときは、反映後にパネル一覧の「表紙タイトルにする」「表紙サブタイトルにする」ボタンで手動で指定できます（そのパネルの文言が表紙欄に移り、パネルは一覧から消えます）。</w:t>
+      </w:r>
+    </w:p>
+    <w:p>
+      <w:pPr>
+        <w:pStyle w:val="ListParagraph"/>
+        <w:numPr>
+          <w:ilvl w:val="0"/>
+          <w:numId w:val="2"/>
+        </w:numPr>
+        <w:spacing w:after="60" w:line="320"/>
+      </w:pPr>
+      <w:r>
+        <w:rPr>
+          <w:rFonts w:ascii="Yu Gothic" w:cs="Yu Gothic" w:eastAsia="Yu Gothic" w:hAnsi="Yu Gothic"/>
+        </w:rPr>
+        <w:t xml:space="preserve">テキストボックスの順番はファイル内部の順序です。実際の読み順と違うときは、パネルごとの「▲」「▼」ボタンで並べ替えます。</w:t>
+      </w:r>
+    </w:p>
+    <w:p>
+      <w:pPr>
+        <w:spacing w:after="60"/>
+      </w:pPr>
+    </w:p>
+    <w:p>
+      <w:pPr>
+        <w:pStyle w:val="Heading2"/>
+      </w:pPr>
+      <w:r>
+        <w:rPr>
+          <w:rFonts w:ascii="Yu Gothic" w:cs="Yu Gothic" w:eastAsia="Yu Gothic" w:hAnsi="Yu Gothic"/>
+        </w:rPr>
+        <w:t xml:space="preserve">3.5 パネルごとの文言</w:t>
+      </w:r>
+    </w:p>
+    <w:p>
+      <w:pPr>
+        <w:spacing w:after="160" w:before="60"/>
+        <w:jc w:val="center"/>
+      </w:pPr>
+      <w:r>
+        <w:drawing>
+          <wp:inline distT="0" distB="0" distL="0" distR="0">
+            <wp:extent cx="5334000" cy="4695825"/>
+            <wp:effectExtent t="0" r="0" b="0" l="0"/>
+            <wp:docPr id="8" name="パネルごとの文言の欄" descr="パネルごとの文言の欄" title="パネルごとの文言の欄"/>
+            <wp:cNvGraphicFramePr>
+              <a:graphicFrameLocks xmlns:a="http://schemas.openxmlformats.org/drawingml/2006/main" noChangeAspect="1"/>
+            </wp:cNvGraphicFramePr>
+            <a:graphic xmlns:a="http://schemas.openxmlformats.org/drawingml/2006/main">
+              <a:graphicData uri="http://schemas.openxmlformats.org/drawingml/2006/picture">
+                <pic:pic xmlns:pic="http://schemas.openxmlformats.org/drawingml/2006/picture">
+                  <pic:nvPicPr>
+                    <pic:cNvPr id="0" name="" descr=""/>
+                    <pic:cNvPicPr>
+                      <a:picLocks noChangeAspect="1" noChangeArrowheads="1"/>
+                    </pic:cNvPicPr>
+                  </pic:nvPicPr>
+                  <pic:blipFill>
+                    <a:blip r:embed="rId16" cstate="none"/>
+                    <a:srcRect/>
+                    <a:stretch>
+                      <a:fillRect/>
+                    </a:stretch>
+                  </pic:blipFill>
+                  <pic:spPr bwMode="auto">
+                    <a:xfrm>
+                      <a:off x="0" y="0"/>
                       <a:ext cx="5334000" cy="4695825"/>
                     </a:xfrm>
                     <a:prstGeom prst="rect">
@@ -3125,7 +3645,7 @@
           <wp:inline distT="0" distB="0" distL="0" distR="0">
             <wp:extent cx="5334000" cy="200025"/>
             <wp:effectExtent t="0" r="0" b="0" l="0"/>
-            <wp:docPr id="6" name="印刷ボタンとガイド線の切替" descr="印刷ボタンとガイド線の切替" title="印刷ボタンとガイド線の切替"/>
+            <wp:docPr id="9" name="印刷ボタンとガイド線の切替" descr="印刷ボタンとガイド線の切替" title="印刷ボタンとガイド線の切替"/>
             <wp:cNvGraphicFramePr>
               <a:graphicFrameLocks xmlns:a="http://schemas.openxmlformats.org/drawingml/2006/main" noChangeAspect="1"/>
             </wp:cNvGraphicFramePr>
@@ -3139,7 +3659,7 @@
                     </pic:cNvPicPr>
                   </pic:nvPicPr>
                   <pic:blipFill>
-                    <a:blip r:embed="rId14" cstate="none"/>
+                    <a:blip r:embed="rId17" cstate="none"/>
                     <a:srcRect/>
                     <a:stretch>
                       <a:fillRect/>

</xml_diff>

<commit_message>
Manual: cover only the Word-import tool
Co-Authored-By: Claude Sonnet 5.5 <noreply@anthropic.com>
Claude-Session: https://claude.ai/code/session_01Lr4nGZF4GGC967dspef5Pw
</commit_message>
<xml_diff>
--- a/deliverables/jabara-manual.docx
+++ b/deliverables/jabara-manual.docx
@@ -68,7 +68,7 @@
           <w:sz w:val="24"/>
           <w:szCs w:val="24"/>
         </w:rPr>
-        <w:t xml:space="preserve">蛇腹祝辞メーカー／Word読み込み版　共通</w:t>
+        <w:t xml:space="preserve">Word読み込み版</w:t>
       </w:r>
     </w:p>
     <w:p>
@@ -154,7 +154,7 @@
         <w:rPr>
           <w:rFonts w:ascii="Yu Gothic" w:cs="Yu Gothic" w:eastAsia="Yu Gothic" w:hAnsi="Yu Gothic"/>
         </w:rPr>
-        <w:t xml:space="preserve">台本を、パネルに収まる文字数で自動的に区切る（「。」「、」や改行を優先）</w:t>
+        <w:t xml:space="preserve">Wordファイル（.docx／.doc）を選ぶだけで、表紙・本文・ふりがな・字下げを読み込み、パネルに収まるよう自動で区切る</w:t>
       </w:r>
     </w:p>
     <w:p>
@@ -218,309 +218,32 @@
         <w:rPr>
           <w:rFonts w:ascii="Yu Gothic" w:cs="Yu Gothic" w:eastAsia="Yu Gothic" w:hAnsi="Yu Gothic"/>
         </w:rPr>
-        <w:t xml:space="preserve">1.2 2つのツールの使い分け</w:t>
-      </w:r>
-    </w:p>
-    <w:tbl>
-      <w:tblPr>
-        <w:tblW w:type="dxa" w:w="9638"/>
-        <w:tblBorders>
-          <w:top w:val="single" w:color="auto" w:sz="4"/>
-          <w:left w:val="single" w:color="auto" w:sz="4"/>
-          <w:bottom w:val="single" w:color="auto" w:sz="4"/>
-          <w:right w:val="single" w:color="auto" w:sz="4"/>
-          <w:insideH w:val="single" w:color="auto" w:sz="4"/>
-          <w:insideV w:val="single" w:color="auto" w:sz="4"/>
-        </w:tblBorders>
-      </w:tblPr>
-      <w:tblGrid>
-        <w:gridCol w:w="2700"/>
-        <w:gridCol w:w="2400"/>
-        <w:gridCol w:w="4538"/>
-      </w:tblGrid>
-      <w:tr>
-        <w:trPr>
-          <w:tblHeader/>
-        </w:trPr>
-        <w:tc>
-          <w:tcPr>
-            <w:tcW w:type="dxa" w:w="2700"/>
-            <w:tcBorders>
-              <w:top w:val="single" w:color="C9CEC0" w:sz="4"/>
-              <w:left w:val="single" w:color="C9CEC0" w:sz="4"/>
-              <w:bottom w:val="single" w:color="C9CEC0" w:sz="4"/>
-              <w:right w:val="single" w:color="C9CEC0" w:sz="4"/>
-            </w:tcBorders>
-            <w:shd w:fill="E6ECF3" w:color="auto" w:val="clear"/>
-            <w:tcMar>
-              <w:top w:type="dxa" w:w="70"/>
-              <w:left w:type="dxa" w:w="110"/>
-              <w:bottom w:type="dxa" w:w="70"/>
-              <w:right w:type="dxa" w:w="110"/>
-            </w:tcMar>
-          </w:tcPr>
-          <w:p>
-            <w:pPr>
-              <w:spacing w:after="0" w:line="300"/>
-            </w:pPr>
-            <w:r>
-              <w:rPr>
-                <w:rFonts w:ascii="Yu Gothic" w:cs="Yu Gothic" w:eastAsia="Yu Gothic" w:hAnsi="Yu Gothic"/>
-                <w:b/>
-                <w:bCs/>
-                <w:color w:val="2B4C6F"/>
-              </w:rPr>
-              <w:t xml:space="preserve">ファイル</w:t>
-            </w:r>
-          </w:p>
-        </w:tc>
-        <w:tc>
-          <w:tcPr>
-            <w:tcW w:type="dxa" w:w="2400"/>
-            <w:tcBorders>
-              <w:top w:val="single" w:color="C9CEC0" w:sz="4"/>
-              <w:left w:val="single" w:color="C9CEC0" w:sz="4"/>
-              <w:bottom w:val="single" w:color="C9CEC0" w:sz="4"/>
-              <w:right w:val="single" w:color="C9CEC0" w:sz="4"/>
-            </w:tcBorders>
-            <w:shd w:fill="E6ECF3" w:color="auto" w:val="clear"/>
-            <w:tcMar>
-              <w:top w:type="dxa" w:w="70"/>
-              <w:left w:type="dxa" w:w="110"/>
-              <w:bottom w:type="dxa" w:w="70"/>
-              <w:right w:type="dxa" w:w="110"/>
-            </w:tcMar>
-          </w:tcPr>
-          <w:p>
-            <w:pPr>
-              <w:spacing w:after="0" w:line="300"/>
-            </w:pPr>
-            <w:r>
-              <w:rPr>
-                <w:rFonts w:ascii="Yu Gothic" w:cs="Yu Gothic" w:eastAsia="Yu Gothic" w:hAnsi="Yu Gothic"/>
-                <w:b/>
-                <w:bCs/>
-                <w:color w:val="2B4C6F"/>
-              </w:rPr>
-              <w:t xml:space="preserve">名称</w:t>
-            </w:r>
-          </w:p>
-        </w:tc>
-        <w:tc>
-          <w:tcPr>
-            <w:tcW w:type="dxa" w:w="4538"/>
-            <w:tcBorders>
-              <w:top w:val="single" w:color="C9CEC0" w:sz="4"/>
-              <w:left w:val="single" w:color="C9CEC0" w:sz="4"/>
-              <w:bottom w:val="single" w:color="C9CEC0" w:sz="4"/>
-              <w:right w:val="single" w:color="C9CEC0" w:sz="4"/>
-            </w:tcBorders>
-            <w:shd w:fill="E6ECF3" w:color="auto" w:val="clear"/>
-            <w:tcMar>
-              <w:top w:type="dxa" w:w="70"/>
-              <w:left w:type="dxa" w:w="110"/>
-              <w:bottom w:type="dxa" w:w="70"/>
-              <w:right w:type="dxa" w:w="110"/>
-            </w:tcMar>
-          </w:tcPr>
-          <w:p>
-            <w:pPr>
-              <w:spacing w:after="0" w:line="300"/>
-            </w:pPr>
-            <w:r>
-              <w:rPr>
-                <w:rFonts w:ascii="Yu Gothic" w:cs="Yu Gothic" w:eastAsia="Yu Gothic" w:hAnsi="Yu Gothic"/>
-                <w:b/>
-                <w:bCs/>
-                <w:color w:val="2B4C6F"/>
-              </w:rPr>
-              <w:t xml:space="preserve">使いどころ</w:t>
-            </w:r>
-          </w:p>
-        </w:tc>
-      </w:tr>
-      <w:tr>
-        <w:tc>
-          <w:tcPr>
-            <w:tcW w:type="dxa" w:w="2700"/>
-            <w:tcBorders>
-              <w:top w:val="single" w:color="C9CEC0" w:sz="4"/>
-              <w:left w:val="single" w:color="C9CEC0" w:sz="4"/>
-              <w:bottom w:val="single" w:color="C9CEC0" w:sz="4"/>
-              <w:right w:val="single" w:color="C9CEC0" w:sz="4"/>
-            </w:tcBorders>
-            <w:tcMar>
-              <w:top w:type="dxa" w:w="70"/>
-              <w:left w:type="dxa" w:w="110"/>
-              <w:bottom w:type="dxa" w:w="70"/>
-              <w:right w:type="dxa" w:w="110"/>
-            </w:tcMar>
-          </w:tcPr>
-          <w:p>
-            <w:pPr>
-              <w:spacing w:after="0" w:line="300"/>
-            </w:pPr>
-            <w:r>
-              <w:rPr>
-                <w:rFonts w:ascii="Yu Gothic" w:cs="Yu Gothic" w:eastAsia="Yu Gothic" w:hAnsi="Yu Gothic"/>
-              </w:rPr>
-              <w:t xml:space="preserve">jabara-word-import.html</w:t>
-            </w:r>
-          </w:p>
-        </w:tc>
-        <w:tc>
-          <w:tcPr>
-            <w:tcW w:type="dxa" w:w="2400"/>
-            <w:tcBorders>
-              <w:top w:val="single" w:color="C9CEC0" w:sz="4"/>
-              <w:left w:val="single" w:color="C9CEC0" w:sz="4"/>
-              <w:bottom w:val="single" w:color="C9CEC0" w:sz="4"/>
-              <w:right w:val="single" w:color="C9CEC0" w:sz="4"/>
-            </w:tcBorders>
-            <w:tcMar>
-              <w:top w:type="dxa" w:w="70"/>
-              <w:left w:type="dxa" w:w="110"/>
-              <w:bottom w:type="dxa" w:w="70"/>
-              <w:right w:type="dxa" w:w="110"/>
-            </w:tcMar>
-          </w:tcPr>
-          <w:p>
-            <w:pPr>
-              <w:spacing w:after="0" w:line="300"/>
-            </w:pPr>
-            <w:r>
-              <w:rPr>
-                <w:rFonts w:ascii="Yu Gothic" w:cs="Yu Gothic" w:eastAsia="Yu Gothic" w:hAnsi="Yu Gothic"/>
-              </w:rPr>
-              <w:t xml:space="preserve">Word読み込み版（おすすめ）</w:t>
-            </w:r>
-          </w:p>
-        </w:tc>
-        <w:tc>
-          <w:tcPr>
-            <w:tcW w:type="dxa" w:w="4538"/>
-            <w:tcBorders>
-              <w:top w:val="single" w:color="C9CEC0" w:sz="4"/>
-              <w:left w:val="single" w:color="C9CEC0" w:sz="4"/>
-              <w:bottom w:val="single" w:color="C9CEC0" w:sz="4"/>
-              <w:right w:val="single" w:color="C9CEC0" w:sz="4"/>
-            </w:tcBorders>
-            <w:tcMar>
-              <w:top w:type="dxa" w:w="70"/>
-              <w:left w:type="dxa" w:w="110"/>
-              <w:bottom w:type="dxa" w:w="70"/>
-              <w:right w:type="dxa" w:w="110"/>
-            </w:tcMar>
-          </w:tcPr>
-          <w:p>
-            <w:pPr>
-              <w:spacing w:after="0" w:line="300"/>
-            </w:pPr>
-            <w:r>
-              <w:rPr>
-                <w:rFonts w:ascii="Yu Gothic" w:cs="Yu Gothic" w:eastAsia="Yu Gothic" w:hAnsi="Yu Gothic"/>
-              </w:rPr>
-              <w:t xml:space="preserve">Wordで作った祝辞（.docx／.doc）を選ぶだけ。表紙・本文・ふりがな・字下げ・パネルの区切りまで自動で入ります。</w:t>
-            </w:r>
-          </w:p>
-        </w:tc>
-      </w:tr>
-      <w:tr>
-        <w:tc>
-          <w:tcPr>
-            <w:tcW w:type="dxa" w:w="2700"/>
-            <w:tcBorders>
-              <w:top w:val="single" w:color="C9CEC0" w:sz="4"/>
-              <w:left w:val="single" w:color="C9CEC0" w:sz="4"/>
-              <w:bottom w:val="single" w:color="C9CEC0" w:sz="4"/>
-              <w:right w:val="single" w:color="C9CEC0" w:sz="4"/>
-            </w:tcBorders>
-            <w:tcMar>
-              <w:top w:type="dxa" w:w="70"/>
-              <w:left w:type="dxa" w:w="110"/>
-              <w:bottom w:type="dxa" w:w="70"/>
-              <w:right w:type="dxa" w:w="110"/>
-            </w:tcMar>
-          </w:tcPr>
-          <w:p>
-            <w:pPr>
-              <w:spacing w:after="0" w:line="300"/>
-            </w:pPr>
-            <w:r>
-              <w:rPr>
-                <w:rFonts w:ascii="Yu Gothic" w:cs="Yu Gothic" w:eastAsia="Yu Gothic" w:hAnsi="Yu Gothic"/>
-              </w:rPr>
-              <w:t xml:space="preserve">jabara-shukuji.html</w:t>
-            </w:r>
-          </w:p>
-        </w:tc>
-        <w:tc>
-          <w:tcPr>
-            <w:tcW w:type="dxa" w:w="2400"/>
-            <w:tcBorders>
-              <w:top w:val="single" w:color="C9CEC0" w:sz="4"/>
-              <w:left w:val="single" w:color="C9CEC0" w:sz="4"/>
-              <w:bottom w:val="single" w:color="C9CEC0" w:sz="4"/>
-              <w:right w:val="single" w:color="C9CEC0" w:sz="4"/>
-            </w:tcBorders>
-            <w:tcMar>
-              <w:top w:type="dxa" w:w="70"/>
-              <w:left w:type="dxa" w:w="110"/>
-              <w:bottom w:type="dxa" w:w="70"/>
-              <w:right w:type="dxa" w:w="110"/>
-            </w:tcMar>
-          </w:tcPr>
-          <w:p>
-            <w:pPr>
-              <w:spacing w:after="0" w:line="300"/>
-            </w:pPr>
-            <w:r>
-              <w:rPr>
-                <w:rFonts w:ascii="Yu Gothic" w:cs="Yu Gothic" w:eastAsia="Yu Gothic" w:hAnsi="Yu Gothic"/>
-              </w:rPr>
-              <w:t xml:space="preserve">蛇腹祝辞メーカー</w:t>
-            </w:r>
-          </w:p>
-        </w:tc>
-        <w:tc>
-          <w:tcPr>
-            <w:tcW w:type="dxa" w:w="4538"/>
-            <w:tcBorders>
-              <w:top w:val="single" w:color="C9CEC0" w:sz="4"/>
-              <w:left w:val="single" w:color="C9CEC0" w:sz="4"/>
-              <w:bottom w:val="single" w:color="C9CEC0" w:sz="4"/>
-              <w:right w:val="single" w:color="C9CEC0" w:sz="4"/>
-            </w:tcBorders>
-            <w:tcMar>
-              <w:top w:type="dxa" w:w="70"/>
-              <w:left w:type="dxa" w:w="110"/>
-              <w:bottom w:type="dxa" w:w="70"/>
-              <w:right w:type="dxa" w:w="110"/>
-            </w:tcMar>
-          </w:tcPr>
-          <w:p>
-            <w:pPr>
-              <w:spacing w:after="0" w:line="300"/>
-            </w:pPr>
-            <w:r>
-              <w:rPr>
-                <w:rFonts w:ascii="Yu Gothic" w:cs="Yu Gothic" w:eastAsia="Yu Gothic" w:hAnsi="Yu Gothic"/>
-              </w:rPr>
-              <w:t xml:space="preserve">台本（テキスト）を貼り付けて、自動でパネルに区切る。Wordのファイルが無いとき向け。</w:t>
-            </w:r>
-          </w:p>
-        </w:tc>
-      </w:tr>
-    </w:tbl>
-    <w:p>
-      <w:pPr>
-        <w:spacing w:after="120" w:before="120" w:line="320"/>
-      </w:pPr>
-      <w:r>
-        <w:rPr>
-          <w:rFonts w:ascii="Yu Gothic" w:cs="Yu Gothic" w:eastAsia="Yu Gothic" w:hAnsi="Yu Gothic"/>
-        </w:rPr>
-        <w:t xml:space="preserve">迷ったら「Word読み込み版」を使ってください。入力欄・設定・印刷方法は両ツールで共通で、違いは「台本を一括入力する欄」が「Wordファイルを読み込む欄」に置き換わっている点だけです。</w:t>
+        <w:t xml:space="preserve">1.2 使うファイル</w:t>
+      </w:r>
+    </w:p>
+    <w:p>
+      <w:pPr>
+        <w:spacing w:after="120" w:line="320"/>
+      </w:pPr>
+      <w:r>
+        <w:rPr>
+          <w:rFonts w:ascii="Yu Gothic" w:cs="Yu Gothic" w:eastAsia="Yu Gothic" w:hAnsi="Yu Gothic"/>
+        </w:rPr>
+        <w:t xml:space="preserve">ファイル名は </w:t>
+      </w:r>
+      <w:r>
+        <w:rPr>
+          <w:rFonts w:ascii="Yu Gothic" w:cs="Yu Gothic" w:eastAsia="Yu Gothic" w:hAnsi="Yu Gothic"/>
+          <w:b/>
+          <w:bCs/>
+        </w:rPr>
+        <w:t xml:space="preserve">jabara-word-import.html</w:t>
+      </w:r>
+      <w:r>
+        <w:rPr>
+          <w:rFonts w:ascii="Yu Gothic" w:cs="Yu Gothic" w:eastAsia="Yu Gothic" w:hAnsi="Yu Gothic"/>
+        </w:rPr>
+        <w:t xml:space="preserve">（Word読み込み版）です。ブラウザで開くだけで使えます。</w:t>
       </w:r>
     </w:p>
     <w:p>
@@ -579,7 +302,7 @@
         <w:rPr>
           <w:rFonts w:ascii="Yu Gothic" w:cs="Yu Gothic" w:eastAsia="Yu Gothic" w:hAnsi="Yu Gothic"/>
         </w:rPr>
-        <w:t xml:space="preserve">入力内容はブラウザ内だけで処理され、外部には送信されません。一方で保存機能はないため、ページを再読み込みすると初期状態に戻ります。作業を中断するときは、台本を別途テキストなどで保管してください。</w:t>
+        <w:t xml:space="preserve">入力内容はブラウザ内だけで処理され、外部には送信されません。一方で保存機能はないため、ページを再読み込みすると初期状態に戻ります。作業を中断するときは、元のWordファイルを保管しておけば、いつでも読み込み直せます。</w:t>
       </w:r>
     </w:p>
     <w:p>
@@ -1145,7 +868,7 @@
               <w:rPr>
                 <w:rFonts w:ascii="Yu Gothic" w:cs="Yu Gothic" w:eastAsia="Yu Gothic" w:hAnsi="Yu Gothic"/>
               </w:rPr>
-              <w:t xml:space="preserve">ふりがなの追加・修正（3.6）</w:t>
+              <w:t xml:space="preserve">ふりがなの追加・修正（3.5）</w:t>
             </w:r>
           </w:p>
         </w:tc>
@@ -1203,7 +926,7 @@
               <w:rPr>
                 <w:rFonts w:ascii="Yu Gothic" w:cs="Yu Gothic" w:eastAsia="Yu Gothic" w:hAnsi="Yu Gothic"/>
               </w:rPr>
-              <w:t xml:space="preserve">署名の位置：最後のパネルの「スペース自動調整」（3.8）</w:t>
+              <w:t xml:space="preserve">署名の位置：最後のパネルの「スペース自動調整」（3.7）</w:t>
             </w:r>
           </w:p>
         </w:tc>
@@ -1249,7 +972,7 @@
           </w:tcPr>
           <w:p>
             <w:pPr>
-              <w:spacing w:after="60" w:line="300"/>
+              <w:spacing w:after="0" w:line="300"/>
             </w:pPr>
             <w:r>
               <w:rPr>
@@ -1265,17 +988,6 @@
                 <w:rFonts w:ascii="Yu Gothic" w:cs="Yu Gothic" w:eastAsia="Yu Gothic" w:hAnsi="Yu Gothic"/>
               </w:rPr>
               <w:t xml:space="preserve">テキストボックスが無く、本文の行だけのWordファイルでも読み込めます。その場合は「。」「、」の位置を見て、自然な区切りでパネルに分けます（表紙は空のままなので、必要なら上の手動ボタンで指定します）。</w:t>
-            </w:r>
-          </w:p>
-          <w:p>
-            <w:pPr>
-              <w:spacing w:after="0" w:line="300"/>
-            </w:pPr>
-            <w:r>
-              <w:rPr>
-                <w:rFonts w:ascii="Yu Gothic" w:cs="Yu Gothic" w:eastAsia="Yu Gothic" w:hAnsi="Yu Gothic"/>
-              </w:rPr>
-              <w:t xml:space="preserve">Wordファイルが無いときは「蛇腹祝辞メーカー」を使い、台本を貼り付けて「パネルに反映」を押します（3.3）。</w:t>
             </w:r>
           </w:p>
         </w:tc>
@@ -1891,7 +1603,7 @@
               <w:rPr>
                 <w:rFonts w:ascii="Yu Gothic" w:cs="Yu Gothic" w:eastAsia="Yu Gothic" w:hAnsi="Yu Gothic"/>
               </w:rPr>
-              <w:t xml:space="preserve">全パネル共通の文字サイズ。パネルごとに上書きもできます（3.5）。</w:t>
+              <w:t xml:space="preserve">全パネル共通の文字サイズ。パネルごとに上書きもできます（3.4）。</w:t>
             </w:r>
           </w:p>
         </w:tc>
@@ -2326,7 +2038,7 @@
         <w:rPr>
           <w:rFonts w:ascii="Yu Gothic" w:cs="Yu Gothic" w:eastAsia="Yu Gothic" w:hAnsi="Yu Gothic"/>
         </w:rPr>
-        <w:t xml:space="preserve">3.3 台本を一括入力する（蛇腹祝辞メーカー）</w:t>
+        <w:t xml:space="preserve">3.3 Wordファイルを読み込む（Word読み込み版）</w:t>
       </w:r>
     </w:p>
     <w:p>
@@ -2337,9 +2049,9 @@
       <w:r>
         <w:drawing>
           <wp:inline distT="0" distB="0" distL="0" distR="0">
-            <wp:extent cx="5334000" cy="1876425"/>
+            <wp:extent cx="5334000" cy="1171575"/>
             <wp:effectExtent t="0" r="0" b="0" l="0"/>
-            <wp:docPr id="6" name="台本を一括入力する欄" descr="台本を一括入力する欄" title="台本を一括入力する欄"/>
+            <wp:docPr id="6" name="Wordファイルを読み込む欄" descr="Wordファイルを読み込む欄" title="Wordファイルを読み込む欄"/>
             <wp:cNvGraphicFramePr>
               <a:graphicFrameLocks xmlns:a="http://schemas.openxmlformats.org/drawingml/2006/main" noChangeAspect="1"/>
             </wp:cNvGraphicFramePr>
@@ -2362,7 +2074,7 @@
                   <pic:spPr bwMode="auto">
                     <a:xfrm>
                       <a:off x="0" y="0"/>
-                      <a:ext cx="5334000" cy="1876425"/>
+                      <a:ext cx="5334000" cy="1171575"/>
                     </a:xfrm>
                     <a:prstGeom prst="rect">
                       <a:avLst/>
@@ -2387,7 +2099,7 @@
           <w:sz w:val="18"/>
           <w:szCs w:val="18"/>
         </w:rPr>
-        <w:t xml:space="preserve">図3　台本を一括入力する欄</w:t>
+        <w:t xml:space="preserve">図4　Wordファイルを読み込む欄</w:t>
       </w:r>
     </w:p>
     <w:p>
@@ -2403,7 +2115,7 @@
         <w:rPr>
           <w:rFonts w:ascii="Yu Gothic" w:cs="Yu Gothic" w:eastAsia="Yu Gothic" w:hAnsi="Yu Gothic"/>
         </w:rPr>
-        <w:t xml:space="preserve">台本をそのまま貼り付けます。</w:t>
+        <w:t xml:space="preserve">「ファイルを選択」で Wordファイル（.docx、または旧形式の .doc）を選びます。</w:t>
       </w:r>
     </w:p>
     <w:p>
@@ -2419,7 +2131,20 @@
         <w:rPr>
           <w:rFonts w:ascii="Yu Gothic" w:cs="Yu Gothic" w:eastAsia="Yu Gothic" w:hAnsi="Yu Gothic"/>
         </w:rPr>
-        <w:t xml:space="preserve">「パネルに反映」を押すと、現在のパネル幅・文字サイズに収まる文字数を目安に、「。」「、」や改行を優先して自動でパネルに区切られます。</w:t>
+        <w:t xml:space="preserve">「パネルに反映」を押すと、パネルの一覧が読み込んだ内容に置き換わります。</w:t>
+      </w:r>
+    </w:p>
+    <w:p>
+      <w:pPr>
+        <w:spacing w:after="60" w:before="80"/>
+      </w:pPr>
+      <w:r>
+        <w:rPr>
+          <w:rFonts w:ascii="Yu Gothic" w:cs="Yu Gothic" w:eastAsia="Yu Gothic" w:hAnsi="Yu Gothic"/>
+          <w:b/>
+          <w:bCs/>
+        </w:rPr>
+        <w:t xml:space="preserve">読み込みのルール</w:t>
       </w:r>
     </w:p>
     <w:p>
@@ -2427,26 +2152,127 @@
         <w:pStyle w:val="ListParagraph"/>
         <w:numPr>
           <w:ilvl w:val="0"/>
-          <w:numId w:val="3"/>
+          <w:numId w:val="2"/>
         </w:numPr>
-        <w:spacing w:after="80" w:line="320"/>
-      </w:pPr>
-      <w:r>
-        <w:rPr>
-          <w:rFonts w:ascii="Yu Gothic" w:cs="Yu Gothic" w:eastAsia="Yu Gothic" w:hAnsi="Yu Gothic"/>
-        </w:rPr>
-        <w:t xml:space="preserve">意図した位置で必ず区切りたいときは、その位置に空行を入れます（空行では必ず区切られます）。</w:t>
-      </w:r>
-    </w:p>
-    <w:p>
-      <w:pPr>
-        <w:spacing w:after="120" w:line="320"/>
-      </w:pPr>
-      <w:r>
-        <w:rPr>
-          <w:rFonts w:ascii="Yu Gothic" w:cs="Yu Gothic" w:eastAsia="Yu Gothic" w:hAnsi="Yu Gothic"/>
-        </w:rPr>
-        <w:t xml:space="preserve">すでにパネルがある状態で押すと、ボタンが「もう一度押すと置き換えます」に変わります。今のパネル一覧を上書きしてよければ、もう一度押してください（数秒で元に戻ります）。</w:t>
+        <w:spacing w:after="60" w:line="320"/>
+      </w:pPr>
+      <w:r>
+        <w:rPr>
+          <w:rFonts w:ascii="Yu Gothic" w:cs="Yu Gothic" w:eastAsia="Yu Gothic" w:hAnsi="Yu Gothic"/>
+        </w:rPr>
+        <w:t xml:space="preserve">Wordのテキストボックス1つが、1つのパネルになります。</w:t>
+      </w:r>
+    </w:p>
+    <w:p>
+      <w:pPr>
+        <w:pStyle w:val="ListParagraph"/>
+        <w:numPr>
+          <w:ilvl w:val="0"/>
+          <w:numId w:val="2"/>
+        </w:numPr>
+        <w:spacing w:after="60" w:line="320"/>
+      </w:pPr>
+      <w:r>
+        <w:rPr>
+          <w:rFonts w:ascii="Yu Gothic" w:cs="Yu Gothic" w:eastAsia="Yu Gothic" w:hAnsi="Yu Gothic"/>
+        </w:rPr>
+        <w:t xml:space="preserve">テキストボックスが無く、本文の行だけのファイルは、1パネルの最大行数に収まるように、文末（「。」）や段落の頭で区切って自動でパネルに分けます（4行なら2行＋2行のように、できるだけ均等に分けます）。「大宝(だいほう)」のように、漢字の直後にひらがなをかっこで入れた書き方は、ふりがなとして読み込みます。</w:t>
+      </w:r>
+    </w:p>
+    <w:p>
+      <w:pPr>
+        <w:pStyle w:val="ListParagraph"/>
+        <w:numPr>
+          <w:ilvl w:val="0"/>
+          <w:numId w:val="2"/>
+        </w:numPr>
+        <w:spacing w:after="60" w:line="320"/>
+      </w:pPr>
+      <w:r>
+        <w:rPr>
+          <w:rFonts w:ascii="Yu Gothic" w:cs="Yu Gothic" w:eastAsia="Yu Gothic" w:hAnsi="Yu Gothic"/>
+        </w:rPr>
+        <w:t xml:space="preserve">文字サイズが明らかに大きいものは表紙タイトル、日付や会場らしい文言（「○年○月」「開式」「会館」など）を含むものは表紙サブタイトルとして自動判定し、表紙欄に振り分けます。本文パネルとは重複しません。判定できないときは通常のパネルとして読み込みます。</w:t>
+      </w:r>
+    </w:p>
+    <w:p>
+      <w:pPr>
+        <w:pStyle w:val="ListParagraph"/>
+        <w:numPr>
+          <w:ilvl w:val="0"/>
+          <w:numId w:val="2"/>
+        </w:numPr>
+        <w:spacing w:after="60" w:line="320"/>
+      </w:pPr>
+      <w:r>
+        <w:rPr>
+          <w:rFonts w:ascii="Yu Gothic" w:cs="Yu Gothic" w:eastAsia="Yu Gothic" w:hAnsi="Yu Gothic"/>
+        </w:rPr>
+        <w:t xml:space="preserve">Wordのふりがな（ルビ）は「文字[よみ]」の形式に変換されます。</w:t>
+      </w:r>
+    </w:p>
+    <w:p>
+      <w:pPr>
+        <w:pStyle w:val="ListParagraph"/>
+        <w:numPr>
+          <w:ilvl w:val="0"/>
+          <w:numId w:val="2"/>
+        </w:numPr>
+        <w:spacing w:after="60" w:line="320"/>
+      </w:pPr>
+      <w:r>
+        <w:rPr>
+          <w:rFonts w:ascii="Yu Gothic" w:cs="Yu Gothic" w:eastAsia="Yu Gothic" w:hAnsi="Yu Gothic"/>
+        </w:rPr>
+        <w:t xml:space="preserve">段落の字下げ（先頭行のインデント）は、全角スペースとして再現されます。</w:t>
+      </w:r>
+    </w:p>
+    <w:p>
+      <w:pPr>
+        <w:pStyle w:val="ListParagraph"/>
+        <w:numPr>
+          <w:ilvl w:val="0"/>
+          <w:numId w:val="2"/>
+        </w:numPr>
+        <w:spacing w:after="60" w:line="320"/>
+      </w:pPr>
+      <w:r>
+        <w:rPr>
+          <w:rFonts w:ascii="Yu Gothic" w:cs="Yu Gothic" w:eastAsia="Yu Gothic" w:hAnsi="Yu Gothic"/>
+        </w:rPr>
+        <w:t xml:space="preserve">文字サイズで見分けられないファイルでも、「開式」「午前」「会館」などの文言があれば、サブタイトルとその直前のタイトルを文言から判定します。</w:t>
+      </w:r>
+    </w:p>
+    <w:p>
+      <w:pPr>
+        <w:pStyle w:val="ListParagraph"/>
+        <w:numPr>
+          <w:ilvl w:val="0"/>
+          <w:numId w:val="2"/>
+        </w:numPr>
+        <w:spacing w:after="60" w:line="320"/>
+      </w:pPr>
+      <w:r>
+        <w:rPr>
+          <w:rFonts w:ascii="Yu Gothic" w:cs="Yu Gothic" w:eastAsia="Yu Gothic" w:hAnsi="Yu Gothic"/>
+        </w:rPr>
+        <w:t xml:space="preserve">自動判定できなかったときは、反映後にパネル一覧の「表紙タイトルにする」「表紙サブタイトルにする」ボタンで手動で指定できます（そのパネルの文言が表紙欄に移り、パネルは一覧から消えます）。</w:t>
+      </w:r>
+    </w:p>
+    <w:p>
+      <w:pPr>
+        <w:pStyle w:val="ListParagraph"/>
+        <w:numPr>
+          <w:ilvl w:val="0"/>
+          <w:numId w:val="2"/>
+        </w:numPr>
+        <w:spacing w:after="60" w:line="320"/>
+      </w:pPr>
+      <w:r>
+        <w:rPr>
+          <w:rFonts w:ascii="Yu Gothic" w:cs="Yu Gothic" w:eastAsia="Yu Gothic" w:hAnsi="Yu Gothic"/>
+        </w:rPr>
+        <w:t xml:space="preserve">テキストボックスの順番はファイル内部の順序です。実際の読み順と違うときは、パネルごとの「▲」「▼」ボタンで並べ替えます。</w:t>
       </w:r>
     </w:p>
     <w:p>
@@ -2462,7 +2288,7 @@
         <w:rPr>
           <w:rFonts w:ascii="Yu Gothic" w:cs="Yu Gothic" w:eastAsia="Yu Gothic" w:hAnsi="Yu Gothic"/>
         </w:rPr>
-        <w:t xml:space="preserve">3.4 Wordファイルを読み込む（Word読み込み版）</w:t>
+        <w:t xml:space="preserve">3.4 パネルごとの文言</w:t>
       </w:r>
     </w:p>
     <w:p>
@@ -2473,9 +2299,9 @@
       <w:r>
         <w:drawing>
           <wp:inline distT="0" distB="0" distL="0" distR="0">
-            <wp:extent cx="5334000" cy="1171575"/>
+            <wp:extent cx="5334000" cy="4695825"/>
             <wp:effectExtent t="0" r="0" b="0" l="0"/>
-            <wp:docPr id="7" name="Wordファイルを読み込む欄" descr="Wordファイルを読み込む欄" title="Wordファイルを読み込む欄"/>
+            <wp:docPr id="7" name="パネルごとの文言の欄" descr="パネルごとの文言の欄" title="パネルごとの文言の欄"/>
             <wp:cNvGraphicFramePr>
               <a:graphicFrameLocks xmlns:a="http://schemas.openxmlformats.org/drawingml/2006/main" noChangeAspect="1"/>
             </wp:cNvGraphicFramePr>
@@ -2498,7 +2324,7 @@
                   <pic:spPr bwMode="auto">
                     <a:xfrm>
                       <a:off x="0" y="0"/>
-                      <a:ext cx="5334000" cy="1171575"/>
+                      <a:ext cx="5334000" cy="4695825"/>
                     </a:xfrm>
                     <a:prstGeom prst="rect">
                       <a:avLst/>
@@ -2523,7 +2349,154 @@
           <w:sz w:val="18"/>
           <w:szCs w:val="18"/>
         </w:rPr>
-        <w:t xml:space="preserve">図4　Wordファイルを読み込む欄</w:t>
+        <w:t xml:space="preserve">図5　パネルごとの文言の欄</w:t>
+      </w:r>
+    </w:p>
+    <w:p>
+      <w:pPr>
+        <w:spacing w:after="120" w:line="320"/>
+      </w:pPr>
+      <w:r>
+        <w:rPr>
+          <w:rFonts w:ascii="Yu Gothic" w:cs="Yu Gothic" w:eastAsia="Yu Gothic" w:hAnsi="Yu Gothic"/>
+        </w:rPr>
+        <w:t xml:space="preserve">パネルは右から順に並びます。各行には、番号・文言・文字数・文字サイズ・削除ボタン（×）があります。</w:t>
+      </w:r>
+    </w:p>
+    <w:p>
+      <w:pPr>
+        <w:pStyle w:val="ListParagraph"/>
+        <w:numPr>
+          <w:ilvl w:val="0"/>
+          <w:numId w:val="2"/>
+        </w:numPr>
+        <w:spacing w:after="60" w:line="320"/>
+      </w:pPr>
+      <w:r>
+        <w:rPr>
+          <w:rFonts w:ascii="Yu Gothic" w:cs="Yu Gothic" w:eastAsia="Yu Gothic" w:hAnsi="Yu Gothic"/>
+          <w:b/>
+          <w:bCs/>
+        </w:rPr>
+        <w:t xml:space="preserve">改行：</w:t>
+      </w:r>
+      <w:r>
+        <w:rPr>
+          <w:rFonts w:ascii="Yu Gothic" w:cs="Yu Gothic" w:eastAsia="Yu Gothic" w:hAnsi="Yu Gothic"/>
+        </w:rPr>
+        <w:t xml:space="preserve">Enterで改行すると、次の行（列）に送られます。</w:t>
+      </w:r>
+    </w:p>
+    <w:p>
+      <w:pPr>
+        <w:pStyle w:val="ListParagraph"/>
+        <w:numPr>
+          <w:ilvl w:val="0"/>
+          <w:numId w:val="2"/>
+        </w:numPr>
+        <w:spacing w:after="60" w:line="320"/>
+      </w:pPr>
+      <w:r>
+        <w:rPr>
+          <w:rFonts w:ascii="Yu Gothic" w:cs="Yu Gothic" w:eastAsia="Yu Gothic" w:hAnsi="Yu Gothic"/>
+          <w:b/>
+          <w:bCs/>
+        </w:rPr>
+        <w:t xml:space="preserve">文字サイズ：</w:t>
+      </w:r>
+      <w:r>
+        <w:rPr>
+          <w:rFonts w:ascii="Yu Gothic" w:cs="Yu Gothic" w:eastAsia="Yu Gothic" w:hAnsi="Yu Gothic"/>
+        </w:rPr>
+        <w:t xml:space="preserve">空欄なら全体設定の文字サイズを使います。そのパネルだけ変えたいときに数値を入れます。</w:t>
+      </w:r>
+    </w:p>
+    <w:p>
+      <w:pPr>
+        <w:pStyle w:val="ListParagraph"/>
+        <w:numPr>
+          <w:ilvl w:val="0"/>
+          <w:numId w:val="2"/>
+        </w:numPr>
+        <w:spacing w:after="60" w:line="320"/>
+      </w:pPr>
+      <w:r>
+        <w:rPr>
+          <w:rFonts w:ascii="Yu Gothic" w:cs="Yu Gothic" w:eastAsia="Yu Gothic" w:hAnsi="Yu Gothic"/>
+          <w:b/>
+          <w:bCs/>
+        </w:rPr>
+        <w:t xml:space="preserve">文言を消す：</w:t>
+      </w:r>
+      <w:r>
+        <w:rPr>
+          <w:rFonts w:ascii="Yu Gothic" w:cs="Yu Gothic" w:eastAsia="Yu Gothic" w:hAnsi="Yu Gothic"/>
+        </w:rPr>
+        <w:t xml:space="preserve">そのパネルの文言だけを消します。</w:t>
+      </w:r>
+    </w:p>
+    <w:p>
+      <w:pPr>
+        <w:pStyle w:val="ListParagraph"/>
+        <w:numPr>
+          <w:ilvl w:val="0"/>
+          <w:numId w:val="2"/>
+        </w:numPr>
+        <w:spacing w:after="60" w:line="320"/>
+      </w:pPr>
+      <w:r>
+        <w:rPr>
+          <w:rFonts w:ascii="Yu Gothic" w:cs="Yu Gothic" w:eastAsia="Yu Gothic" w:hAnsi="Yu Gothic"/>
+          <w:b/>
+          <w:bCs/>
+        </w:rPr>
+        <w:t xml:space="preserve">＋ パネルを追加：</w:t>
+      </w:r>
+      <w:r>
+        <w:rPr>
+          <w:rFonts w:ascii="Yu Gothic" w:cs="Yu Gothic" w:eastAsia="Yu Gothic" w:hAnsi="Yu Gothic"/>
+        </w:rPr>
+        <w:t xml:space="preserve">末尾に空のパネルを追加します。</w:t>
+      </w:r>
+    </w:p>
+    <w:p>
+      <w:pPr>
+        <w:pStyle w:val="ListParagraph"/>
+        <w:numPr>
+          <w:ilvl w:val="0"/>
+          <w:numId w:val="2"/>
+        </w:numPr>
+        <w:spacing w:after="60" w:line="320"/>
+      </w:pPr>
+      <w:r>
+        <w:rPr>
+          <w:rFonts w:ascii="Yu Gothic" w:cs="Yu Gothic" w:eastAsia="Yu Gothic" w:hAnsi="Yu Gothic"/>
+          <w:b/>
+          <w:bCs/>
+        </w:rPr>
+        <w:t xml:space="preserve">全パネルの文言を一括削除：</w:t>
+      </w:r>
+      <w:r>
+        <w:rPr>
+          <w:rFonts w:ascii="Yu Gothic" w:cs="Yu Gothic" w:eastAsia="Yu Gothic" w:hAnsi="Yu Gothic"/>
+        </w:rPr>
+        <w:t xml:space="preserve">全パネルを空欄にします。誤操作防止のため、ボタンが「もう一度押すと全て空欄にします」に変わるので、もう一度押すと実行されます。</w:t>
+      </w:r>
+    </w:p>
+    <w:p>
+      <w:pPr>
+        <w:spacing w:after="60"/>
+      </w:pPr>
+    </w:p>
+    <w:p>
+      <w:pPr>
+        <w:pStyle w:val="Heading2"/>
+      </w:pPr>
+      <w:r>
+        <w:rPr>
+          <w:rFonts w:ascii="Yu Gothic" w:cs="Yu Gothic" w:eastAsia="Yu Gothic" w:hAnsi="Yu Gothic"/>
+        </w:rPr>
+        <w:t xml:space="preserve">3.5 ふりがなを付ける</w:t>
       </w:r>
     </w:p>
     <w:p>
@@ -2539,7 +2512,7 @@
         <w:rPr>
           <w:rFonts w:ascii="Yu Gothic" w:cs="Yu Gothic" w:eastAsia="Yu Gothic" w:hAnsi="Yu Gothic"/>
         </w:rPr>
-        <w:t xml:space="preserve">「ファイルを選択」で Wordファイル（.docx、または旧形式の .doc）を選びます。</w:t>
+        <w:t xml:space="preserve">ふりがなを付けたい漢字（またはカタカナ）を、文言の中でドラッグして選択します。</w:t>
       </w:r>
     </w:p>
     <w:p>
@@ -2555,20 +2528,548 @@
         <w:rPr>
           <w:rFonts w:ascii="Yu Gothic" w:cs="Yu Gothic" w:eastAsia="Yu Gothic" w:hAnsi="Yu Gothic"/>
         </w:rPr>
-        <w:t xml:space="preserve">「パネルに反映」を押すと、パネルの一覧が読み込んだ内容に置き換わります。</w:t>
-      </w:r>
-    </w:p>
-    <w:p>
-      <w:pPr>
-        <w:spacing w:after="60" w:before="80"/>
-      </w:pPr>
-      <w:r>
-        <w:rPr>
-          <w:rFonts w:ascii="Yu Gothic" w:cs="Yu Gothic" w:eastAsia="Yu Gothic" w:hAnsi="Yu Gothic"/>
-          <w:b/>
-          <w:bCs/>
-        </w:rPr>
-        <w:t xml:space="preserve">読み込みのルール</w:t>
+        <w:t xml:space="preserve">「ふりがなを付ける」ボタンを押し、表示された欄によみを入力します。</w:t>
+      </w:r>
+    </w:p>
+    <w:p>
+      <w:pPr>
+        <w:pStyle w:val="ListParagraph"/>
+        <w:numPr>
+          <w:ilvl w:val="0"/>
+          <w:numId w:val="3"/>
+        </w:numPr>
+        <w:spacing w:after="80" w:line="320"/>
+      </w:pPr>
+      <w:r>
+        <w:rPr>
+          <w:rFonts w:ascii="Yu Gothic" w:cs="Yu Gothic" w:eastAsia="Yu Gothic" w:hAnsi="Yu Gothic"/>
+        </w:rPr>
+        <w:t xml:space="preserve">「追加」（またはEnterキー）で確定します。やめるときは「キャンセル」（またはEscキー）。</w:t>
+      </w:r>
+    </w:p>
+    <w:p>
+      <w:pPr>
+        <w:spacing w:after="120" w:line="320"/>
+      </w:pPr>
+      <w:r>
+        <w:rPr>
+          <w:rFonts w:ascii="Yu Gothic" w:cs="Yu Gothic" w:eastAsia="Yu Gothic" w:hAnsi="Yu Gothic"/>
+        </w:rPr>
+        <w:t xml:space="preserve">文言には「本日[ほんじつ]」のように、大かっこの中によみが入った形で記録されます。この形式は直接入力しても構いません。</w:t>
+      </w:r>
+    </w:p>
+    <w:p>
+      <w:pPr>
+        <w:spacing w:after="40"/>
+      </w:pPr>
+    </w:p>
+    <w:tbl>
+      <w:tblPr>
+        <w:tblW w:type="dxa" w:w="9638"/>
+        <w:tblBorders>
+          <w:top w:val="single" w:color="auto" w:sz="4"/>
+          <w:left w:val="single" w:color="auto" w:sz="4"/>
+          <w:bottom w:val="single" w:color="auto" w:sz="4"/>
+          <w:right w:val="single" w:color="auto" w:sz="4"/>
+          <w:insideH w:val="single" w:color="auto" w:sz="4"/>
+          <w:insideV w:val="single" w:color="auto" w:sz="4"/>
+        </w:tblBorders>
+      </w:tblPr>
+      <w:tblGrid>
+        <w:gridCol w:w="3000"/>
+        <w:gridCol w:w="3000"/>
+        <w:gridCol w:w="3638"/>
+      </w:tblGrid>
+      <w:tr>
+        <w:trPr>
+          <w:tblHeader/>
+        </w:trPr>
+        <w:tc>
+          <w:tcPr>
+            <w:tcW w:type="dxa" w:w="3000"/>
+            <w:tcBorders>
+              <w:top w:val="single" w:color="C9CEC0" w:sz="4"/>
+              <w:left w:val="single" w:color="C9CEC0" w:sz="4"/>
+              <w:bottom w:val="single" w:color="C9CEC0" w:sz="4"/>
+              <w:right w:val="single" w:color="C9CEC0" w:sz="4"/>
+            </w:tcBorders>
+            <w:shd w:fill="E6ECF3" w:color="auto" w:val="clear"/>
+            <w:tcMar>
+              <w:top w:type="dxa" w:w="70"/>
+              <w:left w:type="dxa" w:w="110"/>
+              <w:bottom w:type="dxa" w:w="70"/>
+              <w:right w:type="dxa" w:w="110"/>
+            </w:tcMar>
+          </w:tcPr>
+          <w:p>
+            <w:pPr>
+              <w:spacing w:after="0" w:line="300"/>
+            </w:pPr>
+            <w:r>
+              <w:rPr>
+                <w:rFonts w:ascii="Yu Gothic" w:cs="Yu Gothic" w:eastAsia="Yu Gothic" w:hAnsi="Yu Gothic"/>
+                <w:b/>
+                <w:bCs/>
+                <w:color w:val="2B4C6F"/>
+              </w:rPr>
+              <w:t xml:space="preserve">入力</w:t>
+            </w:r>
+          </w:p>
+        </w:tc>
+        <w:tc>
+          <w:tcPr>
+            <w:tcW w:type="dxa" w:w="3000"/>
+            <w:tcBorders>
+              <w:top w:val="single" w:color="C9CEC0" w:sz="4"/>
+              <w:left w:val="single" w:color="C9CEC0" w:sz="4"/>
+              <w:bottom w:val="single" w:color="C9CEC0" w:sz="4"/>
+              <w:right w:val="single" w:color="C9CEC0" w:sz="4"/>
+            </w:tcBorders>
+            <w:shd w:fill="E6ECF3" w:color="auto" w:val="clear"/>
+            <w:tcMar>
+              <w:top w:type="dxa" w:w="70"/>
+              <w:left w:type="dxa" w:w="110"/>
+              <w:bottom w:type="dxa" w:w="70"/>
+              <w:right w:type="dxa" w:w="110"/>
+            </w:tcMar>
+          </w:tcPr>
+          <w:p>
+            <w:pPr>
+              <w:spacing w:after="0" w:line="300"/>
+            </w:pPr>
+            <w:r>
+              <w:rPr>
+                <w:rFonts w:ascii="Yu Gothic" w:cs="Yu Gothic" w:eastAsia="Yu Gothic" w:hAnsi="Yu Gothic"/>
+                <w:b/>
+                <w:bCs/>
+                <w:color w:val="2B4C6F"/>
+              </w:rPr>
+              <w:t xml:space="preserve">表示</w:t>
+            </w:r>
+          </w:p>
+        </w:tc>
+        <w:tc>
+          <w:tcPr>
+            <w:tcW w:type="dxa" w:w="3638"/>
+            <w:tcBorders>
+              <w:top w:val="single" w:color="C9CEC0" w:sz="4"/>
+              <w:left w:val="single" w:color="C9CEC0" w:sz="4"/>
+              <w:bottom w:val="single" w:color="C9CEC0" w:sz="4"/>
+              <w:right w:val="single" w:color="C9CEC0" w:sz="4"/>
+            </w:tcBorders>
+            <w:shd w:fill="E6ECF3" w:color="auto" w:val="clear"/>
+            <w:tcMar>
+              <w:top w:type="dxa" w:w="70"/>
+              <w:left w:type="dxa" w:w="110"/>
+              <w:bottom w:type="dxa" w:w="70"/>
+              <w:right w:type="dxa" w:w="110"/>
+            </w:tcMar>
+          </w:tcPr>
+          <w:p>
+            <w:pPr>
+              <w:spacing w:after="0" w:line="300"/>
+            </w:pPr>
+            <w:r>
+              <w:rPr>
+                <w:rFonts w:ascii="Yu Gothic" w:cs="Yu Gothic" w:eastAsia="Yu Gothic" w:hAnsi="Yu Gothic"/>
+                <w:b/>
+                <w:bCs/>
+                <w:color w:val="2B4C6F"/>
+              </w:rPr>
+              <w:t xml:space="preserve">ポイント</w:t>
+            </w:r>
+          </w:p>
+        </w:tc>
+      </w:tr>
+      <w:tr>
+        <w:tc>
+          <w:tcPr>
+            <w:tcW w:type="dxa" w:w="3000"/>
+            <w:tcBorders>
+              <w:top w:val="single" w:color="C9CEC0" w:sz="4"/>
+              <w:left w:val="single" w:color="C9CEC0" w:sz="4"/>
+              <w:bottom w:val="single" w:color="C9CEC0" w:sz="4"/>
+              <w:right w:val="single" w:color="C9CEC0" w:sz="4"/>
+            </w:tcBorders>
+            <w:tcMar>
+              <w:top w:type="dxa" w:w="70"/>
+              <w:left w:type="dxa" w:w="110"/>
+              <w:bottom w:type="dxa" w:w="70"/>
+              <w:right w:type="dxa" w:w="110"/>
+            </w:tcMar>
+          </w:tcPr>
+          <w:p>
+            <w:pPr>
+              <w:spacing w:after="0" w:line="300"/>
+            </w:pPr>
+            <w:r>
+              <w:rPr>
+                <w:rFonts w:ascii="Yu Gothic" w:cs="Yu Gothic" w:eastAsia="Yu Gothic" w:hAnsi="Yu Gothic"/>
+              </w:rPr>
+              <w:t xml:space="preserve">本日[ほんじつ]、ここに</w:t>
+            </w:r>
+          </w:p>
+        </w:tc>
+        <w:tc>
+          <w:tcPr>
+            <w:tcW w:type="dxa" w:w="3000"/>
+            <w:tcBorders>
+              <w:top w:val="single" w:color="C9CEC0" w:sz="4"/>
+              <w:left w:val="single" w:color="C9CEC0" w:sz="4"/>
+              <w:bottom w:val="single" w:color="C9CEC0" w:sz="4"/>
+              <w:right w:val="single" w:color="C9CEC0" w:sz="4"/>
+            </w:tcBorders>
+            <w:tcMar>
+              <w:top w:type="dxa" w:w="70"/>
+              <w:left w:type="dxa" w:w="110"/>
+              <w:bottom w:type="dxa" w:w="70"/>
+              <w:right w:type="dxa" w:w="110"/>
+            </w:tcMar>
+          </w:tcPr>
+          <w:p>
+            <w:pPr>
+              <w:spacing w:after="0" w:line="300"/>
+            </w:pPr>
+            <w:r>
+              <w:rPr>
+                <w:rFonts w:ascii="Yu Gothic" w:cs="Yu Gothic" w:eastAsia="Yu Gothic" w:hAnsi="Yu Gothic"/>
+              </w:rPr>
+              <w:t xml:space="preserve">本日にほんじつ</w:t>
+            </w:r>
+          </w:p>
+        </w:tc>
+        <w:tc>
+          <w:tcPr>
+            <w:tcW w:type="dxa" w:w="3638"/>
+            <w:tcBorders>
+              <w:top w:val="single" w:color="C9CEC0" w:sz="4"/>
+              <w:left w:val="single" w:color="C9CEC0" w:sz="4"/>
+              <w:bottom w:val="single" w:color="C9CEC0" w:sz="4"/>
+              <w:right w:val="single" w:color="C9CEC0" w:sz="4"/>
+            </w:tcBorders>
+            <w:tcMar>
+              <w:top w:type="dxa" w:w="70"/>
+              <w:left w:type="dxa" w:w="110"/>
+              <w:bottom w:type="dxa" w:w="70"/>
+              <w:right w:type="dxa" w:w="110"/>
+            </w:tcMar>
+          </w:tcPr>
+          <w:p>
+            <w:pPr>
+              <w:spacing w:after="0" w:line="300"/>
+            </w:pPr>
+            <w:r>
+              <w:rPr>
+                <w:rFonts w:ascii="Yu Gothic" w:cs="Yu Gothic" w:eastAsia="Yu Gothic" w:hAnsi="Yu Gothic"/>
+              </w:rPr>
+              <w:t xml:space="preserve">熟語は、まとまりごとに1つの［　］で。</w:t>
+            </w:r>
+          </w:p>
+        </w:tc>
+      </w:tr>
+      <w:tr>
+        <w:tc>
+          <w:tcPr>
+            <w:tcW w:type="dxa" w:w="3000"/>
+            <w:tcBorders>
+              <w:top w:val="single" w:color="C9CEC0" w:sz="4"/>
+              <w:left w:val="single" w:color="C9CEC0" w:sz="4"/>
+              <w:bottom w:val="single" w:color="C9CEC0" w:sz="4"/>
+              <w:right w:val="single" w:color="C9CEC0" w:sz="4"/>
+            </w:tcBorders>
+            <w:tcMar>
+              <w:top w:type="dxa" w:w="70"/>
+              <w:left w:type="dxa" w:w="110"/>
+              <w:bottom w:type="dxa" w:w="70"/>
+              <w:right w:type="dxa" w:w="110"/>
+            </w:tcMar>
+          </w:tcPr>
+          <w:p>
+            <w:pPr>
+              <w:spacing w:after="0" w:line="300"/>
+            </w:pPr>
+            <w:r>
+              <w:rPr>
+                <w:rFonts w:ascii="Yu Gothic" w:cs="Yu Gothic" w:eastAsia="Yu Gothic" w:hAnsi="Yu Gothic"/>
+              </w:rPr>
+              <w:t xml:space="preserve">心[こころ]よりお慶[よろこ]び</w:t>
+            </w:r>
+          </w:p>
+        </w:tc>
+        <w:tc>
+          <w:tcPr>
+            <w:tcW w:type="dxa" w:w="3000"/>
+            <w:tcBorders>
+              <w:top w:val="single" w:color="C9CEC0" w:sz="4"/>
+              <w:left w:val="single" w:color="C9CEC0" w:sz="4"/>
+              <w:bottom w:val="single" w:color="C9CEC0" w:sz="4"/>
+              <w:right w:val="single" w:color="C9CEC0" w:sz="4"/>
+            </w:tcBorders>
+            <w:tcMar>
+              <w:top w:type="dxa" w:w="70"/>
+              <w:left w:type="dxa" w:w="110"/>
+              <w:bottom w:type="dxa" w:w="70"/>
+              <w:right w:type="dxa" w:w="110"/>
+            </w:tcMar>
+          </w:tcPr>
+          <w:p>
+            <w:pPr>
+              <w:spacing w:after="0" w:line="300"/>
+            </w:pPr>
+            <w:r>
+              <w:rPr>
+                <w:rFonts w:ascii="Yu Gothic" w:cs="Yu Gothic" w:eastAsia="Yu Gothic" w:hAnsi="Yu Gothic"/>
+              </w:rPr>
+              <w:t xml:space="preserve">心・慶にふりがな</w:t>
+            </w:r>
+          </w:p>
+        </w:tc>
+        <w:tc>
+          <w:tcPr>
+            <w:tcW w:type="dxa" w:w="3638"/>
+            <w:tcBorders>
+              <w:top w:val="single" w:color="C9CEC0" w:sz="4"/>
+              <w:left w:val="single" w:color="C9CEC0" w:sz="4"/>
+              <w:bottom w:val="single" w:color="C9CEC0" w:sz="4"/>
+              <w:right w:val="single" w:color="C9CEC0" w:sz="4"/>
+            </w:tcBorders>
+            <w:tcMar>
+              <w:top w:type="dxa" w:w="70"/>
+              <w:left w:type="dxa" w:w="110"/>
+              <w:bottom w:type="dxa" w:w="70"/>
+              <w:right w:type="dxa" w:w="110"/>
+            </w:tcMar>
+          </w:tcPr>
+          <w:p>
+            <w:pPr>
+              <w:spacing w:after="0" w:line="300"/>
+            </w:pPr>
+            <w:r>
+              <w:rPr>
+                <w:rFonts w:ascii="Yu Gothic" w:cs="Yu Gothic" w:eastAsia="Yu Gothic" w:hAnsi="Yu Gothic"/>
+              </w:rPr>
+              <w:t xml:space="preserve">送り仮名（ひらがな）は［　］の外に出す。</w:t>
+            </w:r>
+          </w:p>
+        </w:tc>
+      </w:tr>
+      <w:tr>
+        <w:tc>
+          <w:tcPr>
+            <w:tcW w:type="dxa" w:w="3000"/>
+            <w:tcBorders>
+              <w:top w:val="single" w:color="C9CEC0" w:sz="4"/>
+              <w:left w:val="single" w:color="C9CEC0" w:sz="4"/>
+              <w:bottom w:val="single" w:color="C9CEC0" w:sz="4"/>
+              <w:right w:val="single" w:color="C9CEC0" w:sz="4"/>
+            </w:tcBorders>
+            <w:tcMar>
+              <w:top w:type="dxa" w:w="70"/>
+              <w:left w:type="dxa" w:w="110"/>
+              <w:bottom w:type="dxa" w:w="70"/>
+              <w:right w:type="dxa" w:w="110"/>
+            </w:tcMar>
+          </w:tcPr>
+          <w:p>
+            <w:pPr>
+              <w:spacing w:after="0" w:line="300"/>
+            </w:pPr>
+            <w:r>
+              <w:rPr>
+                <w:rFonts w:ascii="Yu Gothic" w:cs="Yu Gothic" w:eastAsia="Yu Gothic" w:hAnsi="Yu Gothic"/>
+              </w:rPr>
+              <w:t xml:space="preserve">○○市[まるまるし]</w:t>
+            </w:r>
+          </w:p>
+        </w:tc>
+        <w:tc>
+          <w:tcPr>
+            <w:tcW w:type="dxa" w:w="3000"/>
+            <w:tcBorders>
+              <w:top w:val="single" w:color="C9CEC0" w:sz="4"/>
+              <w:left w:val="single" w:color="C9CEC0" w:sz="4"/>
+              <w:bottom w:val="single" w:color="C9CEC0" w:sz="4"/>
+              <w:right w:val="single" w:color="C9CEC0" w:sz="4"/>
+            </w:tcBorders>
+            <w:tcMar>
+              <w:top w:type="dxa" w:w="70"/>
+              <w:left w:type="dxa" w:w="110"/>
+              <w:bottom w:type="dxa" w:w="70"/>
+              <w:right w:type="dxa" w:w="110"/>
+            </w:tcMar>
+          </w:tcPr>
+          <w:p>
+            <w:pPr>
+              <w:spacing w:after="0" w:line="300"/>
+            </w:pPr>
+            <w:r>
+              <w:rPr>
+                <w:rFonts w:ascii="Yu Gothic" w:cs="Yu Gothic" w:eastAsia="Yu Gothic" w:hAnsi="Yu Gothic"/>
+              </w:rPr>
+              <w:t xml:space="preserve">○○市にまるまるし</w:t>
+            </w:r>
+          </w:p>
+        </w:tc>
+        <w:tc>
+          <w:tcPr>
+            <w:tcW w:type="dxa" w:w="3638"/>
+            <w:tcBorders>
+              <w:top w:val="single" w:color="C9CEC0" w:sz="4"/>
+              <w:left w:val="single" w:color="C9CEC0" w:sz="4"/>
+              <w:bottom w:val="single" w:color="C9CEC0" w:sz="4"/>
+              <w:right w:val="single" w:color="C9CEC0" w:sz="4"/>
+            </w:tcBorders>
+            <w:tcMar>
+              <w:top w:type="dxa" w:w="70"/>
+              <w:left w:type="dxa" w:w="110"/>
+              <w:bottom w:type="dxa" w:w="70"/>
+              <w:right w:type="dxa" w:w="110"/>
+            </w:tcMar>
+          </w:tcPr>
+          <w:p>
+            <w:pPr>
+              <w:spacing w:after="0" w:line="300"/>
+            </w:pPr>
+            <w:r>
+              <w:rPr>
+                <w:rFonts w:ascii="Yu Gothic" w:cs="Yu Gothic" w:eastAsia="Yu Gothic" w:hAnsi="Yu Gothic"/>
+              </w:rPr>
+              <w:t xml:space="preserve">「○」の伏せ字にもふりがなを付けられる。</w:t>
+            </w:r>
+          </w:p>
+        </w:tc>
+      </w:tr>
+    </w:tbl>
+    <w:p>
+      <w:pPr>
+        <w:spacing w:after="80"/>
+      </w:pPr>
+    </w:p>
+    <w:tbl>
+      <w:tblPr>
+        <w:tblW w:type="dxa" w:w="9638"/>
+        <w:tblBorders>
+          <w:top w:val="single" w:color="auto" w:sz="4"/>
+          <w:left w:val="single" w:color="auto" w:sz="4"/>
+          <w:bottom w:val="single" w:color="auto" w:sz="4"/>
+          <w:right w:val="single" w:color="auto" w:sz="4"/>
+          <w:insideH w:val="single" w:color="auto" w:sz="4"/>
+          <w:insideV w:val="single" w:color="auto" w:sz="4"/>
+        </w:tblBorders>
+      </w:tblPr>
+      <w:tblGrid>
+        <w:gridCol w:w="9638"/>
+      </w:tblGrid>
+      <w:tr>
+        <w:tc>
+          <w:tcPr>
+            <w:tcW w:type="dxa" w:w="9638"/>
+            <w:tcBorders>
+              <w:top w:val="none" w:color="FFFFFF" w:sz="0"/>
+              <w:left w:val="single" w:color="B26A00" w:sz="24"/>
+              <w:bottom w:val="none" w:color="FFFFFF" w:sz="0"/>
+              <w:right w:val="none" w:color="FFFFFF" w:sz="0"/>
+            </w:tcBorders>
+            <w:shd w:fill="FFF6E5" w:color="auto" w:val="clear"/>
+            <w:tcMar>
+              <w:top w:type="dxa" w:w="100"/>
+              <w:left w:type="dxa" w:w="180"/>
+              <w:bottom w:type="dxa" w:w="100"/>
+              <w:right w:type="dxa" w:w="140"/>
+            </w:tcMar>
+          </w:tcPr>
+          <w:p>
+            <w:pPr>
+              <w:spacing w:after="0" w:line="300"/>
+            </w:pPr>
+            <w:r>
+              <w:rPr>
+                <w:rFonts w:ascii="Yu Gothic" w:cs="Yu Gothic" w:eastAsia="Yu Gothic" w:hAnsi="Yu Gothic"/>
+                <w:b/>
+                <w:bCs/>
+                <w:color w:val="B26A00"/>
+              </w:rPr>
+              <w:t xml:space="preserve">注意　</w:t>
+            </w:r>
+            <w:r>
+              <w:rPr>
+                <w:rFonts w:ascii="Yu Gothic" w:cs="Yu Gothic" w:eastAsia="Yu Gothic" w:hAnsi="Yu Gothic"/>
+              </w:rPr>
+              <w:t xml:space="preserve">ひらがなを含む範囲を選んでボタンを押すと「選択範囲にひらがなが含まれています」と表示されます。送り仮名を除き、漢字（・カタカナ）の部分だけを選び直してください。</w:t>
+            </w:r>
+          </w:p>
+        </w:tc>
+      </w:tr>
+    </w:tbl>
+    <w:p>
+      <w:pPr>
+        <w:spacing w:after="120"/>
+      </w:pPr>
+    </w:p>
+    <w:p>
+      <w:pPr>
+        <w:pStyle w:val="Heading2"/>
+      </w:pPr>
+      <w:r>
+        <w:rPr>
+          <w:rFonts w:ascii="Yu Gothic" w:cs="Yu Gothic" w:eastAsia="Yu Gothic" w:hAnsi="Yu Gothic"/>
+        </w:rPr>
+        <w:t xml:space="preserve">3.6 パネルの境目を調整する</w:t>
+      </w:r>
+    </w:p>
+    <w:p>
+      <w:pPr>
+        <w:spacing w:after="120" w:line="320"/>
+      </w:pPr>
+      <w:r>
+        <w:rPr>
+          <w:rFonts w:ascii="Yu Gothic" w:cs="Yu Gothic" w:eastAsia="Yu Gothic" w:hAnsi="Yu Gothic"/>
+        </w:rPr>
+        <w:t xml:space="preserve">移動したい文字や文を選択して、「◀ 前のパネルへ移動」または「次のパネルへ移動 ▶」を押すと、隣のパネルの先頭または末尾に移せます。ふりがなの［　］の途中だけを選ぶと移動できないので、［　］ごと選択してください。</w:t>
+      </w:r>
+    </w:p>
+    <w:p>
+      <w:pPr>
+        <w:pStyle w:val="Heading2"/>
+      </w:pPr>
+      <w:r>
+        <w:rPr>
+          <w:rFonts w:ascii="Yu Gothic" w:cs="Yu Gothic" w:eastAsia="Yu Gothic" w:hAnsi="Yu Gothic"/>
+        </w:rPr>
+        <w:t xml:space="preserve">3.7 署名パネルの字下げ</w:t>
+      </w:r>
+    </w:p>
+    <w:p>
+      <w:pPr>
+        <w:spacing w:after="120" w:line="320"/>
+      </w:pPr>
+      <w:r>
+        <w:rPr>
+          <w:rFonts w:ascii="Yu Gothic" w:cs="Yu Gothic" w:eastAsia="Yu Gothic" w:hAnsi="Yu Gothic"/>
+        </w:rPr>
+        <w:t xml:space="preserve">最後のパネル（日付と署名）には「スペース自動調整」ボタンがあります。押すと、1行目（日付）の先頭の空白を取り除き、2行目（署名）の先頭に全角5文字分の空白を入れます。</w:t>
+      </w:r>
+    </w:p>
+    <w:p>
+      <w:pPr>
+        <w:pStyle w:val="Heading2"/>
+      </w:pPr>
+      <w:r>
+        <w:rPr>
+          <w:rFonts w:ascii="Yu Gothic" w:cs="Yu Gothic" w:eastAsia="Yu Gothic" w:hAnsi="Yu Gothic"/>
+        </w:rPr>
+        <w:t xml:space="preserve">3.8 はみ出しの警告</w:t>
+      </w:r>
+    </w:p>
+    <w:p>
+      <w:pPr>
+        <w:spacing w:after="120" w:line="320"/>
+      </w:pPr>
+      <w:r>
+        <w:rPr>
+          <w:rFonts w:ascii="Yu Gothic" w:cs="Yu Gothic" w:eastAsia="Yu Gothic" w:hAnsi="Yu Gothic"/>
+        </w:rPr>
+        <w:t xml:space="preserve">文字がパネルからはみ出す、または最大行数を超えると、プレビューのそのパネルが赤枠になり「文字数オーバー」「行数オーバー」のバッジが出ます。対処は次のいずれかです。</w:t>
       </w:r>
     </w:p>
     <w:p>
@@ -2584,7 +3085,7 @@
         <w:rPr>
           <w:rFonts w:ascii="Yu Gothic" w:cs="Yu Gothic" w:eastAsia="Yu Gothic" w:hAnsi="Yu Gothic"/>
         </w:rPr>
-        <w:t xml:space="preserve">Wordのテキストボックス1つが、1つのパネルになります。</w:t>
+        <w:t xml:space="preserve">そのパネルの文字サイズを小さくする</w:t>
       </w:r>
     </w:p>
     <w:p>
@@ -2600,7 +3101,7 @@
         <w:rPr>
           <w:rFonts w:ascii="Yu Gothic" w:cs="Yu Gothic" w:eastAsia="Yu Gothic" w:hAnsi="Yu Gothic"/>
         </w:rPr>
-        <w:t xml:space="preserve">テキストボックスが無く、本文の行だけのファイルは、1パネルの最大行数に収まるように、文末（「。」）や段落の頭で区切って自動でパネルに分けます（4行なら2行＋2行のように、できるだけ均等に分けます）。「大宝(だいほう)」のように、漢字の直後にひらがなをかっこで入れた書き方は、ふりがなとして読み込みます。</w:t>
+        <w:t xml:space="preserve">前後のパネルに文言を移動する（3.6）</w:t>
       </w:r>
     </w:p>
     <w:p>
@@ -2616,7 +3117,18 @@
         <w:rPr>
           <w:rFonts w:ascii="Yu Gothic" w:cs="Yu Gothic" w:eastAsia="Yu Gothic" w:hAnsi="Yu Gothic"/>
         </w:rPr>
-        <w:t xml:space="preserve">文字サイズが明らかに大きいものは表紙タイトル、日付や会場らしい文言（「○年○月」「開式」「会館」など）を含むものは表紙サブタイトルとして自動判定し、表紙欄に振り分けます。本文パネルとは重複しません。判定できないときは通常のパネルとして読み込みます。</w:t>
+        <w:t xml:space="preserve">パネルを追加して文言を分ける</w:t>
+      </w:r>
+    </w:p>
+    <w:p>
+      <w:pPr>
+        <w:pStyle w:val="Heading2"/>
+      </w:pPr>
+      <w:r>
+        <w:rPr>
+          <w:rFonts w:ascii="Yu Gothic" w:cs="Yu Gothic" w:eastAsia="Yu Gothic" w:hAnsi="Yu Gothic"/>
+        </w:rPr>
+        <w:t xml:space="preserve">3.9 プレビューの見方</w:t>
       </w:r>
     </w:p>
     <w:p>
@@ -2632,7 +3144,7 @@
         <w:rPr>
           <w:rFonts w:ascii="Yu Gothic" w:cs="Yu Gothic" w:eastAsia="Yu Gothic" w:hAnsi="Yu Gothic"/>
         </w:rPr>
-        <w:t xml:space="preserve">Wordのふりがな（ルビ）は「文字[よみ]」の形式に変換されます。</w:t>
+        <w:t xml:space="preserve">用紙が1枚ずつ下に並び、パネルは右から左へ順に並びます（縦書きの読み順）。</w:t>
       </w:r>
     </w:p>
     <w:p>
@@ -2648,7 +3160,7 @@
         <w:rPr>
           <w:rFonts w:ascii="Yu Gothic" w:cs="Yu Gothic" w:eastAsia="Yu Gothic" w:hAnsi="Yu Gothic"/>
         </w:rPr>
-        <w:t xml:space="preserve">段落の字下げ（先頭行のインデント）は、全角スペースとして再現されます。</w:t>
+        <w:t xml:space="preserve">赤い点線が折り線で、「山」「谷」のラベルが交互に付きます。</w:t>
       </w:r>
     </w:p>
     <w:p>
@@ -2664,7 +3176,7 @@
         <w:rPr>
           <w:rFonts w:ascii="Yu Gothic" w:cs="Yu Gothic" w:eastAsia="Yu Gothic" w:hAnsi="Yu Gothic"/>
         </w:rPr>
-        <w:t xml:space="preserve">文字サイズで見分けられないファイルでも、「開式」「午前」「会館」などの文言があれば、サブタイトルとその直前のタイトルを文言から判定します。</w:t>
+        <w:t xml:space="preserve">斜線の帯が「のりしろ」です。</w:t>
       </w:r>
     </w:p>
     <w:p>
@@ -2680,39 +3192,23 @@
         <w:rPr>
           <w:rFonts w:ascii="Yu Gothic" w:cs="Yu Gothic" w:eastAsia="Yu Gothic" w:hAnsi="Yu Gothic"/>
         </w:rPr>
-        <w:t xml:space="preserve">自動判定できなかったときは、反映後にパネル一覧の「表紙タイトルにする」「表紙サブタイトルにする」ボタンで手動で指定できます（そのパネルの文言が表紙欄に移り、パネルは一覧から消えます）。</w:t>
-      </w:r>
-    </w:p>
-    <w:p>
-      <w:pPr>
-        <w:pStyle w:val="ListParagraph"/>
-        <w:numPr>
-          <w:ilvl w:val="0"/>
-          <w:numId w:val="2"/>
-        </w:numPr>
-        <w:spacing w:after="60" w:line="320"/>
-      </w:pPr>
-      <w:r>
-        <w:rPr>
-          <w:rFonts w:ascii="Yu Gothic" w:cs="Yu Gothic" w:eastAsia="Yu Gothic" w:hAnsi="Yu Gothic"/>
-        </w:rPr>
-        <w:t xml:space="preserve">テキストボックスの順番はファイル内部の順序です。実際の読み順と違うときは、パネルごとの「▲」「▼」ボタンで並べ替えます。</w:t>
-      </w:r>
-    </w:p>
-    <w:p>
-      <w:pPr>
-        <w:spacing w:after="60"/>
-      </w:pPr>
-    </w:p>
-    <w:p>
-      <w:pPr>
-        <w:pStyle w:val="Heading2"/>
-      </w:pPr>
-      <w:r>
-        <w:rPr>
-          <w:rFonts w:ascii="Yu Gothic" w:cs="Yu Gothic" w:eastAsia="Yu Gothic" w:hAnsi="Yu Gothic"/>
-        </w:rPr>
-        <w:t xml:space="preserve">3.5 パネルごとの文言</w:t>
+        <w:t xml:space="preserve">1枚目の右端が表紙パネル（表紙を有効にしている場合）です。</w:t>
+      </w:r>
+    </w:p>
+    <w:p>
+      <w:r>
+        <w:br w:type="page"/>
+      </w:r>
+    </w:p>
+    <w:p>
+      <w:pPr>
+        <w:pStyle w:val="Heading1"/>
+      </w:pPr>
+      <w:r>
+        <w:rPr>
+          <w:rFonts w:ascii="Yu Gothic" w:cs="Yu Gothic" w:eastAsia="Yu Gothic" w:hAnsi="Yu Gothic"/>
+        </w:rPr>
+        <w:t xml:space="preserve">4. 印刷する</w:t>
       </w:r>
     </w:p>
     <w:p>
@@ -2723,9 +3219,9 @@
       <w:r>
         <w:drawing>
           <wp:inline distT="0" distB="0" distL="0" distR="0">
-            <wp:extent cx="5334000" cy="4695825"/>
+            <wp:extent cx="5334000" cy="200025"/>
             <wp:effectExtent t="0" r="0" b="0" l="0"/>
-            <wp:docPr id="8" name="パネルごとの文言の欄" descr="パネルごとの文言の欄" title="パネルごとの文言の欄"/>
+            <wp:docPr id="8" name="印刷ボタンとガイド線の切替" descr="印刷ボタンとガイド線の切替" title="印刷ボタンとガイド線の切替"/>
             <wp:cNvGraphicFramePr>
               <a:graphicFrameLocks xmlns:a="http://schemas.openxmlformats.org/drawingml/2006/main" noChangeAspect="1"/>
             </wp:cNvGraphicFramePr>
@@ -2748,926 +3244,6 @@
                   <pic:spPr bwMode="auto">
                     <a:xfrm>
                       <a:off x="0" y="0"/>
-                      <a:ext cx="5334000" cy="4695825"/>
-                    </a:xfrm>
-                    <a:prstGeom prst="rect">
-                      <a:avLst/>
-                    </a:prstGeom>
-                  </pic:spPr>
-                </pic:pic>
-              </a:graphicData>
-            </a:graphic>
-          </wp:inline>
-        </w:drawing>
-      </w:r>
-    </w:p>
-    <w:p>
-      <w:pPr>
-        <w:spacing w:after="160"/>
-        <w:jc w:val="center"/>
-      </w:pPr>
-      <w:r>
-        <w:rPr>
-          <w:rFonts w:ascii="Yu Gothic" w:cs="Yu Gothic" w:eastAsia="Yu Gothic" w:hAnsi="Yu Gothic"/>
-          <w:color w:val="5B6B7A"/>
-          <w:sz w:val="18"/>
-          <w:szCs w:val="18"/>
-        </w:rPr>
-        <w:t xml:space="preserve">図5　パネルごとの文言の欄</w:t>
-      </w:r>
-    </w:p>
-    <w:p>
-      <w:pPr>
-        <w:spacing w:after="120" w:line="320"/>
-      </w:pPr>
-      <w:r>
-        <w:rPr>
-          <w:rFonts w:ascii="Yu Gothic" w:cs="Yu Gothic" w:eastAsia="Yu Gothic" w:hAnsi="Yu Gothic"/>
-        </w:rPr>
-        <w:t xml:space="preserve">パネルは右から順に並びます。各行には、番号・文言・文字数・文字サイズ・削除ボタン（×）があります。</w:t>
-      </w:r>
-    </w:p>
-    <w:p>
-      <w:pPr>
-        <w:pStyle w:val="ListParagraph"/>
-        <w:numPr>
-          <w:ilvl w:val="0"/>
-          <w:numId w:val="2"/>
-        </w:numPr>
-        <w:spacing w:after="60" w:line="320"/>
-      </w:pPr>
-      <w:r>
-        <w:rPr>
-          <w:rFonts w:ascii="Yu Gothic" w:cs="Yu Gothic" w:eastAsia="Yu Gothic" w:hAnsi="Yu Gothic"/>
-          <w:b/>
-          <w:bCs/>
-        </w:rPr>
-        <w:t xml:space="preserve">改行：</w:t>
-      </w:r>
-      <w:r>
-        <w:rPr>
-          <w:rFonts w:ascii="Yu Gothic" w:cs="Yu Gothic" w:eastAsia="Yu Gothic" w:hAnsi="Yu Gothic"/>
-        </w:rPr>
-        <w:t xml:space="preserve">Enterで改行すると、次の行（列）に送られます。</w:t>
-      </w:r>
-    </w:p>
-    <w:p>
-      <w:pPr>
-        <w:pStyle w:val="ListParagraph"/>
-        <w:numPr>
-          <w:ilvl w:val="0"/>
-          <w:numId w:val="2"/>
-        </w:numPr>
-        <w:spacing w:after="60" w:line="320"/>
-      </w:pPr>
-      <w:r>
-        <w:rPr>
-          <w:rFonts w:ascii="Yu Gothic" w:cs="Yu Gothic" w:eastAsia="Yu Gothic" w:hAnsi="Yu Gothic"/>
-          <w:b/>
-          <w:bCs/>
-        </w:rPr>
-        <w:t xml:space="preserve">文字サイズ：</w:t>
-      </w:r>
-      <w:r>
-        <w:rPr>
-          <w:rFonts w:ascii="Yu Gothic" w:cs="Yu Gothic" w:eastAsia="Yu Gothic" w:hAnsi="Yu Gothic"/>
-        </w:rPr>
-        <w:t xml:space="preserve">空欄なら全体設定の文字サイズを使います。そのパネルだけ変えたいときに数値を入れます。</w:t>
-      </w:r>
-    </w:p>
-    <w:p>
-      <w:pPr>
-        <w:pStyle w:val="ListParagraph"/>
-        <w:numPr>
-          <w:ilvl w:val="0"/>
-          <w:numId w:val="2"/>
-        </w:numPr>
-        <w:spacing w:after="60" w:line="320"/>
-      </w:pPr>
-      <w:r>
-        <w:rPr>
-          <w:rFonts w:ascii="Yu Gothic" w:cs="Yu Gothic" w:eastAsia="Yu Gothic" w:hAnsi="Yu Gothic"/>
-          <w:b/>
-          <w:bCs/>
-        </w:rPr>
-        <w:t xml:space="preserve">文言を消す：</w:t>
-      </w:r>
-      <w:r>
-        <w:rPr>
-          <w:rFonts w:ascii="Yu Gothic" w:cs="Yu Gothic" w:eastAsia="Yu Gothic" w:hAnsi="Yu Gothic"/>
-        </w:rPr>
-        <w:t xml:space="preserve">そのパネルの文言だけを消します。</w:t>
-      </w:r>
-    </w:p>
-    <w:p>
-      <w:pPr>
-        <w:pStyle w:val="ListParagraph"/>
-        <w:numPr>
-          <w:ilvl w:val="0"/>
-          <w:numId w:val="2"/>
-        </w:numPr>
-        <w:spacing w:after="60" w:line="320"/>
-      </w:pPr>
-      <w:r>
-        <w:rPr>
-          <w:rFonts w:ascii="Yu Gothic" w:cs="Yu Gothic" w:eastAsia="Yu Gothic" w:hAnsi="Yu Gothic"/>
-          <w:b/>
-          <w:bCs/>
-        </w:rPr>
-        <w:t xml:space="preserve">＋ パネルを追加：</w:t>
-      </w:r>
-      <w:r>
-        <w:rPr>
-          <w:rFonts w:ascii="Yu Gothic" w:cs="Yu Gothic" w:eastAsia="Yu Gothic" w:hAnsi="Yu Gothic"/>
-        </w:rPr>
-        <w:t xml:space="preserve">末尾に空のパネルを追加します。</w:t>
-      </w:r>
-    </w:p>
-    <w:p>
-      <w:pPr>
-        <w:pStyle w:val="ListParagraph"/>
-        <w:numPr>
-          <w:ilvl w:val="0"/>
-          <w:numId w:val="2"/>
-        </w:numPr>
-        <w:spacing w:after="60" w:line="320"/>
-      </w:pPr>
-      <w:r>
-        <w:rPr>
-          <w:rFonts w:ascii="Yu Gothic" w:cs="Yu Gothic" w:eastAsia="Yu Gothic" w:hAnsi="Yu Gothic"/>
-          <w:b/>
-          <w:bCs/>
-        </w:rPr>
-        <w:t xml:space="preserve">全パネルの文言を一括削除：</w:t>
-      </w:r>
-      <w:r>
-        <w:rPr>
-          <w:rFonts w:ascii="Yu Gothic" w:cs="Yu Gothic" w:eastAsia="Yu Gothic" w:hAnsi="Yu Gothic"/>
-        </w:rPr>
-        <w:t xml:space="preserve">全パネルを空欄にします。誤操作防止のため、ボタンが「もう一度押すと全て空欄にします」に変わるので、もう一度押すと実行されます。</w:t>
-      </w:r>
-    </w:p>
-    <w:p>
-      <w:pPr>
-        <w:spacing w:after="60"/>
-      </w:pPr>
-    </w:p>
-    <w:p>
-      <w:pPr>
-        <w:pStyle w:val="Heading2"/>
-      </w:pPr>
-      <w:r>
-        <w:rPr>
-          <w:rFonts w:ascii="Yu Gothic" w:cs="Yu Gothic" w:eastAsia="Yu Gothic" w:hAnsi="Yu Gothic"/>
-        </w:rPr>
-        <w:t xml:space="preserve">3.6 ふりがなを付ける</w:t>
-      </w:r>
-    </w:p>
-    <w:p>
-      <w:pPr>
-        <w:pStyle w:val="ListParagraph"/>
-        <w:numPr>
-          <w:ilvl w:val="0"/>
-          <w:numId w:val="3"/>
-        </w:numPr>
-        <w:spacing w:after="80" w:line="320"/>
-      </w:pPr>
-      <w:r>
-        <w:rPr>
-          <w:rFonts w:ascii="Yu Gothic" w:cs="Yu Gothic" w:eastAsia="Yu Gothic" w:hAnsi="Yu Gothic"/>
-        </w:rPr>
-        <w:t xml:space="preserve">ふりがなを付けたい漢字（またはカタカナ）を、文言の中でドラッグして選択します。</w:t>
-      </w:r>
-    </w:p>
-    <w:p>
-      <w:pPr>
-        <w:pStyle w:val="ListParagraph"/>
-        <w:numPr>
-          <w:ilvl w:val="0"/>
-          <w:numId w:val="3"/>
-        </w:numPr>
-        <w:spacing w:after="80" w:line="320"/>
-      </w:pPr>
-      <w:r>
-        <w:rPr>
-          <w:rFonts w:ascii="Yu Gothic" w:cs="Yu Gothic" w:eastAsia="Yu Gothic" w:hAnsi="Yu Gothic"/>
-        </w:rPr>
-        <w:t xml:space="preserve">「ふりがなを付ける」ボタンを押し、表示された欄によみを入力します。</w:t>
-      </w:r>
-    </w:p>
-    <w:p>
-      <w:pPr>
-        <w:pStyle w:val="ListParagraph"/>
-        <w:numPr>
-          <w:ilvl w:val="0"/>
-          <w:numId w:val="3"/>
-        </w:numPr>
-        <w:spacing w:after="80" w:line="320"/>
-      </w:pPr>
-      <w:r>
-        <w:rPr>
-          <w:rFonts w:ascii="Yu Gothic" w:cs="Yu Gothic" w:eastAsia="Yu Gothic" w:hAnsi="Yu Gothic"/>
-        </w:rPr>
-        <w:t xml:space="preserve">「追加」（またはEnterキー）で確定します。やめるときは「キャンセル」（またはEscキー）。</w:t>
-      </w:r>
-    </w:p>
-    <w:p>
-      <w:pPr>
-        <w:spacing w:after="120" w:line="320"/>
-      </w:pPr>
-      <w:r>
-        <w:rPr>
-          <w:rFonts w:ascii="Yu Gothic" w:cs="Yu Gothic" w:eastAsia="Yu Gothic" w:hAnsi="Yu Gothic"/>
-        </w:rPr>
-        <w:t xml:space="preserve">文言には「本日[ほんじつ]」のように、大かっこの中によみが入った形で記録されます。この形式は直接入力しても構いません。</w:t>
-      </w:r>
-    </w:p>
-    <w:p>
-      <w:pPr>
-        <w:spacing w:after="40"/>
-      </w:pPr>
-    </w:p>
-    <w:tbl>
-      <w:tblPr>
-        <w:tblW w:type="dxa" w:w="9638"/>
-        <w:tblBorders>
-          <w:top w:val="single" w:color="auto" w:sz="4"/>
-          <w:left w:val="single" w:color="auto" w:sz="4"/>
-          <w:bottom w:val="single" w:color="auto" w:sz="4"/>
-          <w:right w:val="single" w:color="auto" w:sz="4"/>
-          <w:insideH w:val="single" w:color="auto" w:sz="4"/>
-          <w:insideV w:val="single" w:color="auto" w:sz="4"/>
-        </w:tblBorders>
-      </w:tblPr>
-      <w:tblGrid>
-        <w:gridCol w:w="3000"/>
-        <w:gridCol w:w="3000"/>
-        <w:gridCol w:w="3638"/>
-      </w:tblGrid>
-      <w:tr>
-        <w:trPr>
-          <w:tblHeader/>
-        </w:trPr>
-        <w:tc>
-          <w:tcPr>
-            <w:tcW w:type="dxa" w:w="3000"/>
-            <w:tcBorders>
-              <w:top w:val="single" w:color="C9CEC0" w:sz="4"/>
-              <w:left w:val="single" w:color="C9CEC0" w:sz="4"/>
-              <w:bottom w:val="single" w:color="C9CEC0" w:sz="4"/>
-              <w:right w:val="single" w:color="C9CEC0" w:sz="4"/>
-            </w:tcBorders>
-            <w:shd w:fill="E6ECF3" w:color="auto" w:val="clear"/>
-            <w:tcMar>
-              <w:top w:type="dxa" w:w="70"/>
-              <w:left w:type="dxa" w:w="110"/>
-              <w:bottom w:type="dxa" w:w="70"/>
-              <w:right w:type="dxa" w:w="110"/>
-            </w:tcMar>
-          </w:tcPr>
-          <w:p>
-            <w:pPr>
-              <w:spacing w:after="0" w:line="300"/>
-            </w:pPr>
-            <w:r>
-              <w:rPr>
-                <w:rFonts w:ascii="Yu Gothic" w:cs="Yu Gothic" w:eastAsia="Yu Gothic" w:hAnsi="Yu Gothic"/>
-                <w:b/>
-                <w:bCs/>
-                <w:color w:val="2B4C6F"/>
-              </w:rPr>
-              <w:t xml:space="preserve">入力</w:t>
-            </w:r>
-          </w:p>
-        </w:tc>
-        <w:tc>
-          <w:tcPr>
-            <w:tcW w:type="dxa" w:w="3000"/>
-            <w:tcBorders>
-              <w:top w:val="single" w:color="C9CEC0" w:sz="4"/>
-              <w:left w:val="single" w:color="C9CEC0" w:sz="4"/>
-              <w:bottom w:val="single" w:color="C9CEC0" w:sz="4"/>
-              <w:right w:val="single" w:color="C9CEC0" w:sz="4"/>
-            </w:tcBorders>
-            <w:shd w:fill="E6ECF3" w:color="auto" w:val="clear"/>
-            <w:tcMar>
-              <w:top w:type="dxa" w:w="70"/>
-              <w:left w:type="dxa" w:w="110"/>
-              <w:bottom w:type="dxa" w:w="70"/>
-              <w:right w:type="dxa" w:w="110"/>
-            </w:tcMar>
-          </w:tcPr>
-          <w:p>
-            <w:pPr>
-              <w:spacing w:after="0" w:line="300"/>
-            </w:pPr>
-            <w:r>
-              <w:rPr>
-                <w:rFonts w:ascii="Yu Gothic" w:cs="Yu Gothic" w:eastAsia="Yu Gothic" w:hAnsi="Yu Gothic"/>
-                <w:b/>
-                <w:bCs/>
-                <w:color w:val="2B4C6F"/>
-              </w:rPr>
-              <w:t xml:space="preserve">表示</w:t>
-            </w:r>
-          </w:p>
-        </w:tc>
-        <w:tc>
-          <w:tcPr>
-            <w:tcW w:type="dxa" w:w="3638"/>
-            <w:tcBorders>
-              <w:top w:val="single" w:color="C9CEC0" w:sz="4"/>
-              <w:left w:val="single" w:color="C9CEC0" w:sz="4"/>
-              <w:bottom w:val="single" w:color="C9CEC0" w:sz="4"/>
-              <w:right w:val="single" w:color="C9CEC0" w:sz="4"/>
-            </w:tcBorders>
-            <w:shd w:fill="E6ECF3" w:color="auto" w:val="clear"/>
-            <w:tcMar>
-              <w:top w:type="dxa" w:w="70"/>
-              <w:left w:type="dxa" w:w="110"/>
-              <w:bottom w:type="dxa" w:w="70"/>
-              <w:right w:type="dxa" w:w="110"/>
-            </w:tcMar>
-          </w:tcPr>
-          <w:p>
-            <w:pPr>
-              <w:spacing w:after="0" w:line="300"/>
-            </w:pPr>
-            <w:r>
-              <w:rPr>
-                <w:rFonts w:ascii="Yu Gothic" w:cs="Yu Gothic" w:eastAsia="Yu Gothic" w:hAnsi="Yu Gothic"/>
-                <w:b/>
-                <w:bCs/>
-                <w:color w:val="2B4C6F"/>
-              </w:rPr>
-              <w:t xml:space="preserve">ポイント</w:t>
-            </w:r>
-          </w:p>
-        </w:tc>
-      </w:tr>
-      <w:tr>
-        <w:tc>
-          <w:tcPr>
-            <w:tcW w:type="dxa" w:w="3000"/>
-            <w:tcBorders>
-              <w:top w:val="single" w:color="C9CEC0" w:sz="4"/>
-              <w:left w:val="single" w:color="C9CEC0" w:sz="4"/>
-              <w:bottom w:val="single" w:color="C9CEC0" w:sz="4"/>
-              <w:right w:val="single" w:color="C9CEC0" w:sz="4"/>
-            </w:tcBorders>
-            <w:tcMar>
-              <w:top w:type="dxa" w:w="70"/>
-              <w:left w:type="dxa" w:w="110"/>
-              <w:bottom w:type="dxa" w:w="70"/>
-              <w:right w:type="dxa" w:w="110"/>
-            </w:tcMar>
-          </w:tcPr>
-          <w:p>
-            <w:pPr>
-              <w:spacing w:after="0" w:line="300"/>
-            </w:pPr>
-            <w:r>
-              <w:rPr>
-                <w:rFonts w:ascii="Yu Gothic" w:cs="Yu Gothic" w:eastAsia="Yu Gothic" w:hAnsi="Yu Gothic"/>
-              </w:rPr>
-              <w:t xml:space="preserve">本日[ほんじつ]、ここに</w:t>
-            </w:r>
-          </w:p>
-        </w:tc>
-        <w:tc>
-          <w:tcPr>
-            <w:tcW w:type="dxa" w:w="3000"/>
-            <w:tcBorders>
-              <w:top w:val="single" w:color="C9CEC0" w:sz="4"/>
-              <w:left w:val="single" w:color="C9CEC0" w:sz="4"/>
-              <w:bottom w:val="single" w:color="C9CEC0" w:sz="4"/>
-              <w:right w:val="single" w:color="C9CEC0" w:sz="4"/>
-            </w:tcBorders>
-            <w:tcMar>
-              <w:top w:type="dxa" w:w="70"/>
-              <w:left w:type="dxa" w:w="110"/>
-              <w:bottom w:type="dxa" w:w="70"/>
-              <w:right w:type="dxa" w:w="110"/>
-            </w:tcMar>
-          </w:tcPr>
-          <w:p>
-            <w:pPr>
-              <w:spacing w:after="0" w:line="300"/>
-            </w:pPr>
-            <w:r>
-              <w:rPr>
-                <w:rFonts w:ascii="Yu Gothic" w:cs="Yu Gothic" w:eastAsia="Yu Gothic" w:hAnsi="Yu Gothic"/>
-              </w:rPr>
-              <w:t xml:space="preserve">本日にほんじつ</w:t>
-            </w:r>
-          </w:p>
-        </w:tc>
-        <w:tc>
-          <w:tcPr>
-            <w:tcW w:type="dxa" w:w="3638"/>
-            <w:tcBorders>
-              <w:top w:val="single" w:color="C9CEC0" w:sz="4"/>
-              <w:left w:val="single" w:color="C9CEC0" w:sz="4"/>
-              <w:bottom w:val="single" w:color="C9CEC0" w:sz="4"/>
-              <w:right w:val="single" w:color="C9CEC0" w:sz="4"/>
-            </w:tcBorders>
-            <w:tcMar>
-              <w:top w:type="dxa" w:w="70"/>
-              <w:left w:type="dxa" w:w="110"/>
-              <w:bottom w:type="dxa" w:w="70"/>
-              <w:right w:type="dxa" w:w="110"/>
-            </w:tcMar>
-          </w:tcPr>
-          <w:p>
-            <w:pPr>
-              <w:spacing w:after="0" w:line="300"/>
-            </w:pPr>
-            <w:r>
-              <w:rPr>
-                <w:rFonts w:ascii="Yu Gothic" w:cs="Yu Gothic" w:eastAsia="Yu Gothic" w:hAnsi="Yu Gothic"/>
-              </w:rPr>
-              <w:t xml:space="preserve">熟語は、まとまりごとに1つの［　］で。</w:t>
-            </w:r>
-          </w:p>
-        </w:tc>
-      </w:tr>
-      <w:tr>
-        <w:tc>
-          <w:tcPr>
-            <w:tcW w:type="dxa" w:w="3000"/>
-            <w:tcBorders>
-              <w:top w:val="single" w:color="C9CEC0" w:sz="4"/>
-              <w:left w:val="single" w:color="C9CEC0" w:sz="4"/>
-              <w:bottom w:val="single" w:color="C9CEC0" w:sz="4"/>
-              <w:right w:val="single" w:color="C9CEC0" w:sz="4"/>
-            </w:tcBorders>
-            <w:tcMar>
-              <w:top w:type="dxa" w:w="70"/>
-              <w:left w:type="dxa" w:w="110"/>
-              <w:bottom w:type="dxa" w:w="70"/>
-              <w:right w:type="dxa" w:w="110"/>
-            </w:tcMar>
-          </w:tcPr>
-          <w:p>
-            <w:pPr>
-              <w:spacing w:after="0" w:line="300"/>
-            </w:pPr>
-            <w:r>
-              <w:rPr>
-                <w:rFonts w:ascii="Yu Gothic" w:cs="Yu Gothic" w:eastAsia="Yu Gothic" w:hAnsi="Yu Gothic"/>
-              </w:rPr>
-              <w:t xml:space="preserve">心[こころ]よりお慶[よろこ]び</w:t>
-            </w:r>
-          </w:p>
-        </w:tc>
-        <w:tc>
-          <w:tcPr>
-            <w:tcW w:type="dxa" w:w="3000"/>
-            <w:tcBorders>
-              <w:top w:val="single" w:color="C9CEC0" w:sz="4"/>
-              <w:left w:val="single" w:color="C9CEC0" w:sz="4"/>
-              <w:bottom w:val="single" w:color="C9CEC0" w:sz="4"/>
-              <w:right w:val="single" w:color="C9CEC0" w:sz="4"/>
-            </w:tcBorders>
-            <w:tcMar>
-              <w:top w:type="dxa" w:w="70"/>
-              <w:left w:type="dxa" w:w="110"/>
-              <w:bottom w:type="dxa" w:w="70"/>
-              <w:right w:type="dxa" w:w="110"/>
-            </w:tcMar>
-          </w:tcPr>
-          <w:p>
-            <w:pPr>
-              <w:spacing w:after="0" w:line="300"/>
-            </w:pPr>
-            <w:r>
-              <w:rPr>
-                <w:rFonts w:ascii="Yu Gothic" w:cs="Yu Gothic" w:eastAsia="Yu Gothic" w:hAnsi="Yu Gothic"/>
-              </w:rPr>
-              <w:t xml:space="preserve">心・慶にふりがな</w:t>
-            </w:r>
-          </w:p>
-        </w:tc>
-        <w:tc>
-          <w:tcPr>
-            <w:tcW w:type="dxa" w:w="3638"/>
-            <w:tcBorders>
-              <w:top w:val="single" w:color="C9CEC0" w:sz="4"/>
-              <w:left w:val="single" w:color="C9CEC0" w:sz="4"/>
-              <w:bottom w:val="single" w:color="C9CEC0" w:sz="4"/>
-              <w:right w:val="single" w:color="C9CEC0" w:sz="4"/>
-            </w:tcBorders>
-            <w:tcMar>
-              <w:top w:type="dxa" w:w="70"/>
-              <w:left w:type="dxa" w:w="110"/>
-              <w:bottom w:type="dxa" w:w="70"/>
-              <w:right w:type="dxa" w:w="110"/>
-            </w:tcMar>
-          </w:tcPr>
-          <w:p>
-            <w:pPr>
-              <w:spacing w:after="0" w:line="300"/>
-            </w:pPr>
-            <w:r>
-              <w:rPr>
-                <w:rFonts w:ascii="Yu Gothic" w:cs="Yu Gothic" w:eastAsia="Yu Gothic" w:hAnsi="Yu Gothic"/>
-              </w:rPr>
-              <w:t xml:space="preserve">送り仮名（ひらがな）は［　］の外に出す。</w:t>
-            </w:r>
-          </w:p>
-        </w:tc>
-      </w:tr>
-      <w:tr>
-        <w:tc>
-          <w:tcPr>
-            <w:tcW w:type="dxa" w:w="3000"/>
-            <w:tcBorders>
-              <w:top w:val="single" w:color="C9CEC0" w:sz="4"/>
-              <w:left w:val="single" w:color="C9CEC0" w:sz="4"/>
-              <w:bottom w:val="single" w:color="C9CEC0" w:sz="4"/>
-              <w:right w:val="single" w:color="C9CEC0" w:sz="4"/>
-            </w:tcBorders>
-            <w:tcMar>
-              <w:top w:type="dxa" w:w="70"/>
-              <w:left w:type="dxa" w:w="110"/>
-              <w:bottom w:type="dxa" w:w="70"/>
-              <w:right w:type="dxa" w:w="110"/>
-            </w:tcMar>
-          </w:tcPr>
-          <w:p>
-            <w:pPr>
-              <w:spacing w:after="0" w:line="300"/>
-            </w:pPr>
-            <w:r>
-              <w:rPr>
-                <w:rFonts w:ascii="Yu Gothic" w:cs="Yu Gothic" w:eastAsia="Yu Gothic" w:hAnsi="Yu Gothic"/>
-              </w:rPr>
-              <w:t xml:space="preserve">○○市[まるまるし]</w:t>
-            </w:r>
-          </w:p>
-        </w:tc>
-        <w:tc>
-          <w:tcPr>
-            <w:tcW w:type="dxa" w:w="3000"/>
-            <w:tcBorders>
-              <w:top w:val="single" w:color="C9CEC0" w:sz="4"/>
-              <w:left w:val="single" w:color="C9CEC0" w:sz="4"/>
-              <w:bottom w:val="single" w:color="C9CEC0" w:sz="4"/>
-              <w:right w:val="single" w:color="C9CEC0" w:sz="4"/>
-            </w:tcBorders>
-            <w:tcMar>
-              <w:top w:type="dxa" w:w="70"/>
-              <w:left w:type="dxa" w:w="110"/>
-              <w:bottom w:type="dxa" w:w="70"/>
-              <w:right w:type="dxa" w:w="110"/>
-            </w:tcMar>
-          </w:tcPr>
-          <w:p>
-            <w:pPr>
-              <w:spacing w:after="0" w:line="300"/>
-            </w:pPr>
-            <w:r>
-              <w:rPr>
-                <w:rFonts w:ascii="Yu Gothic" w:cs="Yu Gothic" w:eastAsia="Yu Gothic" w:hAnsi="Yu Gothic"/>
-              </w:rPr>
-              <w:t xml:space="preserve">○○市にまるまるし</w:t>
-            </w:r>
-          </w:p>
-        </w:tc>
-        <w:tc>
-          <w:tcPr>
-            <w:tcW w:type="dxa" w:w="3638"/>
-            <w:tcBorders>
-              <w:top w:val="single" w:color="C9CEC0" w:sz="4"/>
-              <w:left w:val="single" w:color="C9CEC0" w:sz="4"/>
-              <w:bottom w:val="single" w:color="C9CEC0" w:sz="4"/>
-              <w:right w:val="single" w:color="C9CEC0" w:sz="4"/>
-            </w:tcBorders>
-            <w:tcMar>
-              <w:top w:type="dxa" w:w="70"/>
-              <w:left w:type="dxa" w:w="110"/>
-              <w:bottom w:type="dxa" w:w="70"/>
-              <w:right w:type="dxa" w:w="110"/>
-            </w:tcMar>
-          </w:tcPr>
-          <w:p>
-            <w:pPr>
-              <w:spacing w:after="0" w:line="300"/>
-            </w:pPr>
-            <w:r>
-              <w:rPr>
-                <w:rFonts w:ascii="Yu Gothic" w:cs="Yu Gothic" w:eastAsia="Yu Gothic" w:hAnsi="Yu Gothic"/>
-              </w:rPr>
-              <w:t xml:space="preserve">「○」の伏せ字にもふりがなを付けられる。</w:t>
-            </w:r>
-          </w:p>
-        </w:tc>
-      </w:tr>
-    </w:tbl>
-    <w:p>
-      <w:pPr>
-        <w:spacing w:after="80"/>
-      </w:pPr>
-    </w:p>
-    <w:tbl>
-      <w:tblPr>
-        <w:tblW w:type="dxa" w:w="9638"/>
-        <w:tblBorders>
-          <w:top w:val="single" w:color="auto" w:sz="4"/>
-          <w:left w:val="single" w:color="auto" w:sz="4"/>
-          <w:bottom w:val="single" w:color="auto" w:sz="4"/>
-          <w:right w:val="single" w:color="auto" w:sz="4"/>
-          <w:insideH w:val="single" w:color="auto" w:sz="4"/>
-          <w:insideV w:val="single" w:color="auto" w:sz="4"/>
-        </w:tblBorders>
-      </w:tblPr>
-      <w:tblGrid>
-        <w:gridCol w:w="9638"/>
-      </w:tblGrid>
-      <w:tr>
-        <w:tc>
-          <w:tcPr>
-            <w:tcW w:type="dxa" w:w="9638"/>
-            <w:tcBorders>
-              <w:top w:val="none" w:color="FFFFFF" w:sz="0"/>
-              <w:left w:val="single" w:color="B26A00" w:sz="24"/>
-              <w:bottom w:val="none" w:color="FFFFFF" w:sz="0"/>
-              <w:right w:val="none" w:color="FFFFFF" w:sz="0"/>
-            </w:tcBorders>
-            <w:shd w:fill="FFF6E5" w:color="auto" w:val="clear"/>
-            <w:tcMar>
-              <w:top w:type="dxa" w:w="100"/>
-              <w:left w:type="dxa" w:w="180"/>
-              <w:bottom w:type="dxa" w:w="100"/>
-              <w:right w:type="dxa" w:w="140"/>
-            </w:tcMar>
-          </w:tcPr>
-          <w:p>
-            <w:pPr>
-              <w:spacing w:after="0" w:line="300"/>
-            </w:pPr>
-            <w:r>
-              <w:rPr>
-                <w:rFonts w:ascii="Yu Gothic" w:cs="Yu Gothic" w:eastAsia="Yu Gothic" w:hAnsi="Yu Gothic"/>
-                <w:b/>
-                <w:bCs/>
-                <w:color w:val="B26A00"/>
-              </w:rPr>
-              <w:t xml:space="preserve">注意　</w:t>
-            </w:r>
-            <w:r>
-              <w:rPr>
-                <w:rFonts w:ascii="Yu Gothic" w:cs="Yu Gothic" w:eastAsia="Yu Gothic" w:hAnsi="Yu Gothic"/>
-              </w:rPr>
-              <w:t xml:space="preserve">ひらがなを含む範囲を選んでボタンを押すと「選択範囲にひらがなが含まれています」と表示されます。送り仮名を除き、漢字（・カタカナ）の部分だけを選び直してください。</w:t>
-            </w:r>
-          </w:p>
-        </w:tc>
-      </w:tr>
-    </w:tbl>
-    <w:p>
-      <w:pPr>
-        <w:spacing w:after="120"/>
-      </w:pPr>
-    </w:p>
-    <w:p>
-      <w:pPr>
-        <w:pStyle w:val="Heading2"/>
-      </w:pPr>
-      <w:r>
-        <w:rPr>
-          <w:rFonts w:ascii="Yu Gothic" w:cs="Yu Gothic" w:eastAsia="Yu Gothic" w:hAnsi="Yu Gothic"/>
-        </w:rPr>
-        <w:t xml:space="preserve">3.7 パネルの境目を調整する</w:t>
-      </w:r>
-    </w:p>
-    <w:p>
-      <w:pPr>
-        <w:spacing w:after="120" w:line="320"/>
-      </w:pPr>
-      <w:r>
-        <w:rPr>
-          <w:rFonts w:ascii="Yu Gothic" w:cs="Yu Gothic" w:eastAsia="Yu Gothic" w:hAnsi="Yu Gothic"/>
-        </w:rPr>
-        <w:t xml:space="preserve">移動したい文字や文を選択して、「◀ 前のパネルへ移動」または「次のパネルへ移動 ▶」を押すと、隣のパネルの先頭または末尾に移せます。ふりがなの［　］の途中だけを選ぶと移動できないので、［　］ごと選択してください。</w:t>
-      </w:r>
-    </w:p>
-    <w:p>
-      <w:pPr>
-        <w:pStyle w:val="Heading2"/>
-      </w:pPr>
-      <w:r>
-        <w:rPr>
-          <w:rFonts w:ascii="Yu Gothic" w:cs="Yu Gothic" w:eastAsia="Yu Gothic" w:hAnsi="Yu Gothic"/>
-        </w:rPr>
-        <w:t xml:space="preserve">3.8 署名パネルの字下げ</w:t>
-      </w:r>
-    </w:p>
-    <w:p>
-      <w:pPr>
-        <w:spacing w:after="120" w:line="320"/>
-      </w:pPr>
-      <w:r>
-        <w:rPr>
-          <w:rFonts w:ascii="Yu Gothic" w:cs="Yu Gothic" w:eastAsia="Yu Gothic" w:hAnsi="Yu Gothic"/>
-        </w:rPr>
-        <w:t xml:space="preserve">最後のパネル（日付と署名）には「スペース自動調整」ボタンがあります。押すと、1行目（日付）の先頭の空白を取り除き、2行目（署名）の先頭に全角5文字分の空白を入れます。</w:t>
-      </w:r>
-    </w:p>
-    <w:p>
-      <w:pPr>
-        <w:pStyle w:val="Heading2"/>
-      </w:pPr>
-      <w:r>
-        <w:rPr>
-          <w:rFonts w:ascii="Yu Gothic" w:cs="Yu Gothic" w:eastAsia="Yu Gothic" w:hAnsi="Yu Gothic"/>
-        </w:rPr>
-        <w:t xml:space="preserve">3.9 はみ出しの警告</w:t>
-      </w:r>
-    </w:p>
-    <w:p>
-      <w:pPr>
-        <w:spacing w:after="120" w:line="320"/>
-      </w:pPr>
-      <w:r>
-        <w:rPr>
-          <w:rFonts w:ascii="Yu Gothic" w:cs="Yu Gothic" w:eastAsia="Yu Gothic" w:hAnsi="Yu Gothic"/>
-        </w:rPr>
-        <w:t xml:space="preserve">文字がパネルからはみ出す、または最大行数を超えると、プレビューのそのパネルが赤枠になり「文字数オーバー」「行数オーバー」のバッジが出ます。対処は次のいずれかです。</w:t>
-      </w:r>
-    </w:p>
-    <w:p>
-      <w:pPr>
-        <w:pStyle w:val="ListParagraph"/>
-        <w:numPr>
-          <w:ilvl w:val="0"/>
-          <w:numId w:val="2"/>
-        </w:numPr>
-        <w:spacing w:after="60" w:line="320"/>
-      </w:pPr>
-      <w:r>
-        <w:rPr>
-          <w:rFonts w:ascii="Yu Gothic" w:cs="Yu Gothic" w:eastAsia="Yu Gothic" w:hAnsi="Yu Gothic"/>
-        </w:rPr>
-        <w:t xml:space="preserve">そのパネルの文字サイズを小さくする</w:t>
-      </w:r>
-    </w:p>
-    <w:p>
-      <w:pPr>
-        <w:pStyle w:val="ListParagraph"/>
-        <w:numPr>
-          <w:ilvl w:val="0"/>
-          <w:numId w:val="2"/>
-        </w:numPr>
-        <w:spacing w:after="60" w:line="320"/>
-      </w:pPr>
-      <w:r>
-        <w:rPr>
-          <w:rFonts w:ascii="Yu Gothic" w:cs="Yu Gothic" w:eastAsia="Yu Gothic" w:hAnsi="Yu Gothic"/>
-        </w:rPr>
-        <w:t xml:space="preserve">前後のパネルに文言を移動する（3.7）</w:t>
-      </w:r>
-    </w:p>
-    <w:p>
-      <w:pPr>
-        <w:pStyle w:val="ListParagraph"/>
-        <w:numPr>
-          <w:ilvl w:val="0"/>
-          <w:numId w:val="2"/>
-        </w:numPr>
-        <w:spacing w:after="60" w:line="320"/>
-      </w:pPr>
-      <w:r>
-        <w:rPr>
-          <w:rFonts w:ascii="Yu Gothic" w:cs="Yu Gothic" w:eastAsia="Yu Gothic" w:hAnsi="Yu Gothic"/>
-        </w:rPr>
-        <w:t xml:space="preserve">パネルを追加して文言を分ける</w:t>
-      </w:r>
-    </w:p>
-    <w:p>
-      <w:pPr>
-        <w:pStyle w:val="Heading2"/>
-      </w:pPr>
-      <w:r>
-        <w:rPr>
-          <w:rFonts w:ascii="Yu Gothic" w:cs="Yu Gothic" w:eastAsia="Yu Gothic" w:hAnsi="Yu Gothic"/>
-        </w:rPr>
-        <w:t xml:space="preserve">3.10 プレビューの見方</w:t>
-      </w:r>
-    </w:p>
-    <w:p>
-      <w:pPr>
-        <w:pStyle w:val="ListParagraph"/>
-        <w:numPr>
-          <w:ilvl w:val="0"/>
-          <w:numId w:val="2"/>
-        </w:numPr>
-        <w:spacing w:after="60" w:line="320"/>
-      </w:pPr>
-      <w:r>
-        <w:rPr>
-          <w:rFonts w:ascii="Yu Gothic" w:cs="Yu Gothic" w:eastAsia="Yu Gothic" w:hAnsi="Yu Gothic"/>
-        </w:rPr>
-        <w:t xml:space="preserve">用紙が1枚ずつ下に並び、パネルは右から左へ順に並びます（縦書きの読み順）。</w:t>
-      </w:r>
-    </w:p>
-    <w:p>
-      <w:pPr>
-        <w:pStyle w:val="ListParagraph"/>
-        <w:numPr>
-          <w:ilvl w:val="0"/>
-          <w:numId w:val="2"/>
-        </w:numPr>
-        <w:spacing w:after="60" w:line="320"/>
-      </w:pPr>
-      <w:r>
-        <w:rPr>
-          <w:rFonts w:ascii="Yu Gothic" w:cs="Yu Gothic" w:eastAsia="Yu Gothic" w:hAnsi="Yu Gothic"/>
-        </w:rPr>
-        <w:t xml:space="preserve">赤い点線が折り線で、「山」「谷」のラベルが交互に付きます。</w:t>
-      </w:r>
-    </w:p>
-    <w:p>
-      <w:pPr>
-        <w:pStyle w:val="ListParagraph"/>
-        <w:numPr>
-          <w:ilvl w:val="0"/>
-          <w:numId w:val="2"/>
-        </w:numPr>
-        <w:spacing w:after="60" w:line="320"/>
-      </w:pPr>
-      <w:r>
-        <w:rPr>
-          <w:rFonts w:ascii="Yu Gothic" w:cs="Yu Gothic" w:eastAsia="Yu Gothic" w:hAnsi="Yu Gothic"/>
-        </w:rPr>
-        <w:t xml:space="preserve">斜線の帯が「のりしろ」です。</w:t>
-      </w:r>
-    </w:p>
-    <w:p>
-      <w:pPr>
-        <w:pStyle w:val="ListParagraph"/>
-        <w:numPr>
-          <w:ilvl w:val="0"/>
-          <w:numId w:val="2"/>
-        </w:numPr>
-        <w:spacing w:after="60" w:line="320"/>
-      </w:pPr>
-      <w:r>
-        <w:rPr>
-          <w:rFonts w:ascii="Yu Gothic" w:cs="Yu Gothic" w:eastAsia="Yu Gothic" w:hAnsi="Yu Gothic"/>
-        </w:rPr>
-        <w:t xml:space="preserve">1枚目の右端が表紙パネル（表紙を有効にしている場合）です。</w:t>
-      </w:r>
-    </w:p>
-    <w:p>
-      <w:r>
-        <w:br w:type="page"/>
-      </w:r>
-    </w:p>
-    <w:p>
-      <w:pPr>
-        <w:pStyle w:val="Heading1"/>
-      </w:pPr>
-      <w:r>
-        <w:rPr>
-          <w:rFonts w:ascii="Yu Gothic" w:cs="Yu Gothic" w:eastAsia="Yu Gothic" w:hAnsi="Yu Gothic"/>
-        </w:rPr>
-        <w:t xml:space="preserve">4. 印刷する</w:t>
-      </w:r>
-    </w:p>
-    <w:p>
-      <w:pPr>
-        <w:spacing w:after="160" w:before="60"/>
-        <w:jc w:val="center"/>
-      </w:pPr>
-      <w:r>
-        <w:drawing>
-          <wp:inline distT="0" distB="0" distL="0" distR="0">
-            <wp:extent cx="5334000" cy="200025"/>
-            <wp:effectExtent t="0" r="0" b="0" l="0"/>
-            <wp:docPr id="9" name="印刷ボタンとガイド線の切替" descr="印刷ボタンとガイド線の切替" title="印刷ボタンとガイド線の切替"/>
-            <wp:cNvGraphicFramePr>
-              <a:graphicFrameLocks xmlns:a="http://schemas.openxmlformats.org/drawingml/2006/main" noChangeAspect="1"/>
-            </wp:cNvGraphicFramePr>
-            <a:graphic xmlns:a="http://schemas.openxmlformats.org/drawingml/2006/main">
-              <a:graphicData uri="http://schemas.openxmlformats.org/drawingml/2006/picture">
-                <pic:pic xmlns:pic="http://schemas.openxmlformats.org/drawingml/2006/picture">
-                  <pic:nvPicPr>
-                    <pic:cNvPr id="0" name="" descr=""/>
-                    <pic:cNvPicPr>
-                      <a:picLocks noChangeAspect="1" noChangeArrowheads="1"/>
-                    </pic:cNvPicPr>
-                  </pic:nvPicPr>
-                  <pic:blipFill>
-                    <a:blip r:embed="rId17" cstate="none"/>
-                    <a:srcRect/>
-                    <a:stretch>
-                      <a:fillRect/>
-                    </a:stretch>
-                  </pic:blipFill>
-                  <pic:spPr bwMode="auto">
-                    <a:xfrm>
-                      <a:off x="0" y="0"/>
                       <a:ext cx="5334000" cy="200025"/>
                     </a:xfrm>
                     <a:prstGeom prst="rect">
@@ -5011,7 +4587,7 @@
               <w:rPr>
                 <w:rFonts w:ascii="Yu Gothic" w:cs="Yu Gothic" w:eastAsia="Yu Gothic" w:hAnsi="Yu Gothic"/>
               </w:rPr>
-              <w:t xml:space="preserve">3.9の対処（文字サイズを下げる・文言を移動・パネルを追加）を行ってください。</w:t>
+              <w:t xml:space="preserve">3.8の対処（文字サイズを下げる・文言を移動・パネルを追加）を行ってください。</w:t>
             </w:r>
           </w:p>
         </w:tc>
@@ -5301,7 +4877,7 @@
               <w:rPr>
                 <w:rFonts w:ascii="Yu Gothic" w:cs="Yu Gothic" w:eastAsia="Yu Gothic" w:hAnsi="Yu Gothic"/>
               </w:rPr>
-              <w:t xml:space="preserve">保存機能はありません。再読み込みで初期状態に戻ります。台本は別途保管してください。</w:t>
+              <w:t xml:space="preserve">保存機能はありません。再読み込みで初期状態に戻ります。元のWordファイルを保管しておき、読み込み直してください。</w:t>
             </w:r>
           </w:p>
         </w:tc>

</xml_diff>

<commit_message>
One-click line moves between panels (no selection needed)
Co-Authored-By: Claude Sonnet 5.5 <noreply@anthropic.com>
Claude-Session: https://claude.ai/code/session_01Lr4nGZF4GGC967dspef5Pw
</commit_message>
<xml_diff>
--- a/deliverables/jabara-manual.docx
+++ b/deliverables/jabara-manual.docx
@@ -810,7 +810,7 @@
               <w:rPr>
                 <w:rFonts w:ascii="Yu Gothic" w:cs="Yu Gothic" w:eastAsia="Yu Gothic" w:hAnsi="Yu Gothic"/>
               </w:rPr>
-              <w:t xml:space="preserve">区切り位置を変えたいとき：「前／次のパネルへ移動」</w:t>
+              <w:t xml:space="preserve">区切り位置を変えたいとき：「先頭行を前へ」「末尾行を次へ」</w:t>
             </w:r>
           </w:p>
         </w:tc>
@@ -3025,7 +3025,18 @@
         <w:rPr>
           <w:rFonts w:ascii="Yu Gothic" w:cs="Yu Gothic" w:eastAsia="Yu Gothic" w:hAnsi="Yu Gothic"/>
         </w:rPr>
-        <w:t xml:space="preserve">移動したい文字や文を選択して、「◀ 前のパネルへ移動」または「次のパネルへ移動 ▶」を押すと、隣のパネルの先頭または末尾に移せます。ふりがなの［　］の途中だけを選ぶと移動できないので、［　］ごと選択してください。</w:t>
+        <w:t xml:space="preserve">各パネルの下に「◀ 先頭行を前のパネルへ」「末尾行を次のパネルへ ▶」のボタンがあります。文字を選択しなくても、押すだけでその行が隣のパネルへ1行ぶん移ります（移った行は、隣のパネルの末尾または先頭に、独立した1行として入ります）。</w:t>
+      </w:r>
+    </w:p>
+    <w:p>
+      <w:pPr>
+        <w:spacing w:after="120" w:line="320"/>
+      </w:pPr>
+      <w:r>
+        <w:rPr>
+          <w:rFonts w:ascii="Yu Gothic" w:cs="Yu Gothic" w:eastAsia="Yu Gothic" w:hAnsi="Yu Gothic"/>
+        </w:rPr>
+        <w:t xml:space="preserve">行の途中だけを動かしたいときは、動かしたい文字をドラッグで選択してからボタンを押すと、選択した部分だけが移ります。ふりがなの［　］の途中だけを選ぶと移動できないので、［　］ごと選択してください。</w:t>
       </w:r>
     </w:p>
     <w:p>
@@ -3101,7 +3112,7 @@
         <w:rPr>
           <w:rFonts w:ascii="Yu Gothic" w:cs="Yu Gothic" w:eastAsia="Yu Gothic" w:hAnsi="Yu Gothic"/>
         </w:rPr>
-        <w:t xml:space="preserve">前後のパネルに文言を移動する（3.6）</w:t>
+        <w:t xml:space="preserve">前後のパネルに行を移動する（3.6）</w:t>
       </w:r>
     </w:p>
     <w:p>

</xml_diff>

<commit_message>
Add drag-and-drop line board with multi-select and undo
Co-Authored-By: Claude Sonnet 5.5 <noreply@anthropic.com>
Claude-Session: https://claude.ai/code/session_01Lr4nGZF4GGC967dspef5Pw
</commit_message>
<xml_diff>
--- a/deliverables/jabara-manual.docx
+++ b/deliverables/jabara-manual.docx
@@ -810,7 +810,7 @@
               <w:rPr>
                 <w:rFonts w:ascii="Yu Gothic" w:cs="Yu Gothic" w:eastAsia="Yu Gothic" w:hAnsi="Yu Gothic"/>
               </w:rPr>
-              <w:t xml:space="preserve">区切り位置を変えたいとき：「先頭行を前へ」「末尾行を次へ」</w:t>
+              <w:t xml:space="preserve">区切り位置を変えたいとき：行をドラッグで移動（3.6）</w:t>
             </w:r>
           </w:p>
         </w:tc>
@@ -3014,7 +3014,7 @@
         <w:rPr>
           <w:rFonts w:ascii="Yu Gothic" w:cs="Yu Gothic" w:eastAsia="Yu Gothic" w:hAnsi="Yu Gothic"/>
         </w:rPr>
-        <w:t xml:space="preserve">3.6 パネルの境目を調整する</w:t>
+        <w:t xml:space="preserve">3.6 パネルの境目を調整する（行をドラッグで並べ替え）</w:t>
       </w:r>
     </w:p>
     <w:p>
@@ -3025,7 +3025,103 @@
         <w:rPr>
           <w:rFonts w:ascii="Yu Gothic" w:cs="Yu Gothic" w:eastAsia="Yu Gothic" w:hAnsi="Yu Gothic"/>
         </w:rPr>
-        <w:t xml:space="preserve">各パネルの下に「◀ 先頭行を前のパネルへ」「末尾行を次のパネルへ ▶」のボタンがあります。文字を選択しなくても、押すだけでその行が隣のパネルへ1行ぶん移ります（移った行は、隣のパネルの末尾または先頭に、独立した1行として入ります）。</w:t>
+        <w:t xml:space="preserve">「行を並べ替える（ドラッグ）」の欄に、パネルごとの箱と、その中の行が並びます。行をつかんで別の場所へドロップするだけで、行を移動できます。</w:t>
+      </w:r>
+    </w:p>
+    <w:p>
+      <w:pPr>
+        <w:pStyle w:val="ListParagraph"/>
+        <w:numPr>
+          <w:ilvl w:val="0"/>
+          <w:numId w:val="2"/>
+        </w:numPr>
+        <w:spacing w:after="60" w:line="320"/>
+      </w:pPr>
+      <w:r>
+        <w:rPr>
+          <w:rFonts w:ascii="Yu Gothic" w:cs="Yu Gothic" w:eastAsia="Yu Gothic" w:hAnsi="Yu Gothic"/>
+          <w:b/>
+          <w:bCs/>
+        </w:rPr>
+        <w:t xml:space="preserve">1行を動かす：</w:t>
+      </w:r>
+      <w:r>
+        <w:rPr>
+          <w:rFonts w:ascii="Yu Gothic" w:cs="Yu Gothic" w:eastAsia="Yu Gothic" w:hAnsi="Yu Gothic"/>
+        </w:rPr>
+        <w:t xml:space="preserve">行をつかんで、移したい行と行の間（または、そのパネルの空いているところ）にドロップします。赤い線が入る位置に挿入されます。</w:t>
+      </w:r>
+    </w:p>
+    <w:p>
+      <w:pPr>
+        <w:pStyle w:val="ListParagraph"/>
+        <w:numPr>
+          <w:ilvl w:val="0"/>
+          <w:numId w:val="2"/>
+        </w:numPr>
+        <w:spacing w:after="60" w:line="320"/>
+      </w:pPr>
+      <w:r>
+        <w:rPr>
+          <w:rFonts w:ascii="Yu Gothic" w:cs="Yu Gothic" w:eastAsia="Yu Gothic" w:hAnsi="Yu Gothic"/>
+          <w:b/>
+          <w:bCs/>
+        </w:rPr>
+        <w:t xml:space="preserve">複数行をまとめて動かす：</w:t>
+      </w:r>
+      <w:r>
+        <w:rPr>
+          <w:rFonts w:ascii="Yu Gothic" w:cs="Yu Gothic" w:eastAsia="Yu Gothic" w:hAnsi="Yu Gothic"/>
+        </w:rPr>
+        <w:t xml:space="preserve">行をクリックして選択（もう一度クリックで解除）。いくつ選んでも構いません。Shiftを押しながらクリックすると範囲選択できます。選んだ行のどれかをつかんでドロップすると、全部まとめて移ります。</w:t>
+      </w:r>
+    </w:p>
+    <w:p>
+      <w:pPr>
+        <w:pStyle w:val="ListParagraph"/>
+        <w:numPr>
+          <w:ilvl w:val="0"/>
+          <w:numId w:val="2"/>
+        </w:numPr>
+        <w:spacing w:after="60" w:line="320"/>
+      </w:pPr>
+      <w:r>
+        <w:rPr>
+          <w:rFonts w:ascii="Yu Gothic" w:cs="Yu Gothic" w:eastAsia="Yu Gothic" w:hAnsi="Yu Gothic"/>
+          <w:b/>
+          <w:bCs/>
+        </w:rPr>
+        <w:t xml:space="preserve">元に戻す：</w:t>
+      </w:r>
+      <w:r>
+        <w:rPr>
+          <w:rFonts w:ascii="Yu Gothic" w:cs="Yu Gothic" w:eastAsia="Yu Gothic" w:hAnsi="Yu Gothic"/>
+        </w:rPr>
+        <w:t xml:space="preserve">間違えたときは「元に戻す」で、1つ前の状態に戻せます（何回でも戻せます）。</w:t>
+      </w:r>
+    </w:p>
+    <w:p>
+      <w:pPr>
+        <w:pStyle w:val="ListParagraph"/>
+        <w:numPr>
+          <w:ilvl w:val="0"/>
+          <w:numId w:val="2"/>
+        </w:numPr>
+        <w:spacing w:after="60" w:line="320"/>
+      </w:pPr>
+      <w:r>
+        <w:rPr>
+          <w:rFonts w:ascii="Yu Gothic" w:cs="Yu Gothic" w:eastAsia="Yu Gothic" w:hAnsi="Yu Gothic"/>
+          <w:b/>
+          <w:bCs/>
+        </w:rPr>
+        <w:t xml:space="preserve">行数の確認：</w:t>
+      </w:r>
+      <w:r>
+        <w:rPr>
+          <w:rFonts w:ascii="Yu Gothic" w:cs="Yu Gothic" w:eastAsia="Yu Gothic" w:hAnsi="Yu Gothic"/>
+        </w:rPr>
+        <w:t xml:space="preserve">パネルの箱の右上に行数が出ます。最大行数を超えると赤くなります。</w:t>
       </w:r>
     </w:p>
     <w:p>
@@ -3036,7 +3132,7 @@
         <w:rPr>
           <w:rFonts w:ascii="Yu Gothic" w:cs="Yu Gothic" w:eastAsia="Yu Gothic" w:hAnsi="Yu Gothic"/>
         </w:rPr>
-        <w:t xml:space="preserve">行の途中だけを動かしたいときは、動かしたい文字をドラッグで選択してからボタンを押すと、選択した部分だけが移ります。ふりがなの［　］の途中だけを選ぶと移動できないので、［　］ごと選択してください。</w:t>
+        <w:t xml:space="preserve">パネルの下にある「◀ 先頭行を前のパネルへ」「末尾行を次のパネルへ ▶」のボタンは、隣へ1行だけ動かしたいときの近道です。行の途中の文字だけを動かしたいときは、文字を選択してからこのボタンを押します（ふりがなの［　］の途中だけを選ぶと移動できないので、［　］ごと選択してください）。</w:t>
       </w:r>
     </w:p>
     <w:p>

</xml_diff>

<commit_message>
Make every card collapsible; label the two editing methods A and B
Co-Authored-By: Claude Sonnet 5.5 <noreply@anthropic.com>
Claude-Session: https://claude.ai/code/session_01Lr4nGZF4GGC967dspef5Pw
</commit_message>
<xml_diff>
--- a/deliverables/jabara-manual.docx
+++ b/deliverables/jabara-manual.docx
@@ -2288,7 +2288,7 @@
         <w:rPr>
           <w:rFonts w:ascii="Yu Gothic" w:cs="Yu Gothic" w:eastAsia="Yu Gothic" w:hAnsi="Yu Gothic"/>
         </w:rPr>
-        <w:t xml:space="preserve">3.4 パネルごとの文言</w:t>
+        <w:t xml:space="preserve">3.4 パネルごとの文言（B. 文字を直接直す）</w:t>
       </w:r>
     </w:p>
     <w:p>
@@ -3017,6 +3017,67 @@
         <w:t xml:space="preserve">3.6 パネルの境目を調整する（行をドラッグで並べ替え）</w:t>
       </w:r>
     </w:p>
+    <w:tbl>
+      <w:tblPr>
+        <w:tblW w:type="dxa" w:w="9638"/>
+        <w:tblBorders>
+          <w:top w:val="single" w:color="auto" w:sz="4"/>
+          <w:left w:val="single" w:color="auto" w:sz="4"/>
+          <w:bottom w:val="single" w:color="auto" w:sz="4"/>
+          <w:right w:val="single" w:color="auto" w:sz="4"/>
+          <w:insideH w:val="single" w:color="auto" w:sz="4"/>
+          <w:insideV w:val="single" w:color="auto" w:sz="4"/>
+        </w:tblBorders>
+      </w:tblPr>
+      <w:tblGrid>
+        <w:gridCol w:w="9638"/>
+      </w:tblGrid>
+      <w:tr>
+        <w:tc>
+          <w:tcPr>
+            <w:tcW w:type="dxa" w:w="9638"/>
+            <w:tcBorders>
+              <w:top w:val="none" w:color="FFFFFF" w:sz="0"/>
+              <w:left w:val="single" w:color="2B4C6F" w:sz="24"/>
+              <w:bottom w:val="none" w:color="FFFFFF" w:sz="0"/>
+              <w:right w:val="none" w:color="FFFFFF" w:sz="0"/>
+            </w:tcBorders>
+            <w:shd w:fill="E8F1FA" w:color="auto" w:val="clear"/>
+            <w:tcMar>
+              <w:top w:type="dxa" w:w="100"/>
+              <w:left w:type="dxa" w:w="180"/>
+              <w:bottom w:type="dxa" w:w="100"/>
+              <w:right w:type="dxa" w:w="140"/>
+            </w:tcMar>
+          </w:tcPr>
+          <w:p>
+            <w:pPr>
+              <w:spacing w:after="0" w:line="300"/>
+            </w:pPr>
+            <w:r>
+              <w:rPr>
+                <w:rFonts w:ascii="Yu Gothic" w:cs="Yu Gothic" w:eastAsia="Yu Gothic" w:hAnsi="Yu Gothic"/>
+                <w:b/>
+                <w:bCs/>
+                <w:color w:val="2B4C6F"/>
+              </w:rPr>
+              <w:t xml:space="preserve">使い分け　</w:t>
+            </w:r>
+            <w:r>
+              <w:rPr>
+                <w:rFonts w:ascii="Yu Gothic" w:cs="Yu Gothic" w:eastAsia="Yu Gothic" w:hAnsi="Yu Gothic"/>
+              </w:rPr>
+              <w:t xml:space="preserve">行ごと動かしたいときは「A. 行ごと動かす（ドラッグで並べ替え）」、ふりがなや1文字単位の修正は「B. 文字を直接直す」を使います。画面の各欄は、見出しの右の「閉じる」（または見出しをクリック）で折りたためるので、使わない欄は閉じておくと迷いません。</w:t>
+            </w:r>
+          </w:p>
+        </w:tc>
+      </w:tr>
+    </w:tbl>
+    <w:p>
+      <w:pPr>
+        <w:spacing w:after="80"/>
+      </w:pPr>
+    </w:p>
     <w:p>
       <w:pPr>
         <w:spacing w:after="120" w:line="320"/>
@@ -3025,7 +3086,7 @@
         <w:rPr>
           <w:rFonts w:ascii="Yu Gothic" w:cs="Yu Gothic" w:eastAsia="Yu Gothic" w:hAnsi="Yu Gothic"/>
         </w:rPr>
-        <w:t xml:space="preserve">「行を並べ替える（ドラッグ）」の欄に、パネルごとの箱と、その中の行が並びます。行をつかんで別の場所へドロップするだけで、行を移動できます。</w:t>
+        <w:t xml:space="preserve">「A. 行ごと動かす」の欄に、パネルごとの箱と、その中の行が並びます。行をつかんで別の場所へドロップするだけで、行を移動できます。</w:t>
       </w:r>
     </w:p>
     <w:p>

</xml_diff>

<commit_message>
Manual: describe which Word files to import
Co-Authored-By: Claude Sonnet 5.5 <noreply@anthropic.com>
Claude-Session: https://claude.ai/code/session_01Lr4nGZF4GGC967dspef5Pw
</commit_message>
<xml_diff>
--- a/deliverables/jabara-manual.docx
+++ b/deliverables/jabara-manual.docx
@@ -996,6 +996,798 @@
     <w:p>
       <w:pPr>
         <w:spacing w:after="120"/>
+      </w:pPr>
+    </w:p>
+    <w:p>
+      <w:pPr>
+        <w:pStyle w:val="Heading2"/>
+      </w:pPr>
+      <w:r>
+        <w:rPr>
+          <w:rFonts w:ascii="Yu Gothic" w:cs="Yu Gothic" w:eastAsia="Yu Gothic" w:hAnsi="Yu Gothic"/>
+        </w:rPr>
+        <w:t xml:space="preserve">どんなWordファイルを読み込ませるか</w:t>
+      </w:r>
+    </w:p>
+    <w:p>
+      <w:pPr>
+        <w:spacing w:after="120" w:line="320"/>
+      </w:pPr>
+      <w:r>
+        <w:rPr>
+          <w:rFonts w:ascii="Yu Gothic" w:cs="Yu Gothic" w:eastAsia="Yu Gothic" w:hAnsi="Yu Gothic"/>
+        </w:rPr>
+        <w:t xml:space="preserve">次の2つのどちらかの作りなら、そのまま読み込めます。ファイルの形式は .docx（新しい形式）または .doc（旧形式）です。</w:t>
+      </w:r>
+    </w:p>
+    <w:tbl>
+      <w:tblPr>
+        <w:tblW w:type="dxa" w:w="9638"/>
+        <w:tblBorders>
+          <w:top w:val="single" w:color="auto" w:sz="4"/>
+          <w:left w:val="single" w:color="auto" w:sz="4"/>
+          <w:bottom w:val="single" w:color="auto" w:sz="4"/>
+          <w:right w:val="single" w:color="auto" w:sz="4"/>
+          <w:insideH w:val="single" w:color="auto" w:sz="4"/>
+          <w:insideV w:val="single" w:color="auto" w:sz="4"/>
+        </w:tblBorders>
+      </w:tblPr>
+      <w:tblGrid>
+        <w:gridCol w:w="1900"/>
+        <w:gridCol w:w="3700"/>
+        <w:gridCol w:w="4038"/>
+      </w:tblGrid>
+      <w:tr>
+        <w:trPr>
+          <w:tblHeader/>
+        </w:trPr>
+        <w:tc>
+          <w:tcPr>
+            <w:tcW w:type="dxa" w:w="1900"/>
+            <w:tcBorders>
+              <w:top w:val="single" w:color="C9CEC0" w:sz="4"/>
+              <w:left w:val="single" w:color="C9CEC0" w:sz="4"/>
+              <w:bottom w:val="single" w:color="C9CEC0" w:sz="4"/>
+              <w:right w:val="single" w:color="C9CEC0" w:sz="4"/>
+            </w:tcBorders>
+            <w:shd w:fill="E6ECF3" w:color="auto" w:val="clear"/>
+            <w:tcMar>
+              <w:top w:type="dxa" w:w="70"/>
+              <w:left w:type="dxa" w:w="110"/>
+              <w:bottom w:type="dxa" w:w="70"/>
+              <w:right w:type="dxa" w:w="110"/>
+            </w:tcMar>
+          </w:tcPr>
+          <w:p>
+            <w:pPr>
+              <w:spacing w:after="0" w:line="300"/>
+            </w:pPr>
+            <w:r>
+              <w:rPr>
+                <w:rFonts w:ascii="Yu Gothic" w:cs="Yu Gothic" w:eastAsia="Yu Gothic" w:hAnsi="Yu Gothic"/>
+                <w:b/>
+                <w:bCs/>
+                <w:color w:val="2B4C6F"/>
+              </w:rPr>
+              <w:t xml:space="preserve">パターン</w:t>
+            </w:r>
+          </w:p>
+        </w:tc>
+        <w:tc>
+          <w:tcPr>
+            <w:tcW w:type="dxa" w:w="3700"/>
+            <w:tcBorders>
+              <w:top w:val="single" w:color="C9CEC0" w:sz="4"/>
+              <w:left w:val="single" w:color="C9CEC0" w:sz="4"/>
+              <w:bottom w:val="single" w:color="C9CEC0" w:sz="4"/>
+              <w:right w:val="single" w:color="C9CEC0" w:sz="4"/>
+            </w:tcBorders>
+            <w:shd w:fill="E6ECF3" w:color="auto" w:val="clear"/>
+            <w:tcMar>
+              <w:top w:type="dxa" w:w="70"/>
+              <w:left w:type="dxa" w:w="110"/>
+              <w:bottom w:type="dxa" w:w="70"/>
+              <w:right w:type="dxa" w:w="110"/>
+            </w:tcMar>
+          </w:tcPr>
+          <w:p>
+            <w:pPr>
+              <w:spacing w:after="0" w:line="300"/>
+            </w:pPr>
+            <w:r>
+              <w:rPr>
+                <w:rFonts w:ascii="Yu Gothic" w:cs="Yu Gothic" w:eastAsia="Yu Gothic" w:hAnsi="Yu Gothic"/>
+                <w:b/>
+                <w:bCs/>
+                <w:color w:val="2B4C6F"/>
+              </w:rPr>
+              <w:t xml:space="preserve">作り方</w:t>
+            </w:r>
+          </w:p>
+        </w:tc>
+        <w:tc>
+          <w:tcPr>
+            <w:tcW w:type="dxa" w:w="4038"/>
+            <w:tcBorders>
+              <w:top w:val="single" w:color="C9CEC0" w:sz="4"/>
+              <w:left w:val="single" w:color="C9CEC0" w:sz="4"/>
+              <w:bottom w:val="single" w:color="C9CEC0" w:sz="4"/>
+              <w:right w:val="single" w:color="C9CEC0" w:sz="4"/>
+            </w:tcBorders>
+            <w:shd w:fill="E6ECF3" w:color="auto" w:val="clear"/>
+            <w:tcMar>
+              <w:top w:type="dxa" w:w="70"/>
+              <w:left w:type="dxa" w:w="110"/>
+              <w:bottom w:type="dxa" w:w="70"/>
+              <w:right w:type="dxa" w:w="110"/>
+            </w:tcMar>
+          </w:tcPr>
+          <w:p>
+            <w:pPr>
+              <w:spacing w:after="0" w:line="300"/>
+            </w:pPr>
+            <w:r>
+              <w:rPr>
+                <w:rFonts w:ascii="Yu Gothic" w:cs="Yu Gothic" w:eastAsia="Yu Gothic" w:hAnsi="Yu Gothic"/>
+                <w:b/>
+                <w:bCs/>
+                <w:color w:val="2B4C6F"/>
+              </w:rPr>
+              <w:t xml:space="preserve">読み込んだ結果</w:t>
+            </w:r>
+          </w:p>
+        </w:tc>
+      </w:tr>
+      <w:tr>
+        <w:tc>
+          <w:tcPr>
+            <w:tcW w:type="dxa" w:w="1900"/>
+            <w:tcBorders>
+              <w:top w:val="single" w:color="C9CEC0" w:sz="4"/>
+              <w:left w:val="single" w:color="C9CEC0" w:sz="4"/>
+              <w:bottom w:val="single" w:color="C9CEC0" w:sz="4"/>
+              <w:right w:val="single" w:color="C9CEC0" w:sz="4"/>
+            </w:tcBorders>
+            <w:tcMar>
+              <w:top w:type="dxa" w:w="70"/>
+              <w:left w:type="dxa" w:w="110"/>
+              <w:bottom w:type="dxa" w:w="70"/>
+              <w:right w:type="dxa" w:w="110"/>
+            </w:tcMar>
+          </w:tcPr>
+          <w:p>
+            <w:pPr>
+              <w:spacing w:after="0" w:line="300"/>
+            </w:pPr>
+            <w:r>
+              <w:rPr>
+                <w:rFonts w:ascii="Yu Gothic" w:cs="Yu Gothic" w:eastAsia="Yu Gothic" w:hAnsi="Yu Gothic"/>
+              </w:rPr>
+              <w:t xml:space="preserve">A. テキストボックス型（おすすめ）</w:t>
+            </w:r>
+          </w:p>
+        </w:tc>
+        <w:tc>
+          <w:tcPr>
+            <w:tcW w:type="dxa" w:w="3700"/>
+            <w:tcBorders>
+              <w:top w:val="single" w:color="C9CEC0" w:sz="4"/>
+              <w:left w:val="single" w:color="C9CEC0" w:sz="4"/>
+              <w:bottom w:val="single" w:color="C9CEC0" w:sz="4"/>
+              <w:right w:val="single" w:color="C9CEC0" w:sz="4"/>
+            </w:tcBorders>
+            <w:tcMar>
+              <w:top w:type="dxa" w:w="70"/>
+              <w:left w:type="dxa" w:w="110"/>
+              <w:bottom w:type="dxa" w:w="70"/>
+              <w:right w:type="dxa" w:w="110"/>
+            </w:tcMar>
+          </w:tcPr>
+          <w:p>
+            <w:pPr>
+              <w:spacing w:after="0" w:line="300"/>
+            </w:pPr>
+            <w:r>
+              <w:rPr>
+                <w:rFonts w:ascii="Yu Gothic" w:cs="Yu Gothic" w:eastAsia="Yu Gothic" w:hAnsi="Yu Gothic"/>
+              </w:rPr>
+              <w:t xml:space="preserve">1つのテキストボックス＝蛇腹の1パネルとして、文章を入れる。</w:t>
+            </w:r>
+          </w:p>
+          <w:p>
+            <w:pPr>
+              <w:spacing w:after="0" w:line="300"/>
+            </w:pPr>
+            <w:r>
+              <w:rPr>
+                <w:rFonts w:ascii="Yu Gothic" w:cs="Yu Gothic" w:eastAsia="Yu Gothic" w:hAnsi="Yu Gothic"/>
+              </w:rPr>
+              <w:t xml:space="preserve">1枚目のテキストボックスに、タイトルとサブタイトル（日付・会場）を入れ、本文より文字サイズを変える（例：本文30pt、タイトル24pt、サブタイトル18pt）。</w:t>
+            </w:r>
+          </w:p>
+        </w:tc>
+        <w:tc>
+          <w:tcPr>
+            <w:tcW w:type="dxa" w:w="4038"/>
+            <w:tcBorders>
+              <w:top w:val="single" w:color="C9CEC0" w:sz="4"/>
+              <w:left w:val="single" w:color="C9CEC0" w:sz="4"/>
+              <w:bottom w:val="single" w:color="C9CEC0" w:sz="4"/>
+              <w:right w:val="single" w:color="C9CEC0" w:sz="4"/>
+            </w:tcBorders>
+            <w:tcMar>
+              <w:top w:type="dxa" w:w="70"/>
+              <w:left w:type="dxa" w:w="110"/>
+              <w:bottom w:type="dxa" w:w="70"/>
+              <w:right w:type="dxa" w:w="110"/>
+            </w:tcMar>
+          </w:tcPr>
+          <w:p>
+            <w:pPr>
+              <w:spacing w:after="0" w:line="300"/>
+            </w:pPr>
+            <w:r>
+              <w:rPr>
+                <w:rFonts w:ascii="Yu Gothic" w:cs="Yu Gothic" w:eastAsia="Yu Gothic" w:hAnsi="Yu Gothic"/>
+              </w:rPr>
+              <w:t xml:space="preserve">テキストボックス1つが、パネル1つになる。</w:t>
+            </w:r>
+          </w:p>
+          <w:p>
+            <w:pPr>
+              <w:spacing w:after="0" w:line="300"/>
+            </w:pPr>
+            <w:r>
+              <w:rPr>
+                <w:rFonts w:ascii="Yu Gothic" w:cs="Yu Gothic" w:eastAsia="Yu Gothic" w:hAnsi="Yu Gothic"/>
+              </w:rPr>
+              <w:t xml:space="preserve">タイトル・サブタイトルは表紙欄に入る。</w:t>
+            </w:r>
+          </w:p>
+        </w:tc>
+      </w:tr>
+      <w:tr>
+        <w:tc>
+          <w:tcPr>
+            <w:tcW w:type="dxa" w:w="1900"/>
+            <w:tcBorders>
+              <w:top w:val="single" w:color="C9CEC0" w:sz="4"/>
+              <w:left w:val="single" w:color="C9CEC0" w:sz="4"/>
+              <w:bottom w:val="single" w:color="C9CEC0" w:sz="4"/>
+              <w:right w:val="single" w:color="C9CEC0" w:sz="4"/>
+            </w:tcBorders>
+            <w:tcMar>
+              <w:top w:type="dxa" w:w="70"/>
+              <w:left w:type="dxa" w:w="110"/>
+              <w:bottom w:type="dxa" w:w="70"/>
+              <w:right w:type="dxa" w:w="110"/>
+            </w:tcMar>
+          </w:tcPr>
+          <w:p>
+            <w:pPr>
+              <w:spacing w:after="0" w:line="300"/>
+            </w:pPr>
+            <w:r>
+              <w:rPr>
+                <w:rFonts w:ascii="Yu Gothic" w:cs="Yu Gothic" w:eastAsia="Yu Gothic" w:hAnsi="Yu Gothic"/>
+              </w:rPr>
+              <w:t xml:space="preserve">B. 本文だけ型</w:t>
+            </w:r>
+          </w:p>
+        </w:tc>
+        <w:tc>
+          <w:tcPr>
+            <w:tcW w:type="dxa" w:w="3700"/>
+            <w:tcBorders>
+              <w:top w:val="single" w:color="C9CEC0" w:sz="4"/>
+              <w:left w:val="single" w:color="C9CEC0" w:sz="4"/>
+              <w:bottom w:val="single" w:color="C9CEC0" w:sz="4"/>
+              <w:right w:val="single" w:color="C9CEC0" w:sz="4"/>
+            </w:tcBorders>
+            <w:tcMar>
+              <w:top w:type="dxa" w:w="70"/>
+              <w:left w:type="dxa" w:w="110"/>
+              <w:bottom w:type="dxa" w:w="70"/>
+              <w:right w:type="dxa" w:w="110"/>
+            </w:tcMar>
+          </w:tcPr>
+          <w:p>
+            <w:pPr>
+              <w:spacing w:after="0" w:line="300"/>
+            </w:pPr>
+            <w:r>
+              <w:rPr>
+                <w:rFonts w:ascii="Yu Gothic" w:cs="Yu Gothic" w:eastAsia="Yu Gothic" w:hAnsi="Yu Gothic"/>
+              </w:rPr>
+              <w:t xml:space="preserve">テキストボックスを使わず、本文に1行ずつ（1行＝1段落）で文章を書く。</w:t>
+            </w:r>
+          </w:p>
+          <w:p>
+            <w:pPr>
+              <w:spacing w:after="0" w:line="300"/>
+            </w:pPr>
+            <w:r>
+              <w:rPr>
+                <w:rFonts w:ascii="Yu Gothic" w:cs="Yu Gothic" w:eastAsia="Yu Gothic" w:hAnsi="Yu Gothic"/>
+              </w:rPr>
+              <w:t xml:space="preserve">文の終わりは「。」、段落の頭は字下げをする。</w:t>
+            </w:r>
+          </w:p>
+        </w:tc>
+        <w:tc>
+          <w:tcPr>
+            <w:tcW w:type="dxa" w:w="4038"/>
+            <w:tcBorders>
+              <w:top w:val="single" w:color="C9CEC0" w:sz="4"/>
+              <w:left w:val="single" w:color="C9CEC0" w:sz="4"/>
+              <w:bottom w:val="single" w:color="C9CEC0" w:sz="4"/>
+              <w:right w:val="single" w:color="C9CEC0" w:sz="4"/>
+            </w:tcBorders>
+            <w:tcMar>
+              <w:top w:type="dxa" w:w="70"/>
+              <w:left w:type="dxa" w:w="110"/>
+              <w:bottom w:type="dxa" w:w="70"/>
+              <w:right w:type="dxa" w:w="110"/>
+            </w:tcMar>
+          </w:tcPr>
+          <w:p>
+            <w:pPr>
+              <w:spacing w:after="0" w:line="300"/>
+            </w:pPr>
+            <w:r>
+              <w:rPr>
+                <w:rFonts w:ascii="Yu Gothic" w:cs="Yu Gothic" w:eastAsia="Yu Gothic" w:hAnsi="Yu Gothic"/>
+              </w:rPr>
+              <w:t xml:space="preserve">行数の上限（初期値3行）に収まるように、「。」「、」や段落の頭で自動的にパネルへ分ける。</w:t>
+            </w:r>
+          </w:p>
+          <w:p>
+            <w:pPr>
+              <w:spacing w:after="0" w:line="300"/>
+            </w:pPr>
+            <w:r>
+              <w:rPr>
+                <w:rFonts w:ascii="Yu Gothic" w:cs="Yu Gothic" w:eastAsia="Yu Gothic" w:hAnsi="Yu Gothic"/>
+              </w:rPr>
+              <w:t xml:space="preserve">表紙は空のまま（手動で指定）。</w:t>
+            </w:r>
+          </w:p>
+        </w:tc>
+      </w:tr>
+    </w:tbl>
+    <w:p>
+      <w:pPr>
+        <w:spacing w:after="100"/>
+      </w:pPr>
+    </w:p>
+    <w:p>
+      <w:pPr>
+        <w:pStyle w:val="Heading2"/>
+      </w:pPr>
+      <w:r>
+        <w:rPr>
+          <w:rFonts w:ascii="Yu Gothic" w:cs="Yu Gothic" w:eastAsia="Yu Gothic" w:hAnsi="Yu Gothic"/>
+        </w:rPr>
+        <w:t xml:space="preserve">読み込ませる前のチェック</w:t>
+      </w:r>
+    </w:p>
+    <w:p>
+      <w:pPr>
+        <w:pStyle w:val="ListParagraph"/>
+        <w:numPr>
+          <w:ilvl w:val="0"/>
+          <w:numId w:val="2"/>
+        </w:numPr>
+        <w:spacing w:after="60" w:line="320"/>
+      </w:pPr>
+      <w:r>
+        <w:rPr>
+          <w:rFonts w:ascii="Yu Gothic" w:cs="Yu Gothic" w:eastAsia="Yu Gothic" w:hAnsi="Yu Gothic"/>
+        </w:rPr>
+        <w:t xml:space="preserve">ふりがなは、Wordの「ルビ（ふりがな）」機能で付けておく。自動で「漢字[よみ]」に変換されます。本文だけ型では、漢字の直後に「大宝(だいほう)」のようにかっこで書いても変換されます。</w:t>
+      </w:r>
+    </w:p>
+    <w:p>
+      <w:pPr>
+        <w:pStyle w:val="ListParagraph"/>
+        <w:numPr>
+          <w:ilvl w:val="0"/>
+          <w:numId w:val="2"/>
+        </w:numPr>
+        <w:spacing w:after="60" w:line="320"/>
+      </w:pPr>
+      <w:r>
+        <w:rPr>
+          <w:rFonts w:ascii="Yu Gothic" w:cs="Yu Gothic" w:eastAsia="Yu Gothic" w:hAnsi="Yu Gothic"/>
+        </w:rPr>
+        <w:t xml:space="preserve">行頭の字下げは、スペースでも、段落の「最初の行」の字下げ（インデント）でも構いません。字下げは全角スペースとして読み込まれます。</w:t>
+      </w:r>
+    </w:p>
+    <w:p>
+      <w:pPr>
+        <w:pStyle w:val="ListParagraph"/>
+        <w:numPr>
+          <w:ilvl w:val="0"/>
+          <w:numId w:val="2"/>
+        </w:numPr>
+        <w:spacing w:after="60" w:line="320"/>
+      </w:pPr>
+      <w:r>
+        <w:rPr>
+          <w:rFonts w:ascii="Yu Gothic" w:cs="Yu Gothic" w:eastAsia="Yu Gothic" w:hAnsi="Yu Gothic"/>
+        </w:rPr>
+        <w:t xml:space="preserve">表紙を自動で振り分けたいときは、サブタイトルに「開式」「午前」「午後」「会館」「ホール」「体育館」などの会場・時刻の言葉を入れる。タイトルは本文と文字サイズを変える（または、サブタイトルの直前に、「記念」「式典」などを含む短い1行として置く）。</w:t>
+      </w:r>
+    </w:p>
+    <w:p>
+      <w:pPr>
+        <w:pStyle w:val="ListParagraph"/>
+        <w:numPr>
+          <w:ilvl w:val="0"/>
+          <w:numId w:val="2"/>
+        </w:numPr>
+        <w:spacing w:after="60" w:line="320"/>
+      </w:pPr>
+      <w:r>
+        <w:rPr>
+          <w:rFonts w:ascii="Yu Gothic" w:cs="Yu Gothic" w:eastAsia="Yu Gothic" w:hAnsi="Yu Gothic"/>
+        </w:rPr>
+        <w:t xml:space="preserve">テキストボックスは、並べたい順（パネル1から順）に作る。順番が違ったときは、読み込み後に「▲」「▼」で入れ替えられます。</w:t>
+      </w:r>
+    </w:p>
+    <w:p>
+      <w:pPr>
+        <w:pStyle w:val="ListParagraph"/>
+        <w:numPr>
+          <w:ilvl w:val="0"/>
+          <w:numId w:val="2"/>
+        </w:numPr>
+        <w:spacing w:after="60" w:line="320"/>
+      </w:pPr>
+      <w:r>
+        <w:rPr>
+          <w:rFonts w:ascii="Yu Gothic" w:cs="Yu Gothic" w:eastAsia="Yu Gothic" w:hAnsi="Yu Gothic"/>
+        </w:rPr>
+        <w:t xml:space="preserve">パスワードを付けたファイルは読み込めません。解除してから保存し直してください。</w:t>
+      </w:r>
+    </w:p>
+    <w:p>
+      <w:pPr>
+        <w:spacing w:after="60"/>
+      </w:pPr>
+    </w:p>
+    <w:p>
+      <w:pPr>
+        <w:pStyle w:val="Heading2"/>
+      </w:pPr>
+      <w:r>
+        <w:rPr>
+          <w:rFonts w:ascii="Yu Gothic" w:cs="Yu Gothic" w:eastAsia="Yu Gothic" w:hAnsi="Yu Gothic"/>
+        </w:rPr>
+        <w:t xml:space="preserve">読み込まれないもの・避けたほうがよいもの</w:t>
+      </w:r>
+    </w:p>
+    <w:tbl>
+      <w:tblPr>
+        <w:tblW w:type="dxa" w:w="9638"/>
+        <w:tblBorders>
+          <w:top w:val="single" w:color="auto" w:sz="4"/>
+          <w:left w:val="single" w:color="auto" w:sz="4"/>
+          <w:bottom w:val="single" w:color="auto" w:sz="4"/>
+          <w:right w:val="single" w:color="auto" w:sz="4"/>
+          <w:insideH w:val="single" w:color="auto" w:sz="4"/>
+          <w:insideV w:val="single" w:color="auto" w:sz="4"/>
+        </w:tblBorders>
+      </w:tblPr>
+      <w:tblGrid>
+        <w:gridCol w:w="4000"/>
+        <w:gridCol w:w="5638"/>
+      </w:tblGrid>
+      <w:tr>
+        <w:trPr>
+          <w:tblHeader/>
+        </w:trPr>
+        <w:tc>
+          <w:tcPr>
+            <w:tcW w:type="dxa" w:w="4000"/>
+            <w:tcBorders>
+              <w:top w:val="single" w:color="C9CEC0" w:sz="4"/>
+              <w:left w:val="single" w:color="C9CEC0" w:sz="4"/>
+              <w:bottom w:val="single" w:color="C9CEC0" w:sz="4"/>
+              <w:right w:val="single" w:color="C9CEC0" w:sz="4"/>
+            </w:tcBorders>
+            <w:shd w:fill="E6ECF3" w:color="auto" w:val="clear"/>
+            <w:tcMar>
+              <w:top w:type="dxa" w:w="70"/>
+              <w:left w:type="dxa" w:w="110"/>
+              <w:bottom w:type="dxa" w:w="70"/>
+              <w:right w:type="dxa" w:w="110"/>
+            </w:tcMar>
+          </w:tcPr>
+          <w:p>
+            <w:pPr>
+              <w:spacing w:after="0" w:line="300"/>
+            </w:pPr>
+            <w:r>
+              <w:rPr>
+                <w:rFonts w:ascii="Yu Gothic" w:cs="Yu Gothic" w:eastAsia="Yu Gothic" w:hAnsi="Yu Gothic"/>
+                <w:b/>
+                <w:bCs/>
+                <w:color w:val="2B4C6F"/>
+              </w:rPr>
+              <w:t xml:space="preserve">内容</w:t>
+            </w:r>
+          </w:p>
+        </w:tc>
+        <w:tc>
+          <w:tcPr>
+            <w:tcW w:type="dxa" w:w="5638"/>
+            <w:tcBorders>
+              <w:top w:val="single" w:color="C9CEC0" w:sz="4"/>
+              <w:left w:val="single" w:color="C9CEC0" w:sz="4"/>
+              <w:bottom w:val="single" w:color="C9CEC0" w:sz="4"/>
+              <w:right w:val="single" w:color="C9CEC0" w:sz="4"/>
+            </w:tcBorders>
+            <w:shd w:fill="E6ECF3" w:color="auto" w:val="clear"/>
+            <w:tcMar>
+              <w:top w:type="dxa" w:w="70"/>
+              <w:left w:type="dxa" w:w="110"/>
+              <w:bottom w:type="dxa" w:w="70"/>
+              <w:right w:type="dxa" w:w="110"/>
+            </w:tcMar>
+          </w:tcPr>
+          <w:p>
+            <w:pPr>
+              <w:spacing w:after="0" w:line="300"/>
+            </w:pPr>
+            <w:r>
+              <w:rPr>
+                <w:rFonts w:ascii="Yu Gothic" w:cs="Yu Gothic" w:eastAsia="Yu Gothic" w:hAnsi="Yu Gothic"/>
+                <w:b/>
+                <w:bCs/>
+                <w:color w:val="2B4C6F"/>
+              </w:rPr>
+              <w:t xml:space="preserve">扱い</w:t>
+            </w:r>
+          </w:p>
+        </w:tc>
+      </w:tr>
+      <w:tr>
+        <w:tc>
+          <w:tcPr>
+            <w:tcW w:type="dxa" w:w="4000"/>
+            <w:tcBorders>
+              <w:top w:val="single" w:color="C9CEC0" w:sz="4"/>
+              <w:left w:val="single" w:color="C9CEC0" w:sz="4"/>
+              <w:bottom w:val="single" w:color="C9CEC0" w:sz="4"/>
+              <w:right w:val="single" w:color="C9CEC0" w:sz="4"/>
+            </w:tcBorders>
+            <w:tcMar>
+              <w:top w:type="dxa" w:w="70"/>
+              <w:left w:type="dxa" w:w="110"/>
+              <w:bottom w:type="dxa" w:w="70"/>
+              <w:right w:type="dxa" w:w="110"/>
+            </w:tcMar>
+          </w:tcPr>
+          <w:p>
+            <w:pPr>
+              <w:spacing w:after="0" w:line="300"/>
+            </w:pPr>
+            <w:r>
+              <w:rPr>
+                <w:rFonts w:ascii="Yu Gothic" w:cs="Yu Gothic" w:eastAsia="Yu Gothic" w:hAnsi="Yu Gothic"/>
+              </w:rPr>
+              <w:t xml:space="preserve">画像、図形、罫線、色や書体の設定</w:t>
+            </w:r>
+          </w:p>
+        </w:tc>
+        <w:tc>
+          <w:tcPr>
+            <w:tcW w:type="dxa" w:w="5638"/>
+            <w:tcBorders>
+              <w:top w:val="single" w:color="C9CEC0" w:sz="4"/>
+              <w:left w:val="single" w:color="C9CEC0" w:sz="4"/>
+              <w:bottom w:val="single" w:color="C9CEC0" w:sz="4"/>
+              <w:right w:val="single" w:color="C9CEC0" w:sz="4"/>
+            </w:tcBorders>
+            <w:tcMar>
+              <w:top w:type="dxa" w:w="70"/>
+              <w:left w:type="dxa" w:w="110"/>
+              <w:bottom w:type="dxa" w:w="70"/>
+              <w:right w:type="dxa" w:w="110"/>
+            </w:tcMar>
+          </w:tcPr>
+          <w:p>
+            <w:pPr>
+              <w:spacing w:after="0" w:line="300"/>
+            </w:pPr>
+            <w:r>
+              <w:rPr>
+                <w:rFonts w:ascii="Yu Gothic" w:cs="Yu Gothic" w:eastAsia="Yu Gothic" w:hAnsi="Yu Gothic"/>
+              </w:rPr>
+              <w:t xml:space="preserve">読み込まれません（文字だけが対象）。書体・太さはツール側の設定になります。</w:t>
+            </w:r>
+          </w:p>
+        </w:tc>
+      </w:tr>
+      <w:tr>
+        <w:tc>
+          <w:tcPr>
+            <w:tcW w:type="dxa" w:w="4000"/>
+            <w:tcBorders>
+              <w:top w:val="single" w:color="C9CEC0" w:sz="4"/>
+              <w:left w:val="single" w:color="C9CEC0" w:sz="4"/>
+              <w:bottom w:val="single" w:color="C9CEC0" w:sz="4"/>
+              <w:right w:val="single" w:color="C9CEC0" w:sz="4"/>
+            </w:tcBorders>
+            <w:tcMar>
+              <w:top w:type="dxa" w:w="70"/>
+              <w:left w:type="dxa" w:w="110"/>
+              <w:bottom w:type="dxa" w:w="70"/>
+              <w:right w:type="dxa" w:w="110"/>
+            </w:tcMar>
+          </w:tcPr>
+          <w:p>
+            <w:pPr>
+              <w:spacing w:after="0" w:line="300"/>
+            </w:pPr>
+            <w:r>
+              <w:rPr>
+                <w:rFonts w:ascii="Yu Gothic" w:cs="Yu Gothic" w:eastAsia="Yu Gothic" w:hAnsi="Yu Gothic"/>
+              </w:rPr>
+              <w:t xml:space="preserve">ヘッダー・フッター、脚注</w:t>
+            </w:r>
+          </w:p>
+        </w:tc>
+        <w:tc>
+          <w:tcPr>
+            <w:tcW w:type="dxa" w:w="5638"/>
+            <w:tcBorders>
+              <w:top w:val="single" w:color="C9CEC0" w:sz="4"/>
+              <w:left w:val="single" w:color="C9CEC0" w:sz="4"/>
+              <w:bottom w:val="single" w:color="C9CEC0" w:sz="4"/>
+              <w:right w:val="single" w:color="C9CEC0" w:sz="4"/>
+            </w:tcBorders>
+            <w:tcMar>
+              <w:top w:type="dxa" w:w="70"/>
+              <w:left w:type="dxa" w:w="110"/>
+              <w:bottom w:type="dxa" w:w="70"/>
+              <w:right w:type="dxa" w:w="110"/>
+            </w:tcMar>
+          </w:tcPr>
+          <w:p>
+            <w:pPr>
+              <w:spacing w:after="0" w:line="300"/>
+            </w:pPr>
+            <w:r>
+              <w:rPr>
+                <w:rFonts w:ascii="Yu Gothic" w:cs="Yu Gothic" w:eastAsia="Yu Gothic" w:hAnsi="Yu Gothic"/>
+              </w:rPr>
+              <w:t xml:space="preserve">読み込まれません。</w:t>
+            </w:r>
+          </w:p>
+        </w:tc>
+      </w:tr>
+      <w:tr>
+        <w:tc>
+          <w:tcPr>
+            <w:tcW w:type="dxa" w:w="4000"/>
+            <w:tcBorders>
+              <w:top w:val="single" w:color="C9CEC0" w:sz="4"/>
+              <w:left w:val="single" w:color="C9CEC0" w:sz="4"/>
+              <w:bottom w:val="single" w:color="C9CEC0" w:sz="4"/>
+              <w:right w:val="single" w:color="C9CEC0" w:sz="4"/>
+            </w:tcBorders>
+            <w:tcMar>
+              <w:top w:type="dxa" w:w="70"/>
+              <w:left w:type="dxa" w:w="110"/>
+              <w:bottom w:type="dxa" w:w="70"/>
+              <w:right w:type="dxa" w:w="110"/>
+            </w:tcMar>
+          </w:tcPr>
+          <w:p>
+            <w:pPr>
+              <w:spacing w:after="0" w:line="300"/>
+            </w:pPr>
+            <w:r>
+              <w:rPr>
+                <w:rFonts w:ascii="Yu Gothic" w:cs="Yu Gothic" w:eastAsia="Yu Gothic" w:hAnsi="Yu Gothic"/>
+              </w:rPr>
+              <w:t xml:space="preserve">表（罫線の表）</w:t>
+            </w:r>
+          </w:p>
+        </w:tc>
+        <w:tc>
+          <w:tcPr>
+            <w:tcW w:type="dxa" w:w="5638"/>
+            <w:tcBorders>
+              <w:top w:val="single" w:color="C9CEC0" w:sz="4"/>
+              <w:left w:val="single" w:color="C9CEC0" w:sz="4"/>
+              <w:bottom w:val="single" w:color="C9CEC0" w:sz="4"/>
+              <w:right w:val="single" w:color="C9CEC0" w:sz="4"/>
+            </w:tcBorders>
+            <w:tcMar>
+              <w:top w:type="dxa" w:w="70"/>
+              <w:left w:type="dxa" w:w="110"/>
+              <w:bottom w:type="dxa" w:w="70"/>
+              <w:right w:type="dxa" w:w="110"/>
+            </w:tcMar>
+          </w:tcPr>
+          <w:p>
+            <w:pPr>
+              <w:spacing w:after="0" w:line="300"/>
+            </w:pPr>
+            <w:r>
+              <w:rPr>
+                <w:rFonts w:ascii="Yu Gothic" w:cs="Yu Gothic" w:eastAsia="Yu Gothic" w:hAnsi="Yu Gothic"/>
+              </w:rPr>
+              <w:t xml:space="preserve">避けてください。セルの文字が行として混ざることがあります。</w:t>
+            </w:r>
+          </w:p>
+        </w:tc>
+      </w:tr>
+      <w:tr>
+        <w:tc>
+          <w:tcPr>
+            <w:tcW w:type="dxa" w:w="4000"/>
+            <w:tcBorders>
+              <w:top w:val="single" w:color="C9CEC0" w:sz="4"/>
+              <w:left w:val="single" w:color="C9CEC0" w:sz="4"/>
+              <w:bottom w:val="single" w:color="C9CEC0" w:sz="4"/>
+              <w:right w:val="single" w:color="C9CEC0" w:sz="4"/>
+            </w:tcBorders>
+            <w:tcMar>
+              <w:top w:type="dxa" w:w="70"/>
+              <w:left w:type="dxa" w:w="110"/>
+              <w:bottom w:type="dxa" w:w="70"/>
+              <w:right w:type="dxa" w:w="110"/>
+            </w:tcMar>
+          </w:tcPr>
+          <w:p>
+            <w:pPr>
+              <w:spacing w:after="0" w:line="300"/>
+            </w:pPr>
+            <w:r>
+              <w:rPr>
+                <w:rFonts w:ascii="Yu Gothic" w:cs="Yu Gothic" w:eastAsia="Yu Gothic" w:hAnsi="Yu Gothic"/>
+              </w:rPr>
+              <w:t xml:space="preserve">PDFや、写真のWord</w:t>
+            </w:r>
+          </w:p>
+        </w:tc>
+        <w:tc>
+          <w:tcPr>
+            <w:tcW w:type="dxa" w:w="5638"/>
+            <w:tcBorders>
+              <w:top w:val="single" w:color="C9CEC0" w:sz="4"/>
+              <w:left w:val="single" w:color="C9CEC0" w:sz="4"/>
+              <w:bottom w:val="single" w:color="C9CEC0" w:sz="4"/>
+              <w:right w:val="single" w:color="C9CEC0" w:sz="4"/>
+            </w:tcBorders>
+            <w:tcMar>
+              <w:top w:type="dxa" w:w="70"/>
+              <w:left w:type="dxa" w:w="110"/>
+              <w:bottom w:type="dxa" w:w="70"/>
+              <w:right w:type="dxa" w:w="110"/>
+            </w:tcMar>
+          </w:tcPr>
+          <w:p>
+            <w:pPr>
+              <w:spacing w:after="0" w:line="300"/>
+            </w:pPr>
+            <w:r>
+              <w:rPr>
+                <w:rFonts w:ascii="Yu Gothic" w:cs="Yu Gothic" w:eastAsia="Yu Gothic" w:hAnsi="Yu Gothic"/>
+              </w:rPr>
+              <w:t xml:space="preserve">読み込めません（文字データが無いため）。</w:t>
+            </w:r>
+          </w:p>
+        </w:tc>
+      </w:tr>
+    </w:tbl>
+    <w:p>
+      <w:pPr>
+        <w:spacing w:after="100"/>
       </w:pPr>
     </w:p>
     <w:p>

</xml_diff>

<commit_message>
Add Word import template; mention it in the manual
Co-Authored-By: Claude Sonnet 5.5 <noreply@anthropic.com>
Claude-Session: https://claude.ai/code/session_01Lr4nGZF4GGC967dspef5Pw
</commit_message>
<xml_diff>
--- a/deliverables/jabara-manual.docx
+++ b/deliverables/jabara-manual.docx
@@ -1008,6 +1008,67 @@
         </w:rPr>
         <w:t xml:space="preserve">どんなWordファイルを読み込ませるか</w:t>
       </w:r>
+    </w:p>
+    <w:tbl>
+      <w:tblPr>
+        <w:tblW w:type="dxa" w:w="9638"/>
+        <w:tblBorders>
+          <w:top w:val="single" w:color="auto" w:sz="4"/>
+          <w:left w:val="single" w:color="auto" w:sz="4"/>
+          <w:bottom w:val="single" w:color="auto" w:sz="4"/>
+          <w:right w:val="single" w:color="auto" w:sz="4"/>
+          <w:insideH w:val="single" w:color="auto" w:sz="4"/>
+          <w:insideV w:val="single" w:color="auto" w:sz="4"/>
+        </w:tblBorders>
+      </w:tblPr>
+      <w:tblGrid>
+        <w:gridCol w:w="9638"/>
+      </w:tblGrid>
+      <w:tr>
+        <w:tc>
+          <w:tcPr>
+            <w:tcW w:type="dxa" w:w="9638"/>
+            <w:tcBorders>
+              <w:top w:val="none" w:color="FFFFFF" w:sz="0"/>
+              <w:left w:val="single" w:color="2B4C6F" w:sz="24"/>
+              <w:bottom w:val="none" w:color="FFFFFF" w:sz="0"/>
+              <w:right w:val="none" w:color="FFFFFF" w:sz="0"/>
+            </w:tcBorders>
+            <w:shd w:fill="E8F1FA" w:color="auto" w:val="clear"/>
+            <w:tcMar>
+              <w:top w:type="dxa" w:w="100"/>
+              <w:left w:type="dxa" w:w="180"/>
+              <w:bottom w:type="dxa" w:w="100"/>
+              <w:right w:type="dxa" w:w="140"/>
+            </w:tcMar>
+          </w:tcPr>
+          <w:p>
+            <w:pPr>
+              <w:spacing w:after="0" w:line="300"/>
+            </w:pPr>
+            <w:r>
+              <w:rPr>
+                <w:rFonts w:ascii="Yu Gothic" w:cs="Yu Gothic" w:eastAsia="Yu Gothic" w:hAnsi="Yu Gothic"/>
+                <w:b/>
+                <w:bCs/>
+                <w:color w:val="2B4C6F"/>
+              </w:rPr>
+              <w:t xml:space="preserve">テンプレート　</w:t>
+            </w:r>
+            <w:r>
+              <w:rPr>
+                <w:rFonts w:ascii="Yu Gothic" w:cs="Yu Gothic" w:eastAsia="Yu Gothic" w:hAnsi="Yu Gothic"/>
+              </w:rPr>
+              <w:t xml:space="preserve">読み込み用のWordテンプレート「jabara-word-template.docx」を用意しています。2ページ目以降のテキストボックスの【パネル○】の文字を書き換えるだけで、そのまま読み込めます（1ページ目は説明用です）。</w:t>
+            </w:r>
+          </w:p>
+        </w:tc>
+      </w:tr>
+    </w:tbl>
+    <w:p>
+      <w:pPr>
+        <w:spacing w:after="80"/>
+      </w:pPr>
     </w:p>
     <w:p>
       <w:pPr>

</xml_diff>

<commit_message>
Plain-lines Word: detect cover block; replace template with plain-lines version
The template now matches the format actually used (title, date, venue,
blank line, body lines) with no explanatory text; the manual covers usage.

Co-Authored-By: Claude Sonnet 5.5 <noreply@anthropic.com>
Claude-Session: https://claude.ai/code/session_01Lr4nGZF4GGC967dspef5Pw
</commit_message>
<xml_diff>
--- a/deliverables/jabara-manual.docx
+++ b/deliverables/jabara-manual.docx
@@ -987,7 +987,7 @@
               <w:rPr>
                 <w:rFonts w:ascii="Yu Gothic" w:cs="Yu Gothic" w:eastAsia="Yu Gothic" w:hAnsi="Yu Gothic"/>
               </w:rPr>
-              <w:t xml:space="preserve">テキストボックスが無く、本文の行だけのWordファイルでも読み込めます。その場合は「。」「、」の位置を見て、自然な区切りでパネルに分けます（表紙は空のままなので、必要なら上の手動ボタンで指定します）。</w:t>
+              <w:t xml:space="preserve">テキストボックスが無く、本文の行だけのWordファイルでも読み込めます。先頭にタイトル・日付・会場の行（空行の前）があれば表紙に入り、本文は「。」「、」の位置を見て、自然な区切りでパネルに分けます。表紙の行が無いときは表紙は空のままなので、上の手動ボタンで指定できます。</w:t>
             </w:r>
           </w:p>
         </w:tc>
@@ -1059,7 +1059,7 @@
               <w:rPr>
                 <w:rFonts w:ascii="Yu Gothic" w:cs="Yu Gothic" w:eastAsia="Yu Gothic" w:hAnsi="Yu Gothic"/>
               </w:rPr>
-              <w:t xml:space="preserve">読み込み用のWordテンプレート「jabara-word-template.docx」を用意しています。2ページ目以降のテキストボックスの【パネル○】の文字を書き換えるだけで、そのまま読み込めます（1ページ目は説明用です）。</w:t>
+              <w:t xml:space="preserve">読み込み用のWordテンプレート「jabara-word-template.docx」を用意しています。1〜3行目のタイトル・日付・会場と、空行のあとの本文を書き換えるだけで、そのまま読み込めます。</w:t>
             </w:r>
           </w:p>
         </w:tc>
@@ -1224,7 +1224,7 @@
               <w:rPr>
                 <w:rFonts w:ascii="Yu Gothic" w:cs="Yu Gothic" w:eastAsia="Yu Gothic" w:hAnsi="Yu Gothic"/>
               </w:rPr>
-              <w:t xml:space="preserve">A. テキストボックス型（おすすめ）</w:t>
+              <w:t xml:space="preserve">A. テキストボックス型</w:t>
             </w:r>
           </w:p>
         </w:tc>
@@ -1332,7 +1332,7 @@
               <w:rPr>
                 <w:rFonts w:ascii="Yu Gothic" w:cs="Yu Gothic" w:eastAsia="Yu Gothic" w:hAnsi="Yu Gothic"/>
               </w:rPr>
-              <w:t xml:space="preserve">B. 本文だけ型</w:t>
+              <w:t xml:space="preserve">B. 本文だけ型（テンプレート）</w:t>
             </w:r>
           </w:p>
         </w:tc>
@@ -1360,18 +1360,18 @@
               <w:rPr>
                 <w:rFonts w:ascii="Yu Gothic" w:cs="Yu Gothic" w:eastAsia="Yu Gothic" w:hAnsi="Yu Gothic"/>
               </w:rPr>
-              <w:t xml:space="preserve">テキストボックスを使わず、本文に1行ずつ（1行＝1段落）で文章を書く。</w:t>
-            </w:r>
-          </w:p>
-          <w:p>
-            <w:pPr>
-              <w:spacing w:after="0" w:line="300"/>
-            </w:pPr>
-            <w:r>
-              <w:rPr>
-                <w:rFonts w:ascii="Yu Gothic" w:cs="Yu Gothic" w:eastAsia="Yu Gothic" w:hAnsi="Yu Gothic"/>
-              </w:rPr>
-              <w:t xml:space="preserve">文の終わりは「。」、段落の頭は字下げをする。</w:t>
+              <w:t xml:space="preserve">1行目：タイトル。2〜3行目：サブタイトル（日付・会場。「開式」「午前」「会館」などの言葉を入れる）。</w:t>
+            </w:r>
+          </w:p>
+          <w:p>
+            <w:pPr>
+              <w:spacing w:after="0" w:line="300"/>
+            </w:pPr>
+            <w:r>
+              <w:rPr>
+                <w:rFonts w:ascii="Yu Gothic" w:cs="Yu Gothic" w:eastAsia="Yu Gothic" w:hAnsi="Yu Gothic"/>
+              </w:rPr>
+              <w:t xml:space="preserve">1行空けて、本文を1行ずつ（1行＝1段落）書く。文の終わりは「。」、段落の頭は字下げ。</w:t>
             </w:r>
           </w:p>
         </w:tc>
@@ -1399,18 +1399,18 @@
               <w:rPr>
                 <w:rFonts w:ascii="Yu Gothic" w:cs="Yu Gothic" w:eastAsia="Yu Gothic" w:hAnsi="Yu Gothic"/>
               </w:rPr>
-              <w:t xml:space="preserve">行数の上限（初期値3行）に収まるように、「。」「、」や段落の頭で自動的にパネルへ分ける。</w:t>
-            </w:r>
-          </w:p>
-          <w:p>
-            <w:pPr>
-              <w:spacing w:after="0" w:line="300"/>
-            </w:pPr>
-            <w:r>
-              <w:rPr>
-                <w:rFonts w:ascii="Yu Gothic" w:cs="Yu Gothic" w:eastAsia="Yu Gothic" w:hAnsi="Yu Gothic"/>
-              </w:rPr>
-              <w:t xml:space="preserve">表紙は空のまま（手動で指定）。</w:t>
+              <w:t xml:space="preserve">タイトル・サブタイトルは表紙欄に入る。</w:t>
+            </w:r>
+          </w:p>
+          <w:p>
+            <w:pPr>
+              <w:spacing w:after="0" w:line="300"/>
+            </w:pPr>
+            <w:r>
+              <w:rPr>
+                <w:rFonts w:ascii="Yu Gothic" w:cs="Yu Gothic" w:eastAsia="Yu Gothic" w:hAnsi="Yu Gothic"/>
+              </w:rPr>
+              <w:t xml:space="preserve">本文は、行数の上限（初期値3行）に収まるように、「。」「、」や段落の頭で自動的にパネルへ分ける。</w:t>
             </w:r>
           </w:p>
         </w:tc>

</xml_diff>

<commit_message>
Use blank lines as panel separators in plain Word files; ship user's template; manual built around it
Co-Authored-By: Claude Sonnet 5.5 <noreply@anthropic.com>
Claude-Session: https://claude.ai/code/session_01Lr4nGZF4GGC967dspef5Pw
</commit_message>
<xml_diff>
--- a/deliverables/jabara-manual.docx
+++ b/deliverables/jabara-manual.docx
@@ -329,7 +329,7 @@
         <w:rPr>
           <w:rFonts w:ascii="Yu Gothic" w:cs="Yu Gothic" w:eastAsia="Yu Gothic" w:hAnsi="Yu Gothic"/>
         </w:rPr>
-        <w:t xml:space="preserve">2. かんたん3ステップ（Word読み込み版）</w:t>
+        <w:t xml:space="preserve">2. かんたん3ステップ（テンプレートを使う）</w:t>
       </w:r>
     </w:p>
     <w:p>
@@ -340,7 +340,7 @@
         <w:rPr>
           <w:rFonts w:ascii="Yu Gothic" w:cs="Yu Gothic" w:eastAsia="Yu Gothic" w:hAnsi="Yu Gothic"/>
         </w:rPr>
-        <w:t xml:space="preserve">Wordファイルがあれば、操作はこの3つだけです。</w:t>
+        <w:t xml:space="preserve">付属のWordテンプレート「jabara-word-template.docx」に祝辞を書いて、ツールに読み込ませるだけです。</w:t>
       </w:r>
     </w:p>
     <w:p>
@@ -358,13 +358,37 @@
           <w:b/>
           <w:bCs/>
         </w:rPr>
-        <w:t xml:space="preserve">Wordファイルを選ぶ：</w:t>
-      </w:r>
-      <w:r>
-        <w:rPr>
-          <w:rFonts w:ascii="Yu Gothic" w:cs="Yu Gothic" w:eastAsia="Yu Gothic" w:hAnsi="Yu Gothic"/>
-        </w:rPr>
-        <w:t xml:space="preserve">「Word読み込み版」のHTMLを開き、「Wordファイルを読み込む」で祝辞のWordファイル（.docx／.doc）を選びます。</w:t>
+        <w:t xml:space="preserve">テンプレートに祝辞を書く：</w:t>
+      </w:r>
+      <w:r>
+        <w:rPr>
+          <w:rFonts w:ascii="Yu Gothic" w:cs="Yu Gothic" w:eastAsia="Yu Gothic" w:hAnsi="Yu Gothic"/>
+        </w:rPr>
+        <w:t xml:space="preserve">テンプレートをコピーしてWordで開き、タイトル・日付・会場・本文を書き換えます（書き方は下の「テンプレートの書き方」）。</w:t>
+      </w:r>
+    </w:p>
+    <w:p>
+      <w:pPr>
+        <w:pStyle w:val="ListParagraph"/>
+        <w:numPr>
+          <w:ilvl w:val="0"/>
+          <w:numId w:val="3"/>
+        </w:numPr>
+        <w:spacing w:after="80" w:line="320"/>
+      </w:pPr>
+      <w:r>
+        <w:rPr>
+          <w:rFonts w:ascii="Yu Gothic" w:cs="Yu Gothic" w:eastAsia="Yu Gothic" w:hAnsi="Yu Gothic"/>
+          <w:b/>
+          <w:bCs/>
+        </w:rPr>
+        <w:t xml:space="preserve">ツールで読み込む：</w:t>
+      </w:r>
+      <w:r>
+        <w:rPr>
+          <w:rFonts w:ascii="Yu Gothic" w:cs="Yu Gothic" w:eastAsia="Yu Gothic" w:hAnsi="Yu Gothic"/>
+        </w:rPr>
+        <w:t xml:space="preserve">「Word読み込み版」のHTMLを開き、「Wordファイルを読み込む」でそのWordファイルを選びます。</w:t>
       </w:r>
     </w:p>
     <w:p>
@@ -611,6 +635,808 @@
         <w:rPr>
           <w:rFonts w:ascii="Yu Gothic" w:cs="Yu Gothic" w:eastAsia="Yu Gothic" w:hAnsi="Yu Gothic"/>
         </w:rPr>
+        <w:t xml:space="preserve">テンプレートの書き方</w:t>
+      </w:r>
+    </w:p>
+    <w:p>
+      <w:pPr>
+        <w:spacing w:after="120" w:line="320"/>
+      </w:pPr>
+      <w:r>
+        <w:rPr>
+          <w:rFonts w:ascii="Yu Gothic" w:cs="Yu Gothic" w:eastAsia="Yu Gothic" w:hAnsi="Yu Gothic"/>
+        </w:rPr>
+        <w:t xml:space="preserve">テンプレートは、上から次の順に並んでいます。見本の「○○」の部分を書き換えてください。</w:t>
+      </w:r>
+    </w:p>
+    <w:tbl>
+      <w:tblPr>
+        <w:tblW w:type="dxa" w:w="9638"/>
+        <w:tblBorders>
+          <w:top w:val="single" w:color="auto" w:sz="4"/>
+          <w:left w:val="single" w:color="auto" w:sz="4"/>
+          <w:bottom w:val="single" w:color="auto" w:sz="4"/>
+          <w:right w:val="single" w:color="auto" w:sz="4"/>
+          <w:insideH w:val="single" w:color="auto" w:sz="4"/>
+          <w:insideV w:val="single" w:color="auto" w:sz="4"/>
+        </w:tblBorders>
+      </w:tblPr>
+      <w:tblGrid>
+        <w:gridCol w:w="1500"/>
+        <w:gridCol w:w="3100"/>
+        <w:gridCol w:w="5038"/>
+      </w:tblGrid>
+      <w:tr>
+        <w:trPr>
+          <w:tblHeader/>
+        </w:trPr>
+        <w:tc>
+          <w:tcPr>
+            <w:tcW w:type="dxa" w:w="1500"/>
+            <w:tcBorders>
+              <w:top w:val="single" w:color="C9CEC0" w:sz="4"/>
+              <w:left w:val="single" w:color="C9CEC0" w:sz="4"/>
+              <w:bottom w:val="single" w:color="C9CEC0" w:sz="4"/>
+              <w:right w:val="single" w:color="C9CEC0" w:sz="4"/>
+            </w:tcBorders>
+            <w:shd w:fill="E6ECF3" w:color="auto" w:val="clear"/>
+            <w:tcMar>
+              <w:top w:type="dxa" w:w="70"/>
+              <w:left w:type="dxa" w:w="110"/>
+              <w:bottom w:type="dxa" w:w="70"/>
+              <w:right w:type="dxa" w:w="110"/>
+            </w:tcMar>
+          </w:tcPr>
+          <w:p>
+            <w:pPr>
+              <w:spacing w:after="0" w:line="300"/>
+            </w:pPr>
+            <w:r>
+              <w:rPr>
+                <w:rFonts w:ascii="Yu Gothic" w:cs="Yu Gothic" w:eastAsia="Yu Gothic" w:hAnsi="Yu Gothic"/>
+                <w:b/>
+                <w:bCs/>
+                <w:color w:val="2B4C6F"/>
+              </w:rPr>
+              <w:t xml:space="preserve">行</w:t>
+            </w:r>
+          </w:p>
+        </w:tc>
+        <w:tc>
+          <w:tcPr>
+            <w:tcW w:type="dxa" w:w="3100"/>
+            <w:tcBorders>
+              <w:top w:val="single" w:color="C9CEC0" w:sz="4"/>
+              <w:left w:val="single" w:color="C9CEC0" w:sz="4"/>
+              <w:bottom w:val="single" w:color="C9CEC0" w:sz="4"/>
+              <w:right w:val="single" w:color="C9CEC0" w:sz="4"/>
+            </w:tcBorders>
+            <w:shd w:fill="E6ECF3" w:color="auto" w:val="clear"/>
+            <w:tcMar>
+              <w:top w:type="dxa" w:w="70"/>
+              <w:left w:type="dxa" w:w="110"/>
+              <w:bottom w:type="dxa" w:w="70"/>
+              <w:right w:type="dxa" w:w="110"/>
+            </w:tcMar>
+          </w:tcPr>
+          <w:p>
+            <w:pPr>
+              <w:spacing w:after="0" w:line="300"/>
+            </w:pPr>
+            <w:r>
+              <w:rPr>
+                <w:rFonts w:ascii="Yu Gothic" w:cs="Yu Gothic" w:eastAsia="Yu Gothic" w:hAnsi="Yu Gothic"/>
+                <w:b/>
+                <w:bCs/>
+                <w:color w:val="2B4C6F"/>
+              </w:rPr>
+              <w:t xml:space="preserve">内容</w:t>
+            </w:r>
+          </w:p>
+        </w:tc>
+        <w:tc>
+          <w:tcPr>
+            <w:tcW w:type="dxa" w:w="5038"/>
+            <w:tcBorders>
+              <w:top w:val="single" w:color="C9CEC0" w:sz="4"/>
+              <w:left w:val="single" w:color="C9CEC0" w:sz="4"/>
+              <w:bottom w:val="single" w:color="C9CEC0" w:sz="4"/>
+              <w:right w:val="single" w:color="C9CEC0" w:sz="4"/>
+            </w:tcBorders>
+            <w:shd w:fill="E6ECF3" w:color="auto" w:val="clear"/>
+            <w:tcMar>
+              <w:top w:type="dxa" w:w="70"/>
+              <w:left w:type="dxa" w:w="110"/>
+              <w:bottom w:type="dxa" w:w="70"/>
+              <w:right w:type="dxa" w:w="110"/>
+            </w:tcMar>
+          </w:tcPr>
+          <w:p>
+            <w:pPr>
+              <w:spacing w:after="0" w:line="300"/>
+            </w:pPr>
+            <w:r>
+              <w:rPr>
+                <w:rFonts w:ascii="Yu Gothic" w:cs="Yu Gothic" w:eastAsia="Yu Gothic" w:hAnsi="Yu Gothic"/>
+                <w:b/>
+                <w:bCs/>
+                <w:color w:val="2B4C6F"/>
+              </w:rPr>
+              <w:t xml:space="preserve">見本</w:t>
+            </w:r>
+          </w:p>
+        </w:tc>
+      </w:tr>
+      <w:tr>
+        <w:tc>
+          <w:tcPr>
+            <w:tcW w:type="dxa" w:w="1500"/>
+            <w:tcBorders>
+              <w:top w:val="single" w:color="C9CEC0" w:sz="4"/>
+              <w:left w:val="single" w:color="C9CEC0" w:sz="4"/>
+              <w:bottom w:val="single" w:color="C9CEC0" w:sz="4"/>
+              <w:right w:val="single" w:color="C9CEC0" w:sz="4"/>
+            </w:tcBorders>
+            <w:tcMar>
+              <w:top w:type="dxa" w:w="70"/>
+              <w:left w:type="dxa" w:w="110"/>
+              <w:bottom w:type="dxa" w:w="70"/>
+              <w:right w:type="dxa" w:w="110"/>
+            </w:tcMar>
+          </w:tcPr>
+          <w:p>
+            <w:pPr>
+              <w:spacing w:after="0" w:line="300"/>
+            </w:pPr>
+            <w:r>
+              <w:rPr>
+                <w:rFonts w:ascii="Yu Gothic" w:cs="Yu Gothic" w:eastAsia="Yu Gothic" w:hAnsi="Yu Gothic"/>
+              </w:rPr>
+              <w:t xml:space="preserve">1行目</w:t>
+            </w:r>
+          </w:p>
+        </w:tc>
+        <w:tc>
+          <w:tcPr>
+            <w:tcW w:type="dxa" w:w="3100"/>
+            <w:tcBorders>
+              <w:top w:val="single" w:color="C9CEC0" w:sz="4"/>
+              <w:left w:val="single" w:color="C9CEC0" w:sz="4"/>
+              <w:bottom w:val="single" w:color="C9CEC0" w:sz="4"/>
+              <w:right w:val="single" w:color="C9CEC0" w:sz="4"/>
+            </w:tcBorders>
+            <w:tcMar>
+              <w:top w:type="dxa" w:w="70"/>
+              <w:left w:type="dxa" w:w="110"/>
+              <w:bottom w:type="dxa" w:w="70"/>
+              <w:right w:type="dxa" w:w="110"/>
+            </w:tcMar>
+          </w:tcPr>
+          <w:p>
+            <w:pPr>
+              <w:spacing w:after="0" w:line="300"/>
+            </w:pPr>
+            <w:r>
+              <w:rPr>
+                <w:rFonts w:ascii="Yu Gothic" w:cs="Yu Gothic" w:eastAsia="Yu Gothic" w:hAnsi="Yu Gothic"/>
+              </w:rPr>
+              <w:t xml:space="preserve">タイトル（24pt・太字）</w:t>
+            </w:r>
+          </w:p>
+        </w:tc>
+        <w:tc>
+          <w:tcPr>
+            <w:tcW w:type="dxa" w:w="5038"/>
+            <w:tcBorders>
+              <w:top w:val="single" w:color="C9CEC0" w:sz="4"/>
+              <w:left w:val="single" w:color="C9CEC0" w:sz="4"/>
+              <w:bottom w:val="single" w:color="C9CEC0" w:sz="4"/>
+              <w:right w:val="single" w:color="C9CEC0" w:sz="4"/>
+            </w:tcBorders>
+            <w:tcMar>
+              <w:top w:type="dxa" w:w="70"/>
+              <w:left w:type="dxa" w:w="110"/>
+              <w:bottom w:type="dxa" w:w="70"/>
+              <w:right w:type="dxa" w:w="110"/>
+            </w:tcMar>
+          </w:tcPr>
+          <w:p>
+            <w:pPr>
+              <w:spacing w:after="0" w:line="300"/>
+            </w:pPr>
+            <w:r>
+              <w:rPr>
+                <w:rFonts w:ascii="Yu Gothic" w:cs="Yu Gothic" w:eastAsia="Yu Gothic" w:hAnsi="Yu Gothic"/>
+              </w:rPr>
+              <w:t xml:space="preserve">○○市　○○周年記念式典　祝辞</w:t>
+            </w:r>
+          </w:p>
+        </w:tc>
+      </w:tr>
+      <w:tr>
+        <w:tc>
+          <w:tcPr>
+            <w:tcW w:type="dxa" w:w="1500"/>
+            <w:tcBorders>
+              <w:top w:val="single" w:color="C9CEC0" w:sz="4"/>
+              <w:left w:val="single" w:color="C9CEC0" w:sz="4"/>
+              <w:bottom w:val="single" w:color="C9CEC0" w:sz="4"/>
+              <w:right w:val="single" w:color="C9CEC0" w:sz="4"/>
+            </w:tcBorders>
+            <w:tcMar>
+              <w:top w:type="dxa" w:w="70"/>
+              <w:left w:type="dxa" w:w="110"/>
+              <w:bottom w:type="dxa" w:w="70"/>
+              <w:right w:type="dxa" w:w="110"/>
+            </w:tcMar>
+          </w:tcPr>
+          <w:p>
+            <w:pPr>
+              <w:spacing w:after="0" w:line="300"/>
+            </w:pPr>
+            <w:r>
+              <w:rPr>
+                <w:rFonts w:ascii="Yu Gothic" w:cs="Yu Gothic" w:eastAsia="Yu Gothic" w:hAnsi="Yu Gothic"/>
+              </w:rPr>
+              <w:t xml:space="preserve">2行目</w:t>
+            </w:r>
+          </w:p>
+        </w:tc>
+        <w:tc>
+          <w:tcPr>
+            <w:tcW w:type="dxa" w:w="3100"/>
+            <w:tcBorders>
+              <w:top w:val="single" w:color="C9CEC0" w:sz="4"/>
+              <w:left w:val="single" w:color="C9CEC0" w:sz="4"/>
+              <w:bottom w:val="single" w:color="C9CEC0" w:sz="4"/>
+              <w:right w:val="single" w:color="C9CEC0" w:sz="4"/>
+            </w:tcBorders>
+            <w:tcMar>
+              <w:top w:type="dxa" w:w="70"/>
+              <w:left w:type="dxa" w:w="110"/>
+              <w:bottom w:type="dxa" w:w="70"/>
+              <w:right w:type="dxa" w:w="110"/>
+            </w:tcMar>
+          </w:tcPr>
+          <w:p>
+            <w:pPr>
+              <w:spacing w:after="0" w:line="300"/>
+            </w:pPr>
+            <w:r>
+              <w:rPr>
+                <w:rFonts w:ascii="Yu Gothic" w:cs="Yu Gothic" w:eastAsia="Yu Gothic" w:hAnsi="Yu Gothic"/>
+              </w:rPr>
+              <w:t xml:space="preserve">日付・時刻（18pt）</w:t>
+            </w:r>
+          </w:p>
+        </w:tc>
+        <w:tc>
+          <w:tcPr>
+            <w:tcW w:type="dxa" w:w="5038"/>
+            <w:tcBorders>
+              <w:top w:val="single" w:color="C9CEC0" w:sz="4"/>
+              <w:left w:val="single" w:color="C9CEC0" w:sz="4"/>
+              <w:bottom w:val="single" w:color="C9CEC0" w:sz="4"/>
+              <w:right w:val="single" w:color="C9CEC0" w:sz="4"/>
+            </w:tcBorders>
+            <w:tcMar>
+              <w:top w:type="dxa" w:w="70"/>
+              <w:left w:type="dxa" w:w="110"/>
+              <w:bottom w:type="dxa" w:w="70"/>
+              <w:right w:type="dxa" w:w="110"/>
+            </w:tcMar>
+          </w:tcPr>
+          <w:p>
+            <w:pPr>
+              <w:spacing w:after="0" w:line="300"/>
+            </w:pPr>
+            <w:r>
+              <w:rPr>
+                <w:rFonts w:ascii="Yu Gothic" w:cs="Yu Gothic" w:eastAsia="Yu Gothic" w:hAnsi="Yu Gothic"/>
+              </w:rPr>
+              <w:t xml:space="preserve">令和○年○月○日（○）午前○時　開式</w:t>
+            </w:r>
+          </w:p>
+        </w:tc>
+      </w:tr>
+      <w:tr>
+        <w:tc>
+          <w:tcPr>
+            <w:tcW w:type="dxa" w:w="1500"/>
+            <w:tcBorders>
+              <w:top w:val="single" w:color="C9CEC0" w:sz="4"/>
+              <w:left w:val="single" w:color="C9CEC0" w:sz="4"/>
+              <w:bottom w:val="single" w:color="C9CEC0" w:sz="4"/>
+              <w:right w:val="single" w:color="C9CEC0" w:sz="4"/>
+            </w:tcBorders>
+            <w:tcMar>
+              <w:top w:type="dxa" w:w="70"/>
+              <w:left w:type="dxa" w:w="110"/>
+              <w:bottom w:type="dxa" w:w="70"/>
+              <w:right w:type="dxa" w:w="110"/>
+            </w:tcMar>
+          </w:tcPr>
+          <w:p>
+            <w:pPr>
+              <w:spacing w:after="0" w:line="300"/>
+            </w:pPr>
+            <w:r>
+              <w:rPr>
+                <w:rFonts w:ascii="Yu Gothic" w:cs="Yu Gothic" w:eastAsia="Yu Gothic" w:hAnsi="Yu Gothic"/>
+              </w:rPr>
+              <w:t xml:space="preserve">3行目</w:t>
+            </w:r>
+          </w:p>
+        </w:tc>
+        <w:tc>
+          <w:tcPr>
+            <w:tcW w:type="dxa" w:w="3100"/>
+            <w:tcBorders>
+              <w:top w:val="single" w:color="C9CEC0" w:sz="4"/>
+              <w:left w:val="single" w:color="C9CEC0" w:sz="4"/>
+              <w:bottom w:val="single" w:color="C9CEC0" w:sz="4"/>
+              <w:right w:val="single" w:color="C9CEC0" w:sz="4"/>
+            </w:tcBorders>
+            <w:tcMar>
+              <w:top w:type="dxa" w:w="70"/>
+              <w:left w:type="dxa" w:w="110"/>
+              <w:bottom w:type="dxa" w:w="70"/>
+              <w:right w:type="dxa" w:w="110"/>
+            </w:tcMar>
+          </w:tcPr>
+          <w:p>
+            <w:pPr>
+              <w:spacing w:after="0" w:line="300"/>
+            </w:pPr>
+            <w:r>
+              <w:rPr>
+                <w:rFonts w:ascii="Yu Gothic" w:cs="Yu Gothic" w:eastAsia="Yu Gothic" w:hAnsi="Yu Gothic"/>
+              </w:rPr>
+              <w:t xml:space="preserve">会場（18pt）</w:t>
+            </w:r>
+          </w:p>
+        </w:tc>
+        <w:tc>
+          <w:tcPr>
+            <w:tcW w:type="dxa" w:w="5038"/>
+            <w:tcBorders>
+              <w:top w:val="single" w:color="C9CEC0" w:sz="4"/>
+              <w:left w:val="single" w:color="C9CEC0" w:sz="4"/>
+              <w:bottom w:val="single" w:color="C9CEC0" w:sz="4"/>
+              <w:right w:val="single" w:color="C9CEC0" w:sz="4"/>
+            </w:tcBorders>
+            <w:tcMar>
+              <w:top w:type="dxa" w:w="70"/>
+              <w:left w:type="dxa" w:w="110"/>
+              <w:bottom w:type="dxa" w:w="70"/>
+              <w:right w:type="dxa" w:w="110"/>
+            </w:tcMar>
+          </w:tcPr>
+          <w:p>
+            <w:pPr>
+              <w:spacing w:after="0" w:line="300"/>
+            </w:pPr>
+            <w:r>
+              <w:rPr>
+                <w:rFonts w:ascii="Yu Gothic" w:cs="Yu Gothic" w:eastAsia="Yu Gothic" w:hAnsi="Yu Gothic"/>
+              </w:rPr>
+              <w:t xml:space="preserve">○○市立○○会館</w:t>
+            </w:r>
+          </w:p>
+        </w:tc>
+      </w:tr>
+      <w:tr>
+        <w:tc>
+          <w:tcPr>
+            <w:tcW w:type="dxa" w:w="1500"/>
+            <w:tcBorders>
+              <w:top w:val="single" w:color="C9CEC0" w:sz="4"/>
+              <w:left w:val="single" w:color="C9CEC0" w:sz="4"/>
+              <w:bottom w:val="single" w:color="C9CEC0" w:sz="4"/>
+              <w:right w:val="single" w:color="C9CEC0" w:sz="4"/>
+            </w:tcBorders>
+            <w:tcMar>
+              <w:top w:type="dxa" w:w="70"/>
+              <w:left w:type="dxa" w:w="110"/>
+              <w:bottom w:type="dxa" w:w="70"/>
+              <w:right w:type="dxa" w:w="110"/>
+            </w:tcMar>
+          </w:tcPr>
+          <w:p>
+            <w:pPr>
+              <w:spacing w:after="0" w:line="300"/>
+            </w:pPr>
+            <w:r>
+              <w:rPr>
+                <w:rFonts w:ascii="Yu Gothic" w:cs="Yu Gothic" w:eastAsia="Yu Gothic" w:hAnsi="Yu Gothic"/>
+              </w:rPr>
+              <w:t xml:space="preserve">（空行）</w:t>
+            </w:r>
+          </w:p>
+        </w:tc>
+        <w:tc>
+          <w:tcPr>
+            <w:tcW w:type="dxa" w:w="3100"/>
+            <w:tcBorders>
+              <w:top w:val="single" w:color="C9CEC0" w:sz="4"/>
+              <w:left w:val="single" w:color="C9CEC0" w:sz="4"/>
+              <w:bottom w:val="single" w:color="C9CEC0" w:sz="4"/>
+              <w:right w:val="single" w:color="C9CEC0" w:sz="4"/>
+            </w:tcBorders>
+            <w:tcMar>
+              <w:top w:type="dxa" w:w="70"/>
+              <w:left w:type="dxa" w:w="110"/>
+              <w:bottom w:type="dxa" w:w="70"/>
+              <w:right w:type="dxa" w:w="110"/>
+            </w:tcMar>
+          </w:tcPr>
+          <w:p>
+            <w:pPr>
+              <w:spacing w:after="0" w:line="300"/>
+            </w:pPr>
+            <w:r>
+              <w:rPr>
+                <w:rFonts w:ascii="Yu Gothic" w:cs="Yu Gothic" w:eastAsia="Yu Gothic" w:hAnsi="Yu Gothic"/>
+              </w:rPr>
+              <w:t xml:space="preserve">ここまでが表紙。ここで1行空ける</w:t>
+            </w:r>
+          </w:p>
+        </w:tc>
+        <w:tc>
+          <w:tcPr>
+            <w:tcW w:type="dxa" w:w="5038"/>
+            <w:tcBorders>
+              <w:top w:val="single" w:color="C9CEC0" w:sz="4"/>
+              <w:left w:val="single" w:color="C9CEC0" w:sz="4"/>
+              <w:bottom w:val="single" w:color="C9CEC0" w:sz="4"/>
+              <w:right w:val="single" w:color="C9CEC0" w:sz="4"/>
+            </w:tcBorders>
+            <w:tcMar>
+              <w:top w:type="dxa" w:w="70"/>
+              <w:left w:type="dxa" w:w="110"/>
+              <w:bottom w:type="dxa" w:w="70"/>
+              <w:right w:type="dxa" w:w="110"/>
+            </w:tcMar>
+          </w:tcPr>
+          <w:p>
+            <w:pPr>
+              <w:spacing w:after="0" w:line="300"/>
+            </w:pPr>
+            <w:r>
+              <w:rPr>
+                <w:rFonts w:ascii="Yu Gothic" w:cs="Yu Gothic" w:eastAsia="Yu Gothic" w:hAnsi="Yu Gothic"/>
+              </w:rPr>
+              <w:t xml:space="preserve"/>
+            </w:r>
+          </w:p>
+        </w:tc>
+      </w:tr>
+      <w:tr>
+        <w:tc>
+          <w:tcPr>
+            <w:tcW w:type="dxa" w:w="1500"/>
+            <w:tcBorders>
+              <w:top w:val="single" w:color="C9CEC0" w:sz="4"/>
+              <w:left w:val="single" w:color="C9CEC0" w:sz="4"/>
+              <w:bottom w:val="single" w:color="C9CEC0" w:sz="4"/>
+              <w:right w:val="single" w:color="C9CEC0" w:sz="4"/>
+            </w:tcBorders>
+            <w:tcMar>
+              <w:top w:type="dxa" w:w="70"/>
+              <w:left w:type="dxa" w:w="110"/>
+              <w:bottom w:type="dxa" w:w="70"/>
+              <w:right w:type="dxa" w:w="110"/>
+            </w:tcMar>
+          </w:tcPr>
+          <w:p>
+            <w:pPr>
+              <w:spacing w:after="0" w:line="300"/>
+            </w:pPr>
+            <w:r>
+              <w:rPr>
+                <w:rFonts w:ascii="Yu Gothic" w:cs="Yu Gothic" w:eastAsia="Yu Gothic" w:hAnsi="Yu Gothic"/>
+              </w:rPr>
+              <w:t xml:space="preserve">4行目〜</w:t>
+            </w:r>
+          </w:p>
+        </w:tc>
+        <w:tc>
+          <w:tcPr>
+            <w:tcW w:type="dxa" w:w="3100"/>
+            <w:tcBorders>
+              <w:top w:val="single" w:color="C9CEC0" w:sz="4"/>
+              <w:left w:val="single" w:color="C9CEC0" w:sz="4"/>
+              <w:bottom w:val="single" w:color="C9CEC0" w:sz="4"/>
+              <w:right w:val="single" w:color="C9CEC0" w:sz="4"/>
+            </w:tcBorders>
+            <w:tcMar>
+              <w:top w:type="dxa" w:w="70"/>
+              <w:left w:type="dxa" w:w="110"/>
+              <w:bottom w:type="dxa" w:w="70"/>
+              <w:right w:type="dxa" w:w="110"/>
+            </w:tcMar>
+          </w:tcPr>
+          <w:p>
+            <w:pPr>
+              <w:spacing w:after="0" w:line="300"/>
+            </w:pPr>
+            <w:r>
+              <w:rPr>
+                <w:rFonts w:ascii="Yu Gothic" w:cs="Yu Gothic" w:eastAsia="Yu Gothic" w:hAnsi="Yu Gothic"/>
+              </w:rPr>
+              <w:t xml:space="preserve">本文。1行ずつ書き、パネルの間は空行を1行入れる</w:t>
+            </w:r>
+          </w:p>
+        </w:tc>
+        <w:tc>
+          <w:tcPr>
+            <w:tcW w:type="dxa" w:w="5038"/>
+            <w:tcBorders>
+              <w:top w:val="single" w:color="C9CEC0" w:sz="4"/>
+              <w:left w:val="single" w:color="C9CEC0" w:sz="4"/>
+              <w:bottom w:val="single" w:color="C9CEC0" w:sz="4"/>
+              <w:right w:val="single" w:color="C9CEC0" w:sz="4"/>
+            </w:tcBorders>
+            <w:tcMar>
+              <w:top w:type="dxa" w:w="70"/>
+              <w:left w:type="dxa" w:w="110"/>
+              <w:bottom w:type="dxa" w:w="70"/>
+              <w:right w:type="dxa" w:w="110"/>
+            </w:tcMar>
+          </w:tcPr>
+          <w:p>
+            <w:pPr>
+              <w:spacing w:after="0" w:line="300"/>
+            </w:pPr>
+            <w:r>
+              <w:rPr>
+                <w:rFonts w:ascii="Yu Gothic" w:cs="Yu Gothic" w:eastAsia="Yu Gothic" w:hAnsi="Yu Gothic"/>
+              </w:rPr>
+              <w:t xml:space="preserve">（1パネルめ）</w:t>
+            </w:r>
+          </w:p>
+          <w:p>
+            <w:pPr>
+              <w:spacing w:after="0" w:line="300"/>
+            </w:pPr>
+            <w:r>
+              <w:rPr>
+                <w:rFonts w:ascii="Yu Gothic" w:cs="Yu Gothic" w:eastAsia="Yu Gothic" w:hAnsi="Yu Gothic"/>
+              </w:rPr>
+              <w:t xml:space="preserve">　○○市が</w:t>
+            </w:r>
+          </w:p>
+          <w:p>
+            <w:pPr>
+              <w:spacing w:after="0" w:line="300"/>
+            </w:pPr>
+            <w:r>
+              <w:rPr>
+                <w:rFonts w:ascii="Yu Gothic" w:cs="Yu Gothic" w:eastAsia="Yu Gothic" w:hAnsi="Yu Gothic"/>
+              </w:rPr>
+              <w:t xml:space="preserve">市制施行○○周年を迎えられ、</w:t>
+            </w:r>
+          </w:p>
+          <w:p>
+            <w:pPr>
+              <w:spacing w:after="0" w:line="300"/>
+            </w:pPr>
+            <w:r>
+              <w:rPr>
+                <w:rFonts w:ascii="Yu Gothic" w:cs="Yu Gothic" w:eastAsia="Yu Gothic" w:hAnsi="Yu Gothic"/>
+              </w:rPr>
+              <w:t xml:space="preserve">（空行）</w:t>
+            </w:r>
+          </w:p>
+          <w:p>
+            <w:pPr>
+              <w:spacing w:after="0" w:line="300"/>
+            </w:pPr>
+            <w:r>
+              <w:rPr>
+                <w:rFonts w:ascii="Yu Gothic" w:cs="Yu Gothic" w:eastAsia="Yu Gothic" w:hAnsi="Yu Gothic"/>
+              </w:rPr>
+              <w:t xml:space="preserve">（2パネルめ）</w:t>
+            </w:r>
+          </w:p>
+          <w:p>
+            <w:pPr>
+              <w:spacing w:after="0" w:line="300"/>
+            </w:pPr>
+            <w:r>
+              <w:rPr>
+                <w:rFonts w:ascii="Yu Gothic" w:cs="Yu Gothic" w:eastAsia="Yu Gothic" w:hAnsi="Yu Gothic"/>
+              </w:rPr>
+              <w:t xml:space="preserve">このように記念式典が盛大に</w:t>
+            </w:r>
+          </w:p>
+          <w:p>
+            <w:pPr>
+              <w:spacing w:after="0" w:line="300"/>
+            </w:pPr>
+            <w:r>
+              <w:rPr>
+                <w:rFonts w:ascii="Yu Gothic" w:cs="Yu Gothic" w:eastAsia="Yu Gothic" w:hAnsi="Yu Gothic"/>
+              </w:rPr>
+              <w:t xml:space="preserve">開催されますことを、</w:t>
+            </w:r>
+          </w:p>
+          <w:p>
+            <w:pPr>
+              <w:spacing w:after="0" w:line="300"/>
+            </w:pPr>
+            <w:r>
+              <w:rPr>
+                <w:rFonts w:ascii="Yu Gothic" w:cs="Yu Gothic" w:eastAsia="Yu Gothic" w:hAnsi="Yu Gothic"/>
+              </w:rPr>
+              <w:t xml:space="preserve">心からお慶び申し上げます。</w:t>
+            </w:r>
+          </w:p>
+        </w:tc>
+      </w:tr>
+    </w:tbl>
+    <w:p>
+      <w:pPr>
+        <w:spacing w:after="80"/>
+      </w:pPr>
+    </w:p>
+    <w:p>
+      <w:pPr>
+        <w:pStyle w:val="ListParagraph"/>
+        <w:numPr>
+          <w:ilvl w:val="0"/>
+          <w:numId w:val="2"/>
+        </w:numPr>
+        <w:spacing w:after="60" w:line="320"/>
+      </w:pPr>
+      <w:r>
+        <w:rPr>
+          <w:rFonts w:ascii="Yu Gothic" w:cs="Yu Gothic" w:eastAsia="Yu Gothic" w:hAnsi="Yu Gothic"/>
+          <w:b/>
+          <w:bCs/>
+        </w:rPr>
+        <w:t xml:space="preserve">1パネル＝空行で区切った1まとまり：</w:t>
+      </w:r>
+      <w:r>
+        <w:rPr>
+          <w:rFonts w:ascii="Yu Gothic" w:cs="Yu Gothic" w:eastAsia="Yu Gothic" w:hAnsi="Yu Gothic"/>
+        </w:rPr>
+        <w:t xml:space="preserve">1行ずつ（Enterで段落を分けて）書きます。1パネルは最大3行、1行は全角15文字程度が目安です。パネルの間には空行を1行入れます。</w:t>
+      </w:r>
+    </w:p>
+    <w:p>
+      <w:pPr>
+        <w:pStyle w:val="ListParagraph"/>
+        <w:numPr>
+          <w:ilvl w:val="0"/>
+          <w:numId w:val="2"/>
+        </w:numPr>
+        <w:spacing w:after="60" w:line="320"/>
+      </w:pPr>
+      <w:r>
+        <w:rPr>
+          <w:rFonts w:ascii="Yu Gothic" w:cs="Yu Gothic" w:eastAsia="Yu Gothic" w:hAnsi="Yu Gothic"/>
+          <w:b/>
+          <w:bCs/>
+        </w:rPr>
+        <w:t xml:space="preserve">段落の頭：</w:t>
+      </w:r>
+      <w:r>
+        <w:rPr>
+          <w:rFonts w:ascii="Yu Gothic" w:cs="Yu Gothic" w:eastAsia="Yu Gothic" w:hAnsi="Yu Gothic"/>
+        </w:rPr>
+        <w:t xml:space="preserve">字下げ（段落の「最初の行」を1字下げ）か、全角スペースを入れます。字下げは全角スペースとして読み込まれます。</w:t>
+      </w:r>
+    </w:p>
+    <w:p>
+      <w:pPr>
+        <w:pStyle w:val="ListParagraph"/>
+        <w:numPr>
+          <w:ilvl w:val="0"/>
+          <w:numId w:val="2"/>
+        </w:numPr>
+        <w:spacing w:after="60" w:line="320"/>
+      </w:pPr>
+      <w:r>
+        <w:rPr>
+          <w:rFonts w:ascii="Yu Gothic" w:cs="Yu Gothic" w:eastAsia="Yu Gothic" w:hAnsi="Yu Gothic"/>
+          <w:b/>
+          <w:bCs/>
+        </w:rPr>
+        <w:t xml:space="preserve">ふりがな：</w:t>
+      </w:r>
+      <w:r>
+        <w:rPr>
+          <w:rFonts w:ascii="Yu Gothic" w:cs="Yu Gothic" w:eastAsia="Yu Gothic" w:hAnsi="Yu Gothic"/>
+        </w:rPr>
+        <w:t xml:space="preserve">Wordの「ふりがな」（ルビ）機能で付けると、そのまま読み込まれます。「大宝(だいほう)」のように、漢字の直後にひらがなをかっこで書く方法でも変換されます。</w:t>
+      </w:r>
+    </w:p>
+    <w:p>
+      <w:pPr>
+        <w:pStyle w:val="ListParagraph"/>
+        <w:numPr>
+          <w:ilvl w:val="0"/>
+          <w:numId w:val="2"/>
+        </w:numPr>
+        <w:spacing w:after="60" w:line="320"/>
+      </w:pPr>
+      <w:r>
+        <w:rPr>
+          <w:rFonts w:ascii="Yu Gothic" w:cs="Yu Gothic" w:eastAsia="Yu Gothic" w:hAnsi="Yu Gothic"/>
+          <w:b/>
+          <w:bCs/>
+        </w:rPr>
+        <w:t xml:space="preserve">表紙の判定：</w:t>
+      </w:r>
+      <w:r>
+        <w:rPr>
+          <w:rFonts w:ascii="Yu Gothic" w:cs="Yu Gothic" w:eastAsia="Yu Gothic" w:hAnsi="Yu Gothic"/>
+        </w:rPr>
+        <w:t xml:space="preserve">日付・会場の行に「開式」「午前」「午後」「会館」「ホール」「体育館」などの言葉を入れておくと、確実に表紙へ振り分けられます。タイトル24pt・日付と会場18ptの文字サイズも判定に使うので、テンプレートのままにしてください。</w:t>
+      </w:r>
+    </w:p>
+    <w:p>
+      <w:pPr>
+        <w:pStyle w:val="ListParagraph"/>
+        <w:numPr>
+          <w:ilvl w:val="0"/>
+          <w:numId w:val="2"/>
+        </w:numPr>
+        <w:spacing w:after="60" w:line="320"/>
+      </w:pPr>
+      <w:r>
+        <w:rPr>
+          <w:rFonts w:ascii="Yu Gothic" w:cs="Yu Gothic" w:eastAsia="Yu Gothic" w:hAnsi="Yu Gothic"/>
+          <w:b/>
+          <w:bCs/>
+        </w:rPr>
+        <w:t xml:space="preserve">空行を入れなかったとき：</w:t>
+      </w:r>
+      <w:r>
+        <w:rPr>
+          <w:rFonts w:ascii="Yu Gothic" w:cs="Yu Gothic" w:eastAsia="Yu Gothic" w:hAnsi="Yu Gothic"/>
+        </w:rPr>
+        <w:t xml:space="preserve">本文を1パネル最大3行に収まるように、「。」「、」や段落の頭で自動的に区切ります。（区切りは後から、画面上でドラッグして直せます）</w:t>
+      </w:r>
+    </w:p>
+    <w:p>
+      <w:pPr>
+        <w:pStyle w:val="ListParagraph"/>
+        <w:numPr>
+          <w:ilvl w:val="0"/>
+          <w:numId w:val="2"/>
+        </w:numPr>
+        <w:spacing w:after="60" w:line="320"/>
+      </w:pPr>
+      <w:r>
+        <w:rPr>
+          <w:rFonts w:ascii="Yu Gothic" w:cs="Yu Gothic" w:eastAsia="Yu Gothic" w:hAnsi="Yu Gothic"/>
+          <w:b/>
+          <w:bCs/>
+        </w:rPr>
+        <w:t xml:space="preserve">1パネルが4行以上のとき：</w:t>
+      </w:r>
+      <w:r>
+        <w:rPr>
+          <w:rFonts w:ascii="Yu Gothic" w:cs="Yu Gothic" w:eastAsia="Yu Gothic" w:hAnsi="Yu Gothic"/>
+        </w:rPr>
+        <w:t xml:space="preserve">3行ずつに分けて、複数のパネルになります。</w:t>
+      </w:r>
+    </w:p>
+    <w:p>
+      <w:pPr>
+        <w:spacing w:after="80"/>
+      </w:pPr>
+    </w:p>
+    <w:p>
+      <w:pPr>
+        <w:pStyle w:val="Heading2"/>
+      </w:pPr>
+      <w:r>
+        <w:rPr>
+          <w:rFonts w:ascii="Yu Gothic" w:cs="Yu Gothic" w:eastAsia="Yu Gothic" w:hAnsi="Yu Gothic"/>
+        </w:rPr>
         <w:t xml:space="preserve">自動で入るもの／あとで確認するもの</w:t>
       </w:r>
     </w:p>
@@ -782,7 +1608,7 @@
               <w:rPr>
                 <w:rFonts w:ascii="Yu Gothic" w:cs="Yu Gothic" w:eastAsia="Yu Gothic" w:hAnsi="Yu Gothic"/>
               </w:rPr>
-              <w:t xml:space="preserve">本文のパネル分け（1パネル最大3行）</w:t>
+              <w:t xml:space="preserve">本文のパネル分け（空行の位置、最大3行）</w:t>
             </w:r>
           </w:p>
         </w:tc>
@@ -937,67 +1763,6 @@
         <w:spacing w:after="80"/>
       </w:pPr>
     </w:p>
-    <w:tbl>
-      <w:tblPr>
-        <w:tblW w:type="dxa" w:w="9638"/>
-        <w:tblBorders>
-          <w:top w:val="single" w:color="auto" w:sz="4"/>
-          <w:left w:val="single" w:color="auto" w:sz="4"/>
-          <w:bottom w:val="single" w:color="auto" w:sz="4"/>
-          <w:right w:val="single" w:color="auto" w:sz="4"/>
-          <w:insideH w:val="single" w:color="auto" w:sz="4"/>
-          <w:insideV w:val="single" w:color="auto" w:sz="4"/>
-        </w:tblBorders>
-      </w:tblPr>
-      <w:tblGrid>
-        <w:gridCol w:w="9638"/>
-      </w:tblGrid>
-      <w:tr>
-        <w:tc>
-          <w:tcPr>
-            <w:tcW w:type="dxa" w:w="9638"/>
-            <w:tcBorders>
-              <w:top w:val="none" w:color="FFFFFF" w:sz="0"/>
-              <w:left w:val="single" w:color="2B4C6F" w:sz="24"/>
-              <w:bottom w:val="none" w:color="FFFFFF" w:sz="0"/>
-              <w:right w:val="none" w:color="FFFFFF" w:sz="0"/>
-            </w:tcBorders>
-            <w:shd w:fill="E8F1FA" w:color="auto" w:val="clear"/>
-            <w:tcMar>
-              <w:top w:type="dxa" w:w="100"/>
-              <w:left w:type="dxa" w:w="180"/>
-              <w:bottom w:type="dxa" w:w="100"/>
-              <w:right w:type="dxa" w:w="140"/>
-            </w:tcMar>
-          </w:tcPr>
-          <w:p>
-            <w:pPr>
-              <w:spacing w:after="0" w:line="300"/>
-            </w:pPr>
-            <w:r>
-              <w:rPr>
-                <w:rFonts w:ascii="Yu Gothic" w:cs="Yu Gothic" w:eastAsia="Yu Gothic" w:hAnsi="Yu Gothic"/>
-                <w:b/>
-                <w:bCs/>
-                <w:color w:val="2B4C6F"/>
-              </w:rPr>
-              <w:t xml:space="preserve">メモ　</w:t>
-            </w:r>
-            <w:r>
-              <w:rPr>
-                <w:rFonts w:ascii="Yu Gothic" w:cs="Yu Gothic" w:eastAsia="Yu Gothic" w:hAnsi="Yu Gothic"/>
-              </w:rPr>
-              <w:t xml:space="preserve">テキストボックスが無く、本文の行だけのWordファイルでも読み込めます。先頭にタイトル・日付・会場の行（空行の前）があれば表紙に入り、本文は「。」「、」の位置を見て、自然な区切りでパネルに分けます。表紙の行が無いときは表紙は空のままなので、上の手動ボタンで指定できます。</w:t>
-            </w:r>
-          </w:p>
-        </w:tc>
-      </w:tr>
-    </w:tbl>
-    <w:p>
-      <w:pPr>
-        <w:spacing w:after="120"/>
-      </w:pPr>
-    </w:p>
     <w:p>
       <w:pPr>
         <w:pStyle w:val="Heading2"/>
@@ -1006,430 +1771,7 @@
         <w:rPr>
           <w:rFonts w:ascii="Yu Gothic" w:cs="Yu Gothic" w:eastAsia="Yu Gothic" w:hAnsi="Yu Gothic"/>
         </w:rPr>
-        <w:t xml:space="preserve">どんなWordファイルを読み込ませるか</w:t>
-      </w:r>
-    </w:p>
-    <w:tbl>
-      <w:tblPr>
-        <w:tblW w:type="dxa" w:w="9638"/>
-        <w:tblBorders>
-          <w:top w:val="single" w:color="auto" w:sz="4"/>
-          <w:left w:val="single" w:color="auto" w:sz="4"/>
-          <w:bottom w:val="single" w:color="auto" w:sz="4"/>
-          <w:right w:val="single" w:color="auto" w:sz="4"/>
-          <w:insideH w:val="single" w:color="auto" w:sz="4"/>
-          <w:insideV w:val="single" w:color="auto" w:sz="4"/>
-        </w:tblBorders>
-      </w:tblPr>
-      <w:tblGrid>
-        <w:gridCol w:w="9638"/>
-      </w:tblGrid>
-      <w:tr>
-        <w:tc>
-          <w:tcPr>
-            <w:tcW w:type="dxa" w:w="9638"/>
-            <w:tcBorders>
-              <w:top w:val="none" w:color="FFFFFF" w:sz="0"/>
-              <w:left w:val="single" w:color="2B4C6F" w:sz="24"/>
-              <w:bottom w:val="none" w:color="FFFFFF" w:sz="0"/>
-              <w:right w:val="none" w:color="FFFFFF" w:sz="0"/>
-            </w:tcBorders>
-            <w:shd w:fill="E8F1FA" w:color="auto" w:val="clear"/>
-            <w:tcMar>
-              <w:top w:type="dxa" w:w="100"/>
-              <w:left w:type="dxa" w:w="180"/>
-              <w:bottom w:type="dxa" w:w="100"/>
-              <w:right w:type="dxa" w:w="140"/>
-            </w:tcMar>
-          </w:tcPr>
-          <w:p>
-            <w:pPr>
-              <w:spacing w:after="0" w:line="300"/>
-            </w:pPr>
-            <w:r>
-              <w:rPr>
-                <w:rFonts w:ascii="Yu Gothic" w:cs="Yu Gothic" w:eastAsia="Yu Gothic" w:hAnsi="Yu Gothic"/>
-                <w:b/>
-                <w:bCs/>
-                <w:color w:val="2B4C6F"/>
-              </w:rPr>
-              <w:t xml:space="preserve">テンプレート　</w:t>
-            </w:r>
-            <w:r>
-              <w:rPr>
-                <w:rFonts w:ascii="Yu Gothic" w:cs="Yu Gothic" w:eastAsia="Yu Gothic" w:hAnsi="Yu Gothic"/>
-              </w:rPr>
-              <w:t xml:space="preserve">読み込み用のWordテンプレート「jabara-word-template.docx」を用意しています。1〜3行目のタイトル・日付・会場と、空行のあとの本文を書き換えるだけで、そのまま読み込めます。</w:t>
-            </w:r>
-          </w:p>
-        </w:tc>
-      </w:tr>
-    </w:tbl>
-    <w:p>
-      <w:pPr>
-        <w:spacing w:after="80"/>
-      </w:pPr>
-    </w:p>
-    <w:p>
-      <w:pPr>
-        <w:spacing w:after="120" w:line="320"/>
-      </w:pPr>
-      <w:r>
-        <w:rPr>
-          <w:rFonts w:ascii="Yu Gothic" w:cs="Yu Gothic" w:eastAsia="Yu Gothic" w:hAnsi="Yu Gothic"/>
-        </w:rPr>
-        <w:t xml:space="preserve">次の2つのどちらかの作りなら、そのまま読み込めます。ファイルの形式は .docx（新しい形式）または .doc（旧形式）です。</w:t>
-      </w:r>
-    </w:p>
-    <w:tbl>
-      <w:tblPr>
-        <w:tblW w:type="dxa" w:w="9638"/>
-        <w:tblBorders>
-          <w:top w:val="single" w:color="auto" w:sz="4"/>
-          <w:left w:val="single" w:color="auto" w:sz="4"/>
-          <w:bottom w:val="single" w:color="auto" w:sz="4"/>
-          <w:right w:val="single" w:color="auto" w:sz="4"/>
-          <w:insideH w:val="single" w:color="auto" w:sz="4"/>
-          <w:insideV w:val="single" w:color="auto" w:sz="4"/>
-        </w:tblBorders>
-      </w:tblPr>
-      <w:tblGrid>
-        <w:gridCol w:w="1900"/>
-        <w:gridCol w:w="3700"/>
-        <w:gridCol w:w="4038"/>
-      </w:tblGrid>
-      <w:tr>
-        <w:trPr>
-          <w:tblHeader/>
-        </w:trPr>
-        <w:tc>
-          <w:tcPr>
-            <w:tcW w:type="dxa" w:w="1900"/>
-            <w:tcBorders>
-              <w:top w:val="single" w:color="C9CEC0" w:sz="4"/>
-              <w:left w:val="single" w:color="C9CEC0" w:sz="4"/>
-              <w:bottom w:val="single" w:color="C9CEC0" w:sz="4"/>
-              <w:right w:val="single" w:color="C9CEC0" w:sz="4"/>
-            </w:tcBorders>
-            <w:shd w:fill="E6ECF3" w:color="auto" w:val="clear"/>
-            <w:tcMar>
-              <w:top w:type="dxa" w:w="70"/>
-              <w:left w:type="dxa" w:w="110"/>
-              <w:bottom w:type="dxa" w:w="70"/>
-              <w:right w:type="dxa" w:w="110"/>
-            </w:tcMar>
-          </w:tcPr>
-          <w:p>
-            <w:pPr>
-              <w:spacing w:after="0" w:line="300"/>
-            </w:pPr>
-            <w:r>
-              <w:rPr>
-                <w:rFonts w:ascii="Yu Gothic" w:cs="Yu Gothic" w:eastAsia="Yu Gothic" w:hAnsi="Yu Gothic"/>
-                <w:b/>
-                <w:bCs/>
-                <w:color w:val="2B4C6F"/>
-              </w:rPr>
-              <w:t xml:space="preserve">パターン</w:t>
-            </w:r>
-          </w:p>
-        </w:tc>
-        <w:tc>
-          <w:tcPr>
-            <w:tcW w:type="dxa" w:w="3700"/>
-            <w:tcBorders>
-              <w:top w:val="single" w:color="C9CEC0" w:sz="4"/>
-              <w:left w:val="single" w:color="C9CEC0" w:sz="4"/>
-              <w:bottom w:val="single" w:color="C9CEC0" w:sz="4"/>
-              <w:right w:val="single" w:color="C9CEC0" w:sz="4"/>
-            </w:tcBorders>
-            <w:shd w:fill="E6ECF3" w:color="auto" w:val="clear"/>
-            <w:tcMar>
-              <w:top w:type="dxa" w:w="70"/>
-              <w:left w:type="dxa" w:w="110"/>
-              <w:bottom w:type="dxa" w:w="70"/>
-              <w:right w:type="dxa" w:w="110"/>
-            </w:tcMar>
-          </w:tcPr>
-          <w:p>
-            <w:pPr>
-              <w:spacing w:after="0" w:line="300"/>
-            </w:pPr>
-            <w:r>
-              <w:rPr>
-                <w:rFonts w:ascii="Yu Gothic" w:cs="Yu Gothic" w:eastAsia="Yu Gothic" w:hAnsi="Yu Gothic"/>
-                <w:b/>
-                <w:bCs/>
-                <w:color w:val="2B4C6F"/>
-              </w:rPr>
-              <w:t xml:space="preserve">作り方</w:t>
-            </w:r>
-          </w:p>
-        </w:tc>
-        <w:tc>
-          <w:tcPr>
-            <w:tcW w:type="dxa" w:w="4038"/>
-            <w:tcBorders>
-              <w:top w:val="single" w:color="C9CEC0" w:sz="4"/>
-              <w:left w:val="single" w:color="C9CEC0" w:sz="4"/>
-              <w:bottom w:val="single" w:color="C9CEC0" w:sz="4"/>
-              <w:right w:val="single" w:color="C9CEC0" w:sz="4"/>
-            </w:tcBorders>
-            <w:shd w:fill="E6ECF3" w:color="auto" w:val="clear"/>
-            <w:tcMar>
-              <w:top w:type="dxa" w:w="70"/>
-              <w:left w:type="dxa" w:w="110"/>
-              <w:bottom w:type="dxa" w:w="70"/>
-              <w:right w:type="dxa" w:w="110"/>
-            </w:tcMar>
-          </w:tcPr>
-          <w:p>
-            <w:pPr>
-              <w:spacing w:after="0" w:line="300"/>
-            </w:pPr>
-            <w:r>
-              <w:rPr>
-                <w:rFonts w:ascii="Yu Gothic" w:cs="Yu Gothic" w:eastAsia="Yu Gothic" w:hAnsi="Yu Gothic"/>
-                <w:b/>
-                <w:bCs/>
-                <w:color w:val="2B4C6F"/>
-              </w:rPr>
-              <w:t xml:space="preserve">読み込んだ結果</w:t>
-            </w:r>
-          </w:p>
-        </w:tc>
-      </w:tr>
-      <w:tr>
-        <w:tc>
-          <w:tcPr>
-            <w:tcW w:type="dxa" w:w="1900"/>
-            <w:tcBorders>
-              <w:top w:val="single" w:color="C9CEC0" w:sz="4"/>
-              <w:left w:val="single" w:color="C9CEC0" w:sz="4"/>
-              <w:bottom w:val="single" w:color="C9CEC0" w:sz="4"/>
-              <w:right w:val="single" w:color="C9CEC0" w:sz="4"/>
-            </w:tcBorders>
-            <w:tcMar>
-              <w:top w:type="dxa" w:w="70"/>
-              <w:left w:type="dxa" w:w="110"/>
-              <w:bottom w:type="dxa" w:w="70"/>
-              <w:right w:type="dxa" w:w="110"/>
-            </w:tcMar>
-          </w:tcPr>
-          <w:p>
-            <w:pPr>
-              <w:spacing w:after="0" w:line="300"/>
-            </w:pPr>
-            <w:r>
-              <w:rPr>
-                <w:rFonts w:ascii="Yu Gothic" w:cs="Yu Gothic" w:eastAsia="Yu Gothic" w:hAnsi="Yu Gothic"/>
-              </w:rPr>
-              <w:t xml:space="preserve">A. テキストボックス型</w:t>
-            </w:r>
-          </w:p>
-        </w:tc>
-        <w:tc>
-          <w:tcPr>
-            <w:tcW w:type="dxa" w:w="3700"/>
-            <w:tcBorders>
-              <w:top w:val="single" w:color="C9CEC0" w:sz="4"/>
-              <w:left w:val="single" w:color="C9CEC0" w:sz="4"/>
-              <w:bottom w:val="single" w:color="C9CEC0" w:sz="4"/>
-              <w:right w:val="single" w:color="C9CEC0" w:sz="4"/>
-            </w:tcBorders>
-            <w:tcMar>
-              <w:top w:type="dxa" w:w="70"/>
-              <w:left w:type="dxa" w:w="110"/>
-              <w:bottom w:type="dxa" w:w="70"/>
-              <w:right w:type="dxa" w:w="110"/>
-            </w:tcMar>
-          </w:tcPr>
-          <w:p>
-            <w:pPr>
-              <w:spacing w:after="0" w:line="300"/>
-            </w:pPr>
-            <w:r>
-              <w:rPr>
-                <w:rFonts w:ascii="Yu Gothic" w:cs="Yu Gothic" w:eastAsia="Yu Gothic" w:hAnsi="Yu Gothic"/>
-              </w:rPr>
-              <w:t xml:space="preserve">1つのテキストボックス＝蛇腹の1パネルとして、文章を入れる。</w:t>
-            </w:r>
-          </w:p>
-          <w:p>
-            <w:pPr>
-              <w:spacing w:after="0" w:line="300"/>
-            </w:pPr>
-            <w:r>
-              <w:rPr>
-                <w:rFonts w:ascii="Yu Gothic" w:cs="Yu Gothic" w:eastAsia="Yu Gothic" w:hAnsi="Yu Gothic"/>
-              </w:rPr>
-              <w:t xml:space="preserve">1枚目のテキストボックスに、タイトルとサブタイトル（日付・会場）を入れ、本文より文字サイズを変える（例：本文30pt、タイトル24pt、サブタイトル18pt）。</w:t>
-            </w:r>
-          </w:p>
-        </w:tc>
-        <w:tc>
-          <w:tcPr>
-            <w:tcW w:type="dxa" w:w="4038"/>
-            <w:tcBorders>
-              <w:top w:val="single" w:color="C9CEC0" w:sz="4"/>
-              <w:left w:val="single" w:color="C9CEC0" w:sz="4"/>
-              <w:bottom w:val="single" w:color="C9CEC0" w:sz="4"/>
-              <w:right w:val="single" w:color="C9CEC0" w:sz="4"/>
-            </w:tcBorders>
-            <w:tcMar>
-              <w:top w:type="dxa" w:w="70"/>
-              <w:left w:type="dxa" w:w="110"/>
-              <w:bottom w:type="dxa" w:w="70"/>
-              <w:right w:type="dxa" w:w="110"/>
-            </w:tcMar>
-          </w:tcPr>
-          <w:p>
-            <w:pPr>
-              <w:spacing w:after="0" w:line="300"/>
-            </w:pPr>
-            <w:r>
-              <w:rPr>
-                <w:rFonts w:ascii="Yu Gothic" w:cs="Yu Gothic" w:eastAsia="Yu Gothic" w:hAnsi="Yu Gothic"/>
-              </w:rPr>
-              <w:t xml:space="preserve">テキストボックス1つが、パネル1つになる。</w:t>
-            </w:r>
-          </w:p>
-          <w:p>
-            <w:pPr>
-              <w:spacing w:after="0" w:line="300"/>
-            </w:pPr>
-            <w:r>
-              <w:rPr>
-                <w:rFonts w:ascii="Yu Gothic" w:cs="Yu Gothic" w:eastAsia="Yu Gothic" w:hAnsi="Yu Gothic"/>
-              </w:rPr>
-              <w:t xml:space="preserve">タイトル・サブタイトルは表紙欄に入る。</w:t>
-            </w:r>
-          </w:p>
-        </w:tc>
-      </w:tr>
-      <w:tr>
-        <w:tc>
-          <w:tcPr>
-            <w:tcW w:type="dxa" w:w="1900"/>
-            <w:tcBorders>
-              <w:top w:val="single" w:color="C9CEC0" w:sz="4"/>
-              <w:left w:val="single" w:color="C9CEC0" w:sz="4"/>
-              <w:bottom w:val="single" w:color="C9CEC0" w:sz="4"/>
-              <w:right w:val="single" w:color="C9CEC0" w:sz="4"/>
-            </w:tcBorders>
-            <w:tcMar>
-              <w:top w:type="dxa" w:w="70"/>
-              <w:left w:type="dxa" w:w="110"/>
-              <w:bottom w:type="dxa" w:w="70"/>
-              <w:right w:type="dxa" w:w="110"/>
-            </w:tcMar>
-          </w:tcPr>
-          <w:p>
-            <w:pPr>
-              <w:spacing w:after="0" w:line="300"/>
-            </w:pPr>
-            <w:r>
-              <w:rPr>
-                <w:rFonts w:ascii="Yu Gothic" w:cs="Yu Gothic" w:eastAsia="Yu Gothic" w:hAnsi="Yu Gothic"/>
-              </w:rPr>
-              <w:t xml:space="preserve">B. 本文だけ型（テンプレート）</w:t>
-            </w:r>
-          </w:p>
-        </w:tc>
-        <w:tc>
-          <w:tcPr>
-            <w:tcW w:type="dxa" w:w="3700"/>
-            <w:tcBorders>
-              <w:top w:val="single" w:color="C9CEC0" w:sz="4"/>
-              <w:left w:val="single" w:color="C9CEC0" w:sz="4"/>
-              <w:bottom w:val="single" w:color="C9CEC0" w:sz="4"/>
-              <w:right w:val="single" w:color="C9CEC0" w:sz="4"/>
-            </w:tcBorders>
-            <w:tcMar>
-              <w:top w:type="dxa" w:w="70"/>
-              <w:left w:type="dxa" w:w="110"/>
-              <w:bottom w:type="dxa" w:w="70"/>
-              <w:right w:type="dxa" w:w="110"/>
-            </w:tcMar>
-          </w:tcPr>
-          <w:p>
-            <w:pPr>
-              <w:spacing w:after="0" w:line="300"/>
-            </w:pPr>
-            <w:r>
-              <w:rPr>
-                <w:rFonts w:ascii="Yu Gothic" w:cs="Yu Gothic" w:eastAsia="Yu Gothic" w:hAnsi="Yu Gothic"/>
-              </w:rPr>
-              <w:t xml:space="preserve">1行目：タイトル。2〜3行目：サブタイトル（日付・会場。「開式」「午前」「会館」などの言葉を入れる）。</w:t>
-            </w:r>
-          </w:p>
-          <w:p>
-            <w:pPr>
-              <w:spacing w:after="0" w:line="300"/>
-            </w:pPr>
-            <w:r>
-              <w:rPr>
-                <w:rFonts w:ascii="Yu Gothic" w:cs="Yu Gothic" w:eastAsia="Yu Gothic" w:hAnsi="Yu Gothic"/>
-              </w:rPr>
-              <w:t xml:space="preserve">1行空けて、本文を1行ずつ（1行＝1段落）書く。文の終わりは「。」、段落の頭は字下げ。</w:t>
-            </w:r>
-          </w:p>
-        </w:tc>
-        <w:tc>
-          <w:tcPr>
-            <w:tcW w:type="dxa" w:w="4038"/>
-            <w:tcBorders>
-              <w:top w:val="single" w:color="C9CEC0" w:sz="4"/>
-              <w:left w:val="single" w:color="C9CEC0" w:sz="4"/>
-              <w:bottom w:val="single" w:color="C9CEC0" w:sz="4"/>
-              <w:right w:val="single" w:color="C9CEC0" w:sz="4"/>
-            </w:tcBorders>
-            <w:tcMar>
-              <w:top w:type="dxa" w:w="70"/>
-              <w:left w:type="dxa" w:w="110"/>
-              <w:bottom w:type="dxa" w:w="70"/>
-              <w:right w:type="dxa" w:w="110"/>
-            </w:tcMar>
-          </w:tcPr>
-          <w:p>
-            <w:pPr>
-              <w:spacing w:after="0" w:line="300"/>
-            </w:pPr>
-            <w:r>
-              <w:rPr>
-                <w:rFonts w:ascii="Yu Gothic" w:cs="Yu Gothic" w:eastAsia="Yu Gothic" w:hAnsi="Yu Gothic"/>
-              </w:rPr>
-              <w:t xml:space="preserve">タイトル・サブタイトルは表紙欄に入る。</w:t>
-            </w:r>
-          </w:p>
-          <w:p>
-            <w:pPr>
-              <w:spacing w:after="0" w:line="300"/>
-            </w:pPr>
-            <w:r>
-              <w:rPr>
-                <w:rFonts w:ascii="Yu Gothic" w:cs="Yu Gothic" w:eastAsia="Yu Gothic" w:hAnsi="Yu Gothic"/>
-              </w:rPr>
-              <w:t xml:space="preserve">本文は、行数の上限（初期値3行）に収まるように、「。」「、」や段落の頭で自動的にパネルへ分ける。</w:t>
-            </w:r>
-          </w:p>
-        </w:tc>
-      </w:tr>
-    </w:tbl>
-    <w:p>
-      <w:pPr>
-        <w:spacing w:after="100"/>
-      </w:pPr>
-    </w:p>
-    <w:p>
-      <w:pPr>
-        <w:pStyle w:val="Heading2"/>
-      </w:pPr>
-      <w:r>
-        <w:rPr>
-          <w:rFonts w:ascii="Yu Gothic" w:cs="Yu Gothic" w:eastAsia="Yu Gothic" w:hAnsi="Yu Gothic"/>
-        </w:rPr>
-        <w:t xml:space="preserve">読み込ませる前のチェック</w:t>
+        <w:t xml:space="preserve">そのほかに読み込めるWordファイル</w:t>
       </w:r>
     </w:p>
     <w:p>
@@ -1445,7 +1787,7 @@
         <w:rPr>
           <w:rFonts w:ascii="Yu Gothic" w:cs="Yu Gothic" w:eastAsia="Yu Gothic" w:hAnsi="Yu Gothic"/>
         </w:rPr>
-        <w:t xml:space="preserve">ふりがなは、Wordの「ルビ（ふりがな）」機能で付けておく。自動で「漢字[よみ]」に変換されます。本文だけ型では、漢字の直後に「大宝(だいほう)」のようにかっこで書いても変換されます。</w:t>
+        <w:t xml:space="preserve">旧形式の .doc も読み込めます。</w:t>
       </w:r>
     </w:p>
     <w:p>
@@ -1461,7 +1803,7 @@
         <w:rPr>
           <w:rFonts w:ascii="Yu Gothic" w:cs="Yu Gothic" w:eastAsia="Yu Gothic" w:hAnsi="Yu Gothic"/>
         </w:rPr>
-        <w:t xml:space="preserve">行頭の字下げは、スペースでも、段落の「最初の行」の字下げ（インデント）でも構いません。字下げは全角スペースとして読み込まれます。</w:t>
+        <w:t xml:space="preserve">1つのテキストボックス＝1パネルで作ったWordも読み込めます（1つ目のテキストボックスにタイトルと日付・会場を、本文より大きい文字で入れておくと、表紙に振り分けられます）。</w:t>
       </w:r>
     </w:p>
     <w:p>
@@ -1477,7 +1819,7 @@
         <w:rPr>
           <w:rFonts w:ascii="Yu Gothic" w:cs="Yu Gothic" w:eastAsia="Yu Gothic" w:hAnsi="Yu Gothic"/>
         </w:rPr>
-        <w:t xml:space="preserve">表紙を自動で振り分けたいときは、サブタイトルに「開式」「午前」「午後」「会館」「ホール」「体育館」などの会場・時刻の言葉を入れる。タイトルは本文と文字サイズを変える（または、サブタイトルの直前に、「記念」「式典」などを含む短い1行として置く）。</w:t>
+        <w:t xml:space="preserve">パスワードを付けたファイル、PDF、写真のWordは読み込めません。</w:t>
       </w:r>
     </w:p>
     <w:p>
@@ -1493,362 +1835,12 @@
         <w:rPr>
           <w:rFonts w:ascii="Yu Gothic" w:cs="Yu Gothic" w:eastAsia="Yu Gothic" w:hAnsi="Yu Gothic"/>
         </w:rPr>
-        <w:t xml:space="preserve">テキストボックスは、並べたい順（パネル1から順）に作る。順番が違ったときは、読み込み後に「▲」「▼」で入れ替えられます。</w:t>
-      </w:r>
-    </w:p>
-    <w:p>
-      <w:pPr>
-        <w:pStyle w:val="ListParagraph"/>
-        <w:numPr>
-          <w:ilvl w:val="0"/>
-          <w:numId w:val="2"/>
-        </w:numPr>
-        <w:spacing w:after="60" w:line="320"/>
-      </w:pPr>
-      <w:r>
-        <w:rPr>
-          <w:rFonts w:ascii="Yu Gothic" w:cs="Yu Gothic" w:eastAsia="Yu Gothic" w:hAnsi="Yu Gothic"/>
-        </w:rPr>
-        <w:t xml:space="preserve">パスワードを付けたファイルは読み込めません。解除してから保存し直してください。</w:t>
-      </w:r>
-    </w:p>
-    <w:p>
-      <w:pPr>
-        <w:spacing w:after="60"/>
-      </w:pPr>
-    </w:p>
-    <w:p>
-      <w:pPr>
-        <w:pStyle w:val="Heading2"/>
-      </w:pPr>
-      <w:r>
-        <w:rPr>
-          <w:rFonts w:ascii="Yu Gothic" w:cs="Yu Gothic" w:eastAsia="Yu Gothic" w:hAnsi="Yu Gothic"/>
-        </w:rPr>
-        <w:t xml:space="preserve">読み込まれないもの・避けたほうがよいもの</w:t>
-      </w:r>
-    </w:p>
-    <w:tbl>
-      <w:tblPr>
-        <w:tblW w:type="dxa" w:w="9638"/>
-        <w:tblBorders>
-          <w:top w:val="single" w:color="auto" w:sz="4"/>
-          <w:left w:val="single" w:color="auto" w:sz="4"/>
-          <w:bottom w:val="single" w:color="auto" w:sz="4"/>
-          <w:right w:val="single" w:color="auto" w:sz="4"/>
-          <w:insideH w:val="single" w:color="auto" w:sz="4"/>
-          <w:insideV w:val="single" w:color="auto" w:sz="4"/>
-        </w:tblBorders>
-      </w:tblPr>
-      <w:tblGrid>
-        <w:gridCol w:w="4000"/>
-        <w:gridCol w:w="5638"/>
-      </w:tblGrid>
-      <w:tr>
-        <w:trPr>
-          <w:tblHeader/>
-        </w:trPr>
-        <w:tc>
-          <w:tcPr>
-            <w:tcW w:type="dxa" w:w="4000"/>
-            <w:tcBorders>
-              <w:top w:val="single" w:color="C9CEC0" w:sz="4"/>
-              <w:left w:val="single" w:color="C9CEC0" w:sz="4"/>
-              <w:bottom w:val="single" w:color="C9CEC0" w:sz="4"/>
-              <w:right w:val="single" w:color="C9CEC0" w:sz="4"/>
-            </w:tcBorders>
-            <w:shd w:fill="E6ECF3" w:color="auto" w:val="clear"/>
-            <w:tcMar>
-              <w:top w:type="dxa" w:w="70"/>
-              <w:left w:type="dxa" w:w="110"/>
-              <w:bottom w:type="dxa" w:w="70"/>
-              <w:right w:type="dxa" w:w="110"/>
-            </w:tcMar>
-          </w:tcPr>
-          <w:p>
-            <w:pPr>
-              <w:spacing w:after="0" w:line="300"/>
-            </w:pPr>
-            <w:r>
-              <w:rPr>
-                <w:rFonts w:ascii="Yu Gothic" w:cs="Yu Gothic" w:eastAsia="Yu Gothic" w:hAnsi="Yu Gothic"/>
-                <w:b/>
-                <w:bCs/>
-                <w:color w:val="2B4C6F"/>
-              </w:rPr>
-              <w:t xml:space="preserve">内容</w:t>
-            </w:r>
-          </w:p>
-        </w:tc>
-        <w:tc>
-          <w:tcPr>
-            <w:tcW w:type="dxa" w:w="5638"/>
-            <w:tcBorders>
-              <w:top w:val="single" w:color="C9CEC0" w:sz="4"/>
-              <w:left w:val="single" w:color="C9CEC0" w:sz="4"/>
-              <w:bottom w:val="single" w:color="C9CEC0" w:sz="4"/>
-              <w:right w:val="single" w:color="C9CEC0" w:sz="4"/>
-            </w:tcBorders>
-            <w:shd w:fill="E6ECF3" w:color="auto" w:val="clear"/>
-            <w:tcMar>
-              <w:top w:type="dxa" w:w="70"/>
-              <w:left w:type="dxa" w:w="110"/>
-              <w:bottom w:type="dxa" w:w="70"/>
-              <w:right w:type="dxa" w:w="110"/>
-            </w:tcMar>
-          </w:tcPr>
-          <w:p>
-            <w:pPr>
-              <w:spacing w:after="0" w:line="300"/>
-            </w:pPr>
-            <w:r>
-              <w:rPr>
-                <w:rFonts w:ascii="Yu Gothic" w:cs="Yu Gothic" w:eastAsia="Yu Gothic" w:hAnsi="Yu Gothic"/>
-                <w:b/>
-                <w:bCs/>
-                <w:color w:val="2B4C6F"/>
-              </w:rPr>
-              <w:t xml:space="preserve">扱い</w:t>
-            </w:r>
-          </w:p>
-        </w:tc>
-      </w:tr>
-      <w:tr>
-        <w:tc>
-          <w:tcPr>
-            <w:tcW w:type="dxa" w:w="4000"/>
-            <w:tcBorders>
-              <w:top w:val="single" w:color="C9CEC0" w:sz="4"/>
-              <w:left w:val="single" w:color="C9CEC0" w:sz="4"/>
-              <w:bottom w:val="single" w:color="C9CEC0" w:sz="4"/>
-              <w:right w:val="single" w:color="C9CEC0" w:sz="4"/>
-            </w:tcBorders>
-            <w:tcMar>
-              <w:top w:type="dxa" w:w="70"/>
-              <w:left w:type="dxa" w:w="110"/>
-              <w:bottom w:type="dxa" w:w="70"/>
-              <w:right w:type="dxa" w:w="110"/>
-            </w:tcMar>
-          </w:tcPr>
-          <w:p>
-            <w:pPr>
-              <w:spacing w:after="0" w:line="300"/>
-            </w:pPr>
-            <w:r>
-              <w:rPr>
-                <w:rFonts w:ascii="Yu Gothic" w:cs="Yu Gothic" w:eastAsia="Yu Gothic" w:hAnsi="Yu Gothic"/>
-              </w:rPr>
-              <w:t xml:space="preserve">画像、図形、罫線、色や書体の設定</w:t>
-            </w:r>
-          </w:p>
-        </w:tc>
-        <w:tc>
-          <w:tcPr>
-            <w:tcW w:type="dxa" w:w="5638"/>
-            <w:tcBorders>
-              <w:top w:val="single" w:color="C9CEC0" w:sz="4"/>
-              <w:left w:val="single" w:color="C9CEC0" w:sz="4"/>
-              <w:bottom w:val="single" w:color="C9CEC0" w:sz="4"/>
-              <w:right w:val="single" w:color="C9CEC0" w:sz="4"/>
-            </w:tcBorders>
-            <w:tcMar>
-              <w:top w:type="dxa" w:w="70"/>
-              <w:left w:type="dxa" w:w="110"/>
-              <w:bottom w:type="dxa" w:w="70"/>
-              <w:right w:type="dxa" w:w="110"/>
-            </w:tcMar>
-          </w:tcPr>
-          <w:p>
-            <w:pPr>
-              <w:spacing w:after="0" w:line="300"/>
-            </w:pPr>
-            <w:r>
-              <w:rPr>
-                <w:rFonts w:ascii="Yu Gothic" w:cs="Yu Gothic" w:eastAsia="Yu Gothic" w:hAnsi="Yu Gothic"/>
-              </w:rPr>
-              <w:t xml:space="preserve">読み込まれません（文字だけが対象）。書体・太さはツール側の設定になります。</w:t>
-            </w:r>
-          </w:p>
-        </w:tc>
-      </w:tr>
-      <w:tr>
-        <w:tc>
-          <w:tcPr>
-            <w:tcW w:type="dxa" w:w="4000"/>
-            <w:tcBorders>
-              <w:top w:val="single" w:color="C9CEC0" w:sz="4"/>
-              <w:left w:val="single" w:color="C9CEC0" w:sz="4"/>
-              <w:bottom w:val="single" w:color="C9CEC0" w:sz="4"/>
-              <w:right w:val="single" w:color="C9CEC0" w:sz="4"/>
-            </w:tcBorders>
-            <w:tcMar>
-              <w:top w:type="dxa" w:w="70"/>
-              <w:left w:type="dxa" w:w="110"/>
-              <w:bottom w:type="dxa" w:w="70"/>
-              <w:right w:type="dxa" w:w="110"/>
-            </w:tcMar>
-          </w:tcPr>
-          <w:p>
-            <w:pPr>
-              <w:spacing w:after="0" w:line="300"/>
-            </w:pPr>
-            <w:r>
-              <w:rPr>
-                <w:rFonts w:ascii="Yu Gothic" w:cs="Yu Gothic" w:eastAsia="Yu Gothic" w:hAnsi="Yu Gothic"/>
-              </w:rPr>
-              <w:t xml:space="preserve">ヘッダー・フッター、脚注</w:t>
-            </w:r>
-          </w:p>
-        </w:tc>
-        <w:tc>
-          <w:tcPr>
-            <w:tcW w:type="dxa" w:w="5638"/>
-            <w:tcBorders>
-              <w:top w:val="single" w:color="C9CEC0" w:sz="4"/>
-              <w:left w:val="single" w:color="C9CEC0" w:sz="4"/>
-              <w:bottom w:val="single" w:color="C9CEC0" w:sz="4"/>
-              <w:right w:val="single" w:color="C9CEC0" w:sz="4"/>
-            </w:tcBorders>
-            <w:tcMar>
-              <w:top w:type="dxa" w:w="70"/>
-              <w:left w:type="dxa" w:w="110"/>
-              <w:bottom w:type="dxa" w:w="70"/>
-              <w:right w:type="dxa" w:w="110"/>
-            </w:tcMar>
-          </w:tcPr>
-          <w:p>
-            <w:pPr>
-              <w:spacing w:after="0" w:line="300"/>
-            </w:pPr>
-            <w:r>
-              <w:rPr>
-                <w:rFonts w:ascii="Yu Gothic" w:cs="Yu Gothic" w:eastAsia="Yu Gothic" w:hAnsi="Yu Gothic"/>
-              </w:rPr>
-              <w:t xml:space="preserve">読み込まれません。</w:t>
-            </w:r>
-          </w:p>
-        </w:tc>
-      </w:tr>
-      <w:tr>
-        <w:tc>
-          <w:tcPr>
-            <w:tcW w:type="dxa" w:w="4000"/>
-            <w:tcBorders>
-              <w:top w:val="single" w:color="C9CEC0" w:sz="4"/>
-              <w:left w:val="single" w:color="C9CEC0" w:sz="4"/>
-              <w:bottom w:val="single" w:color="C9CEC0" w:sz="4"/>
-              <w:right w:val="single" w:color="C9CEC0" w:sz="4"/>
-            </w:tcBorders>
-            <w:tcMar>
-              <w:top w:type="dxa" w:w="70"/>
-              <w:left w:type="dxa" w:w="110"/>
-              <w:bottom w:type="dxa" w:w="70"/>
-              <w:right w:type="dxa" w:w="110"/>
-            </w:tcMar>
-          </w:tcPr>
-          <w:p>
-            <w:pPr>
-              <w:spacing w:after="0" w:line="300"/>
-            </w:pPr>
-            <w:r>
-              <w:rPr>
-                <w:rFonts w:ascii="Yu Gothic" w:cs="Yu Gothic" w:eastAsia="Yu Gothic" w:hAnsi="Yu Gothic"/>
-              </w:rPr>
-              <w:t xml:space="preserve">表（罫線の表）</w:t>
-            </w:r>
-          </w:p>
-        </w:tc>
-        <w:tc>
-          <w:tcPr>
-            <w:tcW w:type="dxa" w:w="5638"/>
-            <w:tcBorders>
-              <w:top w:val="single" w:color="C9CEC0" w:sz="4"/>
-              <w:left w:val="single" w:color="C9CEC0" w:sz="4"/>
-              <w:bottom w:val="single" w:color="C9CEC0" w:sz="4"/>
-              <w:right w:val="single" w:color="C9CEC0" w:sz="4"/>
-            </w:tcBorders>
-            <w:tcMar>
-              <w:top w:type="dxa" w:w="70"/>
-              <w:left w:type="dxa" w:w="110"/>
-              <w:bottom w:type="dxa" w:w="70"/>
-              <w:right w:type="dxa" w:w="110"/>
-            </w:tcMar>
-          </w:tcPr>
-          <w:p>
-            <w:pPr>
-              <w:spacing w:after="0" w:line="300"/>
-            </w:pPr>
-            <w:r>
-              <w:rPr>
-                <w:rFonts w:ascii="Yu Gothic" w:cs="Yu Gothic" w:eastAsia="Yu Gothic" w:hAnsi="Yu Gothic"/>
-              </w:rPr>
-              <w:t xml:space="preserve">避けてください。セルの文字が行として混ざることがあります。</w:t>
-            </w:r>
-          </w:p>
-        </w:tc>
-      </w:tr>
-      <w:tr>
-        <w:tc>
-          <w:tcPr>
-            <w:tcW w:type="dxa" w:w="4000"/>
-            <w:tcBorders>
-              <w:top w:val="single" w:color="C9CEC0" w:sz="4"/>
-              <w:left w:val="single" w:color="C9CEC0" w:sz="4"/>
-              <w:bottom w:val="single" w:color="C9CEC0" w:sz="4"/>
-              <w:right w:val="single" w:color="C9CEC0" w:sz="4"/>
-            </w:tcBorders>
-            <w:tcMar>
-              <w:top w:type="dxa" w:w="70"/>
-              <w:left w:type="dxa" w:w="110"/>
-              <w:bottom w:type="dxa" w:w="70"/>
-              <w:right w:type="dxa" w:w="110"/>
-            </w:tcMar>
-          </w:tcPr>
-          <w:p>
-            <w:pPr>
-              <w:spacing w:after="0" w:line="300"/>
-            </w:pPr>
-            <w:r>
-              <w:rPr>
-                <w:rFonts w:ascii="Yu Gothic" w:cs="Yu Gothic" w:eastAsia="Yu Gothic" w:hAnsi="Yu Gothic"/>
-              </w:rPr>
-              <w:t xml:space="preserve">PDFや、写真のWord</w:t>
-            </w:r>
-          </w:p>
-        </w:tc>
-        <w:tc>
-          <w:tcPr>
-            <w:tcW w:type="dxa" w:w="5638"/>
-            <w:tcBorders>
-              <w:top w:val="single" w:color="C9CEC0" w:sz="4"/>
-              <w:left w:val="single" w:color="C9CEC0" w:sz="4"/>
-              <w:bottom w:val="single" w:color="C9CEC0" w:sz="4"/>
-              <w:right w:val="single" w:color="C9CEC0" w:sz="4"/>
-            </w:tcBorders>
-            <w:tcMar>
-              <w:top w:type="dxa" w:w="70"/>
-              <w:left w:type="dxa" w:w="110"/>
-              <w:bottom w:type="dxa" w:w="70"/>
-              <w:right w:type="dxa" w:w="110"/>
-            </w:tcMar>
-          </w:tcPr>
-          <w:p>
-            <w:pPr>
-              <w:spacing w:after="0" w:line="300"/>
-            </w:pPr>
-            <w:r>
-              <w:rPr>
-                <w:rFonts w:ascii="Yu Gothic" w:cs="Yu Gothic" w:eastAsia="Yu Gothic" w:hAnsi="Yu Gothic"/>
-              </w:rPr>
-              <w:t xml:space="preserve">読み込めません（文字データが無いため）。</w:t>
-            </w:r>
-          </w:p>
-        </w:tc>
-      </w:tr>
-    </w:tbl>
-    <w:p>
-      <w:pPr>
-        <w:spacing w:after="100"/>
+        <w:t xml:space="preserve">画像・図形・色や書体の設定、ヘッダー・フッター・脚注は読み込まれません（文字だけが対象）。表（罫線の表）は、セルの文字が行として混ざることがあるので避けてください。</w:t>
+      </w:r>
+    </w:p>
+    <w:p>
+      <w:pPr>
+        <w:spacing w:after="120"/>
       </w:pPr>
     </w:p>
     <w:p>

</xml_diff>